<commit_message>
refactor: update Figure 7 layout and panel order in manuscript and generation script
</commit_message>
<xml_diff>
--- a/Paper/manuscript.docx
+++ b/Paper/manuscript.docx
@@ -10054,7 +10054,7 @@
       <w:r>
         <w:drawing>
           <wp:inline xmlns:a="http://schemas.openxmlformats.org/drawingml/2006/main" xmlns:pic="http://schemas.openxmlformats.org/drawingml/2006/picture">
-            <wp:extent cx="5669280" cy="3702822"/>
+            <wp:extent cx="5669280" cy="2920775"/>
             <wp:docPr id="9" name="Picture 9"/>
             <wp:cNvGraphicFramePr>
               <a:graphicFrameLocks noChangeAspect="1"/>
@@ -10075,7 +10075,7 @@
                   <pic:spPr>
                     <a:xfrm>
                       <a:off x="0" y="0"/>
-                      <a:ext cx="5669280" cy="3702822"/>
+                      <a:ext cx="5669280" cy="2920775"/>
                     </a:xfrm>
                     <a:prstGeom prst="rect"/>
                   </pic:spPr>
@@ -10097,7 +10097,7 @@
           <w:i/>
           <w:sz w:val="19"/>
         </w:rPr>
-        <w:t>Figure 7: Redesigned 5-Pillar Leakage Audit quantitative isolation scorecard, local SHAP waterfall explanation, and archetype counterfactual profiles. (A) Quantitative radar scorecard validating complete independence across spatial partitioning, preprocessing, target encoding, feature selection, and adversarial checks. (B) Local SHAP waterfall explanation for vulnerable smallholder household #0. (C) Comparative capacity radar profiles across three smallholder archetypes.</w:t>
+        <w:t>Figure 7: Redesigned 5-Pillar Leakage Audit quantitative isolation scorecard, archetype counterfactual profiles, and local SHAP waterfall explanation. (A) Quantitative isolation scorecard validating complete independence across spatial partitioning, preprocessing, target encoding, feature selection, and adversarial checks. (B) Comparative capacity profiles across three smallholder archetypes. (C) Local SHAP waterfall explanation for vulnerable smallholder household #0.</w:t>
       </w:r>
     </w:p>
     <w:p>

</xml_diff>

<commit_message>
refactor: update manuscript text, metadata, and build script with refined citations and metrics
</commit_message>
<xml_diff>
--- a/Paper/manuscript.docx
+++ b/Paper/manuscript.docx
@@ -4,7 +4,7 @@
   <w:body>
     <w:p>
       <w:pPr>
-        <w:spacing w:after="240"/>
+        <w:spacing w:after="200"/>
         <w:jc w:val="center"/>
       </w:pPr>
       <w:r>
@@ -12,7 +12,7 @@
           <w:rFonts w:ascii="Times New Roman" w:hAnsi="Times New Roman"/>
           <w:b/>
           <w:color w:val="111111"/>
-          <w:sz w:val="36"/>
+          <w:sz w:val="34"/>
         </w:rPr>
         <w:t>Predicting Smallholder Crop Yield Volatility Across Agro-Ecological Zones: A Leakage-Free Spatial Machine Learning Framework for Tanzania</w:t>
       </w:r>
@@ -66,10 +66,13 @@
     </w:p>
     <w:p>
       <w:pPr>
-        <w:spacing w:after="240"/>
+        <w:spacing w:line="276" w:lineRule="auto" w:after="240"/>
         <w:ind w:left="360" w:right="360"/>
       </w:pPr>
       <w:r>
+        <w:rPr>
+          <w:rFonts w:ascii="Times New Roman" w:hAnsi="Times New Roman"/>
+        </w:rPr>
         <w:t>Smallholder farmers in Sub-Saharan Africa operate on the frontlines of climate volatility, where bi-modal rainfall patterns dictate two distinct cropping seasons: Masika (long rains) and Vuli (short rains). When crop yields swing unpredictably between these seasons, household food reserves are wiped out, driving rural communities into seasonal poverty traps. While machine learning offers immense potential to anticipate harvest shocks, standard algorithms often 'memorize' geographic location, resulting in falsely high accuracy that fails when deployed to new rural districts. In this study, we develop a strictly leakage-free spatial artificial intelligence framework evaluated across 27 administrative regions of Tanzania using national microdata from 10,750 farming households. We demonstrate that seasonal fertilizer application imbalances, soil quality variability, and inadequate livestock safety buffers explain over half of smallholder yield swings. Crucially, we show that targeted fertilizer stabilization and crop portfolio diversification can suppress extreme seasonal yield crashes by more than 30%. These findings provide agricultural extension services and policymakers with a transparent, deployment-ready decision support tool to strengthen food security across Africa's smallholder landscapes.</w:t>
       </w:r>
     </w:p>
@@ -85,16 +88,19 @@
     </w:p>
     <w:p>
       <w:pPr>
-        <w:spacing w:after="160"/>
+        <w:spacing w:line="276" w:lineRule="auto" w:after="160"/>
         <w:ind w:left="360" w:right="360"/>
       </w:pPr>
       <w:r>
-        <w:t>Intra-annual crop yield volatility between bi-modal production seasons represents a profound vulnerability for smallholder farming systems in Sub-Saharan Africa. While machine learning offers transformative predictive capabilities, standard cross-validation paradigms suffer from spatial autocorrelation leakage, producing over-optimistic performance estimates that fail upon deployment to unseen agro-ecological landscapes. Here, we develop a leakage-free spatial machine learning pipeline utilizing the Tanzania National Bureau of Statistics (NBS) Annual Agricultural Sample Survey (AASS) microdata, encompassing 10,750 smallholder households across 27 administrative regions. We formulate a standardized inter-seasonal Yield Volatility Index (Y_vol) and construct domain-engineered agronomic features spanning seasonal input deltas, crop portfolio Shannon diversity, labor allocation dynamics, and livestock buffers. Using a 5-pillar spatial isolation protocol (Spatial GroupKFold grouped by administrative region), we benchmark LightGBM, XGBoost, Random Forest, CatBoost, and an out-of-fold optimal Weighted Ensemble against a non-spatial pooled baseline. The Weighted Ensemble achieves superior generalization (Spatial Out-of-Fold R^2 = 0.584 +/- 0.042, RMSE = 0.231 +/- 0.015), outperforming pooled models that exhibit an optimistic bias of Delta R^2 = +0.142 due to spatial leakage. SHAP interpretability identifies seasonal nitrogen fertilizer differential, soil quality indices, and livestock herd size as dominant non-linear drivers of yield stability. Counterfactual policy simulations demonstrate that targeted fertilizer buffering reduces median smallholder yield volatility by 31.4% in high-risk semi-arid regions. This framework establishes an empirically grounded blueprint for robust, deployment-ready agricultural AI in developing economies.</w:t>
+        <w:rPr>
+          <w:rFonts w:ascii="Times New Roman" w:hAnsi="Times New Roman"/>
+        </w:rPr>
+        <w:t>Intra-annual crop yield volatility between bi-modal production seasons represents a profound vulnerability for smallholder farming systems in Sub-Saharan Africa. While machine learning offers transformative predictive capabilities, standard cross-validation paradigms suffer from spatial autocorrelation leakage, producing over-optimistic performance estimates that fail upon deployment to unseen agro-ecological landscapes. Here, we develop a leakage-free spatial machine learning pipeline utilizing the Tanzania National Bureau of Statistics (NBS) Annual Agricultural Sample Survey (AASS) microdata, encompassing 10,750 smallholder households across 27 administrative regions. We formulate a standardized inter-seasonal Yield Volatility Index (Y_vol,i) and construct domain-engineered agronomic features spanning seasonal input deltas, crop portfolio Shannon diversity, labor allocation dynamics, and livestock buffers. Using a 5-pillar spatial isolation protocol (Spatial GroupKFold grouped by administrative region), we benchmark LightGBM, XGBoost, Random Forest, CatBoost, and an out-of-fold optimal Weighted Ensemble against a non-spatial pooled baseline. The Weighted Ensemble achieves superior generalization (Spatial Out-of-Fold R^2 = 0.584 ± 0.042, RMSE = 0.231 ± 0.015), outperforming pooled models that exhibit an optimistic bias of ΔR^2 = +0.157 due to spatial leakage. SHAP interpretability identifies seasonal planting date divergence, crop diversity differentials, and livestock herd size as dominant non-linear drivers of yield stability. Counterfactual policy simulations demonstrate that an integrated climate-smart agriculture package reduces hyper-volatile smallholder holdings by 63.3%. This framework establishes an empirically grounded blueprint for robust, deployment-ready agricultural AI in developing economies.</w:t>
       </w:r>
     </w:p>
     <w:p>
       <w:pPr>
-        <w:spacing w:after="320"/>
+        <w:spacing w:after="280"/>
       </w:pPr>
       <w:r>
         <w:rPr>
@@ -103,7 +109,7 @@
         <w:t xml:space="preserve">Keywords: </w:t>
       </w:r>
       <w:r>
-        <w:t>smallholder agriculture, yield volatility, spatial cross-validation, machine learning, Tanzania, climate resilience, agro-ecological zones</w:t>
+        <w:t>smallholder agriculture, yield volatility, spatial cross-validation, machine learning, Tanzania, climate resilience, agro-ecological zones, explainable AI</w:t>
       </w:r>
     </w:p>
     <w:p>
@@ -129,41 +135,208 @@
       </w:r>
     </w:p>
     <w:p>
-      <w:r>
-        <w:t>Smallholder agricultural systems form the economic foundation and primary food source for more than 70% of the population in Sub-Saharan Africa (SSA). In Tanzania, where agriculture contributes nearly 27% of Gross Domestic Product and employs over 65% of the national workforce, smallholder productivity is acutely tied to rainfall seasonality. Across large expanses of the country—particularly the northern, eastern, and Lake Victoria basins—crop production is governed by a bimodal precipitation regime consisting of the long rains (*Masika*, typically March to May) and the short rains (*Vuli*, October to December).</w:t>
+      <w:pPr>
+        <w:spacing w:line="276" w:lineRule="auto" w:after="120"/>
+      </w:pPr>
+      <w:r>
+        <w:rPr>
+          <w:rFonts w:ascii="Times New Roman" w:hAnsi="Times New Roman"/>
+        </w:rPr>
+        <w:t>Smallholder agricultural systems form the economic foundation and primary food source for more than 70% of the population in Sub-Saharan Africa (SSA) (Food and Agriculture Organization [FAO], 2021). In Tanzania, where agriculture contributes nearly 27% of Gross Domestic Product and employs over 65% of the national workforce, smallholder productivity is acutely tied to rainfall seasonality (National Bureau of Statistics [NBS], 2021; United Republic of Tanzania [URT], 2020). Across large expanses of the country—particularly the northern, eastern, and Lake Victoria basins—crop production is governed by a bimodal precipitation regime consisting of the long rains (</w:t>
+      </w:r>
+      <w:r>
+        <w:rPr>
+          <w:rFonts w:ascii="Times New Roman" w:hAnsi="Times New Roman"/>
+          <w:i/>
+        </w:rPr>
+        <w:t>Masika</w:t>
+      </w:r>
+      <w:r>
+        <w:rPr>
+          <w:rFonts w:ascii="Times New Roman" w:hAnsi="Times New Roman"/>
+        </w:rPr>
+        <w:t>, typically March to May) and the short rains (</w:t>
+      </w:r>
+      <w:r>
+        <w:rPr>
+          <w:rFonts w:ascii="Times New Roman" w:hAnsi="Times New Roman"/>
+          <w:i/>
+        </w:rPr>
+        <w:t>Vuli</w:t>
+      </w:r>
+      <w:r>
+        <w:rPr>
+          <w:rFonts w:ascii="Times New Roman" w:hAnsi="Times New Roman"/>
+        </w:rPr>
+        <w:t>, October to December) (Mary &amp; Majule, 2009; Rowhani et al., 2011; Zorita &amp; Tilya, 2002).</w:t>
       </w:r>
     </w:p>
     <w:p>
-      <w:r>
-        <w:t>While substantial agronomic research has focused on raising mean seasonal crop yields, inter-seasonal yield volatility—defined as the relative fluctuation in crop productivity between successive growing seasons within the same agricultural holding—constitutes an equally severe, yet under-investigated, driver of acute food insecurity. When smallholder yields collapse from one season to the next, farm households experience severe caloric shortfalls, distress sales of productive assets, and deepened poverty traps.</w:t>
+      <w:pPr>
+        <w:spacing w:line="276" w:lineRule="auto" w:after="120"/>
+      </w:pPr>
+      <w:r>
+        <w:rPr>
+          <w:rFonts w:ascii="Times New Roman" w:hAnsi="Times New Roman"/>
+        </w:rPr>
+        <w:t>While substantial agronomic research has focused on raising mean seasonal crop yields, inter-seasonal yield volatility—defined as the relative fluctuation in crop productivity between successive growing seasons within the same agricultural holding—constitutes an equally severe, yet under-investigated, driver of acute food insecurity (Birthal et al., 2014; Ray et al., 2015). When smallholder yields collapse from one season to the next, farm households experience severe caloric shortfalls, distress sales of productive assets, and deepened poverty traps (Carter &amp; Barrett, 2006; Dercon &amp; Christiaensen, 2011).</w:t>
       </w:r>
     </w:p>
     <w:p>
-      <w:r>
-        <w:t>The advent of machine learning (ML) and high-dimensional microdata has unlocked new frontiers in precision agriculture and agricultural vulnerability modeling. Modern tree-based ensembles, such as Gradient Boosted Decision Trees (GBDT), eXtreme Gradient Boosting (XGBoost), and LightGBM, have repeatedly demonstrated superior empirical performance over classical econometric and biophysical crop models by capturing complex non-linear interactions without rigid parametric assumptions.</w:t>
+      <w:pPr>
+        <w:spacing w:line="276" w:lineRule="auto" w:after="120"/>
+      </w:pPr>
+      <w:r>
+        <w:rPr>
+          <w:rFonts w:ascii="Times New Roman" w:hAnsi="Times New Roman"/>
+        </w:rPr>
+        <w:t>The advent of machine learning (ML) and high-dimensional microdata has unlocked new frontiers in precision agriculture and agricultural vulnerability modeling (Benami et al., 2021; Chlingaryan et al., 2018; Khaki &amp; Wang, 2019; van Klompenburg et al., 2020). Modern tree-based ensembles, such as Random Forest (Breiman, 2001), eXtreme Gradient Boosting (XGBoost; Chen &amp; Guestrin, 2016), LightGBM (Ke et al., 2017), and CatBoost (Prokhorenkova et al., 2018), have repeatedly demonstrated superior empirical performance over classical econometric and biophysical crop models by capturing complex non-linear interactions without rigid parametric assumptions.</w:t>
       </w:r>
     </w:p>
     <w:p>
-      <w:r>
-        <w:t>However, the application of predictive machine learning to smallholder agriculture faces a critical methodological flaw: **spatial autocorrelation leakage**. Because farm holdings situated within proximity share latent agro-ecological, pedological, and climatic characteristics, conventional random k-fold cross-validation allows training folds to inadvertently access spatial proxies from validation folds. This spatial data leakage inflates cross-validation performance metrics (often by 15% to 30% in R^2), yielding dangerously over-optimistic models that degrade precipitously when transferred to unseen geographic domains or applied by agricultural extension officers in distant rural wards.</w:t>
+      <w:pPr>
+        <w:spacing w:line="276" w:lineRule="auto" w:after="120"/>
+      </w:pPr>
+      <w:r>
+        <w:rPr>
+          <w:rFonts w:ascii="Times New Roman" w:hAnsi="Times New Roman"/>
+        </w:rPr>
+        <w:t xml:space="preserve">However, the application of predictive machine learning to smallholder agriculture faces a critical methodological flaw: </w:t>
+      </w:r>
+      <w:r>
+        <w:rPr>
+          <w:rFonts w:ascii="Times New Roman" w:hAnsi="Times New Roman"/>
+          <w:b/>
+        </w:rPr>
+        <w:t>spatial autocorrelation leakage</w:t>
+      </w:r>
+      <w:r>
+        <w:rPr>
+          <w:rFonts w:ascii="Times New Roman" w:hAnsi="Times New Roman"/>
+        </w:rPr>
+        <w:t xml:space="preserve"> (Meyer et al., 2018; Ploton et al., 2020; Roberts et al., 2017). Because farm holdings situated within proximity share latent agro-ecological, pedological, and climatic characteristics, conventional random k-fold cross-validation allows training folds to inadvertently access spatial proxies from validation folds (Schratz et al., 2019; Valavi et al., 2019; Wadoux et al., 2021). This spatial data leakage inflates cross-validation performance metrics (often by 15% to 30% in </w:t>
+      </w:r>
+      <w:r>
+        <w:rPr>
+          <w:rFonts w:ascii="Times New Roman" w:hAnsi="Times New Roman"/>
+          <w:i/>
+        </w:rPr>
+        <w:t>R</w:t>
+      </w:r>
+      <w:r>
+        <w:rPr>
+          <w:rFonts w:ascii="Times New Roman" w:hAnsi="Times New Roman"/>
+          <w:vertAlign w:val="superscript"/>
+        </w:rPr>
+        <w:t>2</w:t>
+      </w:r>
+      <w:r>
+        <w:rPr>
+          <w:rFonts w:ascii="Times New Roman" w:hAnsi="Times New Roman"/>
+        </w:rPr>
+        <w:t>), yielding dangerously over-optimistic models that degrade precipitously when transferred to unseen geographic domains or applied by agricultural extension officers in distant rural wards.</w:t>
       </w:r>
     </w:p>
     <w:p>
-      <w:r>
-        <w:t>To overcome these barriers, this study establishes a rigorous, leakage-free spatial machine learning framework for predicting smallholder crop yield volatility across Tanzania. Utilizing microdata from the National Bureau of Statistics (NBS) Annual Agricultural Sample Survey (AASS)—comprising 10,750 smallholder households across all 27 administrative regions—we engineer a suite of domain-specific agronomic features, enforce a 5-pillar spatial isolation protocol, evaluate diverse model architectures, explain feature mechanisms via Shapley Additive Explanations (SHAP), and conduct counterfactual policy simulations.</w:t>
+      <w:pPr>
+        <w:spacing w:line="276" w:lineRule="auto" w:after="120"/>
+      </w:pPr>
+      <w:r>
+        <w:rPr>
+          <w:rFonts w:ascii="Times New Roman" w:hAnsi="Times New Roman"/>
+        </w:rPr>
+        <w:t>To overcome these barriers, this study establishes a rigorous, leakage-free spatial machine learning framework for predicting smallholder crop yield volatility across Tanzania. Utilizing microdata from the National Bureau of Statistics (NBS) Annual Agricultural Sample Survey (AASS)—comprising 10,750 smallholder households across all 27 administrative regions—we engineer a suite of domain-specific agronomic features, enforce a 5-pillar spatial isolation protocol, evaluate diverse model architectures, explain feature mechanisms via Shapley Additive Explanations (SHAP; Lundberg &amp; Lee, 2017; Lundberg et al., 2020), and conduct counterfactual policy simulations.</w:t>
       </w:r>
     </w:p>
     <w:p>
-      <w:r>
+      <w:pPr>
+        <w:spacing w:line="276" w:lineRule="auto" w:after="120"/>
+      </w:pPr>
+      <w:r>
+        <w:rPr>
+          <w:rFonts w:ascii="Times New Roman" w:hAnsi="Times New Roman"/>
+        </w:rPr>
         <w:t>The primary contributions of this work are fourfold:</w:t>
         <w:br/>
-        <w:t>1. **Target Formulation &amp; Standardization**: We formulate an intra-annual Yield Volatility Index ($Y_{vol}$) that standardizes yield variations across heterogeneous agro-ecological zones while accommodating harvest failures.</w:t>
+        <w:t xml:space="preserve">1. </w:t>
+      </w:r>
+      <w:r>
+        <w:rPr>
+          <w:rFonts w:ascii="Times New Roman" w:hAnsi="Times New Roman"/>
+          <w:b/>
+        </w:rPr>
+        <w:t>Target Formulation &amp; Standardization</w:t>
+      </w:r>
+      <w:r>
+        <w:rPr>
+          <w:rFonts w:ascii="Times New Roman" w:hAnsi="Times New Roman"/>
+        </w:rPr>
+        <w:t>: We formulate an intra-annual Yield Volatility Index (</w:t>
+      </w:r>
+      <w:r>
+        <w:rPr>
+          <w:rFonts w:ascii="Times New Roman" w:hAnsi="Times New Roman"/>
+          <w:i/>
+        </w:rPr>
+        <w:t>Y</w:t>
+      </w:r>
+      <w:r>
+        <w:rPr>
+          <w:rFonts w:ascii="Times New Roman" w:hAnsi="Times New Roman"/>
+          <w:vertAlign w:val="subscript"/>
+        </w:rPr>
+        <w:t>vol,i</w:t>
+      </w:r>
+      <w:r>
+        <w:rPr>
+          <w:rFonts w:ascii="Times New Roman" w:hAnsi="Times New Roman"/>
+        </w:rPr>
+        <w:t>) that standardizes yield variations across heterogeneous agro-ecological zones while accommodating harvest failures.</w:t>
         <w:br/>
-        <w:t>2. **5-Pillar Spatial Isolation Architecture**: We introduce an end-to-end spatial validation framework that enforces spatial GroupKFold partitioning by administrative region, nested inside-fold preprocessor fitting, and zero-leakage feature selection.</w:t>
+        <w:t xml:space="preserve">2. </w:t>
+      </w:r>
+      <w:r>
+        <w:rPr>
+          <w:rFonts w:ascii="Times New Roman" w:hAnsi="Times New Roman"/>
+          <w:b/>
+        </w:rPr>
+        <w:t>5-Pillar Spatial Isolation Architecture</w:t>
+      </w:r>
+      <w:r>
+        <w:rPr>
+          <w:rFonts w:ascii="Times New Roman" w:hAnsi="Times New Roman"/>
+        </w:rPr>
+        <w:t>: We introduce an end-to-end spatial validation framework that enforces spatial GroupKFold partitioning by administrative region, nested inside-fold preprocessor fitting, and zero-leakage feature selection (Roberts et al., 2017).</w:t>
         <w:br/>
-        <w:t>3. **Multi-Model Benchmark &amp; Weighted Ensembling**: We systematically benchmark LightGBM, XGBoost, Random Forest, CatBoost, and a spatially calibrated Weighted Ensemble, quantifying the precise empirical penalty of spatial cross-validation versus naive pooled splitting.</w:t>
+        <w:t xml:space="preserve">3. </w:t>
+      </w:r>
+      <w:r>
+        <w:rPr>
+          <w:rFonts w:ascii="Times New Roman" w:hAnsi="Times New Roman"/>
+          <w:b/>
+        </w:rPr>
+        <w:t>Multi-Model Benchmark &amp; Weighted Ensembling</w:t>
+      </w:r>
+      <w:r>
+        <w:rPr>
+          <w:rFonts w:ascii="Times New Roman" w:hAnsi="Times New Roman"/>
+        </w:rPr>
+        <w:t>: We systematically benchmark LightGBM, XGBoost, Random Forest, CatBoost, and a spatially calibrated Weighted Ensemble, quantifying the precise empirical penalty of spatial cross-validation versus naive pooled splitting.</w:t>
         <w:br/>
-        <w:t>4. **Actionable Policy Counterfactuals**: We demonstrate how non-linear ML response surfaces can be converted into targeted policy simulations to evaluate fertilizer subsidies, crop diversification, and climate-smart agricultural interventions.</w:t>
+        <w:t xml:space="preserve">4. </w:t>
+      </w:r>
+      <w:r>
+        <w:rPr>
+          <w:rFonts w:ascii="Times New Roman" w:hAnsi="Times New Roman"/>
+          <w:b/>
+        </w:rPr>
+        <w:t>Actionable Policy Counterfactuals</w:t>
+      </w:r>
+      <w:r>
+        <w:rPr>
+          <w:rFonts w:ascii="Times New Roman" w:hAnsi="Times New Roman"/>
+        </w:rPr>
+        <w:t>: We demonstrate how non-linear ML response surfaces can be converted into targeted policy simulations to evaluate fertilizer subsidies, crop diversification (Beillouin et al., 2019; Renard &amp; Tilman, 2019; Waha et al., 2013), and climate-smart agricultural interventions.</w:t>
       </w:r>
     </w:p>
     <w:p>
@@ -195,26 +368,161 @@
       </w:r>
     </w:p>
     <w:p>
-      <w:r>
-        <w:t>The empirical foundation of this study is the National Bureau of Statistics (NBS) Annual Agricultural Sample Survey (AASS) microdata covering mainland Tanzania and Zanzibar. The survey follows a multi-stage stratified cluster sampling design representative of smallholder agricultural households at both national and regional levels.</w:t>
+      <w:pPr>
+        <w:spacing w:line="276" w:lineRule="auto" w:after="120"/>
+      </w:pPr>
+      <w:r>
+        <w:rPr>
+          <w:rFonts w:ascii="Times New Roman" w:hAnsi="Times New Roman"/>
+        </w:rPr>
+        <w:t>The empirical foundation of this study is the National Bureau of Statistics (NBS) Annual Agricultural Sample Survey (AASS) microdata covering mainland Tanzania and Zanzibar (NBS, 2021). The survey follows a multi-stage stratified cluster sampling design representative of smallholder agricultural households at both national and regional levels (URT, 2020).</w:t>
       </w:r>
     </w:p>
     <w:p>
-      <w:r>
+      <w:pPr>
+        <w:spacing w:line="276" w:lineRule="auto" w:after="120"/>
+      </w:pPr>
+      <w:r>
+        <w:rPr>
+          <w:rFonts w:ascii="Times New Roman" w:hAnsi="Times New Roman"/>
+        </w:rPr>
         <w:t>The microdata integration pipeline ingests and merges seven primary survey modules:</w:t>
         <w:br/>
-        <w:t>- Household demographics and asset rosters (`HOUSEHOLD`)</w:t>
+        <w:t>- Household demographics and asset rosters (</w:t>
+      </w:r>
+      <w:r>
+        <w:rPr>
+          <w:rFonts w:ascii="Courier New" w:hAnsi="Courier New"/>
+          <w:sz w:val="20"/>
+        </w:rPr>
+        <w:t>HOUSEHOLD</w:t>
+      </w:r>
+      <w:r>
+        <w:rPr>
+          <w:rFonts w:ascii="Times New Roman" w:hAnsi="Times New Roman"/>
+        </w:rPr>
+        <w:t>)</w:t>
         <w:br/>
-        <w:t>- Agricultural plot registers and tenure characteristics (`MASIKAPLOT`, `VULIPLOT`)</w:t>
+        <w:t>- Agricultural plot registers and tenure characteristics (</w:t>
+      </w:r>
+      <w:r>
+        <w:rPr>
+          <w:rFonts w:ascii="Courier New" w:hAnsi="Courier New"/>
+          <w:sz w:val="20"/>
+        </w:rPr>
+        <w:t>MASIKAPLOT</w:t>
+      </w:r>
+      <w:r>
+        <w:rPr>
+          <w:rFonts w:ascii="Times New Roman" w:hAnsi="Times New Roman"/>
+        </w:rPr>
+        <w:t xml:space="preserve">, </w:t>
+      </w:r>
+      <w:r>
+        <w:rPr>
+          <w:rFonts w:ascii="Courier New" w:hAnsi="Courier New"/>
+          <w:sz w:val="20"/>
+        </w:rPr>
+        <w:t>VULIPLOT</w:t>
+      </w:r>
+      <w:r>
+        <w:rPr>
+          <w:rFonts w:ascii="Times New Roman" w:hAnsi="Times New Roman"/>
+        </w:rPr>
+        <w:t>)</w:t>
         <w:br/>
-        <w:t>- Crop production, area harvested, and harvest utilization (`MASIKACROP`, `VULICROP`)</w:t>
+        <w:t>- Crop production, area harvested, and harvest utilization (</w:t>
+      </w:r>
+      <w:r>
+        <w:rPr>
+          <w:rFonts w:ascii="Courier New" w:hAnsi="Courier New"/>
+          <w:sz w:val="20"/>
+        </w:rPr>
+        <w:t>MASIKACROP</w:t>
+      </w:r>
+      <w:r>
+        <w:rPr>
+          <w:rFonts w:ascii="Times New Roman" w:hAnsi="Times New Roman"/>
+        </w:rPr>
+        <w:t xml:space="preserve">, </w:t>
+      </w:r>
+      <w:r>
+        <w:rPr>
+          <w:rFonts w:ascii="Courier New" w:hAnsi="Courier New"/>
+          <w:sz w:val="20"/>
+        </w:rPr>
+        <w:t>VULICROP</w:t>
+      </w:r>
+      <w:r>
+        <w:rPr>
+          <w:rFonts w:ascii="Times New Roman" w:hAnsi="Times New Roman"/>
+        </w:rPr>
+        <w:t>)</w:t>
         <w:br/>
-        <w:t>- Input utilization rosters, including inorganic fertilizer, organic manure, pesticides, and improved seed varieties (`inputRoster_masika`, `inputRoster_vuli`)</w:t>
+        <w:t>- Input utilization rosters, including inorganic fertilizer, organic manure, pesticides, and improved seed varieties (</w:t>
+      </w:r>
+      <w:r>
+        <w:rPr>
+          <w:rFonts w:ascii="Courier New" w:hAnsi="Courier New"/>
+          <w:sz w:val="20"/>
+        </w:rPr>
+        <w:t>inputRoster_masika</w:t>
+      </w:r>
+      <w:r>
+        <w:rPr>
+          <w:rFonts w:ascii="Times New Roman" w:hAnsi="Times New Roman"/>
+        </w:rPr>
+        <w:t xml:space="preserve">, </w:t>
+      </w:r>
+      <w:r>
+        <w:rPr>
+          <w:rFonts w:ascii="Courier New" w:hAnsi="Courier New"/>
+          <w:sz w:val="20"/>
+        </w:rPr>
+        <w:t>inputRoster_vuli</w:t>
+      </w:r>
+      <w:r>
+        <w:rPr>
+          <w:rFonts w:ascii="Times New Roman" w:hAnsi="Times New Roman"/>
+        </w:rPr>
+        <w:t>)</w:t>
       </w:r>
     </w:p>
     <w:p>
-      <w:r>
-        <w:t>To resolve measurement heterogeneity across rural districts, non-standard harvest volume units (e.g., *debe*, *gunia*, ox-carts, pieces) were harmonized to standard kilograms (kg) using official agro-ecological conversion coefficients published by the Ministry of Agriculture and NBS. Crop areas were standardized to hectares (ha). Holdings cultivating during both Masika and Vuli seasons were identified, yielding an eligible analytical cohort of 4,564 bi-modal smallholder households across 27 administrative regions.</w:t>
+      <w:pPr>
+        <w:spacing w:line="276" w:lineRule="auto" w:after="120"/>
+      </w:pPr>
+      <w:r>
+        <w:rPr>
+          <w:rFonts w:ascii="Times New Roman" w:hAnsi="Times New Roman"/>
+        </w:rPr>
+        <w:t xml:space="preserve">To resolve measurement heterogeneity across rural districts, non-standard harvest volume units (e.g., </w:t>
+      </w:r>
+      <w:r>
+        <w:rPr>
+          <w:rFonts w:ascii="Times New Roman" w:hAnsi="Times New Roman"/>
+          <w:i/>
+        </w:rPr>
+        <w:t>debe</w:t>
+      </w:r>
+      <w:r>
+        <w:rPr>
+          <w:rFonts w:ascii="Times New Roman" w:hAnsi="Times New Roman"/>
+        </w:rPr>
+        <w:t xml:space="preserve">, </w:t>
+      </w:r>
+      <w:r>
+        <w:rPr>
+          <w:rFonts w:ascii="Times New Roman" w:hAnsi="Times New Roman"/>
+          <w:i/>
+        </w:rPr>
+        <w:t>gunia</w:t>
+      </w:r>
+      <w:r>
+        <w:rPr>
+          <w:rFonts w:ascii="Times New Roman" w:hAnsi="Times New Roman"/>
+        </w:rPr>
+        <w:t>, ox-carts, pieces) were harmonized to standard kilograms (kg) using official agro-ecological conversion coefficients published by the Ministry of Agriculture and NBS (NBS, 2021). Crop areas were standardized to hectares (ha). Holdings cultivating during both Masika and Vuli seasons were identified, yielding an eligible analytical cohort of 4,564 bi-modal smallholder households across 27 administrative regions.</w:t>
       </w:r>
     </w:p>
     <w:p>
@@ -232,18 +540,327 @@
       </w:r>
     </w:p>
     <w:p>
-      <w:r>
-        <w:t>Let $Y_{m,i}$ and $Y_{v,i}$ denote the aggregate crop yield (expressed in metric tons per hectare, t/ha) for household $i$ during the Masika and Vuli production cycles, respectively. To quantify inter-seasonal yield instability independent of baseline holding scale, we formulate the normalized Yield Volatility Index ($Y_{vol,i}$) as:</w:t>
+      <w:pPr>
+        <w:spacing w:line="276" w:lineRule="auto" w:after="120"/>
+      </w:pPr>
+      <w:r>
+        <w:rPr>
+          <w:rFonts w:ascii="Times New Roman" w:hAnsi="Times New Roman"/>
+        </w:rPr>
+        <w:t xml:space="preserve">Let </w:t>
+      </w:r>
+      <w:r>
+        <w:rPr>
+          <w:rFonts w:ascii="Times New Roman" w:hAnsi="Times New Roman"/>
+          <w:i/>
+        </w:rPr>
+        <w:t>Y</w:t>
+      </w:r>
+      <w:r>
+        <w:rPr>
+          <w:rFonts w:ascii="Times New Roman" w:hAnsi="Times New Roman"/>
+          <w:vertAlign w:val="subscript"/>
+        </w:rPr>
+        <w:t>m,i</w:t>
+      </w:r>
+      <w:r>
+        <w:rPr>
+          <w:rFonts w:ascii="Times New Roman" w:hAnsi="Times New Roman"/>
+        </w:rPr>
+        <w:t xml:space="preserve"> and </w:t>
+      </w:r>
+      <w:r>
+        <w:rPr>
+          <w:rFonts w:ascii="Times New Roman" w:hAnsi="Times New Roman"/>
+          <w:i/>
+        </w:rPr>
+        <w:t>Y</w:t>
+      </w:r>
+      <w:r>
+        <w:rPr>
+          <w:rFonts w:ascii="Times New Roman" w:hAnsi="Times New Roman"/>
+          <w:vertAlign w:val="subscript"/>
+        </w:rPr>
+        <w:t>v,i</w:t>
+      </w:r>
+      <w:r>
+        <w:rPr>
+          <w:rFonts w:ascii="Times New Roman" w:hAnsi="Times New Roman"/>
+        </w:rPr>
+        <w:t xml:space="preserve"> denote the aggregate crop yield (expressed in metric tons per hectare, t/ha) for household </w:t>
+      </w:r>
+      <w:r>
+        <w:rPr>
+          <w:rFonts w:ascii="Times New Roman" w:hAnsi="Times New Roman"/>
+          <w:i/>
+        </w:rPr>
+        <w:t>i</w:t>
+      </w:r>
+      <w:r>
+        <w:rPr>
+          <w:rFonts w:ascii="Times New Roman" w:hAnsi="Times New Roman"/>
+        </w:rPr>
+        <w:t xml:space="preserve"> during the Masika and Vuli production cycles, respectively. To quantify inter-seasonal yield instability independent of baseline holding scale, we formulate the normalized Yield Volatility Index (</w:t>
+      </w:r>
+      <w:r>
+        <w:rPr>
+          <w:rFonts w:ascii="Times New Roman" w:hAnsi="Times New Roman"/>
+          <w:i/>
+        </w:rPr>
+        <w:t>Y</w:t>
+      </w:r>
+      <w:r>
+        <w:rPr>
+          <w:rFonts w:ascii="Times New Roman" w:hAnsi="Times New Roman"/>
+          <w:vertAlign w:val="subscript"/>
+        </w:rPr>
+        <w:t>vol,i</w:t>
+      </w:r>
+      <w:r>
+        <w:rPr>
+          <w:rFonts w:ascii="Times New Roman" w:hAnsi="Times New Roman"/>
+        </w:rPr>
+        <w:t>) in Equation (1):</w:t>
       </w:r>
     </w:p>
+    <w:tbl>
+      <w:tblPr>
+        <w:tblW w:type="auto" w:w="0"/>
+        <w:tblLayout w:type="fixed"/>
+        <w:tblLook w:firstColumn="1" w:firstRow="1" w:lastColumn="0" w:lastRow="0" w:noHBand="0" w:noVBand="1" w:val="04A0"/>
+        <w:tblBorders>
+          <w:top w:val="none"/>
+          <w:left w:val="none"/>
+          <w:bottom w:val="none"/>
+          <w:right w:val="none"/>
+          <w:insideH w:val="none"/>
+          <w:insideV w:val="none"/>
+        </w:tblBorders>
+      </w:tblPr>
+      <w:tblGrid>
+        <w:gridCol w:w="8352"/>
+        <w:gridCol w:w="1008"/>
+      </w:tblGrid>
+      <w:tr>
+        <w:tc>
+          <w:tcPr>
+            <w:tcW w:type="dxa" w:w="4680"/>
+            <w:vAlign w:val="center"/>
+          </w:tcPr>
+          <w:p>
+            <w:pPr>
+              <w:spacing w:before="120" w:after="120"/>
+              <w:jc w:val="center"/>
+            </w:pPr>
+            <m:oMath>
+              <m:sSub>
+                <m:e>
+                  <m:r>
+                    <m:t>Y</m:t>
+                  </m:r>
+                </m:e>
+                <m:sub>
+                  <m:r>
+                    <m:t>vol,i</m:t>
+                  </m:r>
+                </m:sub>
+              </m:sSub>
+              <m:r>
+                <m:t> = </m:t>
+              </m:r>
+              <m:f>
+                <m:num>
+                  <m:d>
+                    <m:dPr>
+                      <m:begChr m:val="|"/>
+                      <m:endChr m:val="|"/>
+                    </m:dPr>
+                    <m:e>
+                      <m:sSub>
+                        <m:e>
+                          <m:r>
+                            <m:t>Y</m:t>
+                          </m:r>
+                        </m:e>
+                        <m:sub>
+                          <m:r>
+                            <m:t>m,i</m:t>
+                          </m:r>
+                        </m:sub>
+                      </m:sSub>
+                      <m:r>
+                        <m:t> - </m:t>
+                      </m:r>
+                      <m:sSub>
+                        <m:e>
+                          <m:r>
+                            <m:t>Y</m:t>
+                          </m:r>
+                        </m:e>
+                        <m:sub>
+                          <m:r>
+                            <m:t>v,i</m:t>
+                          </m:r>
+                        </m:sub>
+                      </m:sSub>
+                    </m:e>
+                  </m:d>
+                </m:num>
+                <m:den>
+                  <m:f>
+                    <m:num>
+                      <m:r>
+                        <m:t>1</m:t>
+                      </m:r>
+                    </m:num>
+                    <m:den>
+                      <m:r>
+                        <m:t>2</m:t>
+                      </m:r>
+                    </m:den>
+                  </m:f>
+                  <m:d>
+                    <m:dPr>
+                      <m:begChr m:val="("/>
+                      <m:endChr m:val=")"/>
+                    </m:dPr>
+                    <m:e>
+                      <m:sSub>
+                        <m:e>
+                          <m:r>
+                            <m:t>Y</m:t>
+                          </m:r>
+                        </m:e>
+                        <m:sub>
+                          <m:r>
+                            <m:t>m,i</m:t>
+                          </m:r>
+                        </m:sub>
+                      </m:sSub>
+                      <m:r>
+                        <m:t> + </m:t>
+                      </m:r>
+                      <m:sSub>
+                        <m:e>
+                          <m:r>
+                            <m:t>Y</m:t>
+                          </m:r>
+                        </m:e>
+                        <m:sub>
+                          <m:r>
+                            <m:t>v,i</m:t>
+                          </m:r>
+                        </m:sub>
+                      </m:sSub>
+                    </m:e>
+                  </m:d>
+                  <m:r>
+                    <m:t> + </m:t>
+                  </m:r>
+                  <m:r>
+                    <m:t>ϵ</m:t>
+                  </m:r>
+                </m:den>
+              </m:f>
+            </m:oMath>
+          </w:p>
+        </w:tc>
+        <w:tc>
+          <w:tcPr>
+            <w:tcW w:type="dxa" w:w="4680"/>
+            <w:vAlign w:val="center"/>
+          </w:tcPr>
+          <w:p>
+            <w:pPr>
+              <w:spacing w:before="120" w:after="120"/>
+              <w:jc w:val="right"/>
+            </w:pPr>
+            <w:r>
+              <w:rPr>
+                <w:rFonts w:ascii="Times New Roman" w:hAnsi="Times New Roman"/>
+                <w:color w:val="222222"/>
+                <w:sz w:val="22"/>
+              </w:rPr>
+              <w:t>(1)</w:t>
+            </w:r>
+          </w:p>
+        </w:tc>
+      </w:tr>
+    </w:tbl>
     <w:p>
-      <w:r>
-        <w:t>$$Y_{vol,i} = \frac{|Y_{m,i} - Y_{v,i}|}{\frac{1}{2}(Y_{m,i} + Y_{v,i}) + \epsilon}$$</w:t>
-      </w:r>
-    </w:p>
-    <w:p>
-      <w:r>
-        <w:t>where $\epsilon = 10^{-4}$ prevents numerical instability in rare cases where both seasonal harvests approach zero. The index is continuous, bounded within $[0, 2]$, where $Y_{vol} = 0$ indicates perfect seasonal yield parity ($Y_{m} = Y_{v}$), and $Y_{vol} = 2$ represents complete seasonal collapse (one season achieves normal harvest while the other experiences total failure).</w:t>
+      <w:pPr>
+        <w:spacing w:line="276" w:lineRule="auto" w:after="120"/>
+      </w:pPr>
+      <w:r>
+        <w:rPr>
+          <w:rFonts w:ascii="Times New Roman" w:hAnsi="Times New Roman"/>
+        </w:rPr>
+        <w:t xml:space="preserve">where </w:t>
+      </w:r>
+      <w:r>
+        <w:rPr>
+          <w:rFonts w:ascii="Times New Roman" w:hAnsi="Times New Roman"/>
+          <w:i/>
+        </w:rPr>
+        <w:t>ϵ = 10^{-4</w:t>
+      </w:r>
+      <w:r>
+        <w:rPr>
+          <w:rFonts w:ascii="Times New Roman" w:hAnsi="Times New Roman"/>
+        </w:rPr>
+        <w:t xml:space="preserve"> prevents numerical instability in rare cases where both seasonal harvests approach zero. The index is continuous, bounded within </w:t>
+      </w:r>
+      <w:r>
+        <w:rPr>
+          <w:rFonts w:ascii="Times New Roman" w:hAnsi="Times New Roman"/>
+          <w:i/>
+        </w:rPr>
+        <w:t>[0, 2]</w:t>
+      </w:r>
+      <w:r>
+        <w:rPr>
+          <w:rFonts w:ascii="Times New Roman" w:hAnsi="Times New Roman"/>
+        </w:rPr>
+        <w:t xml:space="preserve">, where </w:t>
+      </w:r>
+      <w:r>
+        <w:rPr>
+          <w:rFonts w:ascii="Times New Roman" w:hAnsi="Times New Roman"/>
+          <w:i/>
+        </w:rPr>
+        <w:t>Y_{vol = 0</w:t>
+      </w:r>
+      <w:r>
+        <w:rPr>
+          <w:rFonts w:ascii="Times New Roman" w:hAnsi="Times New Roman"/>
+        </w:rPr>
+        <w:t xml:space="preserve"> indicates perfect seasonal yield parity (</w:t>
+      </w:r>
+      <w:r>
+        <w:rPr>
+          <w:rFonts w:ascii="Times New Roman" w:hAnsi="Times New Roman"/>
+          <w:i/>
+        </w:rPr>
+        <w:t>Y_{m = Y_{v</w:t>
+      </w:r>
+      <w:r>
+        <w:rPr>
+          <w:rFonts w:ascii="Times New Roman" w:hAnsi="Times New Roman"/>
+        </w:rPr>
+        <w:t xml:space="preserve">), and </w:t>
+      </w:r>
+      <w:r>
+        <w:rPr>
+          <w:rFonts w:ascii="Times New Roman" w:hAnsi="Times New Roman"/>
+          <w:i/>
+        </w:rPr>
+        <w:t>Y_{vol = 2</w:t>
+      </w:r>
+      <w:r>
+        <w:rPr>
+          <w:rFonts w:ascii="Times New Roman" w:hAnsi="Times New Roman"/>
+        </w:rPr>
+        <w:t xml:space="preserve"> represents complete seasonal collapse (one season achieves normal harvest while the other experiences total failure).</w:t>
       </w:r>
     </w:p>
     <w:p>
@@ -261,21 +878,274 @@
       </w:r>
     </w:p>
     <w:p>
-      <w:r>
+      <w:pPr>
+        <w:spacing w:line="276" w:lineRule="auto" w:after="120"/>
+      </w:pPr>
+      <w:r>
+        <w:rPr>
+          <w:rFonts w:ascii="Times New Roman" w:hAnsi="Times New Roman"/>
+        </w:rPr>
         <w:t>Smallholder crop volatility is driven by the interaction between biophysical shocks and household buffering capacity. We engineer 137 features categorized into four functional domains:</w:t>
         <w:br/>
-        <w:t>1. **Seasonal Input Deltas**: Differential application rates between Masika and Vuli for nitrogenous/phosphatic fertilizers (kg/ha delta), organic manure (kg/ha delta), and labor investments (person-days/ha delta).</w:t>
+        <w:t xml:space="preserve">1. </w:t>
+      </w:r>
+      <w:r>
+        <w:rPr>
+          <w:rFonts w:ascii="Times New Roman" w:hAnsi="Times New Roman"/>
+          <w:b/>
+        </w:rPr>
+        <w:t>Seasonal Input Deltas</w:t>
+      </w:r>
+      <w:r>
+        <w:rPr>
+          <w:rFonts w:ascii="Times New Roman" w:hAnsi="Times New Roman"/>
+        </w:rPr>
+        <w:t>: Differential application rates between Masika and Vuli for nitrogenous/phosphatic fertilizers (kg/ha delta), organic manure (kg/ha delta), and labor investments (person-days/ha delta).</w:t>
         <w:br/>
-        <w:t>2. **Crop Portfolio Shannon Diversity**: The Shannon Equitability Index ($H' = -\sum p_k \ln p_k$) calculated across cultivated crop species in each season, along with the inter-seasonal diversity shift ($\Delta H' = H'_{m} - H'_{v}$).</w:t>
+        <w:t xml:space="preserve">2. </w:t>
+      </w:r>
+      <w:r>
+        <w:rPr>
+          <w:rFonts w:ascii="Times New Roman" w:hAnsi="Times New Roman"/>
+          <w:b/>
+        </w:rPr>
+        <w:t>Crop Portfolio Shannon Diversity</w:t>
+      </w:r>
+      <w:r>
+        <w:rPr>
+          <w:rFonts w:ascii="Times New Roman" w:hAnsi="Times New Roman"/>
+        </w:rPr>
+        <w:t>: The Shannon Equitability Index calculated across cultivated crop species in each season via Equation (2) (Shannon, 1948):</w:t>
+      </w:r>
+    </w:p>
+    <w:tbl>
+      <w:tblPr>
+        <w:tblW w:type="auto" w:w="0"/>
+        <w:tblLayout w:type="fixed"/>
+        <w:tblLook w:firstColumn="1" w:firstRow="1" w:lastColumn="0" w:lastRow="0" w:noHBand="0" w:noVBand="1" w:val="04A0"/>
+        <w:tblBorders>
+          <w:top w:val="none"/>
+          <w:left w:val="none"/>
+          <w:bottom w:val="none"/>
+          <w:right w:val="none"/>
+          <w:insideH w:val="none"/>
+          <w:insideV w:val="none"/>
+        </w:tblBorders>
+      </w:tblPr>
+      <w:tblGrid>
+        <w:gridCol w:w="8352"/>
+        <w:gridCol w:w="1008"/>
+      </w:tblGrid>
+      <w:tr>
+        <w:tc>
+          <w:tcPr>
+            <w:tcW w:type="dxa" w:w="4680"/>
+            <w:vAlign w:val="center"/>
+          </w:tcPr>
+          <w:p>
+            <w:pPr>
+              <w:spacing w:before="120" w:after="120"/>
+              <w:jc w:val="center"/>
+            </w:pPr>
+            <m:oMath>
+              <m:r>
+                <m:t>H′</m:t>
+              </m:r>
+              <m:r>
+                <m:t> = -</m:t>
+              </m:r>
+              <m:nary>
+                <m:naryPr>
+                  <m:chr m:val="∑"/>
+                  <m:limLoc m:val="undOvr"/>
+                </m:naryPr>
+                <m:sub>
+                  <m:r>
+                    <m:t>k=1</m:t>
+                  </m:r>
+                </m:sub>
+                <m:sup>
+                  <m:r>
+                    <m:t>K</m:t>
+                  </m:r>
+                </m:sup>
+                <m:e>
+                  <m:sSub>
+                    <m:e>
+                      <m:r>
+                        <m:t>p</m:t>
+                      </m:r>
+                    </m:e>
+                    <m:sub>
+                      <m:r>
+                        <m:t>k</m:t>
+                      </m:r>
+                    </m:sub>
+                  </m:sSub>
+                  <m:r>
+                    <m:t> ln </m:t>
+                  </m:r>
+                  <m:sSub>
+                    <m:e>
+                      <m:r>
+                        <m:t>p</m:t>
+                      </m:r>
+                    </m:e>
+                    <m:sub>
+                      <m:r>
+                        <m:t>k</m:t>
+                      </m:r>
+                    </m:sub>
+                  </m:sSub>
+                </m:e>
+              </m:nary>
+            </m:oMath>
+          </w:p>
+        </w:tc>
+        <w:tc>
+          <w:tcPr>
+            <w:tcW w:type="dxa" w:w="4680"/>
+            <w:vAlign w:val="center"/>
+          </w:tcPr>
+          <w:p>
+            <w:pPr>
+              <w:spacing w:before="120" w:after="120"/>
+              <w:jc w:val="right"/>
+            </w:pPr>
+            <w:r>
+              <w:rPr>
+                <w:rFonts w:ascii="Times New Roman" w:hAnsi="Times New Roman"/>
+                <w:color w:val="222222"/>
+                <w:sz w:val="22"/>
+              </w:rPr>
+              <w:t>(2)</w:t>
+            </w:r>
+          </w:p>
+        </w:tc>
+      </w:tr>
+    </w:tbl>
+    <w:p>
+      <w:pPr>
+        <w:spacing w:line="276" w:lineRule="auto" w:after="120"/>
+      </w:pPr>
+      <w:r>
+        <w:rPr>
+          <w:rFonts w:ascii="Times New Roman" w:hAnsi="Times New Roman"/>
+        </w:rPr>
+        <w:t>along with the inter-seasonal diversity shift (</w:t>
+      </w:r>
+      <w:r>
+        <w:rPr>
+          <w:rFonts w:ascii="Times New Roman" w:hAnsi="Times New Roman"/>
+          <w:i/>
+        </w:rPr>
+        <w:t>Δ H' = H'_{m - H'_{v</w:t>
+      </w:r>
+      <w:r>
+        <w:rPr>
+          <w:rFonts w:ascii="Times New Roman" w:hAnsi="Times New Roman"/>
+        </w:rPr>
+        <w:t xml:space="preserve">). Here, </w:t>
+      </w:r>
+      <w:r>
+        <w:rPr>
+          <w:rFonts w:ascii="Times New Roman" w:hAnsi="Times New Roman"/>
+          <w:i/>
+        </w:rPr>
+        <w:t>p</w:t>
+      </w:r>
+      <w:r>
+        <w:rPr>
+          <w:rFonts w:ascii="Times New Roman" w:hAnsi="Times New Roman"/>
+          <w:vertAlign w:val="subscript"/>
+        </w:rPr>
+        <w:t>k</w:t>
+      </w:r>
+      <w:r>
+        <w:rPr>
+          <w:rFonts w:ascii="Times New Roman" w:hAnsi="Times New Roman"/>
+        </w:rPr>
+        <w:t xml:space="preserve"> represents the proportional area allocated to crop species </w:t>
+      </w:r>
+      <w:r>
+        <w:rPr>
+          <w:rFonts w:ascii="Times New Roman" w:hAnsi="Times New Roman"/>
+          <w:i/>
+        </w:rPr>
+        <w:t>k</w:t>
+      </w:r>
+      <w:r>
+        <w:rPr>
+          <w:rFonts w:ascii="Times New Roman" w:hAnsi="Times New Roman"/>
+        </w:rPr>
+        <w:t xml:space="preserve"> on holding </w:t>
+      </w:r>
+      <w:r>
+        <w:rPr>
+          <w:rFonts w:ascii="Times New Roman" w:hAnsi="Times New Roman"/>
+          <w:i/>
+        </w:rPr>
+        <w:t>i</w:t>
+      </w:r>
+      <w:r>
+        <w:rPr>
+          <w:rFonts w:ascii="Times New Roman" w:hAnsi="Times New Roman"/>
+        </w:rPr>
+        <w:t xml:space="preserve">, and </w:t>
+      </w:r>
+      <w:r>
+        <w:rPr>
+          <w:rFonts w:ascii="Times New Roman" w:hAnsi="Times New Roman"/>
+          <w:i/>
+        </w:rPr>
+        <w:t>K</w:t>
+      </w:r>
+      <w:r>
+        <w:rPr>
+          <w:rFonts w:ascii="Times New Roman" w:hAnsi="Times New Roman"/>
+        </w:rPr>
+        <w:t xml:space="preserve"> is the total count of cultivated crop varieties. Crop diversification provides biophysical insurance by staggering phenological water demands and hedging against pest pressure (Beillouin et al., 2019; Renard &amp; Tilman, 2019; Waha et al., 2013).</w:t>
         <w:br/>
-        <w:t>3. **Household Endowments &amp; Buffers**: Total Tropical Livestock Units (TLU, standardized conversion of cattle, goats, sheep, and poultry), cultivated plot fragmentation metrics (plot area coefficient of variation), and demographic dependency ratios.</w:t>
+        <w:t xml:space="preserve">3. </w:t>
+      </w:r>
+      <w:r>
+        <w:rPr>
+          <w:rFonts w:ascii="Times New Roman" w:hAnsi="Times New Roman"/>
+          <w:b/>
+        </w:rPr>
+        <w:t>Household Endowments &amp; Buffers</w:t>
+      </w:r>
+      <w:r>
+        <w:rPr>
+          <w:rFonts w:ascii="Times New Roman" w:hAnsi="Times New Roman"/>
+        </w:rPr>
+        <w:t>: Total Tropical Livestock Units (TLU, standardized conversion of cattle, goats, sheep, and poultry), cultivated plot fragmentation metrics (plot area coefficient of variation), and demographic dependency ratios (Carter &amp; Barrett, 2006; Dercon &amp; Christiaensen, 2011).</w:t>
         <w:br/>
-        <w:t>4. **Spatial Agro-Climatic Context**: Regional target-encoded historical yield stability, spatial distance embeddings from unsupervised K-Means agronomic archetypes, and elevation-derived environmental proxies.</w:t>
+        <w:t xml:space="preserve">4. </w:t>
+      </w:r>
+      <w:r>
+        <w:rPr>
+          <w:rFonts w:ascii="Times New Roman" w:hAnsi="Times New Roman"/>
+          <w:b/>
+        </w:rPr>
+        <w:t>Spatial Agro-Climatic Context</w:t>
+      </w:r>
+      <w:r>
+        <w:rPr>
+          <w:rFonts w:ascii="Times New Roman" w:hAnsi="Times New Roman"/>
+        </w:rPr>
+        <w:t>: Regional target-encoded historical yield stability, spatial distance embeddings from unsupervised K-Means agronomic archetypes, and elevation-derived environmental proxies.</w:t>
       </w:r>
     </w:p>
     <w:p>
-      <w:r>
-        <w:t>To eliminate multi-collinearity and noise, a two-stage feature selection pipeline (Boruta shadow feature comparison followed by LightGBM gain scree analysis) filtered the feature space down to the top 25 high-leverage predictive features.</w:t>
+      <w:pPr>
+        <w:spacing w:line="276" w:lineRule="auto" w:after="120"/>
+      </w:pPr>
+      <w:r>
+        <w:rPr>
+          <w:rFonts w:ascii="Times New Roman" w:hAnsi="Times New Roman"/>
+        </w:rPr>
+        <w:t>To eliminate multi-collinearity and noise, a two-stage feature selection pipeline (Boruta shadow feature comparison followed by LightGBM gain scree analysis; Kursa &amp; Rudnicki, 2010) filtered the feature space down to the top 25 high-leverage predictive features.</w:t>
       </w:r>
     </w:p>
     <w:p>
@@ -293,18 +1163,115 @@
       </w:r>
     </w:p>
     <w:p>
-      <w:r>
-        <w:t>To guarantee complete spatial isolation and ensure models generalize to unmonitored districts, we enforce a strict 5-pillar spatial isolation protocol:</w:t>
+      <w:pPr>
+        <w:spacing w:line="276" w:lineRule="auto" w:after="120"/>
+      </w:pPr>
+      <w:r>
+        <w:rPr>
+          <w:rFonts w:ascii="Times New Roman" w:hAnsi="Times New Roman"/>
+        </w:rPr>
+        <w:t>To guarantee complete spatial isolation and ensure models generalize to unmonitored districts, we enforce a strict 5-pillar spatial isolation protocol (Roberts et al., 2017; Valavi et al., 2019):</w:t>
         <w:br/>
-        <w:t>- **Pillar 1 (Spatial Partitioning)**: GroupKFold cross-validation partitioned strictly by administrative region ($K = 5$), ensuring no geographic ward or district appears in both training and validation folds.</w:t>
+        <w:t xml:space="preserve">- </w:t>
+      </w:r>
+      <w:r>
+        <w:rPr>
+          <w:rFonts w:ascii="Times New Roman" w:hAnsi="Times New Roman"/>
+          <w:b/>
+        </w:rPr>
+        <w:t>Pillar 1 (Spatial Partitioning)</w:t>
+      </w:r>
+      <w:r>
+        <w:rPr>
+          <w:rFonts w:ascii="Times New Roman" w:hAnsi="Times New Roman"/>
+        </w:rPr>
+        <w:t>: GroupKFold cross-validation partitioned strictly by administrative region (</w:t>
+      </w:r>
+      <w:r>
+        <w:rPr>
+          <w:rFonts w:ascii="Times New Roman" w:hAnsi="Times New Roman"/>
+          <w:i/>
+        </w:rPr>
+        <w:t>K = 5</w:t>
+      </w:r>
+      <w:r>
+        <w:rPr>
+          <w:rFonts w:ascii="Times New Roman" w:hAnsi="Times New Roman"/>
+        </w:rPr>
+        <w:t>), ensuring no geographic ward or district appears in both training and validation folds.</w:t>
         <w:br/>
-        <w:t>- **Pillar 2 (Preprocessor Isolation)**: Imputation medians, StandardScaler transformations, and PCA projection bases are fitted exclusively on training fold data and applied downstream to out-of-fold validation data.</w:t>
+        <w:t xml:space="preserve">- </w:t>
+      </w:r>
+      <w:r>
+        <w:rPr>
+          <w:rFonts w:ascii="Times New Roman" w:hAnsi="Times New Roman"/>
+          <w:b/>
+        </w:rPr>
+        <w:t>Pillar 2 (Preprocessor Isolation)</w:t>
+      </w:r>
+      <w:r>
+        <w:rPr>
+          <w:rFonts w:ascii="Times New Roman" w:hAnsi="Times New Roman"/>
+        </w:rPr>
+        <w:t>: Imputation medians, StandardScaler transformations, and PCA projection bases are fitted exclusively on training fold data and applied downstream to out-of-fold validation data.</w:t>
         <w:br/>
-        <w:t>- **Pillar 3 (Out-of-Fold Target Encoding)**: Regional target encoding is computed strictly out-of-fold using regularized Bayesian shrinkage to prevent target leakage.</w:t>
+        <w:t xml:space="preserve">- </w:t>
+      </w:r>
+      <w:r>
+        <w:rPr>
+          <w:rFonts w:ascii="Times New Roman" w:hAnsi="Times New Roman"/>
+          <w:b/>
+        </w:rPr>
+        <w:t>Pillar 3 (Out-of-Fold Target Encoding)</w:t>
+      </w:r>
+      <w:r>
+        <w:rPr>
+          <w:rFonts w:ascii="Times New Roman" w:hAnsi="Times New Roman"/>
+        </w:rPr>
+        <w:t>: Regional target encoding is computed strictly out-of-fold using regularized Bayesian shrinkage to prevent target leakage.</w:t>
         <w:br/>
-        <w:t>- **Pillar 4 (Feature Selection Independence)**: Feature importance ranking is re-evaluated across training splits to verify stability against spatial data leakage.</w:t>
+        <w:t xml:space="preserve">- </w:t>
+      </w:r>
+      <w:r>
+        <w:rPr>
+          <w:rFonts w:ascii="Times New Roman" w:hAnsi="Times New Roman"/>
+          <w:b/>
+        </w:rPr>
+        <w:t>Pillar 4 (Feature Selection Independence)</w:t>
+      </w:r>
+      <w:r>
+        <w:rPr>
+          <w:rFonts w:ascii="Times New Roman" w:hAnsi="Times New Roman"/>
+        </w:rPr>
+        <w:t>: Feature importance ranking is re-evaluated across training splits to verify stability against spatial data leakage.</w:t>
         <w:br/>
-        <w:t>- **Pillar 5 (Adversarial Spatial Validation)**: An adversarial classifier trained to distinguish between training and validation folds achieved an ROC-AUC of $0.512 \pm 0.024$ (indistinguishable from random guessing), proving zero residual spatial data leakage.</w:t>
+        <w:t xml:space="preserve">- </w:t>
+      </w:r>
+      <w:r>
+        <w:rPr>
+          <w:rFonts w:ascii="Times New Roman" w:hAnsi="Times New Roman"/>
+          <w:b/>
+        </w:rPr>
+        <w:t>Pillar 5 (Adversarial Spatial Validation)</w:t>
+      </w:r>
+      <w:r>
+        <w:rPr>
+          <w:rFonts w:ascii="Times New Roman" w:hAnsi="Times New Roman"/>
+        </w:rPr>
+        <w:t xml:space="preserve">: An adversarial classifier trained to distinguish between training and validation folds achieved an ROC-AUC of </w:t>
+      </w:r>
+      <w:r>
+        <w:rPr>
+          <w:rFonts w:ascii="Times New Roman" w:hAnsi="Times New Roman"/>
+          <w:i/>
+        </w:rPr>
+        <w:t>0.512 ± 0.024</w:t>
+      </w:r>
+      <w:r>
+        <w:rPr>
+          <w:rFonts w:ascii="Times New Roman" w:hAnsi="Times New Roman"/>
+        </w:rPr>
+        <w:t xml:space="preserve"> (indistinguishable from random guessing), proving zero residual spatial data leakage.</w:t>
       </w:r>
     </w:p>
     <w:p>
@@ -322,30 +1289,523 @@
       </w:r>
     </w:p>
     <w:p>
-      <w:r>
+      <w:pPr>
+        <w:spacing w:line="276" w:lineRule="auto" w:after="120"/>
+      </w:pPr>
+      <w:r>
+        <w:rPr>
+          <w:rFonts w:ascii="Times New Roman" w:hAnsi="Times New Roman"/>
+        </w:rPr>
         <w:t>We benchmark four competitive machine learning model families:</w:t>
         <w:br/>
-        <w:t>1. **LightGBM**: Fast, histogram-based gradient boosted decision trees utilizing leaf-wise tree growth.</w:t>
+        <w:t xml:space="preserve">1. </w:t>
+      </w:r>
+      <w:r>
+        <w:rPr>
+          <w:rFonts w:ascii="Times New Roman" w:hAnsi="Times New Roman"/>
+          <w:b/>
+        </w:rPr>
+        <w:t>LightGBM</w:t>
+      </w:r>
+      <w:r>
+        <w:rPr>
+          <w:rFonts w:ascii="Times New Roman" w:hAnsi="Times New Roman"/>
+        </w:rPr>
+        <w:t>: Fast, histogram-based gradient boosted decision trees utilizing leaf-wise tree growth (Ke et al., 2017).</w:t>
         <w:br/>
-        <w:t>2. **XGBoost**: Extreme Gradient Boosting with exact greedy split-finding and column subsampling.</w:t>
+        <w:t xml:space="preserve">2. </w:t>
+      </w:r>
+      <w:r>
+        <w:rPr>
+          <w:rFonts w:ascii="Times New Roman" w:hAnsi="Times New Roman"/>
+          <w:b/>
+        </w:rPr>
+        <w:t>XGBoost</w:t>
+      </w:r>
+      <w:r>
+        <w:rPr>
+          <w:rFonts w:ascii="Times New Roman" w:hAnsi="Times New Roman"/>
+        </w:rPr>
+        <w:t>: Extreme Gradient Boosting with exact greedy split-finding and column subsampling (Chen &amp; Guestrin, 2016).</w:t>
         <w:br/>
-        <w:t>3. **Random Forest**: Classical bagging ensemble of decorrelated deep decision trees.</w:t>
+        <w:t xml:space="preserve">3. </w:t>
+      </w:r>
+      <w:r>
+        <w:rPr>
+          <w:rFonts w:ascii="Times New Roman" w:hAnsi="Times New Roman"/>
+          <w:b/>
+        </w:rPr>
+        <w:t>Random Forest</w:t>
+      </w:r>
+      <w:r>
+        <w:rPr>
+          <w:rFonts w:ascii="Times New Roman" w:hAnsi="Times New Roman"/>
+        </w:rPr>
+        <w:t>: Classical bagging ensemble of decorrelated deep decision trees (Breiman, 2001).</w:t>
         <w:br/>
-        <w:t>4. **CatBoost**: Gradient boosting with ordered boosting and symmetric oblivious decision trees.</w:t>
+        <w:t xml:space="preserve">4. </w:t>
+      </w:r>
+      <w:r>
+        <w:rPr>
+          <w:rFonts w:ascii="Times New Roman" w:hAnsi="Times New Roman"/>
+          <w:b/>
+        </w:rPr>
+        <w:t>CatBoost</w:t>
+      </w:r>
+      <w:r>
+        <w:rPr>
+          <w:rFonts w:ascii="Times New Roman" w:hAnsi="Times New Roman"/>
+        </w:rPr>
+        <w:t>: Gradient boosting with ordered boosting and symmetric oblivious decision trees (Prokhorenkova et al., 2018).</w:t>
         <w:br/>
-        <w:t>5. **Weighted Ensemble**: An out-of-fold regularized ensemble combining model predictions via bounded non-negative least squares:</w:t>
+        <w:t xml:space="preserve">5. </w:t>
+      </w:r>
+      <w:r>
+        <w:rPr>
+          <w:rFonts w:ascii="Times New Roman" w:hAnsi="Times New Roman"/>
+          <w:b/>
+        </w:rPr>
+        <w:t>Weighted Ensemble</w:t>
+      </w:r>
+      <w:r>
+        <w:rPr>
+          <w:rFonts w:ascii="Times New Roman" w:hAnsi="Times New Roman"/>
+        </w:rPr>
+        <w:t>: An out-of-fold regularized ensemble combining model predictions via bounded non-negative least squares, formulated in Equation (3):</w:t>
       </w:r>
     </w:p>
+    <w:tbl>
+      <w:tblPr>
+        <w:tblW w:type="auto" w:w="0"/>
+        <w:tblLayout w:type="fixed"/>
+        <w:tblLook w:firstColumn="1" w:firstRow="1" w:lastColumn="0" w:lastRow="0" w:noHBand="0" w:noVBand="1" w:val="04A0"/>
+        <w:tblBorders>
+          <w:top w:val="none"/>
+          <w:left w:val="none"/>
+          <w:bottom w:val="none"/>
+          <w:right w:val="none"/>
+          <w:insideH w:val="none"/>
+          <w:insideV w:val="none"/>
+        </w:tblBorders>
+      </w:tblPr>
+      <w:tblGrid>
+        <w:gridCol w:w="8352"/>
+        <w:gridCol w:w="1008"/>
+      </w:tblGrid>
+      <w:tr>
+        <w:tc>
+          <w:tcPr>
+            <w:tcW w:type="dxa" w:w="4680"/>
+            <w:vAlign w:val="center"/>
+          </w:tcPr>
+          <w:p>
+            <w:pPr>
+              <w:spacing w:before="120" w:after="120"/>
+              <w:jc w:val="center"/>
+            </w:pPr>
+            <m:oMath>
+              <m:sSubSup>
+                <m:e>
+                  <m:acc>
+                    <m:accPr>
+                      <m:chr m:val="̂"/>
+                    </m:accPr>
+                    <m:e>
+                      <m:r>
+                        <m:t>Y</m:t>
+                      </m:r>
+                    </m:e>
+                  </m:acc>
+                </m:e>
+                <m:sub>
+                  <m:r>
+                    <m:t>vol,i</m:t>
+                  </m:r>
+                </m:sub>
+                <m:sup>
+                  <m:r>
+                    <m:t>Ens</m:t>
+                  </m:r>
+                </m:sup>
+              </m:sSubSup>
+              <m:r>
+                <m:t> = </m:t>
+              </m:r>
+              <m:nary>
+                <m:naryPr>
+                  <m:chr m:val="∑"/>
+                  <m:limLoc m:val="undOvr"/>
+                </m:naryPr>
+                <m:sub>
+                  <m:r>
+                    <m:t>m=1</m:t>
+                  </m:r>
+                </m:sub>
+                <m:sup>
+                  <m:r>
+                    <m:t>M</m:t>
+                  </m:r>
+                </m:sup>
+                <m:e>
+                  <m:sSub>
+                    <m:e>
+                      <m:r>
+                        <m:t>w</m:t>
+                      </m:r>
+                    </m:e>
+                    <m:sub>
+                      <m:r>
+                        <m:t>m</m:t>
+                      </m:r>
+                    </m:sub>
+                  </m:sSub>
+                  <m:sSubSup>
+                    <m:e>
+                      <m:acc>
+                        <m:accPr>
+                          <m:chr m:val="̂"/>
+                        </m:accPr>
+                        <m:e>
+                          <m:r>
+                            <m:t>Y</m:t>
+                          </m:r>
+                        </m:e>
+                      </m:acc>
+                    </m:e>
+                    <m:sub>
+                      <m:r>
+                        <m:t>vol,i</m:t>
+                      </m:r>
+                    </m:sub>
+                    <m:sup>
+                      <m:r>
+                        <m:t>(m)</m:t>
+                      </m:r>
+                    </m:sup>
+                  </m:sSubSup>
+                </m:e>
+              </m:nary>
+              <m:r>
+                <m:t>,  subject to  </m:t>
+              </m:r>
+              <m:nary>
+                <m:naryPr>
+                  <m:chr m:val="∑"/>
+                  <m:limLoc m:val="undOvr"/>
+                </m:naryPr>
+                <m:sub>
+                  <m:r>
+                    <m:t>m=1</m:t>
+                  </m:r>
+                </m:sub>
+                <m:sup>
+                  <m:r>
+                    <m:t>M</m:t>
+                  </m:r>
+                </m:sup>
+                <m:e>
+                  <m:sSub>
+                    <m:e>
+                      <m:r>
+                        <m:t>w</m:t>
+                      </m:r>
+                    </m:e>
+                    <m:sub>
+                      <m:r>
+                        <m:t>m</m:t>
+                      </m:r>
+                    </m:sub>
+                  </m:sSub>
+                </m:e>
+              </m:nary>
+              <m:r>
+                <m:t> = 1,  </m:t>
+              </m:r>
+              <m:sSub>
+                <m:e>
+                  <m:r>
+                    <m:t>w</m:t>
+                  </m:r>
+                </m:e>
+                <m:sub>
+                  <m:r>
+                    <m:t>m</m:t>
+                  </m:r>
+                </m:sub>
+              </m:sSub>
+              <m:r>
+                <m:t> ≥ 0</m:t>
+              </m:r>
+            </m:oMath>
+          </w:p>
+        </w:tc>
+        <w:tc>
+          <w:tcPr>
+            <w:tcW w:type="dxa" w:w="4680"/>
+            <w:vAlign w:val="center"/>
+          </w:tcPr>
+          <w:p>
+            <w:pPr>
+              <w:spacing w:before="120" w:after="120"/>
+              <w:jc w:val="right"/>
+            </w:pPr>
+            <w:r>
+              <w:rPr>
+                <w:rFonts w:ascii="Times New Roman" w:hAnsi="Times New Roman"/>
+                <w:color w:val="222222"/>
+                <w:sz w:val="22"/>
+              </w:rPr>
+              <w:t>(3)</w:t>
+            </w:r>
+          </w:p>
+        </w:tc>
+      </w:tr>
+    </w:tbl>
     <w:p>
-      <w:r>
-        <w:t>$$\hat{Y}_{vol,i}^{Ens} = \sum_{m=1}^{M} w_m \hat{Y}_{vol,i}^{(m)}, \quad \text{s.t.} \sum w_m = 1, \; w_m \ge 0$$</w:t>
+      <w:pPr>
+        <w:spacing w:line="276" w:lineRule="auto" w:after="120"/>
+      </w:pPr>
+      <w:r>
+        <w:rPr>
+          <w:rFonts w:ascii="Times New Roman" w:hAnsi="Times New Roman"/>
+        </w:rPr>
+        <w:t>All models were evaluated under identical 5-fold spatial cross-validation regimes using Root Mean Squared Error (RMSE), Mean Absolute Error (MAE), and the Spatial Coefficient of Determination (</w:t>
+      </w:r>
+      <w:r>
+        <w:rPr>
+          <w:rFonts w:ascii="Times New Roman" w:hAnsi="Times New Roman"/>
+          <w:i/>
+        </w:rPr>
+        <w:t>R</w:t>
+      </w:r>
+      <w:r>
+        <w:rPr>
+          <w:rFonts w:ascii="Times New Roman" w:hAnsi="Times New Roman"/>
+          <w:vertAlign w:val="superscript"/>
+        </w:rPr>
+        <w:t>2</w:t>
+      </w:r>
+      <w:r>
+        <w:rPr>
+          <w:rFonts w:ascii="Times New Roman" w:hAnsi="Times New Roman"/>
+        </w:rPr>
+        <w:t>) formulated in Equation (4):</w:t>
       </w:r>
     </w:p>
-    <w:p>
-      <w:r>
-        <w:t>All models were evaluated under identical 5-fold spatial cross-validation regimes using Root Mean Squared Error (RMSE), Mean Absolute Error (MAE), and Coefficient of Determination ($R^2$).</w:t>
-      </w:r>
-    </w:p>
+    <w:tbl>
+      <w:tblPr>
+        <w:tblW w:type="auto" w:w="0"/>
+        <w:tblLayout w:type="fixed"/>
+        <w:tblLook w:firstColumn="1" w:firstRow="1" w:lastColumn="0" w:lastRow="0" w:noHBand="0" w:noVBand="1" w:val="04A0"/>
+        <w:tblBorders>
+          <w:top w:val="none"/>
+          <w:left w:val="none"/>
+          <w:bottom w:val="none"/>
+          <w:right w:val="none"/>
+          <w:insideH w:val="none"/>
+          <w:insideV w:val="none"/>
+        </w:tblBorders>
+      </w:tblPr>
+      <w:tblGrid>
+        <w:gridCol w:w="8352"/>
+        <w:gridCol w:w="1008"/>
+      </w:tblGrid>
+      <w:tr>
+        <w:tc>
+          <w:tcPr>
+            <w:tcW w:type="dxa" w:w="4680"/>
+            <w:vAlign w:val="center"/>
+          </w:tcPr>
+          <w:p>
+            <w:pPr>
+              <w:spacing w:before="120" w:after="120"/>
+              <w:jc w:val="center"/>
+            </w:pPr>
+            <m:oMath>
+              <m:sSup>
+                <m:e>
+                  <m:r>
+                    <m:t>R</m:t>
+                  </m:r>
+                </m:e>
+                <m:sup>
+                  <m:r>
+                    <m:t>2</m:t>
+                  </m:r>
+                </m:sup>
+              </m:sSup>
+              <m:r>
+                <m:t> = 1 - </m:t>
+              </m:r>
+              <m:f>
+                <m:num>
+                  <m:nary>
+                    <m:naryPr>
+                      <m:chr m:val="∑"/>
+                      <m:limLoc m:val="undOvr"/>
+                    </m:naryPr>
+                    <m:sub>
+                      <m:r>
+                        <m:t>i=1</m:t>
+                      </m:r>
+                    </m:sub>
+                    <m:sup>
+                      <m:r>
+                        <m:t>N</m:t>
+                      </m:r>
+                    </m:sup>
+                    <m:e>
+                      <m:sSup>
+                        <m:e>
+                          <m:d>
+                            <m:dPr>
+                              <m:begChr m:val="("/>
+                              <m:endChr m:val=")"/>
+                            </m:dPr>
+                            <m:e>
+                              <m:sSub>
+                                <m:e>
+                                  <m:r>
+                                    <m:t>Y</m:t>
+                                  </m:r>
+                                </m:e>
+                                <m:sub>
+                                  <m:r>
+                                    <m:t>vol,i</m:t>
+                                  </m:r>
+                                </m:sub>
+                              </m:sSub>
+                              <m:r>
+                                <m:t> - </m:t>
+                              </m:r>
+                              <m:sSub>
+                                <m:e>
+                                  <m:acc>
+                                    <m:accPr>
+                                      <m:chr m:val="̂"/>
+                                    </m:accPr>
+                                    <m:e>
+                                      <m:r>
+                                        <m:t>Y</m:t>
+                                      </m:r>
+                                    </m:e>
+                                  </m:acc>
+                                </m:e>
+                                <m:sub>
+                                  <m:r>
+                                    <m:t>vol,i</m:t>
+                                  </m:r>
+                                </m:sub>
+                              </m:sSub>
+                            </m:e>
+                          </m:d>
+                        </m:e>
+                        <m:sup>
+                          <m:r>
+                            <m:t>2</m:t>
+                          </m:r>
+                        </m:sup>
+                      </m:sSup>
+                    </m:e>
+                  </m:nary>
+                </m:num>
+                <m:den>
+                  <m:nary>
+                    <m:naryPr>
+                      <m:chr m:val="∑"/>
+                      <m:limLoc m:val="undOvr"/>
+                    </m:naryPr>
+                    <m:sub>
+                      <m:r>
+                        <m:t>i=1</m:t>
+                      </m:r>
+                    </m:sub>
+                    <m:sup>
+                      <m:r>
+                        <m:t>N</m:t>
+                      </m:r>
+                    </m:sup>
+                    <m:e>
+                      <m:sSup>
+                        <m:e>
+                          <m:d>
+                            <m:dPr>
+                              <m:begChr m:val="("/>
+                              <m:endChr m:val=")"/>
+                            </m:dPr>
+                            <m:e>
+                              <m:sSub>
+                                <m:e>
+                                  <m:r>
+                                    <m:t>Y</m:t>
+                                  </m:r>
+                                </m:e>
+                                <m:sub>
+                                  <m:r>
+                                    <m:t>vol,i</m:t>
+                                  </m:r>
+                                </m:sub>
+                              </m:sSub>
+                              <m:r>
+                                <m:t> - </m:t>
+                              </m:r>
+                              <m:sSub>
+                                <m:e>
+                                  <m:acc>
+                                    <m:accPr>
+                                      <m:chr m:val="̄"/>
+                                    </m:accPr>
+                                    <m:e>
+                                      <m:r>
+                                        <m:t>Y</m:t>
+                                      </m:r>
+                                    </m:e>
+                                  </m:acc>
+                                </m:e>
+                                <m:sub>
+                                  <m:r>
+                                    <m:t>vol</m:t>
+                                  </m:r>
+                                </m:sub>
+                              </m:sSub>
+                            </m:e>
+                          </m:d>
+                        </m:e>
+                        <m:sup>
+                          <m:r>
+                            <m:t>2</m:t>
+                          </m:r>
+                        </m:sup>
+                      </m:sSup>
+                    </m:e>
+                  </m:nary>
+                </m:den>
+              </m:f>
+            </m:oMath>
+          </w:p>
+        </w:tc>
+        <w:tc>
+          <w:tcPr>
+            <w:tcW w:type="dxa" w:w="4680"/>
+            <w:vAlign w:val="center"/>
+          </w:tcPr>
+          <w:p>
+            <w:pPr>
+              <w:spacing w:before="120" w:after="120"/>
+              <w:jc w:val="right"/>
+            </w:pPr>
+            <w:r>
+              <w:rPr>
+                <w:rFonts w:ascii="Times New Roman" w:hAnsi="Times New Roman"/>
+                <w:color w:val="222222"/>
+                <w:sz w:val="22"/>
+              </w:rPr>
+              <w:t>(4)</w:t>
+            </w:r>
+          </w:p>
+        </w:tc>
+      </w:tr>
+    </w:tbl>
     <w:p>
       <w:pPr>
         <w:spacing w:before="280" w:after="80"/>
@@ -375,8 +1835,92 @@
       </w:r>
     </w:p>
     <w:p>
-      <w:r>
-        <w:t>The empirical distribution of the Yield Volatility Index across Tanzanian smallholders exhibits significant dispersion (Figure 1, Table 1). The mean volatility index across the 4,564 bi-modal smallholders is 1.096 +/- 0.612, with a median of 1.154. Notably, 38.4% of surveyed holdings fall into the 'hyper-volatile' category (Y_vol &gt;= 1.50), indicating severe inter-seasonal harvest crashes.</w:t>
+      <w:pPr>
+        <w:spacing w:line="276" w:lineRule="auto" w:after="120"/>
+      </w:pPr>
+      <w:r>
+        <w:rPr>
+          <w:rFonts w:ascii="Times New Roman" w:hAnsi="Times New Roman"/>
+        </w:rPr>
+        <w:t xml:space="preserve">The empirical distribution of the Yield Volatility Index across Tanzanian smallholders exhibits significant dispersion (Figure 1, Table 1). The mean volatility index across the 4,564 bi-modal smallholders is </w:t>
+      </w:r>
+      <w:r>
+        <w:rPr>
+          <w:rFonts w:ascii="Times New Roman" w:hAnsi="Times New Roman"/>
+          <w:i/>
+        </w:rPr>
+        <w:t>1.096 ± 0.612</w:t>
+      </w:r>
+      <w:r>
+        <w:rPr>
+          <w:rFonts w:ascii="Times New Roman" w:hAnsi="Times New Roman"/>
+        </w:rPr>
+        <w:t xml:space="preserve">, with a median of </w:t>
+      </w:r>
+      <w:r>
+        <w:rPr>
+          <w:rFonts w:ascii="Times New Roman" w:hAnsi="Times New Roman"/>
+          <w:i/>
+        </w:rPr>
+        <w:t>1.154</w:t>
+      </w:r>
+      <w:r>
+        <w:rPr>
+          <w:rFonts w:ascii="Times New Roman" w:hAnsi="Times New Roman"/>
+        </w:rPr>
+        <w:t>. Notably, 38.4% of surveyed holdings fall into the 'hyper-volatile' category (</w:t>
+      </w:r>
+      <w:r>
+        <w:rPr>
+          <w:rFonts w:ascii="Times New Roman" w:hAnsi="Times New Roman"/>
+          <w:i/>
+        </w:rPr>
+        <w:t>Y_{vol ≥ 1.50</w:t>
+      </w:r>
+      <w:r>
+        <w:rPr>
+          <w:rFonts w:ascii="Times New Roman" w:hAnsi="Times New Roman"/>
+        </w:rPr>
+        <w:t xml:space="preserve">), indicating severe inter-seasonal harvest crashes. Log-yield comparisons between Masika and Vuli seasons confirm that Masika yields are systematically higher and more stable (mean </w:t>
+      </w:r>
+      <w:r>
+        <w:rPr>
+          <w:rFonts w:ascii="Times New Roman" w:hAnsi="Times New Roman"/>
+          <w:i/>
+        </w:rPr>
+        <w:t>1,248</w:t>
+      </w:r>
+      <w:r>
+        <w:rPr>
+          <w:rFonts w:ascii="Times New Roman" w:hAnsi="Times New Roman"/>
+        </w:rPr>
+        <w:t xml:space="preserve"> kg/ha vs. </w:t>
+      </w:r>
+      <w:r>
+        <w:rPr>
+          <w:rFonts w:ascii="Times New Roman" w:hAnsi="Times New Roman"/>
+          <w:i/>
+        </w:rPr>
+        <w:t>612</w:t>
+      </w:r>
+      <w:r>
+        <w:rPr>
+          <w:rFonts w:ascii="Times New Roman" w:hAnsi="Times New Roman"/>
+        </w:rPr>
+        <w:t xml:space="preserve"> kg/ha in Vuli), reflecting the greater reliability of the long rains. However, the correlation between Masika and Vuli yields within individual households is modest (</w:t>
+      </w:r>
+      <w:r>
+        <w:rPr>
+          <w:rFonts w:ascii="Times New Roman" w:hAnsi="Times New Roman"/>
+          <w:i/>
+        </w:rPr>
+        <w:t>r = 0.284</w:t>
+      </w:r>
+      <w:r>
+        <w:rPr>
+          <w:rFonts w:ascii="Times New Roman" w:hAnsi="Times New Roman"/>
+        </w:rPr>
+        <w:t>).</w:t>
       </w:r>
     </w:p>
     <w:p>
@@ -3419,8 +4963,138 @@
       </w:r>
     </w:p>
     <w:p>
-      <w:r>
-        <w:t>Evaluating model architectures under spatial cross-validation reveals substantial performance differentiation (Table 2, Figure 2). Under strict regional spatial GroupKFold, the Weighted Ensemble achieved the highest predictive accuracy (R^2 = 0.584 +/- 0.042, RMSE = 0.231 +/- 0.015). Pooled models that do not isolate spatial regions show an artificial +0.157 R^2 inflation.</w:t>
+      <w:pPr>
+        <w:spacing w:line="276" w:lineRule="auto" w:after="120"/>
+      </w:pPr>
+      <w:r>
+        <w:rPr>
+          <w:rFonts w:ascii="Times New Roman" w:hAnsi="Times New Roman"/>
+        </w:rPr>
+        <w:t>Evaluating model architectures under spatial cross-validation reveals substantial performance differentiation (Table 2, Figure 2). Under strict regional spatial GroupKFold, the Weighted Ensemble achieved the highest predictive accuracy (</w:t>
+      </w:r>
+      <w:r>
+        <w:rPr>
+          <w:rFonts w:ascii="Times New Roman" w:hAnsi="Times New Roman"/>
+          <w:i/>
+        </w:rPr>
+        <w:t>R^2 = 0.584 ± 0.042</w:t>
+      </w:r>
+      <w:r>
+        <w:rPr>
+          <w:rFonts w:ascii="Times New Roman" w:hAnsi="Times New Roman"/>
+        </w:rPr>
+        <w:t xml:space="preserve">, </w:t>
+      </w:r>
+      <w:r>
+        <w:rPr>
+          <w:rFonts w:ascii="Times New Roman" w:hAnsi="Times New Roman"/>
+          <w:i/>
+        </w:rPr>
+        <w:t>RMSE = 0.231 ± 0.015</w:t>
+      </w:r>
+      <w:r>
+        <w:rPr>
+          <w:rFonts w:ascii="Times New Roman" w:hAnsi="Times New Roman"/>
+        </w:rPr>
+        <w:t xml:space="preserve">, </w:t>
+      </w:r>
+      <w:r>
+        <w:rPr>
+          <w:rFonts w:ascii="Times New Roman" w:hAnsi="Times New Roman"/>
+          <w:i/>
+        </w:rPr>
+        <w:t>MAE = 0.178 ± 0.011</w:t>
+      </w:r>
+      <w:r>
+        <w:rPr>
+          <w:rFonts w:ascii="Times New Roman" w:hAnsi="Times New Roman"/>
+        </w:rPr>
+        <w:t>). Among standalone models, LightGBM demonstrated superior single-model performance (</w:t>
+      </w:r>
+      <w:r>
+        <w:rPr>
+          <w:rFonts w:ascii="Times New Roman" w:hAnsi="Times New Roman"/>
+          <w:i/>
+        </w:rPr>
+        <w:t>R^2 = 0.569 ± 0.045</w:t>
+      </w:r>
+      <w:r>
+        <w:rPr>
+          <w:rFonts w:ascii="Times New Roman" w:hAnsi="Times New Roman"/>
+        </w:rPr>
+        <w:t>), followed closely by XGBoost (</w:t>
+      </w:r>
+      <w:r>
+        <w:rPr>
+          <w:rFonts w:ascii="Times New Roman" w:hAnsi="Times New Roman"/>
+          <w:i/>
+        </w:rPr>
+        <w:t>R^2 = 0.558 ± 0.048</w:t>
+      </w:r>
+      <w:r>
+        <w:rPr>
+          <w:rFonts w:ascii="Times New Roman" w:hAnsi="Times New Roman"/>
+        </w:rPr>
+        <w:t>) and CatBoost (</w:t>
+      </w:r>
+      <w:r>
+        <w:rPr>
+          <w:rFonts w:ascii="Times New Roman" w:hAnsi="Times New Roman"/>
+          <w:i/>
+        </w:rPr>
+        <w:t>R^2 = 0.547 ± 0.051</w:t>
+      </w:r>
+      <w:r>
+        <w:rPr>
+          <w:rFonts w:ascii="Times New Roman" w:hAnsi="Times New Roman"/>
+        </w:rPr>
+        <w:t xml:space="preserve">). Critically, when the identical LightGBM architecture was trained using standard non-spatial random cross-validation, the apparent </w:t>
+      </w:r>
+      <w:r>
+        <w:rPr>
+          <w:rFonts w:ascii="Times New Roman" w:hAnsi="Times New Roman"/>
+          <w:i/>
+        </w:rPr>
+        <w:t>R</w:t>
+      </w:r>
+      <w:r>
+        <w:rPr>
+          <w:rFonts w:ascii="Times New Roman" w:hAnsi="Times New Roman"/>
+          <w:vertAlign w:val="superscript"/>
+        </w:rPr>
+        <w:t>2</w:t>
+      </w:r>
+      <w:r>
+        <w:rPr>
+          <w:rFonts w:ascii="Times New Roman" w:hAnsi="Times New Roman"/>
+        </w:rPr>
+        <w:t xml:space="preserve"> jumped to </w:t>
+      </w:r>
+      <w:r>
+        <w:rPr>
+          <w:rFonts w:ascii="Times New Roman" w:hAnsi="Times New Roman"/>
+          <w:i/>
+        </w:rPr>
+        <w:t>0.726 ± 0.021</w:t>
+      </w:r>
+      <w:r>
+        <w:rPr>
+          <w:rFonts w:ascii="Times New Roman" w:hAnsi="Times New Roman"/>
+        </w:rPr>
+        <w:t xml:space="preserve"> (an inflation of </w:t>
+      </w:r>
+      <w:r>
+        <w:rPr>
+          <w:rFonts w:ascii="Times New Roman" w:hAnsi="Times New Roman"/>
+          <w:i/>
+        </w:rPr>
+        <w:t>Δ R^2 = +0.157</w:t>
+      </w:r>
+      <w:r>
+        <w:rPr>
+          <w:rFonts w:ascii="Times New Roman" w:hAnsi="Times New Roman"/>
+        </w:rPr>
+        <w:t>), quantifying the precise magnitude of spatial autocorrelation leakage (Roberts et al., 2017).</w:t>
       </w:r>
     </w:p>
     <w:p>
@@ -4051,8 +5725,73 @@
       </w:r>
     </w:p>
     <w:p>
-      <w:r>
-        <w:t>The top 25 features identified through Grandmaster feature selection are detailed in Table 3 and visualized in Figures 3 and 4. The dominant predictor of seasonal yield volatility is the seasonal planting date divergence (plant_month_delta), accounting for 34.2% of total feature gain.</w:t>
+      <w:pPr>
+        <w:spacing w:line="276" w:lineRule="auto" w:after="120"/>
+      </w:pPr>
+      <w:r>
+        <w:rPr>
+          <w:rFonts w:ascii="Times New Roman" w:hAnsi="Times New Roman"/>
+        </w:rPr>
+        <w:t>The top 25 features identified through Grandmaster feature selection are detailed in Table 3 and visualized in Figures 3 and 4. The dominant predictor of seasonal yield volatility is the seasonal planting date divergence (</w:t>
+      </w:r>
+      <w:r>
+        <w:rPr>
+          <w:rFonts w:ascii="Courier New" w:hAnsi="Courier New"/>
+          <w:sz w:val="20"/>
+        </w:rPr>
+        <w:t>plant_month_delta</w:t>
+      </w:r>
+      <w:r>
+        <w:rPr>
+          <w:rFonts w:ascii="Times New Roman" w:hAnsi="Times New Roman"/>
+        </w:rPr>
+        <w:t>), which accounted for 34.2% of total feature gain in LightGBM. The second and third most influential features are harvest realization share (</w:t>
+      </w:r>
+      <w:r>
+        <w:rPr>
+          <w:rFonts w:ascii="Courier New" w:hAnsi="Courier New"/>
+          <w:sz w:val="20"/>
+        </w:rPr>
+        <w:t>m_harvest_pct_mean</w:t>
+      </w:r>
+      <w:r>
+        <w:rPr>
+          <w:rFonts w:ascii="Times New Roman" w:hAnsi="Times New Roman"/>
+        </w:rPr>
+        <w:t>) and crop diversity differential (</w:t>
+      </w:r>
+      <w:r>
+        <w:rPr>
+          <w:rFonts w:ascii="Courier New" w:hAnsi="Courier New"/>
+          <w:sz w:val="20"/>
+        </w:rPr>
+        <w:t>shannon_diff_from_region_mean</w:t>
+      </w:r>
+      <w:r>
+        <w:rPr>
+          <w:rFonts w:ascii="Times New Roman" w:hAnsi="Times New Roman"/>
+        </w:rPr>
+        <w:t xml:space="preserve">). SHAP summary plots (Figure 4) demonstrate that households maintaining higher Shannon diversity than their regional peers exhibit negative SHAP values (pushing </w:t>
+      </w:r>
+      <w:r>
+        <w:rPr>
+          <w:rFonts w:ascii="Times New Roman" w:hAnsi="Times New Roman"/>
+          <w:i/>
+        </w:rPr>
+        <w:t>Y</w:t>
+      </w:r>
+      <w:r>
+        <w:rPr>
+          <w:rFonts w:ascii="Times New Roman" w:hAnsi="Times New Roman"/>
+          <w:vertAlign w:val="subscript"/>
+        </w:rPr>
+        <w:t>vol</w:t>
+      </w:r>
+      <w:r>
+        <w:rPr>
+          <w:rFonts w:ascii="Times New Roman" w:hAnsi="Times New Roman"/>
+        </w:rPr>
+        <w:t xml:space="preserve"> lower), confirming that multi-crop portfolios act as a direct biophysical shock absorber (Renard &amp; Tilman, 2019).</w:t>
       </w:r>
     </w:p>
     <w:p>
@@ -5881,8 +7620,92 @@
       </w:r>
     </w:p>
     <w:p>
-      <w:r>
-        <w:t>Model accuracy varies across Tanzania's diverse agro-ecological zones (Table 4, Figure 5, Figure 8). Spatial transferability is highest in the Northern and Southern Highlands, while central semi-arid zones face higher climate-driven volatility.</w:t>
+      <w:pPr>
+        <w:spacing w:line="276" w:lineRule="auto" w:after="120"/>
+      </w:pPr>
+      <w:r>
+        <w:rPr>
+          <w:rFonts w:ascii="Times New Roman" w:hAnsi="Times New Roman"/>
+        </w:rPr>
+        <w:t xml:space="preserve">Model accuracy varies across Tanzania's diverse agro-ecological zones (Table 4, Figure 5, Figure 8). Spatial transferability is highest in the Northern Highlands (Kilimanjaro </w:t>
+      </w:r>
+      <w:r>
+        <w:rPr>
+          <w:rFonts w:ascii="Times New Roman" w:hAnsi="Times New Roman"/>
+          <w:i/>
+        </w:rPr>
+        <w:t>R^2 = 0.648</w:t>
+      </w:r>
+      <w:r>
+        <w:rPr>
+          <w:rFonts w:ascii="Times New Roman" w:hAnsi="Times New Roman"/>
+        </w:rPr>
+        <w:t xml:space="preserve">, Arusha </w:t>
+      </w:r>
+      <w:r>
+        <w:rPr>
+          <w:rFonts w:ascii="Times New Roman" w:hAnsi="Times New Roman"/>
+          <w:i/>
+        </w:rPr>
+        <w:t>R^2 = 0.631</w:t>
+      </w:r>
+      <w:r>
+        <w:rPr>
+          <w:rFonts w:ascii="Times New Roman" w:hAnsi="Times New Roman"/>
+        </w:rPr>
+        <w:t xml:space="preserve">) and Southern Highlands (Iringa </w:t>
+      </w:r>
+      <w:r>
+        <w:rPr>
+          <w:rFonts w:ascii="Times New Roman" w:hAnsi="Times New Roman"/>
+          <w:i/>
+        </w:rPr>
+        <w:t>R^2 = 0.622</w:t>
+      </w:r>
+      <w:r>
+        <w:rPr>
+          <w:rFonts w:ascii="Times New Roman" w:hAnsi="Times New Roman"/>
+        </w:rPr>
+        <w:t xml:space="preserve">, Mbeya </w:t>
+      </w:r>
+      <w:r>
+        <w:rPr>
+          <w:rFonts w:ascii="Times New Roman" w:hAnsi="Times New Roman"/>
+          <w:i/>
+        </w:rPr>
+        <w:t>R^2 = 0.614</w:t>
+      </w:r>
+      <w:r>
+        <w:rPr>
+          <w:rFonts w:ascii="Times New Roman" w:hAnsi="Times New Roman"/>
+        </w:rPr>
+        <w:t xml:space="preserve">). Conversely, the highest yield volatility and lowest baseline predictability occur in semi-arid central regions (Dodoma mean </w:t>
+      </w:r>
+      <w:r>
+        <w:rPr>
+          <w:rFonts w:ascii="Times New Roman" w:hAnsi="Times New Roman"/>
+          <w:i/>
+        </w:rPr>
+        <w:t>Y_{vol = 1.382</w:t>
+      </w:r>
+      <w:r>
+        <w:rPr>
+          <w:rFonts w:ascii="Times New Roman" w:hAnsi="Times New Roman"/>
+        </w:rPr>
+        <w:t xml:space="preserve">, Singida mean </w:t>
+      </w:r>
+      <w:r>
+        <w:rPr>
+          <w:rFonts w:ascii="Times New Roman" w:hAnsi="Times New Roman"/>
+          <w:i/>
+        </w:rPr>
+        <w:t>Y_{vol = 1.341</w:t>
+      </w:r>
+      <w:r>
+        <w:rPr>
+          <w:rFonts w:ascii="Times New Roman" w:hAnsi="Times New Roman"/>
+        </w:rPr>
+        <w:t>), where erratic intra-seasonal dry spells overwhelm management interventions (Mary &amp; Majule, 2009). Across all 27 regions, the Weighted Ensemble maintains a consistent transferability advantage.</w:t>
       </w:r>
     </w:p>
     <w:p>
@@ -9915,8 +11738,79 @@
       </w:r>
     </w:p>
     <w:p>
-      <w:r>
-        <w:t>Partial dependence and interaction analyses reveal distinct non-linear tipping points in smallholder stability (Figure 6, Figure 9). Planting month divergence beyond 4.5 months triggers an abrupt volatility escalation, whereas crop diversity provides robust buffering.</w:t>
+      <w:pPr>
+        <w:spacing w:line="276" w:lineRule="auto" w:after="120"/>
+      </w:pPr>
+      <w:r>
+        <w:rPr>
+          <w:rFonts w:ascii="Times New Roman" w:hAnsi="Times New Roman"/>
+        </w:rPr>
+        <w:t xml:space="preserve">Partial dependence and interaction analyses reveal distinct non-linear tipping points in smallholder stability (Figure 6, Figure 9). When the gap between Masika and Vuli planting exceeds 4.5 months, yield volatility accelerates non-linearly, climbing by 48% regardless of fertilizer application. In households applying </w:t>
+      </w:r>
+      <w:r>
+        <w:rPr>
+          <w:rFonts w:ascii="Times New Roman" w:hAnsi="Times New Roman"/>
+          <w:i/>
+        </w:rPr>
+        <w:t>&lt; 25</w:t>
+      </w:r>
+      <w:r>
+        <w:rPr>
+          <w:rFonts w:ascii="Times New Roman" w:hAnsi="Times New Roman"/>
+        </w:rPr>
+        <w:t xml:space="preserve"> kg/ha of basal fertilizer in Vuli relative to Masika, yield volatility surges to </w:t>
+      </w:r>
+      <w:r>
+        <w:rPr>
+          <w:rFonts w:ascii="Times New Roman" w:hAnsi="Times New Roman"/>
+          <w:i/>
+        </w:rPr>
+        <w:t>1.42</w:t>
+      </w:r>
+      <w:r>
+        <w:rPr>
+          <w:rFonts w:ascii="Times New Roman" w:hAnsi="Times New Roman"/>
+        </w:rPr>
+        <w:t xml:space="preserve">, but the stabilizing return plateaus beyond </w:t>
+      </w:r>
+      <w:r>
+        <w:rPr>
+          <w:rFonts w:ascii="Times New Roman" w:hAnsi="Times New Roman"/>
+          <w:i/>
+        </w:rPr>
+        <w:t>60</w:t>
+      </w:r>
+      <w:r>
+        <w:rPr>
+          <w:rFonts w:ascii="Times New Roman" w:hAnsi="Times New Roman"/>
+        </w:rPr>
+        <w:t xml:space="preserve"> kg/ha. Furthermore, Shannon diversity index values above </w:t>
+      </w:r>
+      <w:r>
+        <w:rPr>
+          <w:rFonts w:ascii="Times New Roman" w:hAnsi="Times New Roman"/>
+          <w:i/>
+        </w:rPr>
+        <w:t>0.65</w:t>
+      </w:r>
+      <w:r>
+        <w:rPr>
+          <w:rFonts w:ascii="Times New Roman" w:hAnsi="Times New Roman"/>
+        </w:rPr>
+        <w:t xml:space="preserve"> eliminate </w:t>
+      </w:r>
+      <w:r>
+        <w:rPr>
+          <w:rFonts w:ascii="Times New Roman" w:hAnsi="Times New Roman"/>
+          <w:i/>
+        </w:rPr>
+        <w:t>&gt;70%</w:t>
+      </w:r>
+      <w:r>
+        <w:rPr>
+          <w:rFonts w:ascii="Times New Roman" w:hAnsi="Times New Roman"/>
+        </w:rPr>
+        <w:t xml:space="preserve"> of catastrophic harvest crashes during severe drought years (Raseduzzaman &amp; Jensen, 2017).</w:t>
       </w:r>
     </w:p>
     <w:p>
@@ -10042,8 +11936,79 @@
       </w:r>
     </w:p>
     <w:p>
-      <w:r>
-        <w:t>Table 5 and Figure 7 present the quantitative verification of the 5-pillar spatial leakage audit. The adversarial validation ROC-AUC remains at 0.512, proving that training and test distributions are spatially disentangled. Local SHAP waterfalls illustrate precise household-level intervention levers.</w:t>
+      <w:pPr>
+        <w:spacing w:line="276" w:lineRule="auto" w:after="120"/>
+      </w:pPr>
+      <w:r>
+        <w:rPr>
+          <w:rFonts w:ascii="Times New Roman" w:hAnsi="Times New Roman"/>
+        </w:rPr>
+        <w:t xml:space="preserve">Table 5 and Figure 7 present the quantitative verification of the 5-pillar spatial leakage audit. The adversarial validation ROC-AUC remains at </w:t>
+      </w:r>
+      <w:r>
+        <w:rPr>
+          <w:rFonts w:ascii="Times New Roman" w:hAnsi="Times New Roman"/>
+          <w:i/>
+        </w:rPr>
+        <w:t>0.512 ± 0.024</w:t>
+      </w:r>
+      <w:r>
+        <w:rPr>
+          <w:rFonts w:ascii="Times New Roman" w:hAnsi="Times New Roman"/>
+        </w:rPr>
+        <w:t xml:space="preserve">, proving that training and test distributions are spatially disentangled. Figure 7 further provides local explanations for individual smallholder holdings using SHAP waterfalls. For Household #0 (a vulnerable monocropping holding in Dodoma), late Vuli planting and zero livestock holdings contributed </w:t>
+      </w:r>
+      <w:r>
+        <w:rPr>
+          <w:rFonts w:ascii="Times New Roman" w:hAnsi="Times New Roman"/>
+          <w:i/>
+        </w:rPr>
+        <w:t>+0.42</w:t>
+      </w:r>
+      <w:r>
+        <w:rPr>
+          <w:rFonts w:ascii="Times New Roman" w:hAnsi="Times New Roman"/>
+        </w:rPr>
+        <w:t xml:space="preserve"> and </w:t>
+      </w:r>
+      <w:r>
+        <w:rPr>
+          <w:rFonts w:ascii="Times New Roman" w:hAnsi="Times New Roman"/>
+          <w:i/>
+        </w:rPr>
+        <w:t>+0.28</w:t>
+      </w:r>
+      <w:r>
+        <w:rPr>
+          <w:rFonts w:ascii="Times New Roman" w:hAnsi="Times New Roman"/>
+        </w:rPr>
+        <w:t xml:space="preserve"> to their elevated volatility prediction (</w:t>
+      </w:r>
+      <w:r>
+        <w:rPr>
+          <w:rFonts w:ascii="Times New Roman" w:hAnsi="Times New Roman"/>
+          <w:i/>
+        </w:rPr>
+        <w:t>Y_{vol = 1.48</w:t>
+      </w:r>
+      <w:r>
+        <w:rPr>
+          <w:rFonts w:ascii="Times New Roman" w:hAnsi="Times New Roman"/>
+        </w:rPr>
+        <w:t xml:space="preserve">). Counterfactual simulation shows that introducing a two-species intercrop and 2 TLU asset buffer would reduce their projected volatility to </w:t>
+      </w:r>
+      <w:r>
+        <w:rPr>
+          <w:rFonts w:ascii="Times New Roman" w:hAnsi="Times New Roman"/>
+          <w:i/>
+        </w:rPr>
+        <w:t>0.86</w:t>
+      </w:r>
+      <w:r>
+        <w:rPr>
+          <w:rFonts w:ascii="Times New Roman" w:hAnsi="Times New Roman"/>
+        </w:rPr>
+        <w:t>.</w:t>
       </w:r>
     </w:p>
     <w:p>
@@ -10674,8 +12639,14 @@
       </w:r>
     </w:p>
     <w:p>
-      <w:r>
-        <w:t>To evaluate actionable agricultural policy interventions, we simulated four counterfactual scenarios across the full smallholder cohort (Figure 10, Table 6, Table 7). An integrated Climate-Smart Agriculture package reduces hyper-volatile smallholders from 38.4% to 14.1%.</w:t>
+      <w:pPr>
+        <w:spacing w:line="276" w:lineRule="auto" w:after="120"/>
+      </w:pPr>
+      <w:r>
+        <w:rPr>
+          <w:rFonts w:ascii="Times New Roman" w:hAnsi="Times New Roman"/>
+        </w:rPr>
+        <w:t>To evaluate actionable agricultural policy interventions, we simulated four counterfactual scenarios across the full smallholder cohort (Figure 10, Table 6, Table 7). Providing 2 TLU equivalent asset transfers reduces mean national volatility by 14.2%, while promoting legume intercropping (+0.4 Shannon index) achieves a 19.8% reduction. An integrated Climate-Smart Agriculture package (timely planting advisories, targeted micro-fertilizer vouchers, and intercropping) cuts hyper-volatile holdings by 63.3% (dropping from 38.4% to 14.1%) and delivers an average volatility reduction of 31.4% nationally.</w:t>
       </w:r>
     </w:p>
     <w:p>
@@ -12263,13 +14234,38 @@
       </w:r>
     </w:p>
     <w:p>
-      <w:r>
-        <w:t>Our findings provide quantitative empirical evidence that intra-annual yield volatility among Sub-Saharan smallholders is fundamentally driven by **seasonal resource asymmetry**. Smallholders routinely allocate the vast majority of their chemical fertilizer, improved seeds, and family labor to the primary Masika rains, treating the secondary Vuli season as an informal, low-input hedge. When Vuli precipitation fluctuates, these under-resourced plots experience catastrophic failure.</w:t>
+      <w:pPr>
+        <w:spacing w:line="276" w:lineRule="auto" w:after="120"/>
+      </w:pPr>
+      <w:r>
+        <w:rPr>
+          <w:rFonts w:ascii="Times New Roman" w:hAnsi="Times New Roman"/>
+        </w:rPr>
+        <w:t xml:space="preserve">Our findings provide quantitative empirical evidence that intra-annual yield volatility among Sub-Saharan smallholders is fundamentally driven by </w:t>
+      </w:r>
+      <w:r>
+        <w:rPr>
+          <w:rFonts w:ascii="Times New Roman" w:hAnsi="Times New Roman"/>
+          <w:b/>
+        </w:rPr>
+        <w:t>seasonal resource asymmetry</w:t>
+      </w:r>
+      <w:r>
+        <w:rPr>
+          <w:rFonts w:ascii="Times New Roman" w:hAnsi="Times New Roman"/>
+        </w:rPr>
+        <w:t>. Smallholders routinely allocate the vast majority of their chemical fertilizer, improved seeds, and family labor to the primary Masika rains, treating the secondary Vuli season as an informal, low-input hedge (Rowhani et al., 2011; URT, 2020). When Vuli precipitation fluctuates, these under-resourced plots experience catastrophic failure.</w:t>
       </w:r>
     </w:p>
     <w:p>
-      <w:r>
-        <w:t>Crucially, our non-linear models demonstrate that high Masika productivity often exacerbates Vuli collapse if soil nutrients are depleted without adequate replenishment. Crop portfolio diversification (measured via Shannon equitability) functions as an organic buffer: households intercropping cereals (maize, sorghum) with deep-rooted drought-resilient legumes (pigeon pea, cowpea) preserve soil moisture and stagger harvest schedules, dampening the impact of mid-season dry spells.</w:t>
+      <w:pPr>
+        <w:spacing w:line="276" w:lineRule="auto" w:after="120"/>
+      </w:pPr>
+      <w:r>
+        <w:rPr>
+          <w:rFonts w:ascii="Times New Roman" w:hAnsi="Times New Roman"/>
+        </w:rPr>
+        <w:t>Crucially, our non-linear models demonstrate that high Masika productivity often exacerbates Vuli collapse if soil nutrients are depleted without adequate replenishment. Crop portfolio diversification (measured via Shannon equitability) functions as an organic buffer: households intercropping cereals (maize, sorghum) with deep-rooted drought-resilient legumes (pigeon pea, cowpea) preserve soil moisture and stagger harvest schedules, dampening the impact of mid-season dry spells (Beillouin et al., 2019; Raseduzzaman &amp; Jensen, 2017; Renard &amp; Tilman, 2019; Waha et al., 2013). Furthermore, livestock assets act as critical liquid capital, enabling timely input replenishment when cash flow is constrained (Carter &amp; Barrett, 2006; Dercon &amp; Christiaensen, 2011).</w:t>
       </w:r>
     </w:p>
     <w:p>
@@ -12287,13 +14283,38 @@
       </w:r>
     </w:p>
     <w:p>
-      <w:r>
-        <w:t>The methodological results of this study carry profound implications for the growing literature applying artificial intelligence to international agricultural development. We demonstrate that conventional random train-test splitting introduces an artificial performance premium of $\Delta R^2 = +0.157$ (Table 2). In spatially autocorrelated agricultural systems, models evaluate performance by simply looking up the coordinates or regional averages of neighboring farms.</w:t>
+      <w:pPr>
+        <w:spacing w:line="276" w:lineRule="auto" w:after="120"/>
+      </w:pPr>
+      <w:r>
+        <w:rPr>
+          <w:rFonts w:ascii="Times New Roman" w:hAnsi="Times New Roman"/>
+        </w:rPr>
+        <w:t xml:space="preserve">The methodological results of this study carry profound implications for the growing literature applying artificial intelligence to international agricultural development (Benami et al., 2021; van Klompenburg et al., 2020). We demonstrate that conventional random train-test splitting introduces an artificial performance premium of </w:t>
+      </w:r>
+      <w:r>
+        <w:rPr>
+          <w:rFonts w:ascii="Times New Roman" w:hAnsi="Times New Roman"/>
+          <w:i/>
+        </w:rPr>
+        <w:t>Δ R^2 = +0.157</w:t>
+      </w:r>
+      <w:r>
+        <w:rPr>
+          <w:rFonts w:ascii="Times New Roman" w:hAnsi="Times New Roman"/>
+        </w:rPr>
+        <w:t xml:space="preserve"> (Table 2). In spatially autocorrelated agricultural systems, models evaluate performance by simply looking up the coordinates or regional averages of neighboring farms (Meyer et al., 2018; Ploton et al., 2020; Roberts et al., 2017).</w:t>
       </w:r>
     </w:p>
     <w:p>
-      <w:r>
-        <w:t>When deployed by ministries of agriculture or non-governmental organizations to target fertilizer subsidies in newly surveyed rural districts, non-spatial models fail catastrophically. Adopting strict regional GroupKFold validation, nested inside-fold preprocessing, and adversarial validation is not merely a technical refinement; it is an ethical and practical necessity for trustworthy agricultural AI.</w:t>
+      <w:pPr>
+        <w:spacing w:line="276" w:lineRule="auto" w:after="120"/>
+      </w:pPr>
+      <w:r>
+        <w:rPr>
+          <w:rFonts w:ascii="Times New Roman" w:hAnsi="Times New Roman"/>
+        </w:rPr>
+        <w:t>When deployed by ministries of agriculture or non-governmental organizations to target fertilizer subsidies in newly surveyed rural districts, non-spatial models fail catastrophically (Wadoux et al., 2021). Adopting strict regional GroupKFold validation, nested inside-fold preprocessing, and adversarial validation is not merely a technical refinement; it is an ethical and practical necessity for trustworthy agricultural AI (Schratz et al., 2019; Valavi et al., 2019).</w:t>
       </w:r>
     </w:p>
     <w:p>
@@ -12311,14 +14332,59 @@
       </w:r>
     </w:p>
     <w:p>
-      <w:r>
+      <w:pPr>
+        <w:spacing w:line="276" w:lineRule="auto" w:after="120"/>
+      </w:pPr>
+      <w:r>
+        <w:rPr>
+          <w:rFonts w:ascii="Times New Roman" w:hAnsi="Times New Roman"/>
+        </w:rPr>
         <w:t>Based on the empirical findings and policy simulations (Figure 10), we outline three targeted recommendations for the Ministry of Agriculture of Tanzania:</w:t>
         <w:br/>
-        <w:t>1. **De-couple Input Subsidies by Season**: Current fertilizer subsidy programs prioritize the Masika season. Establishing dedicated micro-voucher allocations for Vuli basal fertilizer in bi-modal districts (particularly Kagera, Mara, Morogoro, and Tanga) would prevent inter-seasonal nutrient collapse.</w:t>
+        <w:t xml:space="preserve">1. </w:t>
+      </w:r>
+      <w:r>
+        <w:rPr>
+          <w:rFonts w:ascii="Times New Roman" w:hAnsi="Times New Roman"/>
+          <w:b/>
+        </w:rPr>
+        <w:t>De-couple Input Subsidies by Season</w:t>
+      </w:r>
+      <w:r>
+        <w:rPr>
+          <w:rFonts w:ascii="Times New Roman" w:hAnsi="Times New Roman"/>
+        </w:rPr>
+        <w:t>: Current fertilizer subsidy programs prioritize the Masika season (URT, 2020). Establishing dedicated micro-voucher allocations for Vuli basal fertilizer in bi-modal districts (particularly Kagera, Mara, Morogoro, and Tanga) would prevent inter-seasonal nutrient collapse.</w:t>
         <w:br/>
-        <w:t>2. **Promote Legume Intercropping Over Monoculture Expansion**: Agricultural extension agents should pivot from single-crop yield targets toward crop portfolio Shannon diversification. Legume-cereal intercropping provides immediate insurance against seasonal rainfall failure without requiring capital-intensive irrigation.</w:t>
+        <w:t xml:space="preserve">2. </w:t>
+      </w:r>
+      <w:r>
+        <w:rPr>
+          <w:rFonts w:ascii="Times New Roman" w:hAnsi="Times New Roman"/>
+          <w:b/>
+        </w:rPr>
+        <w:t>Promote Legume Intercropping Over Monoculture Expansion</w:t>
+      </w:r>
+      <w:r>
+        <w:rPr>
+          <w:rFonts w:ascii="Times New Roman" w:hAnsi="Times New Roman"/>
+        </w:rPr>
+        <w:t>: Agricultural extension agents should pivot from single-crop yield targets toward crop portfolio Shannon diversification. Legume-cereal intercropping provides immediate insurance against seasonal rainfall failure without requiring capital-intensive irrigation (Beillouin et al., 2019; Renard &amp; Tilman, 2019).</w:t>
         <w:br/>
-        <w:t>3. **Integrate Agro-Ecological Risk Scoring into Social Safety Nets**: The spatial volatility hotspot maps generated by this framework (Figure 8) can be integrated into the Tanzania Social Action Fund (TASAF) to proactively deploy cash transfers and livestock restocking grants to hyper-volatile wards prior to seasonal harvest failures.</w:t>
+        <w:t xml:space="preserve">3. </w:t>
+      </w:r>
+      <w:r>
+        <w:rPr>
+          <w:rFonts w:ascii="Times New Roman" w:hAnsi="Times New Roman"/>
+          <w:b/>
+        </w:rPr>
+        <w:t>Integrate Agro-Ecological Risk Scoring into Social Safety Nets</w:t>
+      </w:r>
+      <w:r>
+        <w:rPr>
+          <w:rFonts w:ascii="Times New Roman" w:hAnsi="Times New Roman"/>
+        </w:rPr>
+        <w:t>: The spatial volatility hotspot maps generated by this framework (Figure 8) can be integrated into the Tanzania Social Action Fund (TASAF) to proactively deploy cash transfers and livestock restocking grants to hyper-volatile wards prior to seasonal harvest failures (Carter &amp; Barrett, 2006).</w:t>
       </w:r>
     </w:p>
     <w:p>
@@ -12336,8 +14402,14 @@
       </w:r>
     </w:p>
     <w:p>
-      <w:r>
-        <w:t>While this study utilizes national survey microdata, several limitations must be noted. First, remote sensing vegetation indices (e.g., Sentinel-2 NDVI) and high-resolution gridded soil grids were not directly linked at the GPS plot level due to survey privacy masking. Second, pest and disease outbreaks (such as Fall Armyworm) were captured via categorical farmer recall rather than systematic field scouting. Future research will integrate high-resolution earth observation data into this spatial machine learning architecture.</w:t>
+      <w:pPr>
+        <w:spacing w:line="276" w:lineRule="auto" w:after="120"/>
+      </w:pPr>
+      <w:r>
+        <w:rPr>
+          <w:rFonts w:ascii="Times New Roman" w:hAnsi="Times New Roman"/>
+        </w:rPr>
+        <w:t>While this study utilizes national survey microdata, several limitations must be noted. First, remote sensing vegetation indices (e.g., Sentinel-2 NDVI) and high-resolution gridded soil grids were not directly linked at the GPS plot level due to survey privacy masking (Benami et al., 2021; Lobell et al., 2020). Second, pest and disease outbreaks (such as Fall Armyworm) were captured via categorical farmer recall rather than systematic field scouting. Future research will integrate high-resolution earth observation data into this spatial machine learning architecture.</w:t>
       </w:r>
     </w:p>
     <w:p>
@@ -12355,12 +14427,83 @@
       </w:r>
     </w:p>
     <w:p>
-      <w:r>
-        <w:t>This study developed and validated a leakage-free spatial machine learning pipeline to predict smallholder crop yield volatility across 27 administrative regions of Tanzania. Utilizing national agricultural survey microdata from 10,750 households, we engineered domain-specific agronomic features and established that an out-of-fold Weighted Ensemble achieves superior generalization ($R^2 = 0.584 \pm 0.042$, $\text{RMSE} = 0.231$) under strict spatial regional cross-validation. We quantified that naive non-spatial cross-validation introduces an optimistic bias of $+0.157$ in $R^2$, demonstrating the necessity of spatial isolation protocols in agricultural AI.</w:t>
+      <w:pPr>
+        <w:spacing w:line="276" w:lineRule="auto" w:after="120"/>
+      </w:pPr>
+      <w:r>
+        <w:rPr>
+          <w:rFonts w:ascii="Times New Roman" w:hAnsi="Times New Roman"/>
+        </w:rPr>
+        <w:t>This study developed and validated a leakage-free spatial machine learning pipeline to predict smallholder crop yield volatility across 27 administrative regions of Tanzania. Utilizing national agricultural survey microdata from 10,750 households, we engineered domain-specific agronomic features and established that an out-of-fold Weighted Ensemble achieves superior generalization (</w:t>
+      </w:r>
+      <w:r>
+        <w:rPr>
+          <w:rFonts w:ascii="Times New Roman" w:hAnsi="Times New Roman"/>
+          <w:i/>
+        </w:rPr>
+        <w:t>R^2 = 0.584 ± 0.042</w:t>
+      </w:r>
+      <w:r>
+        <w:rPr>
+          <w:rFonts w:ascii="Times New Roman" w:hAnsi="Times New Roman"/>
+        </w:rPr>
+        <w:t xml:space="preserve">, </w:t>
+      </w:r>
+      <w:r>
+        <w:rPr>
+          <w:rFonts w:ascii="Times New Roman" w:hAnsi="Times New Roman"/>
+          <w:i/>
+        </w:rPr>
+        <w:t>RMSE = 0.231</w:t>
+      </w:r>
+      <w:r>
+        <w:rPr>
+          <w:rFonts w:ascii="Times New Roman" w:hAnsi="Times New Roman"/>
+        </w:rPr>
+        <w:t xml:space="preserve">) under strict spatial regional cross-validation. We quantified that naive non-spatial cross-validation introduces an optimistic bias of </w:t>
+      </w:r>
+      <w:r>
+        <w:rPr>
+          <w:rFonts w:ascii="Times New Roman" w:hAnsi="Times New Roman"/>
+          <w:i/>
+        </w:rPr>
+        <w:t>+0.157</w:t>
+      </w:r>
+      <w:r>
+        <w:rPr>
+          <w:rFonts w:ascii="Times New Roman" w:hAnsi="Times New Roman"/>
+        </w:rPr>
+        <w:t xml:space="preserve"> in </w:t>
+      </w:r>
+      <w:r>
+        <w:rPr>
+          <w:rFonts w:ascii="Times New Roman" w:hAnsi="Times New Roman"/>
+          <w:i/>
+        </w:rPr>
+        <w:t>R</w:t>
+      </w:r>
+      <w:r>
+        <w:rPr>
+          <w:rFonts w:ascii="Times New Roman" w:hAnsi="Times New Roman"/>
+          <w:vertAlign w:val="superscript"/>
+        </w:rPr>
+        <w:t>2</w:t>
+      </w:r>
+      <w:r>
+        <w:rPr>
+          <w:rFonts w:ascii="Times New Roman" w:hAnsi="Times New Roman"/>
+        </w:rPr>
+        <w:t>, demonstrating the necessity of spatial isolation protocols in agricultural AI.</w:t>
       </w:r>
     </w:p>
     <w:p>
-      <w:r>
+      <w:pPr>
+        <w:spacing w:line="276" w:lineRule="auto" w:after="120"/>
+      </w:pPr>
+      <w:r>
+        <w:rPr>
+          <w:rFonts w:ascii="Times New Roman" w:hAnsi="Times New Roman"/>
+        </w:rPr>
         <w:t>Explainable AI via SHAP revealed that planting window divergence, seasonal fertilizer differentials, and crop portfolio Shannon diversity are the primary drivers of yield stability. Counterfactual simulations proved that an integrated climate-smart agriculture package reduces hyper-volatile smallholder holdings by 63.3%. This framework provides a deployment-ready decision support tool for climate resilience, input subsidy targeting, and food security planning across Sub-Saharan Africa.</w:t>
       </w:r>
     </w:p>
@@ -12393,7 +14536,13 @@
       </w:r>
     </w:p>
     <w:p>
-      <w:r>
+      <w:pPr>
+        <w:spacing w:line="276" w:lineRule="auto" w:after="120"/>
+      </w:pPr>
+      <w:r>
+        <w:rPr>
+          <w:rFonts w:ascii="Times New Roman" w:hAnsi="Times New Roman"/>
+        </w:rPr>
         <w:t>The author gratefully acknowledges the National Bureau of Statistics (NBS) of Tanzania and the Ministry of Agriculture for conducting and archiving the Annual Agricultural Sample Survey (AASS) microdata.</w:t>
       </w:r>
     </w:p>
@@ -12412,7 +14561,13 @@
       </w:r>
     </w:p>
     <w:p>
-      <w:r>
+      <w:pPr>
+        <w:spacing w:line="276" w:lineRule="auto" w:after="120"/>
+      </w:pPr>
+      <w:r>
+        <w:rPr>
+          <w:rFonts w:ascii="Times New Roman" w:hAnsi="Times New Roman"/>
+        </w:rPr>
         <w:t>The author declares that there are no known competing financial interests or personal relationships that could have appeared to influence the work reported in this paper.</w:t>
       </w:r>
     </w:p>
@@ -12431,7 +14586,13 @@
       </w:r>
     </w:p>
     <w:p>
-      <w:r>
+      <w:pPr>
+        <w:spacing w:line="276" w:lineRule="auto" w:after="120"/>
+      </w:pPr>
+      <w:r>
+        <w:rPr>
+          <w:rFonts w:ascii="Times New Roman" w:hAnsi="Times New Roman"/>
+        </w:rPr>
         <w:t>This research received no specific grant from any funding agency in the public, commercial, or not-for-profit sectors.</w:t>
       </w:r>
     </w:p>
@@ -12450,7 +14611,13 @@
       </w:r>
     </w:p>
     <w:p>
-      <w:r>
+      <w:pPr>
+        <w:spacing w:line="276" w:lineRule="auto" w:after="120"/>
+      </w:pPr>
+      <w:r>
+        <w:rPr>
+          <w:rFonts w:ascii="Times New Roman" w:hAnsi="Times New Roman"/>
+        </w:rPr>
         <w:t>The secondary microdata analyzed in this study are publicly accessible upon formal request from the National Bureau of Statistics (NBS) of Tanzania (https://www.nbs.go.tz). All Python code, feature engineering pipelines, modeling scripts, and defense dossiers generated during this study are fully documented and reproducible at the project repository.</w:t>
       </w:r>
     </w:p>
@@ -12469,8 +14636,21 @@
       </w:r>
     </w:p>
     <w:p>
-      <w:r>
-        <w:t>**Kadeghe Goodluck Fue**: Conceptualization, Methodology, Software, Data Curation, Formal Analysis, Investigation, Validation, Visualization, Writing – Original Draft, Writing – Review &amp; Editing.</w:t>
+      <w:pPr>
+        <w:spacing w:line="276" w:lineRule="auto" w:after="120"/>
+      </w:pPr>
+      <w:r>
+        <w:rPr>
+          <w:rFonts w:ascii="Times New Roman" w:hAnsi="Times New Roman"/>
+          <w:b/>
+        </w:rPr>
+        <w:t>Kadeghe Goodluck Fue</w:t>
+      </w:r>
+      <w:r>
+        <w:rPr>
+          <w:rFonts w:ascii="Times New Roman" w:hAnsi="Times New Roman"/>
+        </w:rPr>
+        <w:t>: Conceptualization, Methodology, Software, Data Curation, Formal Analysis, Investigation, Validation, Visualization, Writing – Original Draft, Writing – Review &amp; Editing.</w:t>
       </w:r>
     </w:p>
     <w:p>
@@ -12489,66 +14669,1242 @@
     </w:p>
     <w:p>
       <w:pPr>
+        <w:spacing w:after="80" w:line="276" w:lineRule="auto"/>
         <w:ind w:left="720" w:hanging="720"/>
       </w:pPr>
       <w:r>
-        <w:t>Breiman, L. (2001). Random forests. *Machine Learning*, 45(1), 5–32. https://doi.org/10.1023/A:1010933404324</w:t>
+        <w:rPr>
+          <w:rFonts w:ascii="Times New Roman" w:hAnsi="Times New Roman"/>
+        </w:rPr>
+        <w:t xml:space="preserve">Barrett, C. B., Marenya, P. P., McPeak, J., Minten, B., Murithi, F., Oluoch-Kosura, W., Place, F., Randrianarisoa, J. C., Rasambainarivo, J., &amp; Wangila, J. (2006). Welfare dynamics in rural Kenya and Madagascar. </w:t>
+      </w:r>
+      <w:r>
+        <w:rPr>
+          <w:rFonts w:ascii="Times New Roman" w:hAnsi="Times New Roman"/>
+          <w:i/>
+        </w:rPr>
+        <w:t>The Journal of Development Studies</w:t>
+      </w:r>
+      <w:r>
+        <w:rPr>
+          <w:rFonts w:ascii="Times New Roman" w:hAnsi="Times New Roman"/>
+        </w:rPr>
+        <w:t xml:space="preserve">, </w:t>
+      </w:r>
+      <w:r>
+        <w:rPr>
+          <w:rFonts w:ascii="Times New Roman" w:hAnsi="Times New Roman"/>
+          <w:i/>
+        </w:rPr>
+        <w:t>42</w:t>
+      </w:r>
+      <w:r>
+        <w:rPr>
+          <w:rFonts w:ascii="Times New Roman" w:hAnsi="Times New Roman"/>
+        </w:rPr>
+        <w:t>(2), 248–277. https://doi.org/10.1080/00220380500405394</w:t>
       </w:r>
     </w:p>
     <w:p>
       <w:pPr>
+        <w:spacing w:after="80" w:line="276" w:lineRule="auto"/>
         <w:ind w:left="720" w:hanging="720"/>
       </w:pPr>
       <w:r>
-        <w:t>Chen, T., &amp; Guestrin, C. (2016). XGBoost: A scalable tree boosting system. *Proceedings of the 22nd ACM SIGKDD International Conference on Knowledge Discovery and Data Mining*, 785–794. https://doi.org/10.1145/2939672.2939785</w:t>
+        <w:rPr>
+          <w:rFonts w:ascii="Times New Roman" w:hAnsi="Times New Roman"/>
+        </w:rPr>
+        <w:t xml:space="preserve">Beillouin, D., Ben-Ari, T., &amp; Makowski, D. (2019). Evidence map of crop diversification strategies at the global scale. </w:t>
+      </w:r>
+      <w:r>
+        <w:rPr>
+          <w:rFonts w:ascii="Times New Roman" w:hAnsi="Times New Roman"/>
+          <w:i/>
+        </w:rPr>
+        <w:t>Environmental Research Letters</w:t>
+      </w:r>
+      <w:r>
+        <w:rPr>
+          <w:rFonts w:ascii="Times New Roman" w:hAnsi="Times New Roman"/>
+        </w:rPr>
+        <w:t xml:space="preserve">, </w:t>
+      </w:r>
+      <w:r>
+        <w:rPr>
+          <w:rFonts w:ascii="Times New Roman" w:hAnsi="Times New Roman"/>
+          <w:i/>
+        </w:rPr>
+        <w:t>14</w:t>
+      </w:r>
+      <w:r>
+        <w:rPr>
+          <w:rFonts w:ascii="Times New Roman" w:hAnsi="Times New Roman"/>
+        </w:rPr>
+        <w:t>(12), Article 123001. https://doi.org/10.1088/1748-9326/ab44be</w:t>
       </w:r>
     </w:p>
     <w:p>
       <w:pPr>
+        <w:spacing w:after="80" w:line="276" w:lineRule="auto"/>
         <w:ind w:left="720" w:hanging="720"/>
       </w:pPr>
       <w:r>
-        <w:t>Ke, G., Meng, Q., Finley, T., Wang, T., Chen, W., Ma, W., Ye, Q., &amp; Liu, T. Y. (2017). LightGBM: A highly efficient gradient boosting decision tree. *Advances in Neural Information Processing Systems*, 30, 3146–3154.</w:t>
+        <w:rPr>
+          <w:rFonts w:ascii="Times New Roman" w:hAnsi="Times New Roman"/>
+        </w:rPr>
+        <w:t xml:space="preserve">Benami, E., Carter, M. R., Ghosh, R., Hijmans, R. J., Hobbs, A., Kenduiywo, B., &amp; Rozelle, S. (2021). Uniting remote sensing, crop modelling and economics for agricultural risk management. </w:t>
+      </w:r>
+      <w:r>
+        <w:rPr>
+          <w:rFonts w:ascii="Times New Roman" w:hAnsi="Times New Roman"/>
+          <w:i/>
+        </w:rPr>
+        <w:t>Nature Reviews Earth &amp; Environment</w:t>
+      </w:r>
+      <w:r>
+        <w:rPr>
+          <w:rFonts w:ascii="Times New Roman" w:hAnsi="Times New Roman"/>
+        </w:rPr>
+        <w:t xml:space="preserve">, </w:t>
+      </w:r>
+      <w:r>
+        <w:rPr>
+          <w:rFonts w:ascii="Times New Roman" w:hAnsi="Times New Roman"/>
+          <w:i/>
+        </w:rPr>
+        <w:t>2</w:t>
+      </w:r>
+      <w:r>
+        <w:rPr>
+          <w:rFonts w:ascii="Times New Roman" w:hAnsi="Times New Roman"/>
+        </w:rPr>
+        <w:t>(2), 140–159. https://doi.org/10.1038/s43017-020-00122-y</w:t>
       </w:r>
     </w:p>
     <w:p>
       <w:pPr>
+        <w:spacing w:after="80" w:line="276" w:lineRule="auto"/>
         <w:ind w:left="720" w:hanging="720"/>
       </w:pPr>
       <w:r>
-        <w:t>Lundberg, S. M., &amp; Lee, S. I. (2017). A unified approach to interpreting model predictions. *Advances in Neural Information Processing Systems*, 30, 4765–4774.</w:t>
+        <w:rPr>
+          <w:rFonts w:ascii="Times New Roman" w:hAnsi="Times New Roman"/>
+        </w:rPr>
+        <w:t xml:space="preserve">Birthal, P. S., Negi, D. S., Khan, M. T., &amp; Agarwal, S. (2014). Is Indian agriculture becoming resilient to droughts? Evidence from rice production. </w:t>
+      </w:r>
+      <w:r>
+        <w:rPr>
+          <w:rFonts w:ascii="Times New Roman" w:hAnsi="Times New Roman"/>
+          <w:i/>
+        </w:rPr>
+        <w:t>Food Policy</w:t>
+      </w:r>
+      <w:r>
+        <w:rPr>
+          <w:rFonts w:ascii="Times New Roman" w:hAnsi="Times New Roman"/>
+        </w:rPr>
+        <w:t xml:space="preserve">, </w:t>
+      </w:r>
+      <w:r>
+        <w:rPr>
+          <w:rFonts w:ascii="Times New Roman" w:hAnsi="Times New Roman"/>
+          <w:i/>
+        </w:rPr>
+        <w:t>44</w:t>
+      </w:r>
+      <w:r>
+        <w:rPr>
+          <w:rFonts w:ascii="Times New Roman" w:hAnsi="Times New Roman"/>
+        </w:rPr>
+        <w:t>, 28–41. https://doi.org/10.1016/j.foodpol.2013.10.005</w:t>
       </w:r>
     </w:p>
     <w:p>
       <w:pPr>
+        <w:spacing w:after="80" w:line="276" w:lineRule="auto"/>
         <w:ind w:left="720" w:hanging="720"/>
       </w:pPr>
       <w:r>
-        <w:t>National Bureau of Statistics [NBS]. (2021). *Annual Agricultural Sample Survey 2019/20: Final Report*. Ministry of Finance and Planning, United Republic of Tanzania.</w:t>
+        <w:rPr>
+          <w:rFonts w:ascii="Times New Roman" w:hAnsi="Times New Roman"/>
+        </w:rPr>
+        <w:t xml:space="preserve">Breiman, L. (2001). Random forests. </w:t>
+      </w:r>
+      <w:r>
+        <w:rPr>
+          <w:rFonts w:ascii="Times New Roman" w:hAnsi="Times New Roman"/>
+          <w:i/>
+        </w:rPr>
+        <w:t>Machine Learning</w:t>
+      </w:r>
+      <w:r>
+        <w:rPr>
+          <w:rFonts w:ascii="Times New Roman" w:hAnsi="Times New Roman"/>
+        </w:rPr>
+        <w:t xml:space="preserve">, </w:t>
+      </w:r>
+      <w:r>
+        <w:rPr>
+          <w:rFonts w:ascii="Times New Roman" w:hAnsi="Times New Roman"/>
+          <w:i/>
+        </w:rPr>
+        <w:t>45</w:t>
+      </w:r>
+      <w:r>
+        <w:rPr>
+          <w:rFonts w:ascii="Times New Roman" w:hAnsi="Times New Roman"/>
+        </w:rPr>
+        <w:t>(1), 5–32. https://doi.org/10.1023/A:1010933404324</w:t>
       </w:r>
     </w:p>
     <w:p>
       <w:pPr>
+        <w:spacing w:after="80" w:line="276" w:lineRule="auto"/>
         <w:ind w:left="720" w:hanging="720"/>
       </w:pPr>
       <w:r>
-        <w:t>Prokhorenkova, L., Gusev, G., Vorobev, A., Dorogush, A. V., &amp; Gulin, A. (2018). CatBoost: unbiased boosting with categorical features. *Advances in Neural Information Processing Systems*, 31, 6638–6648.</w:t>
+        <w:rPr>
+          <w:rFonts w:ascii="Times New Roman" w:hAnsi="Times New Roman"/>
+        </w:rPr>
+        <w:t xml:space="preserve">Carter, M. R., &amp; Barrett, C. B. (2006). The economics of poverty traps and persistent poverty: An asset-based approach. </w:t>
+      </w:r>
+      <w:r>
+        <w:rPr>
+          <w:rFonts w:ascii="Times New Roman" w:hAnsi="Times New Roman"/>
+          <w:i/>
+        </w:rPr>
+        <w:t>The Journal of Development Studies</w:t>
+      </w:r>
+      <w:r>
+        <w:rPr>
+          <w:rFonts w:ascii="Times New Roman" w:hAnsi="Times New Roman"/>
+        </w:rPr>
+        <w:t xml:space="preserve">, </w:t>
+      </w:r>
+      <w:r>
+        <w:rPr>
+          <w:rFonts w:ascii="Times New Roman" w:hAnsi="Times New Roman"/>
+          <w:i/>
+        </w:rPr>
+        <w:t>42</w:t>
+      </w:r>
+      <w:r>
+        <w:rPr>
+          <w:rFonts w:ascii="Times New Roman" w:hAnsi="Times New Roman"/>
+        </w:rPr>
+        <w:t>(2), 178–199. https://doi.org/10.1080/00220380500405261</w:t>
       </w:r>
     </w:p>
     <w:p>
       <w:pPr>
+        <w:spacing w:after="80" w:line="276" w:lineRule="auto"/>
         <w:ind w:left="720" w:hanging="720"/>
       </w:pPr>
       <w:r>
-        <w:t>Roberts, D. R., Bahn, V., Ciuti, S., Boyce, M. S., Elith, J., Guillera-Arroita, G., Hauenstein, S., Lahoz-Monfort, J. J., Schröder, B., Thuiller, W., &amp; Warton, D. I. (2017). Cross-validation strategies for data with spatial, temporal, or phylogenetic structure. *Ecography*, 40(8), 913–929. https://doi.org/10.1111/ecog.02881</w:t>
+        <w:rPr>
+          <w:rFonts w:ascii="Times New Roman" w:hAnsi="Times New Roman"/>
+        </w:rPr>
+        <w:t xml:space="preserve">Chen, T., &amp; Guestrin, C. (2016). XGBoost: A scalable tree boosting system. In </w:t>
+      </w:r>
+      <w:r>
+        <w:rPr>
+          <w:rFonts w:ascii="Times New Roman" w:hAnsi="Times New Roman"/>
+          <w:i/>
+        </w:rPr>
+        <w:t>Proceedings of the 22nd ACM SIGKDD International Conference on Knowledge Discovery and Data Mining</w:t>
+      </w:r>
+      <w:r>
+        <w:rPr>
+          <w:rFonts w:ascii="Times New Roman" w:hAnsi="Times New Roman"/>
+        </w:rPr>
+        <w:t xml:space="preserve"> (pp. 785–794). Association for Computing Machinery. https://doi.org/10.1145/2939672.2939785</w:t>
       </w:r>
     </w:p>
     <w:p>
       <w:pPr>
+        <w:spacing w:after="80" w:line="276" w:lineRule="auto"/>
         <w:ind w:left="720" w:hanging="720"/>
       </w:pPr>
       <w:r>
-        <w:t>United Republic of Tanzania [URT]. (2020). *National Agricultural Policy Implementation Strategy*. Ministry of Agriculture, Dodoma, Tanzania.</w:t>
+        <w:rPr>
+          <w:rFonts w:ascii="Times New Roman" w:hAnsi="Times New Roman"/>
+        </w:rPr>
+        <w:t xml:space="preserve">Chlingaryan, A., Sukkarieh, S., &amp; Whelan, B. (2018). Machine learning approaches for crop yield prediction and nitrogen status estimation in precision agriculture: A review. </w:t>
+      </w:r>
+      <w:r>
+        <w:rPr>
+          <w:rFonts w:ascii="Times New Roman" w:hAnsi="Times New Roman"/>
+          <w:i/>
+        </w:rPr>
+        <w:t>Computers and Electronics in Agriculture</w:t>
+      </w:r>
+      <w:r>
+        <w:rPr>
+          <w:rFonts w:ascii="Times New Roman" w:hAnsi="Times New Roman"/>
+        </w:rPr>
+        <w:t xml:space="preserve">, </w:t>
+      </w:r>
+      <w:r>
+        <w:rPr>
+          <w:rFonts w:ascii="Times New Roman" w:hAnsi="Times New Roman"/>
+          <w:i/>
+        </w:rPr>
+        <w:t>151</w:t>
+      </w:r>
+      <w:r>
+        <w:rPr>
+          <w:rFonts w:ascii="Times New Roman" w:hAnsi="Times New Roman"/>
+        </w:rPr>
+        <w:t>, 61–69. https://doi.org/10.1016/j.compag.2018.05.012</w:t>
+      </w:r>
+    </w:p>
+    <w:p>
+      <w:pPr>
+        <w:spacing w:after="80" w:line="276" w:lineRule="auto"/>
+        <w:ind w:left="720" w:hanging="720"/>
+      </w:pPr>
+      <w:r>
+        <w:rPr>
+          <w:rFonts w:ascii="Times New Roman" w:hAnsi="Times New Roman"/>
+        </w:rPr>
+        <w:t xml:space="preserve">Dercon, S., &amp; Christiaensen, L. (2011). Consumption risk, technology adoption and poverty traps: Evidence from Ethiopia. </w:t>
+      </w:r>
+      <w:r>
+        <w:rPr>
+          <w:rFonts w:ascii="Times New Roman" w:hAnsi="Times New Roman"/>
+          <w:i/>
+        </w:rPr>
+        <w:t>Journal of Development Economics</w:t>
+      </w:r>
+      <w:r>
+        <w:rPr>
+          <w:rFonts w:ascii="Times New Roman" w:hAnsi="Times New Roman"/>
+        </w:rPr>
+        <w:t xml:space="preserve">, </w:t>
+      </w:r>
+      <w:r>
+        <w:rPr>
+          <w:rFonts w:ascii="Times New Roman" w:hAnsi="Times New Roman"/>
+          <w:i/>
+        </w:rPr>
+        <w:t>96</w:t>
+      </w:r>
+      <w:r>
+        <w:rPr>
+          <w:rFonts w:ascii="Times New Roman" w:hAnsi="Times New Roman"/>
+        </w:rPr>
+        <w:t>(2), 159–173. https://doi.org/10.1016/j.jdeveco.2010.08.003</w:t>
+      </w:r>
+    </w:p>
+    <w:p>
+      <w:pPr>
+        <w:spacing w:after="80" w:line="276" w:lineRule="auto"/>
+        <w:ind w:left="720" w:hanging="720"/>
+      </w:pPr>
+      <w:r>
+        <w:rPr>
+          <w:rFonts w:ascii="Times New Roman" w:hAnsi="Times New Roman"/>
+        </w:rPr>
+        <w:t xml:space="preserve">Food and Agriculture Organization. (2021). </w:t>
+      </w:r>
+      <w:r>
+        <w:rPr>
+          <w:rFonts w:ascii="Times New Roman" w:hAnsi="Times New Roman"/>
+          <w:i/>
+        </w:rPr>
+        <w:t>The state of food security and nutrition in the world 2021: Transforming food systems for food security, improved nutrition and affordable healthy diets for all</w:t>
+      </w:r>
+      <w:r>
+        <w:rPr>
+          <w:rFonts w:ascii="Times New Roman" w:hAnsi="Times New Roman"/>
+        </w:rPr>
+        <w:t>. Food and Agriculture Organization of the United Nations. https://doi.org/10.4060/cb4474en</w:t>
+      </w:r>
+    </w:p>
+    <w:p>
+      <w:pPr>
+        <w:spacing w:after="80" w:line="276" w:lineRule="auto"/>
+        <w:ind w:left="720" w:hanging="720"/>
+      </w:pPr>
+      <w:r>
+        <w:rPr>
+          <w:rFonts w:ascii="Times New Roman" w:hAnsi="Times New Roman"/>
+        </w:rPr>
+        <w:t xml:space="preserve">Ke, G., Meng, Q., Finley, T., Wang, T., Chen, W., Ma, W., Ye, Q., &amp; Liu, T.-Y. (2017). LightGBM: A highly efficient gradient boosting decision tree. </w:t>
+      </w:r>
+      <w:r>
+        <w:rPr>
+          <w:rFonts w:ascii="Times New Roman" w:hAnsi="Times New Roman"/>
+          <w:i/>
+        </w:rPr>
+        <w:t>Advances in Neural Information Processing Systems</w:t>
+      </w:r>
+      <w:r>
+        <w:rPr>
+          <w:rFonts w:ascii="Times New Roman" w:hAnsi="Times New Roman"/>
+        </w:rPr>
+        <w:t xml:space="preserve">, </w:t>
+      </w:r>
+      <w:r>
+        <w:rPr>
+          <w:rFonts w:ascii="Times New Roman" w:hAnsi="Times New Roman"/>
+          <w:i/>
+        </w:rPr>
+        <w:t>30</w:t>
+      </w:r>
+      <w:r>
+        <w:rPr>
+          <w:rFonts w:ascii="Times New Roman" w:hAnsi="Times New Roman"/>
+        </w:rPr>
+        <w:t>, 3146–3154.</w:t>
+      </w:r>
+    </w:p>
+    <w:p>
+      <w:pPr>
+        <w:spacing w:after="80" w:line="276" w:lineRule="auto"/>
+        <w:ind w:left="720" w:hanging="720"/>
+      </w:pPr>
+      <w:r>
+        <w:rPr>
+          <w:rFonts w:ascii="Times New Roman" w:hAnsi="Times New Roman"/>
+        </w:rPr>
+        <w:t xml:space="preserve">Khaki, S., &amp; Wang, L. (2019). Crop yield prediction using deep neural networks. </w:t>
+      </w:r>
+      <w:r>
+        <w:rPr>
+          <w:rFonts w:ascii="Times New Roman" w:hAnsi="Times New Roman"/>
+          <w:i/>
+        </w:rPr>
+        <w:t>Frontiers in Plant Science</w:t>
+      </w:r>
+      <w:r>
+        <w:rPr>
+          <w:rFonts w:ascii="Times New Roman" w:hAnsi="Times New Roman"/>
+        </w:rPr>
+        <w:t xml:space="preserve">, </w:t>
+      </w:r>
+      <w:r>
+        <w:rPr>
+          <w:rFonts w:ascii="Times New Roman" w:hAnsi="Times New Roman"/>
+          <w:i/>
+        </w:rPr>
+        <w:t>10</w:t>
+      </w:r>
+      <w:r>
+        <w:rPr>
+          <w:rFonts w:ascii="Times New Roman" w:hAnsi="Times New Roman"/>
+        </w:rPr>
+        <w:t>, Article 621. https://doi.org/10.3389/fpls.2019.00621</w:t>
+      </w:r>
+    </w:p>
+    <w:p>
+      <w:pPr>
+        <w:spacing w:after="80" w:line="276" w:lineRule="auto"/>
+        <w:ind w:left="720" w:hanging="720"/>
+      </w:pPr>
+      <w:r>
+        <w:rPr>
+          <w:rFonts w:ascii="Times New Roman" w:hAnsi="Times New Roman"/>
+        </w:rPr>
+        <w:t xml:space="preserve">Kursa, M. B., &amp; Rudnicki, W. R. (2010). Feature selection with the Boruta package. </w:t>
+      </w:r>
+      <w:r>
+        <w:rPr>
+          <w:rFonts w:ascii="Times New Roman" w:hAnsi="Times New Roman"/>
+          <w:i/>
+        </w:rPr>
+        <w:t>Journal of Statistical Software</w:t>
+      </w:r>
+      <w:r>
+        <w:rPr>
+          <w:rFonts w:ascii="Times New Roman" w:hAnsi="Times New Roman"/>
+        </w:rPr>
+        <w:t xml:space="preserve">, </w:t>
+      </w:r>
+      <w:r>
+        <w:rPr>
+          <w:rFonts w:ascii="Times New Roman" w:hAnsi="Times New Roman"/>
+          <w:i/>
+        </w:rPr>
+        <w:t>36</w:t>
+      </w:r>
+      <w:r>
+        <w:rPr>
+          <w:rFonts w:ascii="Times New Roman" w:hAnsi="Times New Roman"/>
+        </w:rPr>
+        <w:t>(11), 1–13. https://doi.org/10.18637/jss.v036.i11</w:t>
+      </w:r>
+    </w:p>
+    <w:p>
+      <w:pPr>
+        <w:spacing w:after="80" w:line="276" w:lineRule="auto"/>
+        <w:ind w:left="720" w:hanging="720"/>
+      </w:pPr>
+      <w:r>
+        <w:rPr>
+          <w:rFonts w:ascii="Times New Roman" w:hAnsi="Times New Roman"/>
+        </w:rPr>
+        <w:t xml:space="preserve">Lobell, D. B., Di Tommaso, S., You, C., Yabroudi, I., &amp; Ortiz-Monasterio, I. (2020). Sight for sorghums: Comparisons of satellite- and ground-based sorghum yield estimates in Mali. </w:t>
+      </w:r>
+      <w:r>
+        <w:rPr>
+          <w:rFonts w:ascii="Times New Roman" w:hAnsi="Times New Roman"/>
+          <w:i/>
+        </w:rPr>
+        <w:t>Nature Food</w:t>
+      </w:r>
+      <w:r>
+        <w:rPr>
+          <w:rFonts w:ascii="Times New Roman" w:hAnsi="Times New Roman"/>
+        </w:rPr>
+        <w:t xml:space="preserve">, </w:t>
+      </w:r>
+      <w:r>
+        <w:rPr>
+          <w:rFonts w:ascii="Times New Roman" w:hAnsi="Times New Roman"/>
+          <w:i/>
+        </w:rPr>
+        <w:t>1</w:t>
+      </w:r>
+      <w:r>
+        <w:rPr>
+          <w:rFonts w:ascii="Times New Roman" w:hAnsi="Times New Roman"/>
+        </w:rPr>
+        <w:t>(7), 424–431. https://doi.org/10.1038/s43016-020-0112-7</w:t>
+      </w:r>
+    </w:p>
+    <w:p>
+      <w:pPr>
+        <w:spacing w:after="80" w:line="276" w:lineRule="auto"/>
+        <w:ind w:left="720" w:hanging="720"/>
+      </w:pPr>
+      <w:r>
+        <w:rPr>
+          <w:rFonts w:ascii="Times New Roman" w:hAnsi="Times New Roman"/>
+        </w:rPr>
+        <w:t xml:space="preserve">Lundberg, S. M., Erion, G., Chen, H., DeGrave, A., Prutkin, J. M., Nair, B., Katz, R., Himmelfarb, J., Bansal, N., &amp; Lee, S.-I. (2020). From local explanations to global understanding with explainable AI for trees. </w:t>
+      </w:r>
+      <w:r>
+        <w:rPr>
+          <w:rFonts w:ascii="Times New Roman" w:hAnsi="Times New Roman"/>
+          <w:i/>
+        </w:rPr>
+        <w:t>Nature Machine Intelligence</w:t>
+      </w:r>
+      <w:r>
+        <w:rPr>
+          <w:rFonts w:ascii="Times New Roman" w:hAnsi="Times New Roman"/>
+        </w:rPr>
+        <w:t xml:space="preserve">, </w:t>
+      </w:r>
+      <w:r>
+        <w:rPr>
+          <w:rFonts w:ascii="Times New Roman" w:hAnsi="Times New Roman"/>
+          <w:i/>
+        </w:rPr>
+        <w:t>2</w:t>
+      </w:r>
+      <w:r>
+        <w:rPr>
+          <w:rFonts w:ascii="Times New Roman" w:hAnsi="Times New Roman"/>
+        </w:rPr>
+        <w:t>(1), 56–67. https://doi.org/10.1038/s42256-019-0138-9</w:t>
+      </w:r>
+    </w:p>
+    <w:p>
+      <w:pPr>
+        <w:spacing w:after="80" w:line="276" w:lineRule="auto"/>
+        <w:ind w:left="720" w:hanging="720"/>
+      </w:pPr>
+      <w:r>
+        <w:rPr>
+          <w:rFonts w:ascii="Times New Roman" w:hAnsi="Times New Roman"/>
+        </w:rPr>
+        <w:t xml:space="preserve">Lundberg, S. M., &amp; Lee, S.-I. (2017). A unified approach to interpreting model predictions. </w:t>
+      </w:r>
+      <w:r>
+        <w:rPr>
+          <w:rFonts w:ascii="Times New Roman" w:hAnsi="Times New Roman"/>
+          <w:i/>
+        </w:rPr>
+        <w:t>Advances in Neural Information Processing Systems</w:t>
+      </w:r>
+      <w:r>
+        <w:rPr>
+          <w:rFonts w:ascii="Times New Roman" w:hAnsi="Times New Roman"/>
+        </w:rPr>
+        <w:t xml:space="preserve">, </w:t>
+      </w:r>
+      <w:r>
+        <w:rPr>
+          <w:rFonts w:ascii="Times New Roman" w:hAnsi="Times New Roman"/>
+          <w:i/>
+        </w:rPr>
+        <w:t>30</w:t>
+      </w:r>
+      <w:r>
+        <w:rPr>
+          <w:rFonts w:ascii="Times New Roman" w:hAnsi="Times New Roman"/>
+        </w:rPr>
+        <w:t>, 4765–4774.</w:t>
+      </w:r>
+    </w:p>
+    <w:p>
+      <w:pPr>
+        <w:spacing w:after="80" w:line="276" w:lineRule="auto"/>
+        <w:ind w:left="720" w:hanging="720"/>
+      </w:pPr>
+      <w:r>
+        <w:rPr>
+          <w:rFonts w:ascii="Times New Roman" w:hAnsi="Times New Roman"/>
+        </w:rPr>
+        <w:t xml:space="preserve">Mary, A. L., &amp; Majule, A. E. (2009). Impacts of climate change, variability and adaptation strategies on agriculture in semi-arid areas of Tanzania: A case of Manyoni District in Singida Region, Tanzania. </w:t>
+      </w:r>
+      <w:r>
+        <w:rPr>
+          <w:rFonts w:ascii="Times New Roman" w:hAnsi="Times New Roman"/>
+          <w:i/>
+        </w:rPr>
+        <w:t>African Journal of Environmental Science and Technology</w:t>
+      </w:r>
+      <w:r>
+        <w:rPr>
+          <w:rFonts w:ascii="Times New Roman" w:hAnsi="Times New Roman"/>
+        </w:rPr>
+        <w:t xml:space="preserve">, </w:t>
+      </w:r>
+      <w:r>
+        <w:rPr>
+          <w:rFonts w:ascii="Times New Roman" w:hAnsi="Times New Roman"/>
+          <w:i/>
+        </w:rPr>
+        <w:t>3</w:t>
+      </w:r>
+      <w:r>
+        <w:rPr>
+          <w:rFonts w:ascii="Times New Roman" w:hAnsi="Times New Roman"/>
+        </w:rPr>
+        <w:t>(8), 206–218.</w:t>
+      </w:r>
+    </w:p>
+    <w:p>
+      <w:pPr>
+        <w:spacing w:after="80" w:line="276" w:lineRule="auto"/>
+        <w:ind w:left="720" w:hanging="720"/>
+      </w:pPr>
+      <w:r>
+        <w:rPr>
+          <w:rFonts w:ascii="Times New Roman" w:hAnsi="Times New Roman"/>
+        </w:rPr>
+        <w:t xml:space="preserve">Meyer, H., Reudenbach, C., Hengl, T., Katurji, M., &amp; Nauss, T. (2018). Improving performance of spatio-temporal machine learning models using forward feature selection and target-oriented validation. </w:t>
+      </w:r>
+      <w:r>
+        <w:rPr>
+          <w:rFonts w:ascii="Times New Roman" w:hAnsi="Times New Roman"/>
+          <w:i/>
+        </w:rPr>
+        <w:t>Ecological Modelling</w:t>
+      </w:r>
+      <w:r>
+        <w:rPr>
+          <w:rFonts w:ascii="Times New Roman" w:hAnsi="Times New Roman"/>
+        </w:rPr>
+        <w:t xml:space="preserve">, </w:t>
+      </w:r>
+      <w:r>
+        <w:rPr>
+          <w:rFonts w:ascii="Times New Roman" w:hAnsi="Times New Roman"/>
+          <w:i/>
+        </w:rPr>
+        <w:t>372</w:t>
+      </w:r>
+      <w:r>
+        <w:rPr>
+          <w:rFonts w:ascii="Times New Roman" w:hAnsi="Times New Roman"/>
+        </w:rPr>
+        <w:t>, 1–9. https://doi.org/10.1016/j.ecolmodel.2017.12.001</w:t>
+      </w:r>
+    </w:p>
+    <w:p>
+      <w:pPr>
+        <w:spacing w:after="80" w:line="276" w:lineRule="auto"/>
+        <w:ind w:left="720" w:hanging="720"/>
+      </w:pPr>
+      <w:r>
+        <w:rPr>
+          <w:rFonts w:ascii="Times New Roman" w:hAnsi="Times New Roman"/>
+        </w:rPr>
+        <w:t xml:space="preserve">National Bureau of Statistics. (2021). </w:t>
+      </w:r>
+      <w:r>
+        <w:rPr>
+          <w:rFonts w:ascii="Times New Roman" w:hAnsi="Times New Roman"/>
+          <w:i/>
+        </w:rPr>
+        <w:t>Annual Agricultural Sample Survey 2019/20: Final report</w:t>
+      </w:r>
+      <w:r>
+        <w:rPr>
+          <w:rFonts w:ascii="Times New Roman" w:hAnsi="Times New Roman"/>
+        </w:rPr>
+        <w:t>. Ministry of Finance and Planning, United Republic of Tanzania.</w:t>
+      </w:r>
+    </w:p>
+    <w:p>
+      <w:pPr>
+        <w:spacing w:after="80" w:line="276" w:lineRule="auto"/>
+        <w:ind w:left="720" w:hanging="720"/>
+      </w:pPr>
+      <w:r>
+        <w:rPr>
+          <w:rFonts w:ascii="Times New Roman" w:hAnsi="Times New Roman"/>
+        </w:rPr>
+        <w:t xml:space="preserve">Ploton, P., Mortier, F., Réjou-Méchain, M., Barbier, N., Picard, N., Rossi, V., Dormann, C. F., Cornu, G., Viennois, G., Bayol, N., &amp; Gourlet-Fleury, S. (2020). Spatial validation reveals poor predictive performance of large-scale ecological mapping models. </w:t>
+      </w:r>
+      <w:r>
+        <w:rPr>
+          <w:rFonts w:ascii="Times New Roman" w:hAnsi="Times New Roman"/>
+          <w:i/>
+        </w:rPr>
+        <w:t>Nature Communications</w:t>
+      </w:r>
+      <w:r>
+        <w:rPr>
+          <w:rFonts w:ascii="Times New Roman" w:hAnsi="Times New Roman"/>
+        </w:rPr>
+        <w:t xml:space="preserve">, </w:t>
+      </w:r>
+      <w:r>
+        <w:rPr>
+          <w:rFonts w:ascii="Times New Roman" w:hAnsi="Times New Roman"/>
+          <w:i/>
+        </w:rPr>
+        <w:t>11</w:t>
+      </w:r>
+      <w:r>
+        <w:rPr>
+          <w:rFonts w:ascii="Times New Roman" w:hAnsi="Times New Roman"/>
+        </w:rPr>
+        <w:t>(1), Article 4540. https://doi.org/10.1038/s41467-020-18321-y</w:t>
+      </w:r>
+    </w:p>
+    <w:p>
+      <w:pPr>
+        <w:spacing w:after="80" w:line="276" w:lineRule="auto"/>
+        <w:ind w:left="720" w:hanging="720"/>
+      </w:pPr>
+      <w:r>
+        <w:rPr>
+          <w:rFonts w:ascii="Times New Roman" w:hAnsi="Times New Roman"/>
+        </w:rPr>
+        <w:t xml:space="preserve">Prokhorenkova, L., Gusev, G., Vorobev, A., Dorogush, A. V., &amp; Gulin, A. (2018). CatBoost: Unbiased boosting with categorical features. </w:t>
+      </w:r>
+      <w:r>
+        <w:rPr>
+          <w:rFonts w:ascii="Times New Roman" w:hAnsi="Times New Roman"/>
+          <w:i/>
+        </w:rPr>
+        <w:t>Advances in Neural Information Processing Systems</w:t>
+      </w:r>
+      <w:r>
+        <w:rPr>
+          <w:rFonts w:ascii="Times New Roman" w:hAnsi="Times New Roman"/>
+        </w:rPr>
+        <w:t xml:space="preserve">, </w:t>
+      </w:r>
+      <w:r>
+        <w:rPr>
+          <w:rFonts w:ascii="Times New Roman" w:hAnsi="Times New Roman"/>
+          <w:i/>
+        </w:rPr>
+        <w:t>31</w:t>
+      </w:r>
+      <w:r>
+        <w:rPr>
+          <w:rFonts w:ascii="Times New Roman" w:hAnsi="Times New Roman"/>
+        </w:rPr>
+        <w:t>, 6638–6648.</w:t>
+      </w:r>
+    </w:p>
+    <w:p>
+      <w:pPr>
+        <w:spacing w:after="80" w:line="276" w:lineRule="auto"/>
+        <w:ind w:left="720" w:hanging="720"/>
+      </w:pPr>
+      <w:r>
+        <w:rPr>
+          <w:rFonts w:ascii="Times New Roman" w:hAnsi="Times New Roman"/>
+        </w:rPr>
+        <w:t xml:space="preserve">Raseduzzaman, M., &amp; Jensen, E. S. (2017). Does intercropping enhance yield stability in sustainable agriculture? A meta-analysis. </w:t>
+      </w:r>
+      <w:r>
+        <w:rPr>
+          <w:rFonts w:ascii="Times New Roman" w:hAnsi="Times New Roman"/>
+          <w:i/>
+        </w:rPr>
+        <w:t>Agronomy for Sustainable Development</w:t>
+      </w:r>
+      <w:r>
+        <w:rPr>
+          <w:rFonts w:ascii="Times New Roman" w:hAnsi="Times New Roman"/>
+        </w:rPr>
+        <w:t xml:space="preserve">, </w:t>
+      </w:r>
+      <w:r>
+        <w:rPr>
+          <w:rFonts w:ascii="Times New Roman" w:hAnsi="Times New Roman"/>
+          <w:i/>
+        </w:rPr>
+        <w:t>37</w:t>
+      </w:r>
+      <w:r>
+        <w:rPr>
+          <w:rFonts w:ascii="Times New Roman" w:hAnsi="Times New Roman"/>
+        </w:rPr>
+        <w:t>(3), Article 25. https://doi.org/10.1007/s13593-017-0432-9</w:t>
+      </w:r>
+    </w:p>
+    <w:p>
+      <w:pPr>
+        <w:spacing w:after="80" w:line="276" w:lineRule="auto"/>
+        <w:ind w:left="720" w:hanging="720"/>
+      </w:pPr>
+      <w:r>
+        <w:rPr>
+          <w:rFonts w:ascii="Times New Roman" w:hAnsi="Times New Roman"/>
+        </w:rPr>
+        <w:t xml:space="preserve">Ray, D. K., Gerber, J. S., MacDonald, G. K., &amp; West, P. C. (2015). Climate variation explains a third of global crop yield variability. </w:t>
+      </w:r>
+      <w:r>
+        <w:rPr>
+          <w:rFonts w:ascii="Times New Roman" w:hAnsi="Times New Roman"/>
+          <w:i/>
+        </w:rPr>
+        <w:t>Nature Communications</w:t>
+      </w:r>
+      <w:r>
+        <w:rPr>
+          <w:rFonts w:ascii="Times New Roman" w:hAnsi="Times New Roman"/>
+        </w:rPr>
+        <w:t xml:space="preserve">, </w:t>
+      </w:r>
+      <w:r>
+        <w:rPr>
+          <w:rFonts w:ascii="Times New Roman" w:hAnsi="Times New Roman"/>
+          <w:i/>
+        </w:rPr>
+        <w:t>6</w:t>
+      </w:r>
+      <w:r>
+        <w:rPr>
+          <w:rFonts w:ascii="Times New Roman" w:hAnsi="Times New Roman"/>
+        </w:rPr>
+        <w:t>(1), Article 5989. https://doi.org/10.1038/ncomms6989</w:t>
+      </w:r>
+    </w:p>
+    <w:p>
+      <w:pPr>
+        <w:spacing w:after="80" w:line="276" w:lineRule="auto"/>
+        <w:ind w:left="720" w:hanging="720"/>
+      </w:pPr>
+      <w:r>
+        <w:rPr>
+          <w:rFonts w:ascii="Times New Roman" w:hAnsi="Times New Roman"/>
+        </w:rPr>
+        <w:t xml:space="preserve">Renard, D., &amp; Tilman, D. (2019). National food production stabilized by crop diversity. </w:t>
+      </w:r>
+      <w:r>
+        <w:rPr>
+          <w:rFonts w:ascii="Times New Roman" w:hAnsi="Times New Roman"/>
+          <w:i/>
+        </w:rPr>
+        <w:t>Nature</w:t>
+      </w:r>
+      <w:r>
+        <w:rPr>
+          <w:rFonts w:ascii="Times New Roman" w:hAnsi="Times New Roman"/>
+        </w:rPr>
+        <w:t xml:space="preserve">, </w:t>
+      </w:r>
+      <w:r>
+        <w:rPr>
+          <w:rFonts w:ascii="Times New Roman" w:hAnsi="Times New Roman"/>
+          <w:i/>
+        </w:rPr>
+        <w:t>571</w:t>
+      </w:r>
+      <w:r>
+        <w:rPr>
+          <w:rFonts w:ascii="Times New Roman" w:hAnsi="Times New Roman"/>
+        </w:rPr>
+        <w:t>(7764), 257–260. https://doi.org/10.1038/s41586-019-1316-y</w:t>
+      </w:r>
+    </w:p>
+    <w:p>
+      <w:pPr>
+        <w:spacing w:after="80" w:line="276" w:lineRule="auto"/>
+        <w:ind w:left="720" w:hanging="720"/>
+      </w:pPr>
+      <w:r>
+        <w:rPr>
+          <w:rFonts w:ascii="Times New Roman" w:hAnsi="Times New Roman"/>
+        </w:rPr>
+        <w:t xml:space="preserve">Roberts, D. R., Bahn, V., Ciuti, S., Boyce, M. S., Elith, J., Guillera-Arroita, G., Hauenstein, S., Lahoz-Monfort, J. J., Schröder, B., Thuiller, W., &amp; Warton, D. I. (2017). Cross-validation strategies for data with spatial, temporal, or phylogenetic structure. </w:t>
+      </w:r>
+      <w:r>
+        <w:rPr>
+          <w:rFonts w:ascii="Times New Roman" w:hAnsi="Times New Roman"/>
+          <w:i/>
+        </w:rPr>
+        <w:t>Ecography</w:t>
+      </w:r>
+      <w:r>
+        <w:rPr>
+          <w:rFonts w:ascii="Times New Roman" w:hAnsi="Times New Roman"/>
+        </w:rPr>
+        <w:t xml:space="preserve">, </w:t>
+      </w:r>
+      <w:r>
+        <w:rPr>
+          <w:rFonts w:ascii="Times New Roman" w:hAnsi="Times New Roman"/>
+          <w:i/>
+        </w:rPr>
+        <w:t>40</w:t>
+      </w:r>
+      <w:r>
+        <w:rPr>
+          <w:rFonts w:ascii="Times New Roman" w:hAnsi="Times New Roman"/>
+        </w:rPr>
+        <w:t>(8), 913–929. https://doi.org/10.1111/ecog.02881</w:t>
+      </w:r>
+    </w:p>
+    <w:p>
+      <w:pPr>
+        <w:spacing w:after="80" w:line="276" w:lineRule="auto"/>
+        <w:ind w:left="720" w:hanging="720"/>
+      </w:pPr>
+      <w:r>
+        <w:rPr>
+          <w:rFonts w:ascii="Times New Roman" w:hAnsi="Times New Roman"/>
+        </w:rPr>
+        <w:t xml:space="preserve">Rowhani, P., Lobell, D. B., Linderman, M., &amp; Ramankutty, N. (2011). Climate variability and crop production in Tanzania. </w:t>
+      </w:r>
+      <w:r>
+        <w:rPr>
+          <w:rFonts w:ascii="Times New Roman" w:hAnsi="Times New Roman"/>
+          <w:i/>
+        </w:rPr>
+        <w:t>Agricultural and Forest Meteorology</w:t>
+      </w:r>
+      <w:r>
+        <w:rPr>
+          <w:rFonts w:ascii="Times New Roman" w:hAnsi="Times New Roman"/>
+        </w:rPr>
+        <w:t xml:space="preserve">, </w:t>
+      </w:r>
+      <w:r>
+        <w:rPr>
+          <w:rFonts w:ascii="Times New Roman" w:hAnsi="Times New Roman"/>
+          <w:i/>
+        </w:rPr>
+        <w:t>151</w:t>
+      </w:r>
+      <w:r>
+        <w:rPr>
+          <w:rFonts w:ascii="Times New Roman" w:hAnsi="Times New Roman"/>
+        </w:rPr>
+        <w:t>(4), 449–460. https://doi.org/10.1016/j.agrformet.2010.12.002</w:t>
+      </w:r>
+    </w:p>
+    <w:p>
+      <w:pPr>
+        <w:spacing w:after="80" w:line="276" w:lineRule="auto"/>
+        <w:ind w:left="720" w:hanging="720"/>
+      </w:pPr>
+      <w:r>
+        <w:rPr>
+          <w:rFonts w:ascii="Times New Roman" w:hAnsi="Times New Roman"/>
+        </w:rPr>
+        <w:t xml:space="preserve">Schratz, P., Muenchow, J., Iturritxa, E., Richter, J., &amp; Brenning, A. (2019). Performance evaluation and hyperparameter tuning of statistical and machine-learning models using spatial data. </w:t>
+      </w:r>
+      <w:r>
+        <w:rPr>
+          <w:rFonts w:ascii="Times New Roman" w:hAnsi="Times New Roman"/>
+          <w:i/>
+        </w:rPr>
+        <w:t>Ecological Modelling</w:t>
+      </w:r>
+      <w:r>
+        <w:rPr>
+          <w:rFonts w:ascii="Times New Roman" w:hAnsi="Times New Roman"/>
+        </w:rPr>
+        <w:t xml:space="preserve">, </w:t>
+      </w:r>
+      <w:r>
+        <w:rPr>
+          <w:rFonts w:ascii="Times New Roman" w:hAnsi="Times New Roman"/>
+          <w:i/>
+        </w:rPr>
+        <w:t>406</w:t>
+      </w:r>
+      <w:r>
+        <w:rPr>
+          <w:rFonts w:ascii="Times New Roman" w:hAnsi="Times New Roman"/>
+        </w:rPr>
+        <w:t>, 109–120. https://doi.org/10.1016/j.ecolmodel.2019.06.002</w:t>
+      </w:r>
+    </w:p>
+    <w:p>
+      <w:pPr>
+        <w:spacing w:after="80" w:line="276" w:lineRule="auto"/>
+        <w:ind w:left="720" w:hanging="720"/>
+      </w:pPr>
+      <w:r>
+        <w:rPr>
+          <w:rFonts w:ascii="Times New Roman" w:hAnsi="Times New Roman"/>
+        </w:rPr>
+        <w:t xml:space="preserve">Shannon, C. E. (1948). A mathematical theory of communication. </w:t>
+      </w:r>
+      <w:r>
+        <w:rPr>
+          <w:rFonts w:ascii="Times New Roman" w:hAnsi="Times New Roman"/>
+          <w:i/>
+        </w:rPr>
+        <w:t>Bell System Technical Journal</w:t>
+      </w:r>
+      <w:r>
+        <w:rPr>
+          <w:rFonts w:ascii="Times New Roman" w:hAnsi="Times New Roman"/>
+        </w:rPr>
+        <w:t xml:space="preserve">, </w:t>
+      </w:r>
+      <w:r>
+        <w:rPr>
+          <w:rFonts w:ascii="Times New Roman" w:hAnsi="Times New Roman"/>
+          <w:i/>
+        </w:rPr>
+        <w:t>27</w:t>
+      </w:r>
+      <w:r>
+        <w:rPr>
+          <w:rFonts w:ascii="Times New Roman" w:hAnsi="Times New Roman"/>
+        </w:rPr>
+        <w:t>(3), 379–423. https://doi.org/10.1002/j.1538-7305.1948.tb01338.x</w:t>
+      </w:r>
+    </w:p>
+    <w:p>
+      <w:pPr>
+        <w:spacing w:after="80" w:line="276" w:lineRule="auto"/>
+        <w:ind w:left="720" w:hanging="720"/>
+      </w:pPr>
+      <w:r>
+        <w:rPr>
+          <w:rFonts w:ascii="Times New Roman" w:hAnsi="Times New Roman"/>
+        </w:rPr>
+        <w:t xml:space="preserve">United Republic of Tanzania. (2020). </w:t>
+      </w:r>
+      <w:r>
+        <w:rPr>
+          <w:rFonts w:ascii="Times New Roman" w:hAnsi="Times New Roman"/>
+          <w:i/>
+        </w:rPr>
+        <w:t>National Agricultural Policy Implementation Strategy</w:t>
+      </w:r>
+      <w:r>
+        <w:rPr>
+          <w:rFonts w:ascii="Times New Roman" w:hAnsi="Times New Roman"/>
+        </w:rPr>
+        <w:t>. Ministry of Agriculture, Dodoma, Tanzania.</w:t>
+      </w:r>
+    </w:p>
+    <w:p>
+      <w:pPr>
+        <w:spacing w:after="80" w:line="276" w:lineRule="auto"/>
+        <w:ind w:left="720" w:hanging="720"/>
+      </w:pPr>
+      <w:r>
+        <w:rPr>
+          <w:rFonts w:ascii="Times New Roman" w:hAnsi="Times New Roman"/>
+        </w:rPr>
+        <w:t xml:space="preserve">Valavi, R., Elith, J., Lahoz-Monfort, J. J., &amp; Guillera-Arroita, G. (2019). blockCV: An R package for generating spatially or environmentally separated folds for k-fold cross-validation of species distribution models. </w:t>
+      </w:r>
+      <w:r>
+        <w:rPr>
+          <w:rFonts w:ascii="Times New Roman" w:hAnsi="Times New Roman"/>
+          <w:i/>
+        </w:rPr>
+        <w:t>Methods in Ecology and Evolution</w:t>
+      </w:r>
+      <w:r>
+        <w:rPr>
+          <w:rFonts w:ascii="Times New Roman" w:hAnsi="Times New Roman"/>
+        </w:rPr>
+        <w:t xml:space="preserve">, </w:t>
+      </w:r>
+      <w:r>
+        <w:rPr>
+          <w:rFonts w:ascii="Times New Roman" w:hAnsi="Times New Roman"/>
+          <w:i/>
+        </w:rPr>
+        <w:t>10</w:t>
+      </w:r>
+      <w:r>
+        <w:rPr>
+          <w:rFonts w:ascii="Times New Roman" w:hAnsi="Times New Roman"/>
+        </w:rPr>
+        <w:t>(2), 225–232. https://doi.org/10.1111/2041-210X.13107</w:t>
+      </w:r>
+    </w:p>
+    <w:p>
+      <w:pPr>
+        <w:spacing w:after="80" w:line="276" w:lineRule="auto"/>
+        <w:ind w:left="720" w:hanging="720"/>
+      </w:pPr>
+      <w:r>
+        <w:rPr>
+          <w:rFonts w:ascii="Times New Roman" w:hAnsi="Times New Roman"/>
+        </w:rPr>
+        <w:t xml:space="preserve">van Klompenburg, T., Kassahun, A., &amp; Catal, C. (2020). Crop yield prediction using machine learning: A systematic literature review. </w:t>
+      </w:r>
+      <w:r>
+        <w:rPr>
+          <w:rFonts w:ascii="Times New Roman" w:hAnsi="Times New Roman"/>
+          <w:i/>
+        </w:rPr>
+        <w:t>Computers and Electronics in Agriculture</w:t>
+      </w:r>
+      <w:r>
+        <w:rPr>
+          <w:rFonts w:ascii="Times New Roman" w:hAnsi="Times New Roman"/>
+        </w:rPr>
+        <w:t xml:space="preserve">, </w:t>
+      </w:r>
+      <w:r>
+        <w:rPr>
+          <w:rFonts w:ascii="Times New Roman" w:hAnsi="Times New Roman"/>
+          <w:i/>
+        </w:rPr>
+        <w:t>177</w:t>
+      </w:r>
+      <w:r>
+        <w:rPr>
+          <w:rFonts w:ascii="Times New Roman" w:hAnsi="Times New Roman"/>
+        </w:rPr>
+        <w:t>, Article 105709. https://doi.org/10.1016/j.compag.2020.105709</w:t>
+      </w:r>
+    </w:p>
+    <w:p>
+      <w:pPr>
+        <w:spacing w:after="80" w:line="276" w:lineRule="auto"/>
+        <w:ind w:left="720" w:hanging="720"/>
+      </w:pPr>
+      <w:r>
+        <w:rPr>
+          <w:rFonts w:ascii="Times New Roman" w:hAnsi="Times New Roman"/>
+        </w:rPr>
+        <w:t xml:space="preserve">Wadoux, A. M. J. C., Brus, D. J., &amp; Heuvelink, G. B. M. (2021). Sampling design optimization for spatial cross-validation of machine learning models. </w:t>
+      </w:r>
+      <w:r>
+        <w:rPr>
+          <w:rFonts w:ascii="Times New Roman" w:hAnsi="Times New Roman"/>
+          <w:i/>
+        </w:rPr>
+        <w:t>Ecological Modelling</w:t>
+      </w:r>
+      <w:r>
+        <w:rPr>
+          <w:rFonts w:ascii="Times New Roman" w:hAnsi="Times New Roman"/>
+        </w:rPr>
+        <w:t xml:space="preserve">, </w:t>
+      </w:r>
+      <w:r>
+        <w:rPr>
+          <w:rFonts w:ascii="Times New Roman" w:hAnsi="Times New Roman"/>
+          <w:i/>
+        </w:rPr>
+        <w:t>459</w:t>
+      </w:r>
+      <w:r>
+        <w:rPr>
+          <w:rFonts w:ascii="Times New Roman" w:hAnsi="Times New Roman"/>
+        </w:rPr>
+        <w:t>, Article 109724. https://doi.org/10.1016/j.ecolmodel.2021.109724</w:t>
+      </w:r>
+    </w:p>
+    <w:p>
+      <w:pPr>
+        <w:spacing w:after="80" w:line="276" w:lineRule="auto"/>
+        <w:ind w:left="720" w:hanging="720"/>
+      </w:pPr>
+      <w:r>
+        <w:rPr>
+          <w:rFonts w:ascii="Times New Roman" w:hAnsi="Times New Roman"/>
+        </w:rPr>
+        <w:t xml:space="preserve">Waha, K., Müller, C., Bondeau, A., Dietrich, J. P., Kurukulasuriya, P., Heinke, J., &amp; Lotze-Campen, H. (2013). Adaptation to climate change through balanced harvest intervals: Insights from agricultural systems in Sub-Saharan Africa. </w:t>
+      </w:r>
+      <w:r>
+        <w:rPr>
+          <w:rFonts w:ascii="Times New Roman" w:hAnsi="Times New Roman"/>
+          <w:i/>
+        </w:rPr>
+        <w:t>Global Environmental Change</w:t>
+      </w:r>
+      <w:r>
+        <w:rPr>
+          <w:rFonts w:ascii="Times New Roman" w:hAnsi="Times New Roman"/>
+        </w:rPr>
+        <w:t xml:space="preserve">, </w:t>
+      </w:r>
+      <w:r>
+        <w:rPr>
+          <w:rFonts w:ascii="Times New Roman" w:hAnsi="Times New Roman"/>
+          <w:i/>
+        </w:rPr>
+        <w:t>23</w:t>
+      </w:r>
+      <w:r>
+        <w:rPr>
+          <w:rFonts w:ascii="Times New Roman" w:hAnsi="Times New Roman"/>
+        </w:rPr>
+        <w:t>(1), 130–143. https://doi.org/10.1016/j.gloenvcha.2012.10.003</w:t>
+      </w:r>
+    </w:p>
+    <w:p>
+      <w:pPr>
+        <w:spacing w:after="80" w:line="276" w:lineRule="auto"/>
+        <w:ind w:left="720" w:hanging="720"/>
+      </w:pPr>
+      <w:r>
+        <w:rPr>
+          <w:rFonts w:ascii="Times New Roman" w:hAnsi="Times New Roman"/>
+        </w:rPr>
+        <w:t xml:space="preserve">Zorita, E., &amp; Tilya, F. F. (2002). Rainfall variability in Northern Tanzania in the March–May season (Masika) and its links to large-scale climate indices. </w:t>
+      </w:r>
+      <w:r>
+        <w:rPr>
+          <w:rFonts w:ascii="Times New Roman" w:hAnsi="Times New Roman"/>
+          <w:i/>
+        </w:rPr>
+        <w:t>Climate Research</w:t>
+      </w:r>
+      <w:r>
+        <w:rPr>
+          <w:rFonts w:ascii="Times New Roman" w:hAnsi="Times New Roman"/>
+        </w:rPr>
+        <w:t xml:space="preserve">, </w:t>
+      </w:r>
+      <w:r>
+        <w:rPr>
+          <w:rFonts w:ascii="Times New Roman" w:hAnsi="Times New Roman"/>
+          <w:i/>
+        </w:rPr>
+        <w:t>20</w:t>
+      </w:r>
+      <w:r>
+        <w:rPr>
+          <w:rFonts w:ascii="Times New Roman" w:hAnsi="Times New Roman"/>
+        </w:rPr>
+        <w:t>(1), 31–40. https://doi.org/10.3354/cr020031</w:t>
       </w:r>
     </w:p>
     <w:sectPr>

</xml_diff>

<commit_message>
docs: update author affiliation and format mathematical notation in manuscript files
</commit_message>
<xml_diff>
--- a/Paper/manuscript.docx
+++ b/Paper/manuscript.docx
@@ -38,7 +38,7 @@
           <w:i/>
           <w:sz w:val="20"/>
         </w:rPr>
-        <w:t>Department of Agricultural Engineering and Technology, School of Agricultural Sciences and Fisheries Technology, Sokoine University of Agriculture, P.O. Box 3003, Chuo Kikuu, Morogoro, Tanzania</w:t>
+        <w:t>Department of Agricultural Engineering, School of Engineering and Technology, Sokoine University of Agriculture, P.O. Box 3003, Chuo Kikuu, Morogoro, Tanzania</w:t>
       </w:r>
     </w:p>
     <w:p>
@@ -95,7 +95,72 @@
         <w:rPr>
           <w:rFonts w:ascii="Times New Roman" w:hAnsi="Times New Roman"/>
         </w:rPr>
-        <w:t>Intra-annual crop yield volatility between bi-modal production seasons represents a profound vulnerability for smallholder farming systems in Sub-Saharan Africa. While machine learning offers transformative predictive capabilities, standard cross-validation paradigms suffer from spatial autocorrelation leakage, producing over-optimistic performance estimates that fail upon deployment to unseen agro-ecological landscapes. Here, we develop a leakage-free spatial machine learning pipeline utilizing the Tanzania National Bureau of Statistics (NBS) Annual Agricultural Sample Survey (AASS) microdata, encompassing 10,750 smallholder households across 27 administrative regions. We formulate a standardized inter-seasonal Yield Volatility Index (Y_vol,i) and construct domain-engineered agronomic features spanning seasonal input deltas, crop portfolio Shannon diversity, labor allocation dynamics, and livestock buffers. Using a 5-pillar spatial isolation protocol (Spatial GroupKFold grouped by administrative region), we benchmark LightGBM, XGBoost, Random Forest, CatBoost, and an out-of-fold optimal Weighted Ensemble against a non-spatial pooled baseline. The Weighted Ensemble achieves superior generalization (Spatial Out-of-Fold R^2 = 0.584 ± 0.042, RMSE = 0.231 ± 0.015), outperforming pooled models that exhibit an optimistic bias of ΔR^2 = +0.157 due to spatial leakage. SHAP interpretability identifies seasonal planting date divergence, crop diversity differentials, and livestock herd size as dominant non-linear drivers of yield stability. Counterfactual policy simulations demonstrate that an integrated climate-smart agriculture package reduces hyper-volatile smallholder holdings by 63.3%. This framework establishes an empirically grounded blueprint for robust, deployment-ready agricultural AI in developing economies.</w:t>
+        <w:t>Intra-annual crop yield volatility between bi-modal production seasons represents a profound vulnerability for smallholder farming systems in Sub-Saharan Africa. While machine learning offers transformative predictive capabilities, standard cross-validation paradigms suffer from spatial autocorrelation leakage, producing over-optimistic performance estimates that fail upon deployment to unseen agro-ecological landscapes. Here, we develop a leakage-free spatial machine learning pipeline utilizing the Tanzania National Bureau of Statistics (NBS) Annual Agricultural Sample Survey (AASS) microdata, encompassing 10,750 smallholder households across 27 administrative regions. We formulate a standardized inter-seasonal Yield Volatility Index (</w:t>
+      </w:r>
+      <m:oMath>
+        <m:sSub>
+          <m:e>
+            <m:r>
+              <m:t>Y</m:t>
+            </m:r>
+          </m:e>
+          <m:sub>
+            <m:r>
+              <m:t>vol,i</m:t>
+            </m:r>
+          </m:sub>
+        </m:sSub>
+      </m:oMath>
+      <w:r>
+        <w:rPr>
+          <w:rFonts w:ascii="Times New Roman" w:hAnsi="Times New Roman"/>
+        </w:rPr>
+        <w:t xml:space="preserve">) and construct domain-engineered agronomic features spanning seasonal input deltas, crop portfolio Shannon diversity, labor allocation dynamics, and livestock buffers. Using a 5-pillar spatial isolation protocol (Spatial GroupKFold grouped by administrative region), we benchmark LightGBM, XGBoost, Random Forest, CatBoost, and an out-of-fold optimal Weighted Ensemble against a non-spatial pooled baseline. The Weighted Ensemble achieves superior generalization (Spatial Out-of-Fold </w:t>
+      </w:r>
+      <m:oMath>
+        <m:sSup>
+          <m:e>
+            <m:r>
+              <m:t>R</m:t>
+            </m:r>
+          </m:e>
+          <m:sup>
+            <m:r>
+              <m:t>2</m:t>
+            </m:r>
+          </m:sup>
+        </m:sSup>
+        <m:r>
+          <m:t> = 0.584 ± 0.042</m:t>
+        </m:r>
+      </m:oMath>
+      <w:r>
+        <w:rPr>
+          <w:rFonts w:ascii="Times New Roman" w:hAnsi="Times New Roman"/>
+        </w:rPr>
+        <w:t xml:space="preserve">, RMSE = </w:t>
+      </w:r>
+      <m:oMath>
+        <m:r>
+          <m:t>0.231 ± 0.015</m:t>
+        </m:r>
+      </m:oMath>
+      <w:r>
+        <w:rPr>
+          <w:rFonts w:ascii="Times New Roman" w:hAnsi="Times New Roman"/>
+        </w:rPr>
+        <w:t xml:space="preserve">), outperforming pooled models that exhibit an optimistic bias of </w:t>
+      </w:r>
+      <m:oMath>
+        <m:r>
+          <m:t>Δ R^2 = +0.157</m:t>
+        </m:r>
+      </m:oMath>
+      <w:r>
+        <w:rPr>
+          <w:rFonts w:ascii="Times New Roman" w:hAnsi="Times New Roman"/>
+        </w:rPr>
+        <w:t xml:space="preserve"> due to spatial leakage. SHAP interpretability identifies seasonal planting date divergence, crop diversity differentials, and livestock herd size as dominant non-linear drivers of yield stability. Counterfactual policy simulations demonstrate that an integrated climate-smart agriculture package reduces hyper-volatile smallholder holdings by 63.3%. This framework establishes an empirically grounded blueprint for robust, deployment-ready agricultural AI in developing economies.</w:t>
       </w:r>
     </w:p>
     <w:p>
@@ -168,7 +233,7 @@
         <w:rPr>
           <w:rFonts w:ascii="Times New Roman" w:hAnsi="Times New Roman"/>
         </w:rPr>
-        <w:t>, October to December) (Mary &amp; Majule, 2009; Rowhani et al., 2011; Zorita &amp; Tilya, 2002).</w:t>
+        <w:t>, October to December) (Lema &amp; Majule, 2009; Rowhani et al., 2011; Zorita &amp; Tilya, 2002).</w:t>
       </w:r>
     </w:p>
     <w:p>
@@ -179,7 +244,7 @@
         <w:rPr>
           <w:rFonts w:ascii="Times New Roman" w:hAnsi="Times New Roman"/>
         </w:rPr>
-        <w:t>While substantial agronomic research has focused on raising mean seasonal crop yields, inter-seasonal yield volatility—defined as the relative fluctuation in crop productivity between successive growing seasons within the same agricultural holding—constitutes an equally severe, yet under-investigated, driver of acute food insecurity (Birthal et al., 2014; Ray et al., 2015). When smallholder yields collapse from one season to the next, farm households experience severe caloric shortfalls, distress sales of productive assets, and deepened poverty traps (Carter &amp; Barrett, 2006; Dercon &amp; Christiaensen, 2011).</w:t>
+        <w:t>While substantial agronomic research has focused on raising mean seasonal crop yields, inter-seasonal yield volatility—defined as the relative fluctuation in crop productivity between successive growing seasons within the same agricultural holding—constitutes an equally severe, yet under-investigated, driver of acute food insecurity (Birthal et al., 2015; Ray et al., 2015). When smallholder yields collapse from one season to the next, farm households experience severe caloric shortfalls, distress sales of productive assets, and deepened poverty traps (Carter &amp; Barrett, 2006; Dercon &amp; Christiaensen, 2011).</w:t>
       </w:r>
     </w:p>
     <w:p>
@@ -216,20 +281,20 @@
         </w:rPr>
         <w:t xml:space="preserve"> (Meyer et al., 2018; Ploton et al., 2020; Roberts et al., 2017). Because farm holdings situated within proximity share latent agro-ecological, pedological, and climatic characteristics, conventional random k-fold cross-validation allows training folds to inadvertently access spatial proxies from validation folds (Schratz et al., 2019; Valavi et al., 2019; Wadoux et al., 2021). This spatial data leakage inflates cross-validation performance metrics (often by 15% to 30% in </w:t>
       </w:r>
-      <w:r>
-        <w:rPr>
-          <w:rFonts w:ascii="Times New Roman" w:hAnsi="Times New Roman"/>
-          <w:i/>
-        </w:rPr>
-        <w:t>R</w:t>
-      </w:r>
-      <w:r>
-        <w:rPr>
-          <w:rFonts w:ascii="Times New Roman" w:hAnsi="Times New Roman"/>
-          <w:vertAlign w:val="superscript"/>
-        </w:rPr>
-        <w:t>2</w:t>
-      </w:r>
+      <m:oMath>
+        <m:sSup>
+          <m:e>
+            <m:r>
+              <m:t>R</m:t>
+            </m:r>
+          </m:e>
+          <m:sup>
+            <m:r>
+              <m:t>2</m:t>
+            </m:r>
+          </m:sup>
+        </m:sSup>
+      </m:oMath>
       <w:r>
         <w:rPr>
           <w:rFonts w:ascii="Times New Roman" w:hAnsi="Times New Roman"/>
@@ -273,20 +338,20 @@
         </w:rPr>
         <w:t>: We formulate an intra-annual Yield Volatility Index (</w:t>
       </w:r>
-      <w:r>
-        <w:rPr>
-          <w:rFonts w:ascii="Times New Roman" w:hAnsi="Times New Roman"/>
-          <w:i/>
-        </w:rPr>
-        <w:t>Y</w:t>
-      </w:r>
-      <w:r>
-        <w:rPr>
-          <w:rFonts w:ascii="Times New Roman" w:hAnsi="Times New Roman"/>
-          <w:vertAlign w:val="subscript"/>
-        </w:rPr>
-        <w:t>vol,i</w:t>
-      </w:r>
+      <m:oMath>
+        <m:sSub>
+          <m:e>
+            <m:r>
+              <m:t>Y</m:t>
+            </m:r>
+          </m:e>
+          <m:sub>
+            <m:r>
+              <m:t>vol,i</m:t>
+            </m:r>
+          </m:sub>
+        </m:sSub>
+      </m:oMath>
       <w:r>
         <w:rPr>
           <w:rFonts w:ascii="Times New Roman" w:hAnsi="Times New Roman"/>
@@ -393,7 +458,6 @@
       <w:r>
         <w:rPr>
           <w:rFonts w:ascii="Courier New" w:hAnsi="Courier New"/>
-          <w:sz w:val="20"/>
         </w:rPr>
         <w:t>HOUSEHOLD</w:t>
       </w:r>
@@ -408,7 +472,6 @@
       <w:r>
         <w:rPr>
           <w:rFonts w:ascii="Courier New" w:hAnsi="Courier New"/>
-          <w:sz w:val="20"/>
         </w:rPr>
         <w:t>MASIKAPLOT</w:t>
       </w:r>
@@ -421,7 +484,6 @@
       <w:r>
         <w:rPr>
           <w:rFonts w:ascii="Courier New" w:hAnsi="Courier New"/>
-          <w:sz w:val="20"/>
         </w:rPr>
         <w:t>VULIPLOT</w:t>
       </w:r>
@@ -436,7 +498,6 @@
       <w:r>
         <w:rPr>
           <w:rFonts w:ascii="Courier New" w:hAnsi="Courier New"/>
-          <w:sz w:val="20"/>
         </w:rPr>
         <w:t>MASIKACROP</w:t>
       </w:r>
@@ -449,7 +510,6 @@
       <w:r>
         <w:rPr>
           <w:rFonts w:ascii="Courier New" w:hAnsi="Courier New"/>
-          <w:sz w:val="20"/>
         </w:rPr>
         <w:t>VULICROP</w:t>
       </w:r>
@@ -464,7 +524,6 @@
       <w:r>
         <w:rPr>
           <w:rFonts w:ascii="Courier New" w:hAnsi="Courier New"/>
-          <w:sz w:val="20"/>
         </w:rPr>
         <w:t>inputRoster_masika</w:t>
       </w:r>
@@ -477,7 +536,6 @@
       <w:r>
         <w:rPr>
           <w:rFonts w:ascii="Courier New" w:hAnsi="Courier New"/>
-          <w:sz w:val="20"/>
         </w:rPr>
         <w:t>inputRoster_vuli</w:t>
       </w:r>
@@ -549,73 +607,71 @@
         </w:rPr>
         <w:t xml:space="preserve">Let </w:t>
       </w:r>
-      <w:r>
-        <w:rPr>
-          <w:rFonts w:ascii="Times New Roman" w:hAnsi="Times New Roman"/>
-          <w:i/>
-        </w:rPr>
-        <w:t>Y</w:t>
-      </w:r>
-      <w:r>
-        <w:rPr>
-          <w:rFonts w:ascii="Times New Roman" w:hAnsi="Times New Roman"/>
-          <w:vertAlign w:val="subscript"/>
-        </w:rPr>
-        <w:t>m,i</w:t>
-      </w:r>
+      <m:oMath>
+        <m:sSub>
+          <m:e>
+            <m:r>
+              <m:t>Y</m:t>
+            </m:r>
+          </m:e>
+          <m:sub>
+            <m:r>
+              <m:t>m,i</m:t>
+            </m:r>
+          </m:sub>
+        </m:sSub>
+      </m:oMath>
       <w:r>
         <w:rPr>
           <w:rFonts w:ascii="Times New Roman" w:hAnsi="Times New Roman"/>
         </w:rPr>
         <w:t xml:space="preserve"> and </w:t>
       </w:r>
-      <w:r>
-        <w:rPr>
-          <w:rFonts w:ascii="Times New Roman" w:hAnsi="Times New Roman"/>
-          <w:i/>
-        </w:rPr>
-        <w:t>Y</w:t>
-      </w:r>
-      <w:r>
-        <w:rPr>
-          <w:rFonts w:ascii="Times New Roman" w:hAnsi="Times New Roman"/>
-          <w:vertAlign w:val="subscript"/>
-        </w:rPr>
-        <w:t>v,i</w:t>
-      </w:r>
+      <m:oMath>
+        <m:sSub>
+          <m:e>
+            <m:r>
+              <m:t>Y</m:t>
+            </m:r>
+          </m:e>
+          <m:sub>
+            <m:r>
+              <m:t>v,i</m:t>
+            </m:r>
+          </m:sub>
+        </m:sSub>
+      </m:oMath>
       <w:r>
         <w:rPr>
           <w:rFonts w:ascii="Times New Roman" w:hAnsi="Times New Roman"/>
         </w:rPr>
         <w:t xml:space="preserve"> denote the aggregate crop yield (expressed in metric tons per hectare, t/ha) for household </w:t>
       </w:r>
-      <w:r>
-        <w:rPr>
-          <w:rFonts w:ascii="Times New Roman" w:hAnsi="Times New Roman"/>
-          <w:i/>
-        </w:rPr>
-        <w:t>i</w:t>
-      </w:r>
+      <m:oMath>
+        <m:r>
+          <m:t>i</m:t>
+        </m:r>
+      </m:oMath>
       <w:r>
         <w:rPr>
           <w:rFonts w:ascii="Times New Roman" w:hAnsi="Times New Roman"/>
         </w:rPr>
         <w:t xml:space="preserve"> during the Masika and Vuli production cycles, respectively. To quantify inter-seasonal yield instability independent of baseline holding scale, we formulate the normalized Yield Volatility Index (</w:t>
       </w:r>
-      <w:r>
-        <w:rPr>
-          <w:rFonts w:ascii="Times New Roman" w:hAnsi="Times New Roman"/>
-          <w:i/>
-        </w:rPr>
-        <w:t>Y</w:t>
-      </w:r>
-      <w:r>
-        <w:rPr>
-          <w:rFonts w:ascii="Times New Roman" w:hAnsi="Times New Roman"/>
-          <w:vertAlign w:val="subscript"/>
-        </w:rPr>
-        <w:t>vol,i</w:t>
-      </w:r>
+      <m:oMath>
+        <m:sSub>
+          <m:e>
+            <m:r>
+              <m:t>Y</m:t>
+            </m:r>
+          </m:e>
+          <m:sub>
+            <m:r>
+              <m:t>vol,i</m:t>
+            </m:r>
+          </m:sub>
+        </m:sSub>
+      </m:oMath>
       <w:r>
         <w:rPr>
           <w:rFonts w:ascii="Times New Roman" w:hAnsi="Times New Roman"/>
@@ -797,65 +853,115 @@
         </w:rPr>
         <w:t xml:space="preserve">where </w:t>
       </w:r>
-      <w:r>
-        <w:rPr>
-          <w:rFonts w:ascii="Times New Roman" w:hAnsi="Times New Roman"/>
-          <w:i/>
-        </w:rPr>
-        <w:t>ϵ = 10^{-4</w:t>
-      </w:r>
+      <m:oMath>
+        <m:r>
+          <m:t>ϵ = </m:t>
+        </m:r>
+        <m:sSup>
+          <m:e>
+            <m:r>
+              <m:t>10</m:t>
+            </m:r>
+          </m:e>
+          <m:sup>
+            <m:r>
+              <m:t>-4</m:t>
+            </m:r>
+          </m:sup>
+        </m:sSup>
+      </m:oMath>
       <w:r>
         <w:rPr>
           <w:rFonts w:ascii="Times New Roman" w:hAnsi="Times New Roman"/>
         </w:rPr>
         <w:t xml:space="preserve"> prevents numerical instability in rare cases where both seasonal harvests approach zero. The index is continuous, bounded within </w:t>
       </w:r>
-      <w:r>
-        <w:rPr>
-          <w:rFonts w:ascii="Times New Roman" w:hAnsi="Times New Roman"/>
-          <w:i/>
-        </w:rPr>
-        <w:t>[0, 2]</w:t>
-      </w:r>
+      <m:oMath>
+        <m:r>
+          <m:t>[0, 2]</m:t>
+        </m:r>
+      </m:oMath>
       <w:r>
         <w:rPr>
           <w:rFonts w:ascii="Times New Roman" w:hAnsi="Times New Roman"/>
         </w:rPr>
         <w:t xml:space="preserve">, where </w:t>
       </w:r>
-      <w:r>
-        <w:rPr>
-          <w:rFonts w:ascii="Times New Roman" w:hAnsi="Times New Roman"/>
-          <w:i/>
-        </w:rPr>
-        <w:t>Y_{vol = 0</w:t>
-      </w:r>
+      <m:oMath>
+        <m:sSub>
+          <m:e>
+            <m:r>
+              <m:t>Y</m:t>
+            </m:r>
+          </m:e>
+          <m:sub>
+            <m:r>
+              <m:t>vol</m:t>
+            </m:r>
+          </m:sub>
+        </m:sSub>
+        <m:r>
+          <m:t> = 0</m:t>
+        </m:r>
+      </m:oMath>
       <w:r>
         <w:rPr>
           <w:rFonts w:ascii="Times New Roman" w:hAnsi="Times New Roman"/>
         </w:rPr>
         <w:t xml:space="preserve"> indicates perfect seasonal yield parity (</w:t>
       </w:r>
-      <w:r>
-        <w:rPr>
-          <w:rFonts w:ascii="Times New Roman" w:hAnsi="Times New Roman"/>
-          <w:i/>
-        </w:rPr>
-        <w:t>Y_{m = Y_{v</w:t>
-      </w:r>
+      <m:oMath>
+        <m:sSub>
+          <m:e>
+            <m:r>
+              <m:t>Y</m:t>
+            </m:r>
+          </m:e>
+          <m:sub>
+            <m:r>
+              <m:t>m</m:t>
+            </m:r>
+          </m:sub>
+        </m:sSub>
+        <m:r>
+          <m:t> = </m:t>
+        </m:r>
+        <m:sSub>
+          <m:e>
+            <m:r>
+              <m:t>Y</m:t>
+            </m:r>
+          </m:e>
+          <m:sub>
+            <m:r>
+              <m:t>v</m:t>
+            </m:r>
+          </m:sub>
+        </m:sSub>
+      </m:oMath>
       <w:r>
         <w:rPr>
           <w:rFonts w:ascii="Times New Roman" w:hAnsi="Times New Roman"/>
         </w:rPr>
         <w:t xml:space="preserve">), and </w:t>
       </w:r>
-      <w:r>
-        <w:rPr>
-          <w:rFonts w:ascii="Times New Roman" w:hAnsi="Times New Roman"/>
-          <w:i/>
-        </w:rPr>
-        <w:t>Y_{vol = 2</w:t>
-      </w:r>
+      <m:oMath>
+        <m:sSub>
+          <m:e>
+            <m:r>
+              <m:t>Y</m:t>
+            </m:r>
+          </m:e>
+          <m:sub>
+            <m:r>
+              <m:t>vol</m:t>
+            </m:r>
+          </m:sub>
+        </m:sSub>
+        <m:r>
+          <m:t> = 2</m:t>
+        </m:r>
+      </m:oMath>
       <w:r>
         <w:rPr>
           <w:rFonts w:ascii="Times New Roman" w:hAnsi="Times New Roman"/>
@@ -1034,72 +1140,91 @@
         </w:rPr>
         <w:t>along with the inter-seasonal diversity shift (</w:t>
       </w:r>
-      <w:r>
-        <w:rPr>
-          <w:rFonts w:ascii="Times New Roman" w:hAnsi="Times New Roman"/>
-          <w:i/>
-        </w:rPr>
-        <w:t>Δ H' = H'_{m - H'_{v</w:t>
-      </w:r>
+      <m:oMath>
+        <m:r>
+          <m:t>ΔH′ = </m:t>
+        </m:r>
+        <m:sSub>
+          <m:e>
+            <m:r>
+              <m:t>H′</m:t>
+            </m:r>
+          </m:e>
+          <m:sub>
+            <m:r>
+              <m:t>m</m:t>
+            </m:r>
+          </m:sub>
+        </m:sSub>
+        <m:r>
+          <m:t> - </m:t>
+        </m:r>
+        <m:sSub>
+          <m:e>
+            <m:r>
+              <m:t>H′</m:t>
+            </m:r>
+          </m:e>
+          <m:sub>
+            <m:r>
+              <m:t>v</m:t>
+            </m:r>
+          </m:sub>
+        </m:sSub>
+      </m:oMath>
       <w:r>
         <w:rPr>
           <w:rFonts w:ascii="Times New Roman" w:hAnsi="Times New Roman"/>
         </w:rPr>
         <w:t xml:space="preserve">). Here, </w:t>
       </w:r>
-      <w:r>
-        <w:rPr>
-          <w:rFonts w:ascii="Times New Roman" w:hAnsi="Times New Roman"/>
-          <w:i/>
-        </w:rPr>
-        <w:t>p</w:t>
-      </w:r>
-      <w:r>
-        <w:rPr>
-          <w:rFonts w:ascii="Times New Roman" w:hAnsi="Times New Roman"/>
-          <w:vertAlign w:val="subscript"/>
-        </w:rPr>
-        <w:t>k</w:t>
-      </w:r>
+      <m:oMath>
+        <m:sSub>
+          <m:e>
+            <m:r>
+              <m:t>p</m:t>
+            </m:r>
+          </m:e>
+          <m:sub>
+            <m:r>
+              <m:t>k</m:t>
+            </m:r>
+          </m:sub>
+        </m:sSub>
+      </m:oMath>
       <w:r>
         <w:rPr>
           <w:rFonts w:ascii="Times New Roman" w:hAnsi="Times New Roman"/>
         </w:rPr>
         <w:t xml:space="preserve"> represents the proportional area allocated to crop species </w:t>
       </w:r>
-      <w:r>
-        <w:rPr>
-          <w:rFonts w:ascii="Times New Roman" w:hAnsi="Times New Roman"/>
-          <w:i/>
-        </w:rPr>
-        <w:t>k</w:t>
-      </w:r>
+      <m:oMath>
+        <m:r>
+          <m:t>k</m:t>
+        </m:r>
+      </m:oMath>
       <w:r>
         <w:rPr>
           <w:rFonts w:ascii="Times New Roman" w:hAnsi="Times New Roman"/>
         </w:rPr>
         <w:t xml:space="preserve"> on holding </w:t>
       </w:r>
-      <w:r>
-        <w:rPr>
-          <w:rFonts w:ascii="Times New Roman" w:hAnsi="Times New Roman"/>
-          <w:i/>
-        </w:rPr>
-        <w:t>i</w:t>
-      </w:r>
+      <m:oMath>
+        <m:r>
+          <m:t>i</m:t>
+        </m:r>
+      </m:oMath>
       <w:r>
         <w:rPr>
           <w:rFonts w:ascii="Times New Roman" w:hAnsi="Times New Roman"/>
         </w:rPr>
         <w:t xml:space="preserve">, and </w:t>
       </w:r>
-      <w:r>
-        <w:rPr>
-          <w:rFonts w:ascii="Times New Roman" w:hAnsi="Times New Roman"/>
-          <w:i/>
-        </w:rPr>
-        <w:t>K</w:t>
-      </w:r>
+      <m:oMath>
+        <m:r>
+          <m:t>K</m:t>
+        </m:r>
+      </m:oMath>
       <w:r>
         <w:rPr>
           <w:rFonts w:ascii="Times New Roman" w:hAnsi="Times New Roman"/>
@@ -1187,13 +1312,11 @@
         </w:rPr>
         <w:t>: GroupKFold cross-validation partitioned strictly by administrative region (</w:t>
       </w:r>
-      <w:r>
-        <w:rPr>
-          <w:rFonts w:ascii="Times New Roman" w:hAnsi="Times New Roman"/>
-          <w:i/>
-        </w:rPr>
-        <w:t>K = 5</w:t>
-      </w:r>
+      <m:oMath>
+        <m:r>
+          <m:t>K = 5</m:t>
+        </m:r>
+      </m:oMath>
       <w:r>
         <w:rPr>
           <w:rFonts w:ascii="Times New Roman" w:hAnsi="Times New Roman"/>
@@ -1260,13 +1383,11 @@
         </w:rPr>
         <w:t xml:space="preserve">: An adversarial classifier trained to distinguish between training and validation folds achieved an ROC-AUC of </w:t>
       </w:r>
-      <w:r>
-        <w:rPr>
-          <w:rFonts w:ascii="Times New Roman" w:hAnsi="Times New Roman"/>
-          <w:i/>
-        </w:rPr>
-        <w:t>0.512 ± 0.024</w:t>
-      </w:r>
+      <m:oMath>
+        <m:r>
+          <m:t>0.512 ± 0.024</m:t>
+        </m:r>
+      </m:oMath>
       <w:r>
         <w:rPr>
           <w:rFonts w:ascii="Times New Roman" w:hAnsi="Times New Roman"/>
@@ -1571,20 +1692,20 @@
         </w:rPr>
         <w:t>All models were evaluated under identical 5-fold spatial cross-validation regimes using Root Mean Squared Error (RMSE), Mean Absolute Error (MAE), and the Spatial Coefficient of Determination (</w:t>
       </w:r>
-      <w:r>
-        <w:rPr>
-          <w:rFonts w:ascii="Times New Roman" w:hAnsi="Times New Roman"/>
-          <w:i/>
-        </w:rPr>
-        <w:t>R</w:t>
-      </w:r>
-      <w:r>
-        <w:rPr>
-          <w:rFonts w:ascii="Times New Roman" w:hAnsi="Times New Roman"/>
-          <w:vertAlign w:val="superscript"/>
-        </w:rPr>
-        <w:t>2</w:t>
-      </w:r>
+      <m:oMath>
+        <m:sSup>
+          <m:e>
+            <m:r>
+              <m:t>R</m:t>
+            </m:r>
+          </m:e>
+          <m:sup>
+            <m:r>
+              <m:t>2</m:t>
+            </m:r>
+          </m:sup>
+        </m:sSup>
+      </m:oMath>
       <w:r>
         <w:rPr>
           <w:rFonts w:ascii="Times New Roman" w:hAnsi="Times New Roman"/>
@@ -1844,78 +1965,78 @@
         </w:rPr>
         <w:t xml:space="preserve">The empirical distribution of the Yield Volatility Index across Tanzanian smallholders exhibits significant dispersion (Figure 1, Table 1). The mean volatility index across the 4,564 bi-modal smallholders is </w:t>
       </w:r>
-      <w:r>
-        <w:rPr>
-          <w:rFonts w:ascii="Times New Roman" w:hAnsi="Times New Roman"/>
-          <w:i/>
-        </w:rPr>
-        <w:t>1.096 ± 0.612</w:t>
-      </w:r>
+      <m:oMath>
+        <m:r>
+          <m:t>1.096 ± 0.612</m:t>
+        </m:r>
+      </m:oMath>
       <w:r>
         <w:rPr>
           <w:rFonts w:ascii="Times New Roman" w:hAnsi="Times New Roman"/>
         </w:rPr>
         <w:t xml:space="preserve">, with a median of </w:t>
       </w:r>
-      <w:r>
-        <w:rPr>
-          <w:rFonts w:ascii="Times New Roman" w:hAnsi="Times New Roman"/>
-          <w:i/>
-        </w:rPr>
-        <w:t>1.154</w:t>
-      </w:r>
+      <m:oMath>
+        <m:r>
+          <m:t>1.154</m:t>
+        </m:r>
+      </m:oMath>
       <w:r>
         <w:rPr>
           <w:rFonts w:ascii="Times New Roman" w:hAnsi="Times New Roman"/>
         </w:rPr>
         <w:t>. Notably, 38.4% of surveyed holdings fall into the 'hyper-volatile' category (</w:t>
       </w:r>
-      <w:r>
-        <w:rPr>
-          <w:rFonts w:ascii="Times New Roman" w:hAnsi="Times New Roman"/>
-          <w:i/>
-        </w:rPr>
-        <w:t>Y_{vol ≥ 1.50</w:t>
-      </w:r>
+      <m:oMath>
+        <m:sSub>
+          <m:e>
+            <m:r>
+              <m:t>Y</m:t>
+            </m:r>
+          </m:e>
+          <m:sub>
+            <m:r>
+              <m:t>vol</m:t>
+            </m:r>
+          </m:sub>
+        </m:sSub>
+        <m:r>
+          <m:t> ≥ 1.50</m:t>
+        </m:r>
+      </m:oMath>
       <w:r>
         <w:rPr>
           <w:rFonts w:ascii="Times New Roman" w:hAnsi="Times New Roman"/>
         </w:rPr>
         <w:t xml:space="preserve">), indicating severe inter-seasonal harvest crashes. Log-yield comparisons between Masika and Vuli seasons confirm that Masika yields are systematically higher and more stable (mean </w:t>
       </w:r>
-      <w:r>
-        <w:rPr>
-          <w:rFonts w:ascii="Times New Roman" w:hAnsi="Times New Roman"/>
-          <w:i/>
-        </w:rPr>
-        <w:t>1,248</w:t>
-      </w:r>
+      <m:oMath>
+        <m:r>
+          <m:t>1,248</m:t>
+        </m:r>
+      </m:oMath>
       <w:r>
         <w:rPr>
           <w:rFonts w:ascii="Times New Roman" w:hAnsi="Times New Roman"/>
         </w:rPr>
         <w:t xml:space="preserve"> kg/ha vs. </w:t>
       </w:r>
-      <w:r>
-        <w:rPr>
-          <w:rFonts w:ascii="Times New Roman" w:hAnsi="Times New Roman"/>
-          <w:i/>
-        </w:rPr>
-        <w:t>612</w:t>
-      </w:r>
+      <m:oMath>
+        <m:r>
+          <m:t>612</m:t>
+        </m:r>
+      </m:oMath>
       <w:r>
         <w:rPr>
           <w:rFonts w:ascii="Times New Roman" w:hAnsi="Times New Roman"/>
         </w:rPr>
         <w:t xml:space="preserve"> kg/ha in Vuli), reflecting the greater reliability of the long rains. However, the correlation between Masika and Vuli yields within individual households is modest (</w:t>
       </w:r>
-      <w:r>
-        <w:rPr>
-          <w:rFonts w:ascii="Times New Roman" w:hAnsi="Times New Roman"/>
-          <w:i/>
-        </w:rPr>
-        <w:t>r = 0.284</w:t>
-      </w:r>
+      <m:oMath>
+        <m:r>
+          <m:t>r = 0.284</m:t>
+        </m:r>
+      </m:oMath>
       <w:r>
         <w:rPr>
           <w:rFonts w:ascii="Times New Roman" w:hAnsi="Times New Roman"/>
@@ -1974,7 +2095,76 @@
           <w:i/>
           <w:sz w:val="19"/>
         </w:rPr>
-        <w:t>Figure 1: Target distribution of the smallholder Yield Volatility Index (Y_vol) and seasonal log-yield dynamics across Tanzania. (A) Overall empirical density and boxplot of Y_vol showing positive skew and significant mass in the hyper-volatile zone (Y_vol &gt;= 1.50). (B) Bivariate scatter and joint density comparing Masika (long rains) versus Vuli (short rains) log-yields, highlighting seasonal divergence.</w:t>
+        <w:t>Figure 1: Target distribution of the smallholder Yield Volatility Index (</w:t>
+      </w:r>
+      <m:oMath>
+        <m:sSub>
+          <m:e>
+            <m:r>
+              <m:t>Y</m:t>
+            </m:r>
+          </m:e>
+          <m:sub>
+            <m:r>
+              <m:t>vol</m:t>
+            </m:r>
+          </m:sub>
+        </m:sSub>
+      </m:oMath>
+      <w:r>
+        <w:rPr>
+          <w:rFonts w:ascii="Times New Roman" w:hAnsi="Times New Roman"/>
+          <w:i/>
+          <w:sz w:val="19"/>
+        </w:rPr>
+        <w:t xml:space="preserve">) and seasonal log-yield dynamics across Tanzania. (A) Overall empirical density and boxplot of </w:t>
+      </w:r>
+      <m:oMath>
+        <m:sSub>
+          <m:e>
+            <m:r>
+              <m:t>Y</m:t>
+            </m:r>
+          </m:e>
+          <m:sub>
+            <m:r>
+              <m:t>vol</m:t>
+            </m:r>
+          </m:sub>
+        </m:sSub>
+      </m:oMath>
+      <w:r>
+        <w:rPr>
+          <w:rFonts w:ascii="Times New Roman" w:hAnsi="Times New Roman"/>
+          <w:i/>
+          <w:sz w:val="19"/>
+        </w:rPr>
+        <w:t xml:space="preserve"> showing positive skew and significant mass in the hyper-volatile zone (</w:t>
+      </w:r>
+      <m:oMath>
+        <m:sSub>
+          <m:e>
+            <m:r>
+              <m:t>Y</m:t>
+            </m:r>
+          </m:e>
+          <m:sub>
+            <m:r>
+              <m:t>vol</m:t>
+            </m:r>
+          </m:sub>
+        </m:sSub>
+        <m:r>
+          <m:t> ≥ 1.50</m:t>
+        </m:r>
+      </m:oMath>
+      <w:r>
+        <w:rPr>
+          <w:rFonts w:ascii="Times New Roman" w:hAnsi="Times New Roman"/>
+          <w:i/>
+          <w:sz w:val="19"/>
+        </w:rPr>
+        <w:t>). (B) Bivariate scatter and joint density comparing Masika (long rains) versus Vuli (short rains) log-yields, highlighting seasonal divergence.</w:t>
       </w:r>
     </w:p>
     <w:p>
@@ -1983,6 +2173,7 @@
       </w:pPr>
       <w:r>
         <w:rPr>
+          <w:rFonts w:ascii="Times New Roman" w:hAnsi="Times New Roman"/>
           <w:b/>
           <w:sz w:val="20"/>
         </w:rPr>
@@ -2204,7 +2395,28 @@
                 <w:rFonts w:ascii="Times New Roman" w:hAnsi="Times New Roman"/>
                 <w:sz w:val="17"/>
               </w:rPr>
-              <w:t>Yield Volatility Index (Y_vol)</w:t>
+              <w:t>Yield Volatility Index (</w:t>
+            </w:r>
+            <m:oMath>
+              <m:sSub>
+                <m:e>
+                  <m:r>
+                    <m:t>Y</m:t>
+                  </m:r>
+                </m:e>
+                <m:sub>
+                  <m:r>
+                    <m:t>vol</m:t>
+                  </m:r>
+                </m:sub>
+              </m:sSub>
+            </m:oMath>
+            <w:r>
+              <w:rPr>
+                <w:rFonts w:ascii="Times New Roman" w:hAnsi="Times New Roman"/>
+                <w:sz w:val="17"/>
+              </w:rPr>
+              <w:t>)</w:t>
             </w:r>
           </w:p>
         </w:tc>
@@ -4972,124 +5184,156 @@
         </w:rPr>
         <w:t>Evaluating model architectures under spatial cross-validation reveals substantial performance differentiation (Table 2, Figure 2). Under strict regional spatial GroupKFold, the Weighted Ensemble achieved the highest predictive accuracy (</w:t>
       </w:r>
-      <w:r>
-        <w:rPr>
-          <w:rFonts w:ascii="Times New Roman" w:hAnsi="Times New Roman"/>
-          <w:i/>
-        </w:rPr>
-        <w:t>R^2 = 0.584 ± 0.042</w:t>
-      </w:r>
+      <m:oMath>
+        <m:sSup>
+          <m:e>
+            <m:r>
+              <m:t>R</m:t>
+            </m:r>
+          </m:e>
+          <m:sup>
+            <m:r>
+              <m:t>2</m:t>
+            </m:r>
+          </m:sup>
+        </m:sSup>
+        <m:r>
+          <m:t> = 0.584 ± 0.042</m:t>
+        </m:r>
+      </m:oMath>
       <w:r>
         <w:rPr>
           <w:rFonts w:ascii="Times New Roman" w:hAnsi="Times New Roman"/>
         </w:rPr>
         <w:t xml:space="preserve">, </w:t>
       </w:r>
-      <w:r>
-        <w:rPr>
-          <w:rFonts w:ascii="Times New Roman" w:hAnsi="Times New Roman"/>
-          <w:i/>
-        </w:rPr>
-        <w:t>RMSE = 0.231 ± 0.015</w:t>
-      </w:r>
+      <m:oMath>
+        <m:r>
+          <m:t>RMSE = 0.231 ± 0.015</m:t>
+        </m:r>
+      </m:oMath>
       <w:r>
         <w:rPr>
           <w:rFonts w:ascii="Times New Roman" w:hAnsi="Times New Roman"/>
         </w:rPr>
         <w:t xml:space="preserve">, </w:t>
       </w:r>
-      <w:r>
-        <w:rPr>
-          <w:rFonts w:ascii="Times New Roman" w:hAnsi="Times New Roman"/>
-          <w:i/>
-        </w:rPr>
-        <w:t>MAE = 0.178 ± 0.011</w:t>
-      </w:r>
+      <m:oMath>
+        <m:r>
+          <m:t>MAE = 0.178 ± 0.011</m:t>
+        </m:r>
+      </m:oMath>
       <w:r>
         <w:rPr>
           <w:rFonts w:ascii="Times New Roman" w:hAnsi="Times New Roman"/>
         </w:rPr>
         <w:t>). Among standalone models, LightGBM demonstrated superior single-model performance (</w:t>
       </w:r>
-      <w:r>
-        <w:rPr>
-          <w:rFonts w:ascii="Times New Roman" w:hAnsi="Times New Roman"/>
-          <w:i/>
-        </w:rPr>
-        <w:t>R^2 = 0.569 ± 0.045</w:t>
-      </w:r>
+      <m:oMath>
+        <m:sSup>
+          <m:e>
+            <m:r>
+              <m:t>R</m:t>
+            </m:r>
+          </m:e>
+          <m:sup>
+            <m:r>
+              <m:t>2</m:t>
+            </m:r>
+          </m:sup>
+        </m:sSup>
+        <m:r>
+          <m:t> = 0.569 ± 0.045</m:t>
+        </m:r>
+      </m:oMath>
       <w:r>
         <w:rPr>
           <w:rFonts w:ascii="Times New Roman" w:hAnsi="Times New Roman"/>
         </w:rPr>
         <w:t>), followed closely by XGBoost (</w:t>
       </w:r>
-      <w:r>
-        <w:rPr>
-          <w:rFonts w:ascii="Times New Roman" w:hAnsi="Times New Roman"/>
-          <w:i/>
-        </w:rPr>
-        <w:t>R^2 = 0.558 ± 0.048</w:t>
-      </w:r>
+      <m:oMath>
+        <m:sSup>
+          <m:e>
+            <m:r>
+              <m:t>R</m:t>
+            </m:r>
+          </m:e>
+          <m:sup>
+            <m:r>
+              <m:t>2</m:t>
+            </m:r>
+          </m:sup>
+        </m:sSup>
+        <m:r>
+          <m:t> = 0.558 ± 0.048</m:t>
+        </m:r>
+      </m:oMath>
       <w:r>
         <w:rPr>
           <w:rFonts w:ascii="Times New Roman" w:hAnsi="Times New Roman"/>
         </w:rPr>
         <w:t>) and CatBoost (</w:t>
       </w:r>
-      <w:r>
-        <w:rPr>
-          <w:rFonts w:ascii="Times New Roman" w:hAnsi="Times New Roman"/>
-          <w:i/>
-        </w:rPr>
-        <w:t>R^2 = 0.547 ± 0.051</w:t>
-      </w:r>
+      <m:oMath>
+        <m:sSup>
+          <m:e>
+            <m:r>
+              <m:t>R</m:t>
+            </m:r>
+          </m:e>
+          <m:sup>
+            <m:r>
+              <m:t>2</m:t>
+            </m:r>
+          </m:sup>
+        </m:sSup>
+        <m:r>
+          <m:t> = 0.547 ± 0.051</m:t>
+        </m:r>
+      </m:oMath>
       <w:r>
         <w:rPr>
           <w:rFonts w:ascii="Times New Roman" w:hAnsi="Times New Roman"/>
         </w:rPr>
         <w:t xml:space="preserve">). Critically, when the identical LightGBM architecture was trained using standard non-spatial random cross-validation, the apparent </w:t>
       </w:r>
-      <w:r>
-        <w:rPr>
-          <w:rFonts w:ascii="Times New Roman" w:hAnsi="Times New Roman"/>
-          <w:i/>
-        </w:rPr>
-        <w:t>R</w:t>
-      </w:r>
-      <w:r>
-        <w:rPr>
-          <w:rFonts w:ascii="Times New Roman" w:hAnsi="Times New Roman"/>
-          <w:vertAlign w:val="superscript"/>
-        </w:rPr>
-        <w:t>2</w:t>
-      </w:r>
+      <m:oMath>
+        <m:sSup>
+          <m:e>
+            <m:r>
+              <m:t>R</m:t>
+            </m:r>
+          </m:e>
+          <m:sup>
+            <m:r>
+              <m:t>2</m:t>
+            </m:r>
+          </m:sup>
+        </m:sSup>
+      </m:oMath>
       <w:r>
         <w:rPr>
           <w:rFonts w:ascii="Times New Roman" w:hAnsi="Times New Roman"/>
         </w:rPr>
         <w:t xml:space="preserve"> jumped to </w:t>
       </w:r>
-      <w:r>
-        <w:rPr>
-          <w:rFonts w:ascii="Times New Roman" w:hAnsi="Times New Roman"/>
-          <w:i/>
-        </w:rPr>
-        <w:t>0.726 ± 0.021</w:t>
-      </w:r>
+      <m:oMath>
+        <m:r>
+          <m:t>0.726 ± 0.021</m:t>
+        </m:r>
+      </m:oMath>
       <w:r>
         <w:rPr>
           <w:rFonts w:ascii="Times New Roman" w:hAnsi="Times New Roman"/>
         </w:rPr>
         <w:t xml:space="preserve"> (an inflation of </w:t>
       </w:r>
-      <w:r>
-        <w:rPr>
-          <w:rFonts w:ascii="Times New Roman" w:hAnsi="Times New Roman"/>
-          <w:i/>
-        </w:rPr>
-        <w:t>Δ R^2 = +0.157</w:t>
-      </w:r>
+      <m:oMath>
+        <m:r>
+          <m:t>Δ R^2 = +0.157</m:t>
+        </m:r>
+      </m:oMath>
       <w:r>
         <w:rPr>
           <w:rFonts w:ascii="Times New Roman" w:hAnsi="Times New Roman"/>
@@ -5148,7 +5392,29 @@
           <w:i/>
           <w:sz w:val="19"/>
         </w:rPr>
-        <w:t>Figure 2: Multi-model spatial cross-validation benchmark, error residuals, and out-of-fold calibration curves. (A) Model comparison across 5-fold spatial CV showing R^2 and RMSE for LightGBM, XGBoost, Random Forest, CatBoost, and Weighted Ensemble. (B) Out-of-fold predicted versus observed volatility scatter with 1:1 parity line. (C) Decile calibration curves demonstrating close alignment between predicted risk and empirical volatility across all tiers.</w:t>
+        <w:t xml:space="preserve">Figure 2: Multi-model spatial cross-validation benchmark, error residuals, and out-of-fold calibration curves. (A) Model comparison across 5-fold spatial CV showing </w:t>
+      </w:r>
+      <m:oMath>
+        <m:sSup>
+          <m:e>
+            <m:r>
+              <m:t>R</m:t>
+            </m:r>
+          </m:e>
+          <m:sup>
+            <m:r>
+              <m:t>2</m:t>
+            </m:r>
+          </m:sup>
+        </m:sSup>
+      </m:oMath>
+      <w:r>
+        <w:rPr>
+          <w:rFonts w:ascii="Times New Roman" w:hAnsi="Times New Roman"/>
+          <w:i/>
+          <w:sz w:val="19"/>
+        </w:rPr>
+        <w:t xml:space="preserve"> and RMSE for LightGBM, XGBoost, Random Forest, CatBoost, and Weighted Ensemble. (B) Out-of-fold predicted versus observed volatility scatter with 1:1 parity line. (C) Decile calibration curves demonstrating close alignment between predicted risk and empirical volatility across all tiers.</w:t>
       </w:r>
     </w:p>
     <w:p>
@@ -5157,6 +5423,7 @@
       </w:pPr>
       <w:r>
         <w:rPr>
+          <w:rFonts w:ascii="Times New Roman" w:hAnsi="Times New Roman"/>
           <w:b/>
           <w:sz w:val="20"/>
         </w:rPr>
@@ -5737,7 +6004,6 @@
       <w:r>
         <w:rPr>
           <w:rFonts w:ascii="Courier New" w:hAnsi="Courier New"/>
-          <w:sz w:val="20"/>
         </w:rPr>
         <w:t>plant_month_delta</w:t>
       </w:r>
@@ -5750,7 +6016,6 @@
       <w:r>
         <w:rPr>
           <w:rFonts w:ascii="Courier New" w:hAnsi="Courier New"/>
-          <w:sz w:val="20"/>
         </w:rPr>
         <w:t>m_harvest_pct_mean</w:t>
       </w:r>
@@ -5763,7 +6028,6 @@
       <w:r>
         <w:rPr>
           <w:rFonts w:ascii="Courier New" w:hAnsi="Courier New"/>
-          <w:sz w:val="20"/>
         </w:rPr>
         <w:t>shannon_diff_from_region_mean</w:t>
       </w:r>
@@ -5773,20 +6037,20 @@
         </w:rPr>
         <w:t xml:space="preserve">). SHAP summary plots (Figure 4) demonstrate that households maintaining higher Shannon diversity than their regional peers exhibit negative SHAP values (pushing </w:t>
       </w:r>
-      <w:r>
-        <w:rPr>
-          <w:rFonts w:ascii="Times New Roman" w:hAnsi="Times New Roman"/>
-          <w:i/>
-        </w:rPr>
-        <w:t>Y</w:t>
-      </w:r>
-      <w:r>
-        <w:rPr>
-          <w:rFonts w:ascii="Times New Roman" w:hAnsi="Times New Roman"/>
-          <w:vertAlign w:val="subscript"/>
-        </w:rPr>
-        <w:t>vol</w:t>
-      </w:r>
+      <m:oMath>
+        <m:sSub>
+          <m:e>
+            <m:r>
+              <m:t>Y</m:t>
+            </m:r>
+          </m:e>
+          <m:sub>
+            <m:r>
+              <m:t>vol</m:t>
+            </m:r>
+          </m:sub>
+        </m:sSub>
+      </m:oMath>
       <w:r>
         <w:rPr>
           <w:rFonts w:ascii="Times New Roman" w:hAnsi="Times New Roman"/>
@@ -5899,7 +6163,22 @@
           <w:i/>
           <w:sz w:val="19"/>
         </w:rPr>
-        <w:t>Figure 4: Global SHAP feature attributions and directional dependency plots. (A) SHAP beeswarm plot ranking top-15 features by mean absolute SHAP value, illustrating directional influence on volatility predictions. (B) Partial dependence curves for seasonal planting date shift (plant_month_delta) and Shannon diversity differential.</w:t>
+        <w:t>Figure 4: Global SHAP feature attributions and directional dependency plots. (A) SHAP beeswarm plot ranking top-15 features by mean absolute SHAP value, illustrating directional influence on volatility predictions. (B) Partial dependence curves for seasonal planting date shift (</w:t>
+      </w:r>
+      <w:r>
+        <w:rPr>
+          <w:rFonts w:ascii="Courier New" w:hAnsi="Courier New"/>
+          <w:sz w:val="17"/>
+        </w:rPr>
+        <w:t>plant_month_delta</w:t>
+      </w:r>
+      <w:r>
+        <w:rPr>
+          <w:rFonts w:ascii="Times New Roman" w:hAnsi="Times New Roman"/>
+          <w:i/>
+          <w:sz w:val="19"/>
+        </w:rPr>
+        <w:t>) and Shannon diversity differential.</w:t>
       </w:r>
     </w:p>
     <w:p>
@@ -5908,6 +6187,7 @@
       </w:pPr>
       <w:r>
         <w:rPr>
+          <w:rFonts w:ascii="Times New Roman" w:hAnsi="Times New Roman"/>
           <w:b/>
           <w:sz w:val="20"/>
         </w:rPr>
@@ -7629,83 +7909,143 @@
         </w:rPr>
         <w:t xml:space="preserve">Model accuracy varies across Tanzania's diverse agro-ecological zones (Table 4, Figure 5, Figure 8). Spatial transferability is highest in the Northern Highlands (Kilimanjaro </w:t>
       </w:r>
-      <w:r>
-        <w:rPr>
-          <w:rFonts w:ascii="Times New Roman" w:hAnsi="Times New Roman"/>
-          <w:i/>
-        </w:rPr>
-        <w:t>R^2 = 0.648</w:t>
-      </w:r>
+      <m:oMath>
+        <m:sSup>
+          <m:e>
+            <m:r>
+              <m:t>R</m:t>
+            </m:r>
+          </m:e>
+          <m:sup>
+            <m:r>
+              <m:t>2</m:t>
+            </m:r>
+          </m:sup>
+        </m:sSup>
+        <m:r>
+          <m:t> = 0.648</m:t>
+        </m:r>
+      </m:oMath>
       <w:r>
         <w:rPr>
           <w:rFonts w:ascii="Times New Roman" w:hAnsi="Times New Roman"/>
         </w:rPr>
         <w:t xml:space="preserve">, Arusha </w:t>
       </w:r>
-      <w:r>
-        <w:rPr>
-          <w:rFonts w:ascii="Times New Roman" w:hAnsi="Times New Roman"/>
-          <w:i/>
-        </w:rPr>
-        <w:t>R^2 = 0.631</w:t>
-      </w:r>
+      <m:oMath>
+        <m:sSup>
+          <m:e>
+            <m:r>
+              <m:t>R</m:t>
+            </m:r>
+          </m:e>
+          <m:sup>
+            <m:r>
+              <m:t>2</m:t>
+            </m:r>
+          </m:sup>
+        </m:sSup>
+        <m:r>
+          <m:t> = 0.631</m:t>
+        </m:r>
+      </m:oMath>
       <w:r>
         <w:rPr>
           <w:rFonts w:ascii="Times New Roman" w:hAnsi="Times New Roman"/>
         </w:rPr>
         <w:t xml:space="preserve">) and Southern Highlands (Iringa </w:t>
       </w:r>
-      <w:r>
-        <w:rPr>
-          <w:rFonts w:ascii="Times New Roman" w:hAnsi="Times New Roman"/>
-          <w:i/>
-        </w:rPr>
-        <w:t>R^2 = 0.622</w:t>
-      </w:r>
+      <m:oMath>
+        <m:sSup>
+          <m:e>
+            <m:r>
+              <m:t>R</m:t>
+            </m:r>
+          </m:e>
+          <m:sup>
+            <m:r>
+              <m:t>2</m:t>
+            </m:r>
+          </m:sup>
+        </m:sSup>
+        <m:r>
+          <m:t> = 0.622</m:t>
+        </m:r>
+      </m:oMath>
       <w:r>
         <w:rPr>
           <w:rFonts w:ascii="Times New Roman" w:hAnsi="Times New Roman"/>
         </w:rPr>
         <w:t xml:space="preserve">, Mbeya </w:t>
       </w:r>
-      <w:r>
-        <w:rPr>
-          <w:rFonts w:ascii="Times New Roman" w:hAnsi="Times New Roman"/>
-          <w:i/>
-        </w:rPr>
-        <w:t>R^2 = 0.614</w:t>
-      </w:r>
+      <m:oMath>
+        <m:sSup>
+          <m:e>
+            <m:r>
+              <m:t>R</m:t>
+            </m:r>
+          </m:e>
+          <m:sup>
+            <m:r>
+              <m:t>2</m:t>
+            </m:r>
+          </m:sup>
+        </m:sSup>
+        <m:r>
+          <m:t> = 0.614</m:t>
+        </m:r>
+      </m:oMath>
       <w:r>
         <w:rPr>
           <w:rFonts w:ascii="Times New Roman" w:hAnsi="Times New Roman"/>
         </w:rPr>
         <w:t xml:space="preserve">). Conversely, the highest yield volatility and lowest baseline predictability occur in semi-arid central regions (Dodoma mean </w:t>
       </w:r>
-      <w:r>
-        <w:rPr>
-          <w:rFonts w:ascii="Times New Roman" w:hAnsi="Times New Roman"/>
-          <w:i/>
-        </w:rPr>
-        <w:t>Y_{vol = 1.382</w:t>
-      </w:r>
+      <m:oMath>
+        <m:sSub>
+          <m:e>
+            <m:r>
+              <m:t>Y</m:t>
+            </m:r>
+          </m:e>
+          <m:sub>
+            <m:r>
+              <m:t>vol</m:t>
+            </m:r>
+          </m:sub>
+        </m:sSub>
+        <m:r>
+          <m:t> = 1.382</m:t>
+        </m:r>
+      </m:oMath>
       <w:r>
         <w:rPr>
           <w:rFonts w:ascii="Times New Roman" w:hAnsi="Times New Roman"/>
         </w:rPr>
         <w:t xml:space="preserve">, Singida mean </w:t>
       </w:r>
-      <w:r>
-        <w:rPr>
-          <w:rFonts w:ascii="Times New Roman" w:hAnsi="Times New Roman"/>
-          <w:i/>
-        </w:rPr>
-        <w:t>Y_{vol = 1.341</w:t>
-      </w:r>
+      <m:oMath>
+        <m:sSub>
+          <m:e>
+            <m:r>
+              <m:t>Y</m:t>
+            </m:r>
+          </m:e>
+          <m:sub>
+            <m:r>
+              <m:t>vol</m:t>
+            </m:r>
+          </m:sub>
+        </m:sSub>
+        <m:r>
+          <m:t> = 1.341</m:t>
+        </m:r>
+      </m:oMath>
       <w:r>
         <w:rPr>
           <w:rFonts w:ascii="Times New Roman" w:hAnsi="Times New Roman"/>
         </w:rPr>
-        <w:t>), where erratic intra-seasonal dry spells overwhelm management interventions (Mary &amp; Majule, 2009). Across all 27 regions, the Weighted Ensemble maintains a consistent transferability advantage.</w:t>
+        <w:t>), where erratic intra-seasonal dry spells overwhelm management interventions (Lema &amp; Majule, 2009). Across all 27 regions, the Weighted Ensemble maintains a consistent transferability advantage.</w:t>
       </w:r>
     </w:p>
     <w:p>
@@ -7759,7 +8099,29 @@
           <w:i/>
           <w:sz w:val="19"/>
         </w:rPr>
-        <w:t>Figure 5: Regional heterogeneity and spatial transferability advantage across 27 administrative regions. (A) Spatial distribution of model R^2 across Tanzania regions. (B) Out-of-fold performance comparison between the Weighted Ensemble and baseline models by region, demonstrating consistent transferability improvements across both high-potential and semi-arid zones.</w:t>
+        <w:t xml:space="preserve">Figure 5: Regional heterogeneity and spatial transferability advantage across 27 administrative regions. (A) Spatial distribution of model </w:t>
+      </w:r>
+      <m:oMath>
+        <m:sSup>
+          <m:e>
+            <m:r>
+              <m:t>R</m:t>
+            </m:r>
+          </m:e>
+          <m:sup>
+            <m:r>
+              <m:t>2</m:t>
+            </m:r>
+          </m:sup>
+        </m:sSup>
+      </m:oMath>
+      <w:r>
+        <w:rPr>
+          <w:rFonts w:ascii="Times New Roman" w:hAnsi="Times New Roman"/>
+          <w:i/>
+          <w:sz w:val="19"/>
+        </w:rPr>
+        <w:t xml:space="preserve"> across Tanzania regions. (B) Out-of-fold performance comparison between the Weighted Ensemble and baseline models by region, demonstrating consistent transferability improvements across both high-potential and semi-arid zones.</w:t>
       </w:r>
     </w:p>
     <w:p>
@@ -7822,6 +8184,7 @@
       </w:pPr>
       <w:r>
         <w:rPr>
+          <w:rFonts w:ascii="Times New Roman" w:hAnsi="Times New Roman"/>
           <w:b/>
           <w:sz w:val="20"/>
         </w:rPr>
@@ -11747,65 +12110,55 @@
         </w:rPr>
         <w:t xml:space="preserve">Partial dependence and interaction analyses reveal distinct non-linear tipping points in smallholder stability (Figure 6, Figure 9). When the gap between Masika and Vuli planting exceeds 4.5 months, yield volatility accelerates non-linearly, climbing by 48% regardless of fertilizer application. In households applying </w:t>
       </w:r>
-      <w:r>
-        <w:rPr>
-          <w:rFonts w:ascii="Times New Roman" w:hAnsi="Times New Roman"/>
-          <w:i/>
-        </w:rPr>
-        <w:t>&lt; 25</w:t>
-      </w:r>
+      <m:oMath>
+        <m:r>
+          <m:t>&lt; 25</m:t>
+        </m:r>
+      </m:oMath>
       <w:r>
         <w:rPr>
           <w:rFonts w:ascii="Times New Roman" w:hAnsi="Times New Roman"/>
         </w:rPr>
         <w:t xml:space="preserve"> kg/ha of basal fertilizer in Vuli relative to Masika, yield volatility surges to </w:t>
       </w:r>
-      <w:r>
-        <w:rPr>
-          <w:rFonts w:ascii="Times New Roman" w:hAnsi="Times New Roman"/>
-          <w:i/>
-        </w:rPr>
-        <w:t>1.42</w:t>
-      </w:r>
+      <m:oMath>
+        <m:r>
+          <m:t>1.42</m:t>
+        </m:r>
+      </m:oMath>
       <w:r>
         <w:rPr>
           <w:rFonts w:ascii="Times New Roman" w:hAnsi="Times New Roman"/>
         </w:rPr>
         <w:t xml:space="preserve">, but the stabilizing return plateaus beyond </w:t>
       </w:r>
-      <w:r>
-        <w:rPr>
-          <w:rFonts w:ascii="Times New Roman" w:hAnsi="Times New Roman"/>
-          <w:i/>
-        </w:rPr>
-        <w:t>60</w:t>
-      </w:r>
+      <m:oMath>
+        <m:r>
+          <m:t>60</m:t>
+        </m:r>
+      </m:oMath>
       <w:r>
         <w:rPr>
           <w:rFonts w:ascii="Times New Roman" w:hAnsi="Times New Roman"/>
         </w:rPr>
         <w:t xml:space="preserve"> kg/ha. Furthermore, Shannon diversity index values above </w:t>
       </w:r>
-      <w:r>
-        <w:rPr>
-          <w:rFonts w:ascii="Times New Roman" w:hAnsi="Times New Roman"/>
-          <w:i/>
-        </w:rPr>
-        <w:t>0.65</w:t>
-      </w:r>
+      <m:oMath>
+        <m:r>
+          <m:t>0.65</m:t>
+        </m:r>
+      </m:oMath>
       <w:r>
         <w:rPr>
           <w:rFonts w:ascii="Times New Roman" w:hAnsi="Times New Roman"/>
         </w:rPr>
         <w:t xml:space="preserve"> eliminate </w:t>
       </w:r>
-      <w:r>
-        <w:rPr>
-          <w:rFonts w:ascii="Times New Roman" w:hAnsi="Times New Roman"/>
-          <w:i/>
-        </w:rPr>
-        <w:t>&gt;70%</w:t>
-      </w:r>
+      <m:oMath>
+        <m:r>
+          <m:t>&gt;70%</m:t>
+        </m:r>
+      </m:oMath>
       <w:r>
         <w:rPr>
           <w:rFonts w:ascii="Times New Roman" w:hAnsi="Times New Roman"/>
@@ -11918,7 +12271,22 @@
           <w:i/>
           <w:sz w:val="19"/>
         </w:rPr>
-        <w:t>Figure 9: Agro-economic partial dependence surfaces and two-way interaction contours. (A) Marginal response of yield volatility to fertilizer application rate. (B) Labor allocation shift response. (C) Plot fragmentation (plot_area_cv) interaction surface.</w:t>
+        <w:t>Figure 9: Agro-economic partial dependence surfaces and two-way interaction contours. (A) Marginal response of yield volatility to fertilizer application rate. (B) Labor allocation shift response. (C) Plot fragmentation (</w:t>
+      </w:r>
+      <w:r>
+        <w:rPr>
+          <w:rFonts w:ascii="Courier New" w:hAnsi="Courier New"/>
+          <w:sz w:val="17"/>
+        </w:rPr>
+        <w:t>plot_area_cv</w:t>
+      </w:r>
+      <w:r>
+        <w:rPr>
+          <w:rFonts w:ascii="Times New Roman" w:hAnsi="Times New Roman"/>
+          <w:i/>
+          <w:sz w:val="19"/>
+        </w:rPr>
+        <w:t>) interaction surface.</w:t>
       </w:r>
     </w:p>
     <w:p>
@@ -11945,65 +12313,67 @@
         </w:rPr>
         <w:t xml:space="preserve">Table 5 and Figure 7 present the quantitative verification of the 5-pillar spatial leakage audit. The adversarial validation ROC-AUC remains at </w:t>
       </w:r>
-      <w:r>
-        <w:rPr>
-          <w:rFonts w:ascii="Times New Roman" w:hAnsi="Times New Roman"/>
-          <w:i/>
-        </w:rPr>
-        <w:t>0.512 ± 0.024</w:t>
-      </w:r>
+      <m:oMath>
+        <m:r>
+          <m:t>0.512 ± 0.024</m:t>
+        </m:r>
+      </m:oMath>
       <w:r>
         <w:rPr>
           <w:rFonts w:ascii="Times New Roman" w:hAnsi="Times New Roman"/>
         </w:rPr>
         <w:t xml:space="preserve">, proving that training and test distributions are spatially disentangled. Figure 7 further provides local explanations for individual smallholder holdings using SHAP waterfalls. For Household #0 (a vulnerable monocropping holding in Dodoma), late Vuli planting and zero livestock holdings contributed </w:t>
       </w:r>
-      <w:r>
-        <w:rPr>
-          <w:rFonts w:ascii="Times New Roman" w:hAnsi="Times New Roman"/>
-          <w:i/>
-        </w:rPr>
-        <w:t>+0.42</w:t>
-      </w:r>
+      <m:oMath>
+        <m:r>
+          <m:t>+0.42</m:t>
+        </m:r>
+      </m:oMath>
       <w:r>
         <w:rPr>
           <w:rFonts w:ascii="Times New Roman" w:hAnsi="Times New Roman"/>
         </w:rPr>
         <w:t xml:space="preserve"> and </w:t>
       </w:r>
-      <w:r>
-        <w:rPr>
-          <w:rFonts w:ascii="Times New Roman" w:hAnsi="Times New Roman"/>
-          <w:i/>
-        </w:rPr>
-        <w:t>+0.28</w:t>
-      </w:r>
+      <m:oMath>
+        <m:r>
+          <m:t>+0.28</m:t>
+        </m:r>
+      </m:oMath>
       <w:r>
         <w:rPr>
           <w:rFonts w:ascii="Times New Roman" w:hAnsi="Times New Roman"/>
         </w:rPr>
         <w:t xml:space="preserve"> to their elevated volatility prediction (</w:t>
       </w:r>
-      <w:r>
-        <w:rPr>
-          <w:rFonts w:ascii="Times New Roman" w:hAnsi="Times New Roman"/>
-          <w:i/>
-        </w:rPr>
-        <w:t>Y_{vol = 1.48</w:t>
-      </w:r>
+      <m:oMath>
+        <m:sSub>
+          <m:e>
+            <m:r>
+              <m:t>Y</m:t>
+            </m:r>
+          </m:e>
+          <m:sub>
+            <m:r>
+              <m:t>vol</m:t>
+            </m:r>
+          </m:sub>
+        </m:sSub>
+        <m:r>
+          <m:t> = 1.48</m:t>
+        </m:r>
+      </m:oMath>
       <w:r>
         <w:rPr>
           <w:rFonts w:ascii="Times New Roman" w:hAnsi="Times New Roman"/>
         </w:rPr>
         <w:t xml:space="preserve">). Counterfactual simulation shows that introducing a two-species intercrop and 2 TLU asset buffer would reduce their projected volatility to </w:t>
       </w:r>
-      <w:r>
-        <w:rPr>
-          <w:rFonts w:ascii="Times New Roman" w:hAnsi="Times New Roman"/>
-          <w:i/>
-        </w:rPr>
-        <w:t>0.86</w:t>
-      </w:r>
+      <m:oMath>
+        <m:r>
+          <m:t>0.86</m:t>
+        </m:r>
+      </m:oMath>
       <w:r>
         <w:rPr>
           <w:rFonts w:ascii="Times New Roman" w:hAnsi="Times New Roman"/>
@@ -12071,6 +12441,7 @@
       </w:pPr>
       <w:r>
         <w:rPr>
+          <w:rFonts w:ascii="Times New Roman" w:hAnsi="Times New Roman"/>
           <w:b/>
           <w:sz w:val="20"/>
         </w:rPr>
@@ -12318,7 +12689,28 @@
                 <w:rFonts w:ascii="Times New Roman" w:hAnsi="Times New Roman"/>
                 <w:sz w:val="17"/>
               </w:rPr>
-              <w:t>Verifies target Y_vol is strictly excluded from feature space and no trivial target proxies exist</w:t>
+              <w:t xml:space="preserve">Verifies target </w:t>
+            </w:r>
+            <m:oMath>
+              <m:sSub>
+                <m:e>
+                  <m:r>
+                    <m:t>Y</m:t>
+                  </m:r>
+                </m:e>
+                <m:sub>
+                  <m:r>
+                    <m:t>vol</m:t>
+                  </m:r>
+                </m:sub>
+              </m:sSub>
+            </m:oMath>
+            <w:r>
+              <w:rPr>
+                <w:rFonts w:ascii="Times New Roman" w:hAnsi="Times New Roman"/>
+                <w:sz w:val="17"/>
+              </w:rPr>
+              <w:t xml:space="preserve"> is strictly excluded from feature space and no trivial target proxies exist</w:t>
             </w:r>
           </w:p>
         </w:tc>
@@ -12700,7 +13092,32 @@
           <w:i/>
           <w:sz w:val="19"/>
         </w:rPr>
-        <w:t>Figure 10: Policy counterfactual stress-testing and simulated volatility mitigation distributions under four agricultural intervention packages. (A) Kernel density shifts under baseline status quo, +2 TLU livestock transfer, +0.4 Shannon crop diversification, and integrated Climate-Smart Agriculture (CSA). (B) Proportion of hyper-volatile smallholders (Y_vol &gt;= 1.50) across scenarios. (C) Net percentage reduction in mean smallholder volatility.</w:t>
+        <w:t>Figure 10: Policy counterfactual stress-testing and simulated volatility mitigation distributions under four agricultural intervention packages. (A) Kernel density shifts under baseline status quo, +2 TLU livestock transfer, +0.4 Shannon crop diversification, and integrated Climate-Smart Agriculture (CSA). (B) Proportion of hyper-volatile smallholders (</w:t>
+      </w:r>
+      <m:oMath>
+        <m:sSub>
+          <m:e>
+            <m:r>
+              <m:t>Y</m:t>
+            </m:r>
+          </m:e>
+          <m:sub>
+            <m:r>
+              <m:t>vol</m:t>
+            </m:r>
+          </m:sub>
+        </m:sSub>
+        <m:r>
+          <m:t> ≥ 1.50</m:t>
+        </m:r>
+      </m:oMath>
+      <w:r>
+        <w:rPr>
+          <w:rFonts w:ascii="Times New Roman" w:hAnsi="Times New Roman"/>
+          <w:i/>
+          <w:sz w:val="19"/>
+        </w:rPr>
+        <w:t>) across scenarios. (C) Net percentage reduction in mean smallholder volatility.</w:t>
       </w:r>
     </w:p>
     <w:p>
@@ -12709,6 +13126,7 @@
       </w:pPr>
       <w:r>
         <w:rPr>
+          <w:rFonts w:ascii="Times New Roman" w:hAnsi="Times New Roman"/>
           <w:b/>
           <w:sz w:val="20"/>
         </w:rPr>
@@ -12785,8 +13203,22 @@
                 <w:b/>
                 <w:sz w:val="18"/>
               </w:rPr>
-              <w:t>Mean Y_vol</w:t>
-            </w:r>
+              <w:t xml:space="preserve">Mean </w:t>
+            </w:r>
+            <m:oMath>
+              <m:sSub>
+                <m:e>
+                  <m:r>
+                    <m:t>Y</m:t>
+                  </m:r>
+                </m:e>
+                <m:sub>
+                  <m:r>
+                    <m:t>vol</m:t>
+                  </m:r>
+                </m:sub>
+              </m:sSub>
+            </m:oMath>
           </w:p>
         </w:tc>
         <w:tc>
@@ -13616,6 +14048,7 @@
       </w:pPr>
       <w:r>
         <w:rPr>
+          <w:rFonts w:ascii="Times New Roman" w:hAnsi="Times New Roman"/>
           <w:b/>
           <w:sz w:val="20"/>
         </w:rPr>
@@ -13708,7 +14141,29 @@
                 <w:b/>
                 <w:sz w:val="18"/>
               </w:rPr>
-              <w:t>Observed Volatility (Y_vol)</w:t>
+              <w:t>Observed Volatility (</w:t>
+            </w:r>
+            <m:oMath>
+              <m:sSub>
+                <m:e>
+                  <m:r>
+                    <m:t>Y</m:t>
+                  </m:r>
+                </m:e>
+                <m:sub>
+                  <m:r>
+                    <m:t>vol</m:t>
+                  </m:r>
+                </m:sub>
+              </m:sSub>
+            </m:oMath>
+            <w:r>
+              <w:rPr>
+                <w:rFonts w:ascii="Times New Roman" w:hAnsi="Times New Roman"/>
+                <w:b/>
+                <w:sz w:val="18"/>
+              </w:rPr>
+              <w:t>)</w:t>
             </w:r>
           </w:p>
         </w:tc>
@@ -14292,13 +14747,11 @@
         </w:rPr>
         <w:t xml:space="preserve">The methodological results of this study carry profound implications for the growing literature applying artificial intelligence to international agricultural development (Benami et al., 2021; van Klompenburg et al., 2020). We demonstrate that conventional random train-test splitting introduces an artificial performance premium of </w:t>
       </w:r>
-      <w:r>
-        <w:rPr>
-          <w:rFonts w:ascii="Times New Roman" w:hAnsi="Times New Roman"/>
-          <w:i/>
-        </w:rPr>
-        <w:t>Δ R^2 = +0.157</w:t>
-      </w:r>
+      <m:oMath>
+        <m:r>
+          <m:t>Δ R^2 = +0.157</m:t>
+        </m:r>
+      </m:oMath>
       <w:r>
         <w:rPr>
           <w:rFonts w:ascii="Times New Roman" w:hAnsi="Times New Roman"/>
@@ -14436,59 +14889,65 @@
         </w:rPr>
         <w:t>This study developed and validated a leakage-free spatial machine learning pipeline to predict smallholder crop yield volatility across 27 administrative regions of Tanzania. Utilizing national agricultural survey microdata from 10,750 households, we engineered domain-specific agronomic features and established that an out-of-fold Weighted Ensemble achieves superior generalization (</w:t>
       </w:r>
-      <w:r>
-        <w:rPr>
-          <w:rFonts w:ascii="Times New Roman" w:hAnsi="Times New Roman"/>
-          <w:i/>
-        </w:rPr>
-        <w:t>R^2 = 0.584 ± 0.042</w:t>
-      </w:r>
+      <m:oMath>
+        <m:sSup>
+          <m:e>
+            <m:r>
+              <m:t>R</m:t>
+            </m:r>
+          </m:e>
+          <m:sup>
+            <m:r>
+              <m:t>2</m:t>
+            </m:r>
+          </m:sup>
+        </m:sSup>
+        <m:r>
+          <m:t> = 0.584 ± 0.042</m:t>
+        </m:r>
+      </m:oMath>
       <w:r>
         <w:rPr>
           <w:rFonts w:ascii="Times New Roman" w:hAnsi="Times New Roman"/>
         </w:rPr>
         <w:t xml:space="preserve">, </w:t>
       </w:r>
-      <w:r>
-        <w:rPr>
-          <w:rFonts w:ascii="Times New Roman" w:hAnsi="Times New Roman"/>
-          <w:i/>
-        </w:rPr>
-        <w:t>RMSE = 0.231</w:t>
-      </w:r>
+      <m:oMath>
+        <m:r>
+          <m:t>RMSE = 0.231</m:t>
+        </m:r>
+      </m:oMath>
       <w:r>
         <w:rPr>
           <w:rFonts w:ascii="Times New Roman" w:hAnsi="Times New Roman"/>
         </w:rPr>
         <w:t xml:space="preserve">) under strict spatial regional cross-validation. We quantified that naive non-spatial cross-validation introduces an optimistic bias of </w:t>
       </w:r>
-      <w:r>
-        <w:rPr>
-          <w:rFonts w:ascii="Times New Roman" w:hAnsi="Times New Roman"/>
-          <w:i/>
-        </w:rPr>
-        <w:t>+0.157</w:t>
-      </w:r>
+      <m:oMath>
+        <m:r>
+          <m:t>+0.157</m:t>
+        </m:r>
+      </m:oMath>
       <w:r>
         <w:rPr>
           <w:rFonts w:ascii="Times New Roman" w:hAnsi="Times New Roman"/>
         </w:rPr>
         <w:t xml:space="preserve"> in </w:t>
       </w:r>
-      <w:r>
-        <w:rPr>
-          <w:rFonts w:ascii="Times New Roman" w:hAnsi="Times New Roman"/>
-          <w:i/>
-        </w:rPr>
-        <w:t>R</w:t>
-      </w:r>
-      <w:r>
-        <w:rPr>
-          <w:rFonts w:ascii="Times New Roman" w:hAnsi="Times New Roman"/>
-          <w:vertAlign w:val="superscript"/>
-        </w:rPr>
-        <w:t>2</w:t>
-      </w:r>
+      <m:oMath>
+        <m:sSup>
+          <m:e>
+            <m:r>
+              <m:t>R</m:t>
+            </m:r>
+          </m:e>
+          <m:sup>
+            <m:r>
+              <m:t>2</m:t>
+            </m:r>
+          </m:sup>
+        </m:sSup>
+      </m:oMath>
       <w:r>
         <w:rPr>
           <w:rFonts w:ascii="Times New Roman" w:hAnsi="Times New Roman"/>
@@ -14740,7 +15199,7 @@
         <w:rPr>
           <w:rFonts w:ascii="Times New Roman" w:hAnsi="Times New Roman"/>
         </w:rPr>
-        <w:t>(12), Article 123001. https://doi.org/10.1088/1748-9326/ab44be</w:t>
+        <w:t>(12), Article 123001. https://doi.org/10.1088/1748-9326/ab4449</w:t>
       </w:r>
     </w:p>
     <w:p>
@@ -14790,7 +15249,7 @@
         <w:rPr>
           <w:rFonts w:ascii="Times New Roman" w:hAnsi="Times New Roman"/>
         </w:rPr>
-        <w:t xml:space="preserve">Birthal, P. S., Negi, D. S., Khan, M. T., &amp; Agarwal, S. (2014). Is Indian agriculture becoming resilient to droughts? Evidence from rice production. </w:t>
+        <w:t xml:space="preserve">Birthal, P. S., Negi, D. S., Khan, M. T., &amp; Agarwal, S. (2015). Is Indian agriculture becoming resilient to droughts? Evidence from rice production systems. </w:t>
       </w:r>
       <w:r>
         <w:rPr>
@@ -14810,13 +15269,13 @@
           <w:rFonts w:ascii="Times New Roman" w:hAnsi="Times New Roman"/>
           <w:i/>
         </w:rPr>
-        <w:t>44</w:t>
+        <w:t>56</w:t>
       </w:r>
       <w:r>
         <w:rPr>
           <w:rFonts w:ascii="Times New Roman" w:hAnsi="Times New Roman"/>
         </w:rPr>
-        <w:t>, 28–41. https://doi.org/10.1016/j.foodpol.2013.10.005</w:t>
+        <w:t>, 1–12. https://doi.org/10.1016/j.foodpol.2015.07.005</w:t>
       </w:r>
     </w:p>
     <w:p>
@@ -15144,14 +15603,14 @@
         <w:rPr>
           <w:rFonts w:ascii="Times New Roman" w:hAnsi="Times New Roman"/>
         </w:rPr>
-        <w:t xml:space="preserve">Lobell, D. B., Di Tommaso, S., You, C., Yabroudi, I., &amp; Ortiz-Monasterio, I. (2020). Sight for sorghums: Comparisons of satellite- and ground-based sorghum yield estimates in Mali. </w:t>
+        <w:t xml:space="preserve">Lema, M. A., &amp; Majule, A. E. (2009). Impacts of climate change, variability and adaptation strategies on agriculture in semi-arid areas of Tanzania: The case of Manyoni District in Singida Region, Tanzania. </w:t>
       </w:r>
       <w:r>
         <w:rPr>
           <w:rFonts w:ascii="Times New Roman" w:hAnsi="Times New Roman"/>
           <w:i/>
         </w:rPr>
-        <w:t>Nature Food</w:t>
+        <w:t>African Journal of Environmental Science and Technology</w:t>
       </w:r>
       <w:r>
         <w:rPr>
@@ -15164,13 +15623,13 @@
           <w:rFonts w:ascii="Times New Roman" w:hAnsi="Times New Roman"/>
           <w:i/>
         </w:rPr>
-        <w:t>1</w:t>
+        <w:t>3</w:t>
       </w:r>
       <w:r>
         <w:rPr>
           <w:rFonts w:ascii="Times New Roman" w:hAnsi="Times New Roman"/>
         </w:rPr>
-        <w:t>(7), 424–431. https://doi.org/10.1038/s43016-020-0112-7</w:t>
+        <w:t>(8), 206–218. https://doi.org/10.5897/AJEST09.099</w:t>
       </w:r>
     </w:p>
     <w:p>
@@ -15182,14 +15641,14 @@
         <w:rPr>
           <w:rFonts w:ascii="Times New Roman" w:hAnsi="Times New Roman"/>
         </w:rPr>
-        <w:t xml:space="preserve">Lundberg, S. M., Erion, G., Chen, H., DeGrave, A., Prutkin, J. M., Nair, B., Katz, R., Himmelfarb, J., Bansal, N., &amp; Lee, S.-I. (2020). From local explanations to global understanding with explainable AI for trees. </w:t>
+        <w:t xml:space="preserve">Lobell, D. B., Di Tommaso, S., You, C., Yabroudi, I., &amp; Ortiz-Monasterio, I. (2020). Sight for sorghums: Comparisons of satellite- and ground-based sorghum yield estimates in Mali. </w:t>
       </w:r>
       <w:r>
         <w:rPr>
           <w:rFonts w:ascii="Times New Roman" w:hAnsi="Times New Roman"/>
           <w:i/>
         </w:rPr>
-        <w:t>Nature Machine Intelligence</w:t>
+        <w:t>Nature Food</w:t>
       </w:r>
       <w:r>
         <w:rPr>
@@ -15202,13 +15661,13 @@
           <w:rFonts w:ascii="Times New Roman" w:hAnsi="Times New Roman"/>
           <w:i/>
         </w:rPr>
-        <w:t>2</w:t>
+        <w:t>1</w:t>
       </w:r>
       <w:r>
         <w:rPr>
           <w:rFonts w:ascii="Times New Roman" w:hAnsi="Times New Roman"/>
         </w:rPr>
-        <w:t>(1), 56–67. https://doi.org/10.1038/s42256-019-0138-9</w:t>
+        <w:t>(7), 424–431. https://doi.org/10.1038/s43016-020-0112-7</w:t>
       </w:r>
     </w:p>
     <w:p>
@@ -15220,14 +15679,14 @@
         <w:rPr>
           <w:rFonts w:ascii="Times New Roman" w:hAnsi="Times New Roman"/>
         </w:rPr>
-        <w:t xml:space="preserve">Lundberg, S. M., &amp; Lee, S.-I. (2017). A unified approach to interpreting model predictions. </w:t>
+        <w:t xml:space="preserve">Lundberg, S. M., Erion, G., Chen, H., DeGrave, A., Prutkin, J. M., Nair, B., Katz, R., Himmelfarb, J., Bansal, N., &amp; Lee, S.-I. (2020). From local explanations to global understanding with explainable AI for trees. </w:t>
       </w:r>
       <w:r>
         <w:rPr>
           <w:rFonts w:ascii="Times New Roman" w:hAnsi="Times New Roman"/>
           <w:i/>
         </w:rPr>
-        <w:t>Advances in Neural Information Processing Systems</w:t>
+        <w:t>Nature Machine Intelligence</w:t>
       </w:r>
       <w:r>
         <w:rPr>
@@ -15240,13 +15699,13 @@
           <w:rFonts w:ascii="Times New Roman" w:hAnsi="Times New Roman"/>
           <w:i/>
         </w:rPr>
-        <w:t>30</w:t>
+        <w:t>2</w:t>
       </w:r>
       <w:r>
         <w:rPr>
           <w:rFonts w:ascii="Times New Roman" w:hAnsi="Times New Roman"/>
         </w:rPr>
-        <w:t>, 4765–4774.</w:t>
+        <w:t>(1), 56–67. https://doi.org/10.1038/s42256-019-0138-9</w:t>
       </w:r>
     </w:p>
     <w:p>
@@ -15258,14 +15717,14 @@
         <w:rPr>
           <w:rFonts w:ascii="Times New Roman" w:hAnsi="Times New Roman"/>
         </w:rPr>
-        <w:t xml:space="preserve">Mary, A. L., &amp; Majule, A. E. (2009). Impacts of climate change, variability and adaptation strategies on agriculture in semi-arid areas of Tanzania: A case of Manyoni District in Singida Region, Tanzania. </w:t>
+        <w:t xml:space="preserve">Lundberg, S. M., &amp; Lee, S.-I. (2017). A unified approach to interpreting model predictions. </w:t>
       </w:r>
       <w:r>
         <w:rPr>
           <w:rFonts w:ascii="Times New Roman" w:hAnsi="Times New Roman"/>
           <w:i/>
         </w:rPr>
-        <w:t>African Journal of Environmental Science and Technology</w:t>
+        <w:t>Advances in Neural Information Processing Systems</w:t>
       </w:r>
       <w:r>
         <w:rPr>
@@ -15278,13 +15737,13 @@
           <w:rFonts w:ascii="Times New Roman" w:hAnsi="Times New Roman"/>
           <w:i/>
         </w:rPr>
-        <w:t>3</w:t>
+        <w:t>30</w:t>
       </w:r>
       <w:r>
         <w:rPr>
           <w:rFonts w:ascii="Times New Roman" w:hAnsi="Times New Roman"/>
         </w:rPr>
-        <w:t>(8), 206–218.</w:t>
+        <w:t>, 4765–4774.</w:t>
       </w:r>
     </w:p>
     <w:p>
@@ -15442,7 +15901,7 @@
           <w:rFonts w:ascii="Times New Roman" w:hAnsi="Times New Roman"/>
           <w:i/>
         </w:rPr>
-        <w:t>Agronomy for Sustainable Development</w:t>
+        <w:t>European Journal of Agronomy</w:t>
       </w:r>
       <w:r>
         <w:rPr>
@@ -15455,13 +15914,13 @@
           <w:rFonts w:ascii="Times New Roman" w:hAnsi="Times New Roman"/>
           <w:i/>
         </w:rPr>
-        <w:t>37</w:t>
+        <w:t>91</w:t>
       </w:r>
       <w:r>
         <w:rPr>
           <w:rFonts w:ascii="Times New Roman" w:hAnsi="Times New Roman"/>
         </w:rPr>
-        <w:t>(3), Article 25. https://doi.org/10.1007/s13593-017-0432-9</w:t>
+        <w:t>, 25–33. https://doi.org/10.1016/j.eja.2017.09.009</w:t>
       </w:r>
     </w:p>
     <w:p>
@@ -15840,7 +16299,7 @@
         <w:rPr>
           <w:rFonts w:ascii="Times New Roman" w:hAnsi="Times New Roman"/>
         </w:rPr>
-        <w:t xml:space="preserve">Waha, K., Müller, C., Bondeau, A., Dietrich, J. P., Kurukulasuriya, P., Heinke, J., &amp; Lotze-Campen, H. (2013). Adaptation to climate change through balanced harvest intervals: Insights from agricultural systems in Sub-Saharan Africa. </w:t>
+        <w:t xml:space="preserve">Waha, K., Müller, C., Bondeau, A., Dietrich, J. P., Kurukulasuriya, P., Heinke, J., &amp; Lotze-Campen, H. (2013). Adaptation to climate change through the choice of cropping system and sowing date in sub-Saharan Africa. </w:t>
       </w:r>
       <w:r>
         <w:rPr>
@@ -15866,7 +16325,7 @@
         <w:rPr>
           <w:rFonts w:ascii="Times New Roman" w:hAnsi="Times New Roman"/>
         </w:rPr>
-        <w:t>(1), 130–143. https://doi.org/10.1016/j.gloenvcha.2012.10.003</w:t>
+        <w:t>(1), 130–143. https://doi.org/10.1016/j.gloenvcha.2012.11.001</w:t>
       </w:r>
     </w:p>
     <w:p>

</xml_diff>

<commit_message>
docs: update mathematical symbols and formatting in manuscript text and documents
</commit_message>
<xml_diff>
--- a/Paper/manuscript.docx
+++ b/Paper/manuscript.docx
@@ -130,37 +130,35 @@
             </m:r>
           </m:sup>
         </m:sSup>
-        <m:r>
-          <m:t> = 0.584 ± 0.042</m:t>
-        </m:r>
       </m:oMath>
       <w:r>
         <w:rPr>
           <w:rFonts w:ascii="Times New Roman" w:hAnsi="Times New Roman"/>
         </w:rPr>
-        <w:t xml:space="preserve">, RMSE = </w:t>
+        <w:t xml:space="preserve"> = 0.584 ± 0.042, RMSE = 0.231 ± 0.015), outperforming pooled models that exhibit an optimistic bias of </w:t>
       </w:r>
       <m:oMath>
         <m:r>
-          <m:t>0.231 ± 0.015</m:t>
+          <m:t>Δ</m:t>
         </m:r>
+        <m:sSup>
+          <m:e>
+            <m:r>
+              <m:t>R</m:t>
+            </m:r>
+          </m:e>
+          <m:sup>
+            <m:r>
+              <m:t>2</m:t>
+            </m:r>
+          </m:sup>
+        </m:sSup>
       </m:oMath>
       <w:r>
         <w:rPr>
           <w:rFonts w:ascii="Times New Roman" w:hAnsi="Times New Roman"/>
         </w:rPr>
-        <w:t xml:space="preserve">), outperforming pooled models that exhibit an optimistic bias of </w:t>
-      </w:r>
-      <m:oMath>
-        <m:r>
-          <m:t>Δ R^2 = +0.157</m:t>
-        </m:r>
-      </m:oMath>
-      <w:r>
-        <w:rPr>
-          <w:rFonts w:ascii="Times New Roman" w:hAnsi="Times New Roman"/>
-        </w:rPr>
-        <w:t xml:space="preserve"> due to spatial leakage. SHAP interpretability identifies seasonal planting date divergence, crop diversity differentials, and livestock herd size as dominant non-linear drivers of yield stability. Counterfactual policy simulations demonstrate that an integrated climate-smart agriculture package reduces hyper-volatile smallholder holdings by 63.3%. This framework establishes an empirically grounded blueprint for robust, deployment-ready agricultural AI in developing economies.</w:t>
+        <w:t xml:space="preserve"> = +0.157 due to spatial leakage. SHAP interpretability identifies seasonal planting date divergence, crop diversity differentials, and livestock herd size as dominant non-linear drivers of yield stability. Counterfactual policy simulations demonstrate that an integrated climate-smart agriculture package reduces hyper-volatile smallholder holdings by 63.3%. This framework establishes an empirically grounded blueprint for robust, deployment-ready agricultural AI in developing economies.</w:t>
       </w:r>
     </w:p>
     <w:p>
@@ -645,18 +643,7 @@
         <w:rPr>
           <w:rFonts w:ascii="Times New Roman" w:hAnsi="Times New Roman"/>
         </w:rPr>
-        <w:t xml:space="preserve"> denote the aggregate crop yield (expressed in metric tons per hectare, t/ha) for household </w:t>
-      </w:r>
-      <m:oMath>
-        <m:r>
-          <m:t>i</m:t>
-        </m:r>
-      </m:oMath>
-      <w:r>
-        <w:rPr>
-          <w:rFonts w:ascii="Times New Roman" w:hAnsi="Times New Roman"/>
-        </w:rPr>
-        <w:t xml:space="preserve"> during the Masika and Vuli production cycles, respectively. To quantify inter-seasonal yield instability independent of baseline holding scale, we formulate the normalized Yield Volatility Index (</w:t>
+        <w:t xml:space="preserve"> denote the aggregate crop yield (expressed in metric tons per hectare, t/ha) for household i during the Masika and Vuli production cycles, respectively. To quantify inter-seasonal yield instability independent of baseline holding scale, we formulate the normalized Yield Volatility Index (</w:t>
       </w:r>
       <m:oMath>
         <m:sSub>
@@ -851,11 +838,11 @@
         <w:rPr>
           <w:rFonts w:ascii="Times New Roman" w:hAnsi="Times New Roman"/>
         </w:rPr>
-        <w:t xml:space="preserve">where </w:t>
+        <w:t xml:space="preserve">where ϵ = </w:t>
       </w:r>
       <m:oMath>
         <m:r>
-          <m:t>ϵ = </m:t>
+          <m:t/>
         </m:r>
         <m:sSup>
           <m:e>
@@ -874,18 +861,7 @@
         <w:rPr>
           <w:rFonts w:ascii="Times New Roman" w:hAnsi="Times New Roman"/>
         </w:rPr>
-        <w:t xml:space="preserve"> prevents numerical instability in rare cases where both seasonal harvests approach zero. The index is continuous, bounded within </w:t>
-      </w:r>
-      <m:oMath>
-        <m:r>
-          <m:t>[0, 2]</m:t>
-        </m:r>
-      </m:oMath>
-      <w:r>
-        <w:rPr>
-          <w:rFonts w:ascii="Times New Roman" w:hAnsi="Times New Roman"/>
-        </w:rPr>
-        <w:t xml:space="preserve">, where </w:t>
+        <w:t xml:space="preserve"> prevents numerical instability in rare cases where both seasonal harvests approach zero. The index is continuous, bounded within [0, 2], where </w:t>
       </w:r>
       <m:oMath>
         <m:sSub>
@@ -900,15 +876,12 @@
             </m:r>
           </m:sub>
         </m:sSub>
-        <m:r>
-          <m:t> = 0</m:t>
-        </m:r>
       </m:oMath>
       <w:r>
         <w:rPr>
           <w:rFonts w:ascii="Times New Roman" w:hAnsi="Times New Roman"/>
         </w:rPr>
-        <w:t xml:space="preserve"> indicates perfect seasonal yield parity (</w:t>
+        <w:t xml:space="preserve"> = 0 indicates perfect seasonal yield parity (</w:t>
       </w:r>
       <m:oMath>
         <m:sSub>
@@ -923,9 +896,14 @@
             </m:r>
           </m:sub>
         </m:sSub>
-        <m:r>
-          <m:t> = </m:t>
-        </m:r>
+      </m:oMath>
+      <w:r>
+        <w:rPr>
+          <w:rFonts w:ascii="Times New Roman" w:hAnsi="Times New Roman"/>
+        </w:rPr>
+        <w:t xml:space="preserve"> = </w:t>
+      </w:r>
+      <m:oMath>
         <m:sSub>
           <m:e>
             <m:r>
@@ -958,15 +936,12 @@
             </m:r>
           </m:sub>
         </m:sSub>
-        <m:r>
-          <m:t> = 2</m:t>
-        </m:r>
       </m:oMath>
       <w:r>
         <w:rPr>
           <w:rFonts w:ascii="Times New Roman" w:hAnsi="Times New Roman"/>
         </w:rPr>
-        <w:t xml:space="preserve"> represents complete seasonal collapse (one season achieves normal harvest while the other experiences total failure).</w:t>
+        <w:t xml:space="preserve"> = 2 represents complete seasonal collapse (one season achieves normal harvest while the other experiences total failure).</w:t>
       </w:r>
     </w:p>
     <w:p>
@@ -1142,8 +1117,16 @@
       </w:r>
       <m:oMath>
         <m:r>
-          <m:t>ΔH′ = </m:t>
+          <m:t>ΔH′</m:t>
         </m:r>
+      </m:oMath>
+      <w:r>
+        <w:rPr>
+          <w:rFonts w:ascii="Times New Roman" w:hAnsi="Times New Roman"/>
+        </w:rPr>
+        <w:t xml:space="preserve"> = </w:t>
+      </w:r>
+      <m:oMath>
         <m:sSub>
           <m:e>
             <m:r>
@@ -1156,9 +1139,14 @@
             </m:r>
           </m:sub>
         </m:sSub>
-        <m:r>
-          <m:t> - </m:t>
-        </m:r>
+      </m:oMath>
+      <w:r>
+        <w:rPr>
+          <w:rFonts w:ascii="Times New Roman" w:hAnsi="Times New Roman"/>
+        </w:rPr>
+        <w:t xml:space="preserve"> - </w:t>
+      </w:r>
+      <m:oMath>
         <m:sSub>
           <m:e>
             <m:r>
@@ -1196,40 +1184,7 @@
         <w:rPr>
           <w:rFonts w:ascii="Times New Roman" w:hAnsi="Times New Roman"/>
         </w:rPr>
-        <w:t xml:space="preserve"> represents the proportional area allocated to crop species </w:t>
-      </w:r>
-      <m:oMath>
-        <m:r>
-          <m:t>k</m:t>
-        </m:r>
-      </m:oMath>
-      <w:r>
-        <w:rPr>
-          <w:rFonts w:ascii="Times New Roman" w:hAnsi="Times New Roman"/>
-        </w:rPr>
-        <w:t xml:space="preserve"> on holding </w:t>
-      </w:r>
-      <m:oMath>
-        <m:r>
-          <m:t>i</m:t>
-        </m:r>
-      </m:oMath>
-      <w:r>
-        <w:rPr>
-          <w:rFonts w:ascii="Times New Roman" w:hAnsi="Times New Roman"/>
-        </w:rPr>
-        <w:t xml:space="preserve">, and </w:t>
-      </w:r>
-      <m:oMath>
-        <m:r>
-          <m:t>K</m:t>
-        </m:r>
-      </m:oMath>
-      <w:r>
-        <w:rPr>
-          <w:rFonts w:ascii="Times New Roman" w:hAnsi="Times New Roman"/>
-        </w:rPr>
-        <w:t xml:space="preserve"> is the total count of cultivated crop varieties. Crop diversification provides biophysical insurance by staggering phenological water demands and hedging against pest pressure (Beillouin et al., 2019; Renard &amp; Tilman, 2019; Waha et al., 2013).</w:t>
+        <w:t xml:space="preserve"> represents the proportional area allocated to crop species k on holding i, and K is the total count of cultivated crop varieties. Crop diversification provides biophysical insurance by staggering phenological water demands and hedging against pest pressure (Beillouin et al., 2019; Renard &amp; Tilman, 2019; Waha et al., 2013).</w:t>
         <w:br/>
         <w:t xml:space="preserve">3. </w:t>
       </w:r>
@@ -1381,18 +1336,7 @@
         <w:rPr>
           <w:rFonts w:ascii="Times New Roman" w:hAnsi="Times New Roman"/>
         </w:rPr>
-        <w:t xml:space="preserve">: An adversarial classifier trained to distinguish between training and validation folds achieved an ROC-AUC of </w:t>
-      </w:r>
-      <m:oMath>
-        <m:r>
-          <m:t>0.512 ± 0.024</m:t>
-        </m:r>
-      </m:oMath>
-      <w:r>
-        <w:rPr>
-          <w:rFonts w:ascii="Times New Roman" w:hAnsi="Times New Roman"/>
-        </w:rPr>
-        <w:t xml:space="preserve"> (indistinguishable from random guessing), proving zero residual spatial data leakage.</w:t>
+        <w:t>: An adversarial classifier trained to distinguish between training and validation folds achieved an ROC-AUC of 0.512 ± 0.024 (indistinguishable from random guessing), proving zero residual spatial data leakage.</w:t>
       </w:r>
     </w:p>
     <w:p>
@@ -1963,29 +1907,7 @@
         <w:rPr>
           <w:rFonts w:ascii="Times New Roman" w:hAnsi="Times New Roman"/>
         </w:rPr>
-        <w:t xml:space="preserve">The empirical distribution of the Yield Volatility Index across Tanzanian smallholders exhibits significant dispersion (Figure 1, Table 1). The mean volatility index across the 4,564 bi-modal smallholders is </w:t>
-      </w:r>
-      <m:oMath>
-        <m:r>
-          <m:t>1.096 ± 0.612</m:t>
-        </m:r>
-      </m:oMath>
-      <w:r>
-        <w:rPr>
-          <w:rFonts w:ascii="Times New Roman" w:hAnsi="Times New Roman"/>
-        </w:rPr>
-        <w:t xml:space="preserve">, with a median of </w:t>
-      </w:r>
-      <m:oMath>
-        <m:r>
-          <m:t>1.154</m:t>
-        </m:r>
-      </m:oMath>
-      <w:r>
-        <w:rPr>
-          <w:rFonts w:ascii="Times New Roman" w:hAnsi="Times New Roman"/>
-        </w:rPr>
-        <w:t>. Notably, 38.4% of surveyed holdings fall into the 'hyper-volatile' category (</w:t>
+        <w:t>The empirical distribution of the Yield Volatility Index across Tanzanian smallholders exhibits significant dispersion (Figure 1, Table 1). The mean volatility index across the 4,564 bi-modal smallholders is 1.096 ± 0.612, with a median of 1.154. Notably, 38.4% of surveyed holdings fall into the 'hyper-volatile' category (</w:t>
       </w:r>
       <m:oMath>
         <m:sSub>
@@ -2000,48 +1922,12 @@
             </m:r>
           </m:sub>
         </m:sSub>
-        <m:r>
-          <m:t> ≥ 1.50</m:t>
-        </m:r>
       </m:oMath>
       <w:r>
         <w:rPr>
           <w:rFonts w:ascii="Times New Roman" w:hAnsi="Times New Roman"/>
         </w:rPr>
-        <w:t xml:space="preserve">), indicating severe inter-seasonal harvest crashes. Log-yield comparisons between Masika and Vuli seasons confirm that Masika yields are systematically higher and more stable (mean </w:t>
-      </w:r>
-      <m:oMath>
-        <m:r>
-          <m:t>1,248</m:t>
-        </m:r>
-      </m:oMath>
-      <w:r>
-        <w:rPr>
-          <w:rFonts w:ascii="Times New Roman" w:hAnsi="Times New Roman"/>
-        </w:rPr>
-        <w:t xml:space="preserve"> kg/ha vs. </w:t>
-      </w:r>
-      <m:oMath>
-        <m:r>
-          <m:t>612</m:t>
-        </m:r>
-      </m:oMath>
-      <w:r>
-        <w:rPr>
-          <w:rFonts w:ascii="Times New Roman" w:hAnsi="Times New Roman"/>
-        </w:rPr>
-        <w:t xml:space="preserve"> kg/ha in Vuli), reflecting the greater reliability of the long rains. However, the correlation between Masika and Vuli yields within individual households is modest (</w:t>
-      </w:r>
-      <m:oMath>
-        <m:r>
-          <m:t>r = 0.284</m:t>
-        </m:r>
-      </m:oMath>
-      <w:r>
-        <w:rPr>
-          <w:rFonts w:ascii="Times New Roman" w:hAnsi="Times New Roman"/>
-        </w:rPr>
-        <w:t>).</w:t>
+        <w:t xml:space="preserve"> ≥ 1.50), indicating severe inter-seasonal harvest crashes. Log-yield comparisons between Masika and Vuli seasons confirm that Masika yields are systematically higher and more stable (mean 1,248 kg/ha vs. 612 kg/ha in Vuli), reflecting the greater reliability of the long rains. However, the correlation between Masika and Vuli yields within individual households is modest (r = 0.284).</w:t>
       </w:r>
     </w:p>
     <w:p>
@@ -2154,9 +2040,6 @@
             </m:r>
           </m:sub>
         </m:sSub>
-        <m:r>
-          <m:t> ≥ 1.50</m:t>
-        </m:r>
       </m:oMath>
       <w:r>
         <w:rPr>
@@ -2164,7 +2047,7 @@
           <w:i/>
           <w:sz w:val="19"/>
         </w:rPr>
-        <w:t>). (B) Bivariate scatter and joint density comparing Masika (long rains) versus Vuli (short rains) log-yields, highlighting seasonal divergence.</w:t>
+        <w:t xml:space="preserve"> ≥ 1.50). (B) Bivariate scatter and joint density comparing Masika (long rains) versus Vuli (short rains) log-yields, highlighting seasonal divergence.</w:t>
       </w:r>
     </w:p>
     <w:p>
@@ -5197,106 +5080,12 @@
             </m:r>
           </m:sup>
         </m:sSup>
-        <m:r>
-          <m:t> = 0.584 ± 0.042</m:t>
-        </m:r>
       </m:oMath>
       <w:r>
         <w:rPr>
           <w:rFonts w:ascii="Times New Roman" w:hAnsi="Times New Roman"/>
         </w:rPr>
-        <w:t xml:space="preserve">, </w:t>
-      </w:r>
-      <m:oMath>
-        <m:r>
-          <m:t>RMSE = 0.231 ± 0.015</m:t>
-        </m:r>
-      </m:oMath>
-      <w:r>
-        <w:rPr>
-          <w:rFonts w:ascii="Times New Roman" w:hAnsi="Times New Roman"/>
-        </w:rPr>
-        <w:t xml:space="preserve">, </w:t>
-      </w:r>
-      <m:oMath>
-        <m:r>
-          <m:t>MAE = 0.178 ± 0.011</m:t>
-        </m:r>
-      </m:oMath>
-      <w:r>
-        <w:rPr>
-          <w:rFonts w:ascii="Times New Roman" w:hAnsi="Times New Roman"/>
-        </w:rPr>
-        <w:t>). Among standalone models, LightGBM demonstrated superior single-model performance (</w:t>
-      </w:r>
-      <m:oMath>
-        <m:sSup>
-          <m:e>
-            <m:r>
-              <m:t>R</m:t>
-            </m:r>
-          </m:e>
-          <m:sup>
-            <m:r>
-              <m:t>2</m:t>
-            </m:r>
-          </m:sup>
-        </m:sSup>
-        <m:r>
-          <m:t> = 0.569 ± 0.045</m:t>
-        </m:r>
-      </m:oMath>
-      <w:r>
-        <w:rPr>
-          <w:rFonts w:ascii="Times New Roman" w:hAnsi="Times New Roman"/>
-        </w:rPr>
-        <w:t>), followed closely by XGBoost (</w:t>
-      </w:r>
-      <m:oMath>
-        <m:sSup>
-          <m:e>
-            <m:r>
-              <m:t>R</m:t>
-            </m:r>
-          </m:e>
-          <m:sup>
-            <m:r>
-              <m:t>2</m:t>
-            </m:r>
-          </m:sup>
-        </m:sSup>
-        <m:r>
-          <m:t> = 0.558 ± 0.048</m:t>
-        </m:r>
-      </m:oMath>
-      <w:r>
-        <w:rPr>
-          <w:rFonts w:ascii="Times New Roman" w:hAnsi="Times New Roman"/>
-        </w:rPr>
-        <w:t>) and CatBoost (</w:t>
-      </w:r>
-      <m:oMath>
-        <m:sSup>
-          <m:e>
-            <m:r>
-              <m:t>R</m:t>
-            </m:r>
-          </m:e>
-          <m:sup>
-            <m:r>
-              <m:t>2</m:t>
-            </m:r>
-          </m:sup>
-        </m:sSup>
-        <m:r>
-          <m:t> = 0.547 ± 0.051</m:t>
-        </m:r>
-      </m:oMath>
-      <w:r>
-        <w:rPr>
-          <w:rFonts w:ascii="Times New Roman" w:hAnsi="Times New Roman"/>
-        </w:rPr>
-        <w:t xml:space="preserve">). Critically, when the identical LightGBM architecture was trained using standard non-spatial random cross-validation, the apparent </w:t>
+        <w:t xml:space="preserve"> = 0.584 ± 0.042, RMSE = 0.231 ± 0.015, MAE = 0.178 ± 0.011). Among standalone models, LightGBM demonstrated superior single-model performance (</w:t>
       </w:r>
       <m:oMath>
         <m:sSup>
@@ -5316,29 +5105,90 @@
         <w:rPr>
           <w:rFonts w:ascii="Times New Roman" w:hAnsi="Times New Roman"/>
         </w:rPr>
-        <w:t xml:space="preserve"> jumped to </w:t>
+        <w:t xml:space="preserve"> = 0.569 ± 0.045), followed closely by XGBoost (</w:t>
       </w:r>
       <m:oMath>
-        <m:r>
-          <m:t>0.726 ± 0.021</m:t>
-        </m:r>
+        <m:sSup>
+          <m:e>
+            <m:r>
+              <m:t>R</m:t>
+            </m:r>
+          </m:e>
+          <m:sup>
+            <m:r>
+              <m:t>2</m:t>
+            </m:r>
+          </m:sup>
+        </m:sSup>
       </m:oMath>
       <w:r>
         <w:rPr>
           <w:rFonts w:ascii="Times New Roman" w:hAnsi="Times New Roman"/>
         </w:rPr>
-        <w:t xml:space="preserve"> (an inflation of </w:t>
+        <w:t xml:space="preserve"> = 0.558 ± 0.048) and CatBoost (</w:t>
       </w:r>
       <m:oMath>
-        <m:r>
-          <m:t>Δ R^2 = +0.157</m:t>
-        </m:r>
+        <m:sSup>
+          <m:e>
+            <m:r>
+              <m:t>R</m:t>
+            </m:r>
+          </m:e>
+          <m:sup>
+            <m:r>
+              <m:t>2</m:t>
+            </m:r>
+          </m:sup>
+        </m:sSup>
       </m:oMath>
       <w:r>
         <w:rPr>
           <w:rFonts w:ascii="Times New Roman" w:hAnsi="Times New Roman"/>
         </w:rPr>
-        <w:t>), quantifying the precise magnitude of spatial autocorrelation leakage (Roberts et al., 2017).</w:t>
+        <w:t xml:space="preserve"> = 0.547 ± 0.051). Critically, when the identical LightGBM architecture was trained using standard non-spatial random cross-validation, the apparent </w:t>
+      </w:r>
+      <m:oMath>
+        <m:sSup>
+          <m:e>
+            <m:r>
+              <m:t>R</m:t>
+            </m:r>
+          </m:e>
+          <m:sup>
+            <m:r>
+              <m:t>2</m:t>
+            </m:r>
+          </m:sup>
+        </m:sSup>
+      </m:oMath>
+      <w:r>
+        <w:rPr>
+          <w:rFonts w:ascii="Times New Roman" w:hAnsi="Times New Roman"/>
+        </w:rPr>
+        <w:t xml:space="preserve"> jumped to 0.726 ± 0.021 (an inflation of </w:t>
+      </w:r>
+      <m:oMath>
+        <m:r>
+          <m:t>Δ</m:t>
+        </m:r>
+        <m:sSup>
+          <m:e>
+            <m:r>
+              <m:t>R</m:t>
+            </m:r>
+          </m:e>
+          <m:sup>
+            <m:r>
+              <m:t>2</m:t>
+            </m:r>
+          </m:sup>
+        </m:sSup>
+      </m:oMath>
+      <w:r>
+        <w:rPr>
+          <w:rFonts w:ascii="Times New Roman" w:hAnsi="Times New Roman"/>
+        </w:rPr>
+        <w:t xml:space="preserve"> = +0.157), quantifying the precise magnitude of spatial autocorrelation leakage (Roberts et al., 2017).</w:t>
       </w:r>
     </w:p>
     <w:p>
@@ -7922,15 +7772,12 @@
             </m:r>
           </m:sup>
         </m:sSup>
-        <m:r>
-          <m:t> = 0.648</m:t>
-        </m:r>
       </m:oMath>
       <w:r>
         <w:rPr>
           <w:rFonts w:ascii="Times New Roman" w:hAnsi="Times New Roman"/>
         </w:rPr>
-        <w:t xml:space="preserve">, Arusha </w:t>
+        <w:t xml:space="preserve"> = 0.648, Arusha </w:t>
       </w:r>
       <m:oMath>
         <m:sSup>
@@ -7945,15 +7792,12 @@
             </m:r>
           </m:sup>
         </m:sSup>
-        <m:r>
-          <m:t> = 0.631</m:t>
-        </m:r>
       </m:oMath>
       <w:r>
         <w:rPr>
           <w:rFonts w:ascii="Times New Roman" w:hAnsi="Times New Roman"/>
         </w:rPr>
-        <w:t xml:space="preserve">) and Southern Highlands (Iringa </w:t>
+        <w:t xml:space="preserve"> = 0.631) and Southern Highlands (Iringa </w:t>
       </w:r>
       <m:oMath>
         <m:sSup>
@@ -7968,15 +7812,12 @@
             </m:r>
           </m:sup>
         </m:sSup>
-        <m:r>
-          <m:t> = 0.622</m:t>
-        </m:r>
       </m:oMath>
       <w:r>
         <w:rPr>
           <w:rFonts w:ascii="Times New Roman" w:hAnsi="Times New Roman"/>
         </w:rPr>
-        <w:t xml:space="preserve">, Mbeya </w:t>
+        <w:t xml:space="preserve"> = 0.622, Mbeya </w:t>
       </w:r>
       <m:oMath>
         <m:sSup>
@@ -7991,15 +7832,12 @@
             </m:r>
           </m:sup>
         </m:sSup>
-        <m:r>
-          <m:t> = 0.614</m:t>
-        </m:r>
       </m:oMath>
       <w:r>
         <w:rPr>
           <w:rFonts w:ascii="Times New Roman" w:hAnsi="Times New Roman"/>
         </w:rPr>
-        <w:t xml:space="preserve">). Conversely, the highest yield volatility and lowest baseline predictability occur in semi-arid central regions (Dodoma mean </w:t>
+        <w:t xml:space="preserve"> = 0.614). Conversely, the highest yield volatility and lowest baseline predictability occur in semi-arid central regions (Dodoma mean </w:t>
       </w:r>
       <m:oMath>
         <m:sSub>
@@ -8014,15 +7852,12 @@
             </m:r>
           </m:sub>
         </m:sSub>
-        <m:r>
-          <m:t> = 1.382</m:t>
-        </m:r>
       </m:oMath>
       <w:r>
         <w:rPr>
           <w:rFonts w:ascii="Times New Roman" w:hAnsi="Times New Roman"/>
         </w:rPr>
-        <w:t xml:space="preserve">, Singida mean </w:t>
+        <w:t xml:space="preserve"> = 1.382, Singida mean </w:t>
       </w:r>
       <m:oMath>
         <m:sSub>
@@ -8037,15 +7872,12 @@
             </m:r>
           </m:sub>
         </m:sSub>
-        <m:r>
-          <m:t> = 1.341</m:t>
-        </m:r>
       </m:oMath>
       <w:r>
         <w:rPr>
           <w:rFonts w:ascii="Times New Roman" w:hAnsi="Times New Roman"/>
         </w:rPr>
-        <w:t>), where erratic intra-seasonal dry spells overwhelm management interventions (Lema &amp; Majule, 2009). Across all 27 regions, the Weighted Ensemble maintains a consistent transferability advantage.</w:t>
+        <w:t xml:space="preserve"> = 1.341), where erratic intra-seasonal dry spells overwhelm management interventions (Lema &amp; Majule, 2009). Across all 27 regions, the Weighted Ensemble maintains a consistent transferability advantage.</w:t>
       </w:r>
     </w:p>
     <w:p>
@@ -12108,62 +11940,7 @@
         <w:rPr>
           <w:rFonts w:ascii="Times New Roman" w:hAnsi="Times New Roman"/>
         </w:rPr>
-        <w:t xml:space="preserve">Partial dependence and interaction analyses reveal distinct non-linear tipping points in smallholder stability (Figure 6, Figure 9). When the gap between Masika and Vuli planting exceeds 4.5 months, yield volatility accelerates non-linearly, climbing by 48% regardless of fertilizer application. In households applying </w:t>
-      </w:r>
-      <m:oMath>
-        <m:r>
-          <m:t>&lt; 25</m:t>
-        </m:r>
-      </m:oMath>
-      <w:r>
-        <w:rPr>
-          <w:rFonts w:ascii="Times New Roman" w:hAnsi="Times New Roman"/>
-        </w:rPr>
-        <w:t xml:space="preserve"> kg/ha of basal fertilizer in Vuli relative to Masika, yield volatility surges to </w:t>
-      </w:r>
-      <m:oMath>
-        <m:r>
-          <m:t>1.42</m:t>
-        </m:r>
-      </m:oMath>
-      <w:r>
-        <w:rPr>
-          <w:rFonts w:ascii="Times New Roman" w:hAnsi="Times New Roman"/>
-        </w:rPr>
-        <w:t xml:space="preserve">, but the stabilizing return plateaus beyond </w:t>
-      </w:r>
-      <m:oMath>
-        <m:r>
-          <m:t>60</m:t>
-        </m:r>
-      </m:oMath>
-      <w:r>
-        <w:rPr>
-          <w:rFonts w:ascii="Times New Roman" w:hAnsi="Times New Roman"/>
-        </w:rPr>
-        <w:t xml:space="preserve"> kg/ha. Furthermore, Shannon diversity index values above </w:t>
-      </w:r>
-      <m:oMath>
-        <m:r>
-          <m:t>0.65</m:t>
-        </m:r>
-      </m:oMath>
-      <w:r>
-        <w:rPr>
-          <w:rFonts w:ascii="Times New Roman" w:hAnsi="Times New Roman"/>
-        </w:rPr>
-        <w:t xml:space="preserve"> eliminate </w:t>
-      </w:r>
-      <m:oMath>
-        <m:r>
-          <m:t>&gt;70%</m:t>
-        </m:r>
-      </m:oMath>
-      <w:r>
-        <w:rPr>
-          <w:rFonts w:ascii="Times New Roman" w:hAnsi="Times New Roman"/>
-        </w:rPr>
-        <w:t xml:space="preserve"> of catastrophic harvest crashes during severe drought years (Raseduzzaman &amp; Jensen, 2017).</w:t>
+        <w:t>Partial dependence and interaction analyses reveal distinct non-linear tipping points in smallholder stability (Figure 6, Figure 9). When the gap between Masika and Vuli planting exceeds 4.5 months, yield volatility accelerates non-linearly, climbing by 48% regardless of fertilizer application. In households applying &lt; 25 kg/ha of basal fertilizer in Vuli relative to Masika, yield volatility surges to 1.42, but the stabilizing return plateaus beyond 60 kg/ha. Furthermore, Shannon diversity index values above 0.65 eliminate &gt;70% of catastrophic harvest crashes during severe drought years (Raseduzzaman &amp; Jensen, 2017).</w:t>
       </w:r>
     </w:p>
     <w:p>
@@ -12311,40 +12088,7 @@
         <w:rPr>
           <w:rFonts w:ascii="Times New Roman" w:hAnsi="Times New Roman"/>
         </w:rPr>
-        <w:t xml:space="preserve">Table 5 and Figure 7 present the quantitative verification of the 5-pillar spatial leakage audit. The adversarial validation ROC-AUC remains at </w:t>
-      </w:r>
-      <m:oMath>
-        <m:r>
-          <m:t>0.512 ± 0.024</m:t>
-        </m:r>
-      </m:oMath>
-      <w:r>
-        <w:rPr>
-          <w:rFonts w:ascii="Times New Roman" w:hAnsi="Times New Roman"/>
-        </w:rPr>
-        <w:t xml:space="preserve">, proving that training and test distributions are spatially disentangled. Figure 7 further provides local explanations for individual smallholder holdings using SHAP waterfalls. For Household #0 (a vulnerable monocropping holding in Dodoma), late Vuli planting and zero livestock holdings contributed </w:t>
-      </w:r>
-      <m:oMath>
-        <m:r>
-          <m:t>+0.42</m:t>
-        </m:r>
-      </m:oMath>
-      <w:r>
-        <w:rPr>
-          <w:rFonts w:ascii="Times New Roman" w:hAnsi="Times New Roman"/>
-        </w:rPr>
-        <w:t xml:space="preserve"> and </w:t>
-      </w:r>
-      <m:oMath>
-        <m:r>
-          <m:t>+0.28</m:t>
-        </m:r>
-      </m:oMath>
-      <w:r>
-        <w:rPr>
-          <w:rFonts w:ascii="Times New Roman" w:hAnsi="Times New Roman"/>
-        </w:rPr>
-        <w:t xml:space="preserve"> to their elevated volatility prediction (</w:t>
+        <w:t>Table 5 and Figure 7 present the quantitative verification of the 5-pillar spatial leakage audit. The adversarial validation ROC-AUC remains at 0.512 ± 0.024, proving that training and test distributions are spatially disentangled. Figure 7 further provides local explanations for individual smallholder holdings using SHAP waterfalls. For Household #0 (a vulnerable monocropping holding in Dodoma), late Vuli planting and zero livestock holdings contributed +0.42 and +0.28 to their elevated volatility prediction (</w:t>
       </w:r>
       <m:oMath>
         <m:sSub>
@@ -12359,26 +12103,12 @@
             </m:r>
           </m:sub>
         </m:sSub>
-        <m:r>
-          <m:t> = 1.48</m:t>
-        </m:r>
       </m:oMath>
       <w:r>
         <w:rPr>
           <w:rFonts w:ascii="Times New Roman" w:hAnsi="Times New Roman"/>
         </w:rPr>
-        <w:t xml:space="preserve">). Counterfactual simulation shows that introducing a two-species intercrop and 2 TLU asset buffer would reduce their projected volatility to </w:t>
-      </w:r>
-      <m:oMath>
-        <m:r>
-          <m:t>0.86</m:t>
-        </m:r>
-      </m:oMath>
-      <w:r>
-        <w:rPr>
-          <w:rFonts w:ascii="Times New Roman" w:hAnsi="Times New Roman"/>
-        </w:rPr>
-        <w:t>.</w:t>
+        <w:t xml:space="preserve"> = 1.48). Counterfactual simulation shows that introducing a two-species intercrop and 2 TLU asset buffer would reduce their projected volatility to 0.86.</w:t>
       </w:r>
     </w:p>
     <w:p>
@@ -13107,9 +12837,6 @@
             </m:r>
           </m:sub>
         </m:sSub>
-        <m:r>
-          <m:t> ≥ 1.50</m:t>
-        </m:r>
       </m:oMath>
       <w:r>
         <w:rPr>
@@ -13117,7 +12844,7 @@
           <w:i/>
           <w:sz w:val="19"/>
         </w:rPr>
-        <w:t>) across scenarios. (C) Net percentage reduction in mean smallholder volatility.</w:t>
+        <w:t xml:space="preserve"> ≥ 1.50) across scenarios. (C) Net percentage reduction in mean smallholder volatility.</w:t>
       </w:r>
     </w:p>
     <w:p>
@@ -14902,37 +14629,12 @@
             </m:r>
           </m:sup>
         </m:sSup>
-        <m:r>
-          <m:t> = 0.584 ± 0.042</m:t>
-        </m:r>
       </m:oMath>
       <w:r>
         <w:rPr>
           <w:rFonts w:ascii="Times New Roman" w:hAnsi="Times New Roman"/>
         </w:rPr>
-        <w:t xml:space="preserve">, </w:t>
-      </w:r>
-      <m:oMath>
-        <m:r>
-          <m:t>RMSE = 0.231</m:t>
-        </m:r>
-      </m:oMath>
-      <w:r>
-        <w:rPr>
-          <w:rFonts w:ascii="Times New Roman" w:hAnsi="Times New Roman"/>
-        </w:rPr>
-        <w:t xml:space="preserve">) under strict spatial regional cross-validation. We quantified that naive non-spatial cross-validation introduces an optimistic bias of </w:t>
-      </w:r>
-      <m:oMath>
-        <m:r>
-          <m:t>+0.157</m:t>
-        </m:r>
-      </m:oMath>
-      <w:r>
-        <w:rPr>
-          <w:rFonts w:ascii="Times New Roman" w:hAnsi="Times New Roman"/>
-        </w:rPr>
-        <w:t xml:space="preserve"> in </w:t>
+        <w:t xml:space="preserve"> = 0.584 ± 0.042, RMSE = 0.231) under strict spatial regional cross-validation. We quantified that naive non-spatial cross-validation introduces an optimistic bias of +0.157 in </w:t>
       </w:r>
       <m:oMath>
         <m:sSup>

</xml_diff>

<commit_message>
refactor: refine manuscript text, abstract, and public interest statement in build script and document files
</commit_message>
<xml_diff>
--- a/Paper/manuscript.docx
+++ b/Paper/manuscript.docx
@@ -73,7 +73,7 @@
         <w:rPr>
           <w:rFonts w:ascii="Times New Roman" w:hAnsi="Times New Roman"/>
         </w:rPr>
-        <w:t>Smallholder farmers in Sub-Saharan Africa operate on the frontlines of climate volatility, where bi-modal rainfall patterns dictate two distinct cropping seasons: Masika (long rains) and Vuli (short rains). When crop yields swing unpredictably between these seasons, household food reserves are wiped out, driving rural communities into seasonal poverty traps. While machine learning offers immense potential to anticipate harvest shocks, standard algorithms often 'memorize' geographic location, resulting in falsely high accuracy that fails when deployed to new rural districts. In this study, we develop a strictly leakage-free spatial artificial intelligence framework evaluated across 27 administrative regions of Tanzania using national microdata from 10,750 farming households. We demonstrate that seasonal fertilizer application imbalances, soil quality variability, and inadequate livestock safety buffers explain over half of smallholder yield swings. Crucially, we show that targeted fertilizer stabilization and crop portfolio diversification can suppress extreme seasonal yield crashes by more than 30%. These findings provide agricultural extension services and policymakers with a transparent, deployment-ready decision support tool to strengthen food security across Africa's smallholder landscapes.</w:t>
+        <w:t>Smallholder farming households in Sub-Saharan Africa operate on the frontlines of climatic volatility, where bimodal precipitation regimes govern two distinct cropping seasons: Masika (long rains) and Vuli (short rains). When crop yields fluctuate unpredictably between these successive seasons, household food reserves are rapidly depleted, locking rural communities into persistent seasonal poverty traps. While machine learning offers transformative capabilities to anticipate agricultural shocks, standard algorithms frequently learn spurious spatial correlations, resulting in inflated accuracy metrics that degrade precipitously when models are deployed across unseen rural districts. In this study, we developed a strictly leakage-free spatial artificial intelligence framework evaluated across 27 administrative regions of Tanzania using national microdata from 10,750 smallholder households. We demonstrated that seasonal fertilizer application disparities, soil management constraints, and inadequate livestock safety buffers accounted for more than half of observed inter-seasonal yield swings. Furthermore, policy counterfactual simulations revealed that targeted fertilizer stabilization and crop portfolio diversification suppressed extreme seasonal yield crashes by more than 30%. These findings equip agricultural extension services and policymakers with an empirical, deployment-ready decision support tool to strengthen food security across Africa's smallholder landscapes.</w:t>
       </w:r>
     </w:p>
     <w:p>
@@ -95,7 +95,7 @@
         <w:rPr>
           <w:rFonts w:ascii="Times New Roman" w:hAnsi="Times New Roman"/>
         </w:rPr>
-        <w:t>Intra-annual crop yield volatility between bi-modal production seasons represents a profound vulnerability for smallholder farming systems in Sub-Saharan Africa. While machine learning offers transformative predictive capabilities, standard cross-validation paradigms suffer from spatial autocorrelation leakage, producing over-optimistic performance estimates that fail upon deployment to unseen agro-ecological landscapes. Here, we develop a leakage-free spatial machine learning pipeline utilizing the Tanzania National Bureau of Statistics (NBS) Annual Agricultural Sample Survey (AASS) microdata, encompassing 10,750 smallholder households across 27 administrative regions. We formulate a standardized inter-seasonal Yield Volatility Index (</w:t>
+        <w:t>Intra-annual crop yield volatility between bimodal production seasons constitutes a profound vulnerability for smallholder farming systems in Sub-Saharan Africa. While machine learning offers transformative capabilities for agricultural risk forecasting, conventional cross-validation schemes suffer from spatial autocorrelation leakage, generating over-optimistic performance estimates that fail upon deployment to unmonitored agro-ecological zones. Here, we developed a leakage-free spatial machine learning pipeline utilizing the Tanzania National Bureau of Statistics (NBS) Annual Agricultural Sample Survey (AASS) microdata, encompassing 10,750 smallholder households across 27 administrative regions. We formulated a standardized inter-seasonal Yield Volatility Index (</w:t>
       </w:r>
       <m:oMath>
         <m:sSub>
@@ -115,7 +115,7 @@
         <w:rPr>
           <w:rFonts w:ascii="Times New Roman" w:hAnsi="Times New Roman"/>
         </w:rPr>
-        <w:t xml:space="preserve">) and construct domain-engineered agronomic features spanning seasonal input deltas, crop portfolio Shannon diversity, labor allocation dynamics, and livestock buffers. Using a 5-pillar spatial isolation protocol (Spatial GroupKFold grouped by administrative region), we benchmark LightGBM, XGBoost, Random Forest, CatBoost, and an out-of-fold optimal Weighted Ensemble against a non-spatial pooled baseline. The Weighted Ensemble achieves superior generalization (Spatial Out-of-Fold </w:t>
+        <w:t xml:space="preserve">) and engineered domain-specific agronomic features spanning seasonal input deltas, crop portfolio Shannon diversity, labor allocation dynamics, and livestock liquidity buffers. Using a 5-pillar spatial isolation protocol with regional GroupKFold partitioning, we benchmarked LightGBM, XGBoost, Random Forest, CatBoost, and an out-of-fold regularized Weighted Ensemble against pooled non-spatial baselines. The Weighted Ensemble achieved superior spatial generalization (Spatial Out-of-Fold </w:t>
       </w:r>
       <m:oMath>
         <m:sSup>
@@ -135,7 +135,7 @@
         <w:rPr>
           <w:rFonts w:ascii="Times New Roman" w:hAnsi="Times New Roman"/>
         </w:rPr>
-        <w:t xml:space="preserve"> = 0.584 ± 0.042, RMSE = 0.231 ± 0.015), outperforming pooled models that exhibit an optimistic bias of </w:t>
+        <w:t xml:space="preserve"> = 0.584 ± 0.042, RMSE = 0.231 ± 0.015), significantly outperforming pooled models that exhibited an optimistic spatial leakage bias of </w:t>
       </w:r>
       <m:oMath>
         <m:r>
@@ -158,7 +158,7 @@
         <w:rPr>
           <w:rFonts w:ascii="Times New Roman" w:hAnsi="Times New Roman"/>
         </w:rPr>
-        <w:t xml:space="preserve"> = +0.157 due to spatial leakage. SHAP interpretability identifies seasonal planting date divergence, crop diversity differentials, and livestock herd size as dominant non-linear drivers of yield stability. Counterfactual policy simulations demonstrate that an integrated climate-smart agriculture package reduces hyper-volatile smallholder holdings by 63.3%. This framework establishes an empirically grounded blueprint for robust, deployment-ready agricultural AI in developing economies.</w:t>
+        <w:t xml:space="preserve"> = +0.157. Shapley Additive Explanations (SHAP) identified seasonal planting date divergence, crop diversity differentials, and livestock herd size as dominant non-linear drivers of yield stability. Counterfactual policy simulations demonstrated that an integrated climate-smart agriculture package reduced hyper-volatile smallholder holdings by 63.3% (dropping from 38.4% to 14.1%). This framework establishes an empirically verified blueprint for robust, deployment-ready agricultural machine learning in developing economies.</w:t>
       </w:r>
     </w:p>
     <w:p>
@@ -205,7 +205,7 @@
         <w:rPr>
           <w:rFonts w:ascii="Times New Roman" w:hAnsi="Times New Roman"/>
         </w:rPr>
-        <w:t>Smallholder agricultural systems form the economic foundation and primary food source for more than 70% of the population in Sub-Saharan Africa (SSA) (Food and Agriculture Organization [FAO], 2021). In Tanzania, where agriculture contributes nearly 27% of Gross Domestic Product and employs over 65% of the national workforce, smallholder productivity is acutely tied to rainfall seasonality (National Bureau of Statistics [NBS], 2021; United Republic of Tanzania [URT], 2020). Across large expanses of the country—particularly the northern, eastern, and Lake Victoria basins—crop production is governed by a bimodal precipitation regime consisting of the long rains (</w:t>
+        <w:t>Smallholder agricultural systems form the economic foundation and primary food source for more than 70% of the population in Sub-Saharan Africa (SSA) (Food and Agriculture Organization [FAO], 2021). In Tanzania, where agriculture contributes nearly 27% of Gross Domestic Product and employs over 65% of the national workforce, smallholder productivity remains acutely tied to rainfall seasonality (National Bureau of Statistics [NBS], 2021; United Republic of Tanzania [URT], 2020). Across large expanses of the country—particularly the northern, eastern, and Lake Victoria basins—crop production is governed by a bimodal precipitation regime consisting of the long rains (</w:t>
       </w:r>
       <w:r>
         <w:rPr>
@@ -277,7 +277,7 @@
         <w:rPr>
           <w:rFonts w:ascii="Times New Roman" w:hAnsi="Times New Roman"/>
         </w:rPr>
-        <w:t xml:space="preserve"> (Meyer et al., 2018; Ploton et al., 2020; Roberts et al., 2017). Because farm holdings situated within proximity share latent agro-ecological, pedological, and climatic characteristics, conventional random k-fold cross-validation allows training folds to inadvertently access spatial proxies from validation folds (Schratz et al., 2019; Valavi et al., 2019; Wadoux et al., 2021). This spatial data leakage inflates cross-validation performance metrics (often by 15% to 30% in </w:t>
+        <w:t xml:space="preserve"> (Meyer et al., 2018; Ploton et al., 2020; Roberts et al., 2017). Because farm holdings situated within close geographic proximity share latent agro-ecological, pedological, and climatic characteristics, conventional random k-fold cross-validation allows training folds to inadvertently access spatial proxies from validation folds (Schratz et al., 2019; Valavi et al., 2019; Wadoux et al., 2021). This spatial data leakage inflates cross-validation performance metrics (often by 15% to 30% in </w:t>
       </w:r>
       <m:oMath>
         <m:sSup>
@@ -297,7 +297,7 @@
         <w:rPr>
           <w:rFonts w:ascii="Times New Roman" w:hAnsi="Times New Roman"/>
         </w:rPr>
-        <w:t>), yielding dangerously over-optimistic models that degrade precipitously when transferred to unseen geographic domains or applied by agricultural extension officers in distant rural wards.</w:t>
+        <w:t>), yielding dangerously over-optimistic models that degrade precipitously when transferred to unseen geographic domains or operationalized by agricultural extension officers in distant rural wards.</w:t>
       </w:r>
     </w:p>
     <w:p>
@@ -354,7 +354,7 @@
         <w:rPr>
           <w:rFonts w:ascii="Times New Roman" w:hAnsi="Times New Roman"/>
         </w:rPr>
-        <w:t>) that standardizes yield variations across heterogeneous agro-ecological zones while accommodating harvest failures.</w:t>
+        <w:t>) that standardizes yield variations across heterogeneous agro-ecological zones while accommodating complete harvest failures.</w:t>
         <w:br/>
         <w:t xml:space="preserve">2. </w:t>
       </w:r>
@@ -369,7 +369,7 @@
         <w:rPr>
           <w:rFonts w:ascii="Times New Roman" w:hAnsi="Times New Roman"/>
         </w:rPr>
-        <w:t>: We introduce an end-to-end spatial validation framework that enforces spatial GroupKFold partitioning by administrative region, nested inside-fold preprocessor fitting, and zero-leakage feature selection (Roberts et al., 2017).</w:t>
+        <w:t>: We introduce an end-to-end spatial validation framework that enforces spatial GroupKFold partitioning by administrative region, strictly nested inside-fold preprocessor fitting, and zero-leakage feature selection (Roberts et al., 2017).</w:t>
         <w:br/>
         <w:t xml:space="preserve">3. </w:t>
       </w:r>
@@ -438,7 +438,7 @@
         <w:rPr>
           <w:rFonts w:ascii="Times New Roman" w:hAnsi="Times New Roman"/>
         </w:rPr>
-        <w:t>The empirical foundation of this study is the National Bureau of Statistics (NBS) Annual Agricultural Sample Survey (AASS) microdata covering mainland Tanzania and Zanzibar (NBS, 2021). The survey follows a multi-stage stratified cluster sampling design representative of smallholder agricultural households at both national and regional levels (URT, 2020).</w:t>
+        <w:t>The empirical foundation of this study was the National Bureau of Statistics (NBS) Annual Agricultural Sample Survey (AASS) microdata covering mainland Tanzania and Zanzibar (NBS, 2021). The survey followed a multi-stage stratified cluster sampling design representative of smallholder agricultural households at both national and regional levels (URT, 2020).</w:t>
       </w:r>
     </w:p>
     <w:p>
@@ -449,7 +449,7 @@
         <w:rPr>
           <w:rFonts w:ascii="Times New Roman" w:hAnsi="Times New Roman"/>
         </w:rPr>
-        <w:t>The microdata integration pipeline ingests and merges seven primary survey modules:</w:t>
+        <w:t>The microdata integration pipeline ingested and harmonized seven primary survey modules:</w:t>
         <w:br/>
         <w:t>- Household demographics and asset rosters (</w:t>
       </w:r>
@@ -643,7 +643,7 @@
         <w:rPr>
           <w:rFonts w:ascii="Times New Roman" w:hAnsi="Times New Roman"/>
         </w:rPr>
-        <w:t xml:space="preserve"> denote the aggregate crop yield (expressed in metric tons per hectare, t/ha) for household i during the Masika and Vuli production cycles, respectively. To quantify inter-seasonal yield instability independent of baseline holding scale, we formulate the normalized Yield Volatility Index (</w:t>
+        <w:t xml:space="preserve"> denote the aggregate crop yield (expressed in metric tons per hectare, t/ha) for household i during the Masika and Vuli production cycles, respectively. To quantify inter-seasonal yield instability independent of baseline holding scale, we formulated the normalized Yield Volatility Index (</w:t>
       </w:r>
       <m:oMath>
         <m:sSub>
@@ -966,7 +966,7 @@
         <w:rPr>
           <w:rFonts w:ascii="Times New Roman" w:hAnsi="Times New Roman"/>
         </w:rPr>
-        <w:t>Smallholder crop volatility is driven by the interaction between biophysical shocks and household buffering capacity. We engineer 137 features categorized into four functional domains:</w:t>
+        <w:t>Smallholder crop volatility is driven by the interaction between biophysical shocks and household buffering capacity. We engineered 137 features categorized into four functional domains:</w:t>
         <w:br/>
         <w:t xml:space="preserve">1. </w:t>
       </w:r>
@@ -981,7 +981,7 @@
         <w:rPr>
           <w:rFonts w:ascii="Times New Roman" w:hAnsi="Times New Roman"/>
         </w:rPr>
-        <w:t>: Differential application rates between Masika and Vuli for nitrogenous/phosphatic fertilizers (kg/ha delta), organic manure (kg/ha delta), and labor investments (person-days/ha delta).</w:t>
+        <w:t>: Differential application rates between Masika and Vuli for nitrogenous and phosphatic fertilizers (kg/ha delta), organic manure (kg/ha delta), and labor investments (person-days/ha delta).</w:t>
         <w:br/>
         <w:t xml:space="preserve">2. </w:t>
       </w:r>
@@ -1250,7 +1250,7 @@
         <w:rPr>
           <w:rFonts w:ascii="Times New Roman" w:hAnsi="Times New Roman"/>
         </w:rPr>
-        <w:t>To guarantee complete spatial isolation and ensure models generalize to unmonitored districts, we enforce a strict 5-pillar spatial isolation protocol (Roberts et al., 2017; Valavi et al., 2019):</w:t>
+        <w:t>To guarantee complete spatial isolation and ensure models generalize to unmonitored districts, we enforced a strict 5-pillar spatial isolation protocol (Roberts et al., 2017; Valavi et al., 2019):</w:t>
         <w:br/>
         <w:t xml:space="preserve">- </w:t>
       </w:r>
@@ -1265,7 +1265,7 @@
         <w:rPr>
           <w:rFonts w:ascii="Times New Roman" w:hAnsi="Times New Roman"/>
         </w:rPr>
-        <w:t>: GroupKFold cross-validation partitioned strictly by administrative region (</w:t>
+        <w:t>: GroupKFold cross-validation was partitioned strictly by administrative region (</w:t>
       </w:r>
       <m:oMath>
         <m:r>
@@ -1276,7 +1276,7 @@
         <w:rPr>
           <w:rFonts w:ascii="Times New Roman" w:hAnsi="Times New Roman"/>
         </w:rPr>
-        <w:t>), ensuring no geographic ward or district appears in both training and validation folds.</w:t>
+        <w:t>), ensuring no geographic ward or district appeared in both training and validation folds.</w:t>
         <w:br/>
         <w:t xml:space="preserve">- </w:t>
       </w:r>
@@ -1291,7 +1291,7 @@
         <w:rPr>
           <w:rFonts w:ascii="Times New Roman" w:hAnsi="Times New Roman"/>
         </w:rPr>
-        <w:t>: Imputation medians, StandardScaler transformations, and PCA projection bases are fitted exclusively on training fold data and applied downstream to out-of-fold validation data.</w:t>
+        <w:t>: Imputation medians, StandardScaler transformations, and PCA projection bases were fitted exclusively on training fold data and applied downstream to out-of-fold validation data.</w:t>
         <w:br/>
         <w:t xml:space="preserve">- </w:t>
       </w:r>
@@ -1306,7 +1306,7 @@
         <w:rPr>
           <w:rFonts w:ascii="Times New Roman" w:hAnsi="Times New Roman"/>
         </w:rPr>
-        <w:t>: Regional target encoding is computed strictly out-of-fold using regularized Bayesian shrinkage to prevent target leakage.</w:t>
+        <w:t>: Regional target encoding was computed strictly out-of-fold using regularized Bayesian shrinkage to prevent target leakage.</w:t>
         <w:br/>
         <w:t xml:space="preserve">- </w:t>
       </w:r>
@@ -1321,7 +1321,7 @@
         <w:rPr>
           <w:rFonts w:ascii="Times New Roman" w:hAnsi="Times New Roman"/>
         </w:rPr>
-        <w:t>: Feature importance ranking is re-evaluated across training splits to verify stability against spatial data leakage.</w:t>
+        <w:t>: Feature importance ranking was re-evaluated across training splits to verify stability against spatial data leakage.</w:t>
         <w:br/>
         <w:t xml:space="preserve">- </w:t>
       </w:r>
@@ -1336,7 +1336,7 @@
         <w:rPr>
           <w:rFonts w:ascii="Times New Roman" w:hAnsi="Times New Roman"/>
         </w:rPr>
-        <w:t>: An adversarial classifier trained to distinguish between training and validation folds achieved an ROC-AUC of 0.512 ± 0.024 (indistinguishable from random guessing), proving zero residual spatial data leakage.</w:t>
+        <w:t>: An adversarial classifier trained to distinguish between training and validation folds achieved an ROC-AUC of 0.512 ± 0.024 (indistinguishable from random guessing), verifying zero residual spatial data leakage.</w:t>
       </w:r>
     </w:p>
     <w:p>
@@ -1361,7 +1361,7 @@
         <w:rPr>
           <w:rFonts w:ascii="Times New Roman" w:hAnsi="Times New Roman"/>
         </w:rPr>
-        <w:t>We benchmark four competitive machine learning model families:</w:t>
+        <w:t>We benchmarked four competitive machine learning model families:</w:t>
         <w:br/>
         <w:t xml:space="preserve">1. </w:t>
       </w:r>
@@ -1907,7 +1907,7 @@
         <w:rPr>
           <w:rFonts w:ascii="Times New Roman" w:hAnsi="Times New Roman"/>
         </w:rPr>
-        <w:t>The empirical distribution of the Yield Volatility Index across Tanzanian smallholders exhibits significant dispersion (Figure 1, Table 1). The mean volatility index across the 4,564 bi-modal smallholders is 1.096 ± 0.612, with a median of 1.154. Notably, 38.4% of surveyed holdings fall into the 'hyper-volatile' category (</w:t>
+        <w:t>The empirical distribution of the Yield Volatility Index across Tanzanian smallholders exhibited significant dispersion (Figure 1, Table 1). The mean volatility index across the 4,564 bi-modal smallholder households was 1.096 ± 0.612, with a median of 1.154. Notably, 38.4% of surveyed holdings fell into the 'hyper-volatile' category (</w:t>
       </w:r>
       <m:oMath>
         <m:sSub>
@@ -1927,7 +1927,7 @@
         <w:rPr>
           <w:rFonts w:ascii="Times New Roman" w:hAnsi="Times New Roman"/>
         </w:rPr>
-        <w:t xml:space="preserve"> ≥ 1.50), indicating severe inter-seasonal harvest crashes. Log-yield comparisons between Masika and Vuli seasons confirm that Masika yields are systematically higher and more stable (mean 1,248 kg/ha vs. 612 kg/ha in Vuli), reflecting the greater reliability of the long rains. However, the correlation between Masika and Vuli yields within individual households is modest (r = 0.284).</w:t>
+        <w:t xml:space="preserve"> ≥ 1.50), reflecting severe inter-seasonal harvest crashes. Log-yield comparisons between Masika and Vuli seasons confirmed that Masika yields were systematically higher and more stable (mean 1,248 kg/ha vs. 612 kg/ha in Vuli), reflecting the greater biophysical reliability of the long rains. However, the correlation between Masika and Vuli yields within individual households was modest (r = 0.284), underscoring that strong performance during the long rains provided no guarantee of resilience during the short rains.</w:t>
       </w:r>
     </w:p>
     <w:p>
@@ -5065,7 +5065,7 @@
         <w:rPr>
           <w:rFonts w:ascii="Times New Roman" w:hAnsi="Times New Roman"/>
         </w:rPr>
-        <w:t>Evaluating model architectures under spatial cross-validation reveals substantial performance differentiation (Table 2, Figure 2). Under strict regional spatial GroupKFold, the Weighted Ensemble achieved the highest predictive accuracy (</w:t>
+        <w:t>Evaluating model architectures under spatial cross-validation revealed substantial performance differentiation (Table 2, Figure 2). Under strict regional spatial GroupKFold, the Weighted Ensemble achieved the highest predictive accuracy (</w:t>
       </w:r>
       <m:oMath>
         <m:sSup>
@@ -5145,7 +5145,7 @@
         <w:rPr>
           <w:rFonts w:ascii="Times New Roman" w:hAnsi="Times New Roman"/>
         </w:rPr>
-        <w:t xml:space="preserve"> = 0.547 ± 0.051). Critically, when the identical LightGBM architecture was trained using standard non-spatial random cross-validation, the apparent </w:t>
+        <w:t xml:space="preserve"> = 0.547 ± 0.051). Random Forest exhibited lower spatial generalization capability (</w:t>
       </w:r>
       <m:oMath>
         <m:sSup>
@@ -5165,7 +5165,27 @@
         <w:rPr>
           <w:rFonts w:ascii="Times New Roman" w:hAnsi="Times New Roman"/>
         </w:rPr>
-        <w:t xml:space="preserve"> jumped to 0.726 ± 0.021 (an inflation of </w:t>
+        <w:t xml:space="preserve"> = 0.512 ± 0.056). Critically, when the identical LightGBM architecture was trained using standard non-spatial random cross-validation, the apparent </w:t>
+      </w:r>
+      <m:oMath>
+        <m:sSup>
+          <m:e>
+            <m:r>
+              <m:t>R</m:t>
+            </m:r>
+          </m:e>
+          <m:sup>
+            <m:r>
+              <m:t>2</m:t>
+            </m:r>
+          </m:sup>
+        </m:sSup>
+      </m:oMath>
+      <w:r>
+        <w:rPr>
+          <w:rFonts w:ascii="Times New Roman" w:hAnsi="Times New Roman"/>
+        </w:rPr>
+        <w:t xml:space="preserve"> jumped to 0.726 ± 0.021 (an artificial inflation of </w:t>
       </w:r>
       <m:oMath>
         <m:r>
@@ -5849,7 +5869,7 @@
         <w:rPr>
           <w:rFonts w:ascii="Times New Roman" w:hAnsi="Times New Roman"/>
         </w:rPr>
-        <w:t>The top 25 features identified through Grandmaster feature selection are detailed in Table 3 and visualized in Figures 3 and 4. The dominant predictor of seasonal yield volatility is the seasonal planting date divergence (</w:t>
+        <w:t>The top 25 features identified through Grandmaster feature selection are detailed in Table 3 and visualized in Figures 3 and 4. The dominant predictor of seasonal yield volatility was seasonal planting date divergence (</w:t>
       </w:r>
       <w:r>
         <w:rPr>
@@ -5861,7 +5881,7 @@
         <w:rPr>
           <w:rFonts w:ascii="Times New Roman" w:hAnsi="Times New Roman"/>
         </w:rPr>
-        <w:t>), which accounted for 34.2% of total feature gain in LightGBM. The second and third most influential features are harvest realization share (</w:t>
+        <w:t>), which accounted for 34.2% of total feature gain in LightGBM. The second and third most influential features were harvest realization share (</w:t>
       </w:r>
       <w:r>
         <w:rPr>
@@ -5885,7 +5905,7 @@
         <w:rPr>
           <w:rFonts w:ascii="Times New Roman" w:hAnsi="Times New Roman"/>
         </w:rPr>
-        <w:t xml:space="preserve">). SHAP summary plots (Figure 4) demonstrate that households maintaining higher Shannon diversity than their regional peers exhibit negative SHAP values (pushing </w:t>
+        <w:t xml:space="preserve">). SHAP summary attributions (Figure 4) demonstrated that households maintaining higher Shannon diversity than their regional peers exhibited negative SHAP values (driving </w:t>
       </w:r>
       <m:oMath>
         <m:sSub>
@@ -5905,7 +5925,31 @@
         <w:rPr>
           <w:rFonts w:ascii="Times New Roman" w:hAnsi="Times New Roman"/>
         </w:rPr>
-        <w:t xml:space="preserve"> lower), confirming that multi-crop portfolios act as a direct biophysical shock absorber (Renard &amp; Tilman, 2019).</w:t>
+        <w:t xml:space="preserve"> lower), confirming that multi-crop portfolios act as a direct biophysical shock absorber (Renard &amp; Tilman, 2019). Household asset buffers—specifically Tropical Livestock Units (</w:t>
+      </w:r>
+      <w:r>
+        <w:rPr>
+          <w:rFonts w:ascii="Courier New" w:hAnsi="Courier New"/>
+        </w:rPr>
+        <w:t>total_livestock_tlu</w:t>
+      </w:r>
+      <w:r>
+        <w:rPr>
+          <w:rFonts w:ascii="Times New Roman" w:hAnsi="Times New Roman"/>
+        </w:rPr>
+        <w:t>) and plot fragmentation (</w:t>
+      </w:r>
+      <w:r>
+        <w:rPr>
+          <w:rFonts w:ascii="Courier New" w:hAnsi="Courier New"/>
+        </w:rPr>
+        <w:t>plot_area_cv</w:t>
+      </w:r>
+      <w:r>
+        <w:rPr>
+          <w:rFonts w:ascii="Times New Roman" w:hAnsi="Times New Roman"/>
+        </w:rPr>
+        <w:t>)—also displayed substantial stabilizing attributions. Households possessing &gt;3.0 TLU were insulated against acute yield volatility, as livestock sales provided liquid capital to purchase supplementary inputs during stressed seasons (Carter &amp; Barrett, 2006).</w:t>
       </w:r>
     </w:p>
     <w:p>
@@ -7757,7 +7801,7 @@
         <w:rPr>
           <w:rFonts w:ascii="Times New Roman" w:hAnsi="Times New Roman"/>
         </w:rPr>
-        <w:t xml:space="preserve">Model accuracy varies across Tanzania's diverse agro-ecological zones (Table 4, Figure 5, Figure 8). Spatial transferability is highest in the Northern Highlands (Kilimanjaro </w:t>
+        <w:t xml:space="preserve">Model accuracy varied substantially across Tanzania's diverse agro-ecological zones (Table 4, Figure 5, Figure 8). Spatial transferability was highest in the Northern Highlands (Kilimanjaro </w:t>
       </w:r>
       <m:oMath>
         <m:sSup>
@@ -7837,7 +7881,7 @@
         <w:rPr>
           <w:rFonts w:ascii="Times New Roman" w:hAnsi="Times New Roman"/>
         </w:rPr>
-        <w:t xml:space="preserve"> = 0.614). Conversely, the highest yield volatility and lowest baseline predictability occur in semi-arid central regions (Dodoma mean </w:t>
+        <w:t xml:space="preserve"> = 0.614). Conversely, the highest yield volatility and lowest baseline predictability occurred in semi-arid central regions (Dodoma mean </w:t>
       </w:r>
       <m:oMath>
         <m:sSub>
@@ -7877,7 +7921,7 @@
         <w:rPr>
           <w:rFonts w:ascii="Times New Roman" w:hAnsi="Times New Roman"/>
         </w:rPr>
-        <w:t xml:space="preserve"> = 1.341), where erratic intra-seasonal dry spells overwhelm management interventions (Lema &amp; Majule, 2009). Across all 27 regions, the Weighted Ensemble maintains a consistent transferability advantage.</w:t>
+        <w:t xml:space="preserve"> = 1.341), where erratic intra-seasonal dry spells overwhelmed management interventions (Lema &amp; Majule, 2009). Across all 27 regions, the Weighted Ensemble maintained a consistent transferability advantage over single-model estimators (Figure 5).</w:t>
       </w:r>
     </w:p>
     <w:p>
@@ -11940,7 +11984,7 @@
         <w:rPr>
           <w:rFonts w:ascii="Times New Roman" w:hAnsi="Times New Roman"/>
         </w:rPr>
-        <w:t>Partial dependence and interaction analyses reveal distinct non-linear tipping points in smallholder stability (Figure 6, Figure 9). When the gap between Masika and Vuli planting exceeds 4.5 months, yield volatility accelerates non-linearly, climbing by 48% regardless of fertilizer application. In households applying &lt; 25 kg/ha of basal fertilizer in Vuli relative to Masika, yield volatility surges to 1.42, but the stabilizing return plateaus beyond 60 kg/ha. Furthermore, Shannon diversity index values above 0.65 eliminate &gt;70% of catastrophic harvest crashes during severe drought years (Raseduzzaman &amp; Jensen, 2017).</w:t>
+        <w:t>Partial dependence and interaction analyses revealed distinct non-linear tipping points in smallholder stability (Figure 6, Figure 9). When the gap between Masika and Vuli planting exceeded 4.5 months, yield volatility accelerated non-linearly, climbing by 48% regardless of fertilizer application. In households applying &lt; 25 kg/ha of basal fertilizer in Vuli relative to Masika, yield volatility surged to 1.42, but the marginal stabilizing return plateaued beyond 60 kg/ha, indicating that smallholder stabilization does not require excessive chemical inputs, but rather timely, moderate baseline applications. Furthermore, Shannon diversity index values above 0.65 eliminated &gt;70% of catastrophic harvest crashes during severe drought years (Raseduzzaman &amp; Jensen, 2017).</w:t>
       </w:r>
     </w:p>
     <w:p>
@@ -12088,7 +12132,7 @@
         <w:rPr>
           <w:rFonts w:ascii="Times New Roman" w:hAnsi="Times New Roman"/>
         </w:rPr>
-        <w:t>Table 5 and Figure 7 present the quantitative verification of the 5-pillar spatial leakage audit. The adversarial validation ROC-AUC remains at 0.512 ± 0.024, proving that training and test distributions are spatially disentangled. Figure 7 further provides local explanations for individual smallholder holdings using SHAP waterfalls. For Household #0 (a vulnerable monocropping holding in Dodoma), late Vuli planting and zero livestock holdings contributed +0.42 and +0.28 to their elevated volatility prediction (</w:t>
+        <w:t>Table 5 and Figure 7 present the quantitative verification of the 5-pillar spatial leakage audit. The adversarial validation ROC-AUC remained at 0.512 ± 0.024, demonstrating that training and test distributions were spatially disentangled. Figure 7 further provides local explanations for individual smallholder holdings using SHAP waterfalls. For Household #0 (a vulnerable monocropping holding in Dodoma), delayed Vuli planting and zero livestock holdings contributed +0.42 and +0.28 to their elevated volatility prediction (</w:t>
       </w:r>
       <m:oMath>
         <m:sSub>
@@ -12108,7 +12152,7 @@
         <w:rPr>
           <w:rFonts w:ascii="Times New Roman" w:hAnsi="Times New Roman"/>
         </w:rPr>
-        <w:t xml:space="preserve"> = 1.48). Counterfactual simulation shows that introducing a two-species intercrop and 2 TLU asset buffer would reduce their projected volatility to 0.86.</w:t>
+        <w:t xml:space="preserve"> = 1.48). Counterfactual simulation showed that introducing a two-species intercrop and 2 TLU asset buffer would reduce their projected volatility to 0.86.</w:t>
       </w:r>
     </w:p>
     <w:p>
@@ -12768,7 +12812,7 @@
         <w:rPr>
           <w:rFonts w:ascii="Times New Roman" w:hAnsi="Times New Roman"/>
         </w:rPr>
-        <w:t>To evaluate actionable agricultural policy interventions, we simulated four counterfactual scenarios across the full smallholder cohort (Figure 10, Table 6, Table 7). Providing 2 TLU equivalent asset transfers reduces mean national volatility by 14.2%, while promoting legume intercropping (+0.4 Shannon index) achieves a 19.8% reduction. An integrated Climate-Smart Agriculture package (timely planting advisories, targeted micro-fertilizer vouchers, and intercropping) cuts hyper-volatile holdings by 63.3% (dropping from 38.4% to 14.1%) and delivers an average volatility reduction of 31.4% nationally.</w:t>
+        <w:t>To evaluate actionable agricultural policy interventions, we simulated four counterfactual scenarios across the full smallholder cohort (Figure 10, Table 6, Table 7). Under the baseline status quo, 38.4% of holdings resided in the hyper-volatile state. Providing 2 TLU equivalent asset transfers reduced mean national volatility by 14.2%, while promoting legume intercropping (+0.4 Shannon index) achieved a 19.8% reduction (Beillouin et al., 2019). An integrated Climate-Smart Agriculture package (timely planting advisories, targeted micro-fertilizer vouchers, and intercropping) cut hyper-volatile holdings by 63.3% (dropping from 38.4% to 14.1%) and delivered an average volatility reduction of 31.4% nationally.</w:t>
       </w:r>
     </w:p>
     <w:p>
@@ -14476,14 +14520,26 @@
       </w:r>
       <m:oMath>
         <m:r>
-          <m:t>Δ R^2 = +0.157</m:t>
+          <m:t>Δ</m:t>
         </m:r>
+        <m:sSup>
+          <m:e>
+            <m:r>
+              <m:t>R</m:t>
+            </m:r>
+          </m:e>
+          <m:sup>
+            <m:r>
+              <m:t>2</m:t>
+            </m:r>
+          </m:sup>
+        </m:sSup>
       </m:oMath>
       <w:r>
         <w:rPr>
           <w:rFonts w:ascii="Times New Roman" w:hAnsi="Times New Roman"/>
         </w:rPr>
-        <w:t xml:space="preserve"> (Table 2). In spatially autocorrelated agricultural systems, models evaluate performance by simply looking up the coordinates or regional averages of neighboring farms (Meyer et al., 2018; Ploton et al., 2020; Roberts et al., 2017).</w:t>
+        <w:t xml:space="preserve"> = +0.157 (Table 2). In spatially autocorrelated agricultural systems, models evaluate performance by simply looking up the coordinates or regional averages of neighboring farms (Meyer et al., 2018; Ploton et al., 2020; Roberts et al., 2017).</w:t>
       </w:r>
     </w:p>
     <w:p>
@@ -14589,7 +14645,7 @@
         <w:rPr>
           <w:rFonts w:ascii="Times New Roman" w:hAnsi="Times New Roman"/>
         </w:rPr>
-        <w:t>While this study utilizes national survey microdata, several limitations must be noted. First, remote sensing vegetation indices (e.g., Sentinel-2 NDVI) and high-resolution gridded soil grids were not directly linked at the GPS plot level due to survey privacy masking (Benami et al., 2021; Lobell et al., 2020). Second, pest and disease outbreaks (such as Fall Armyworm) were captured via categorical farmer recall rather than systematic field scouting. Future research will integrate high-resolution earth observation data into this spatial machine learning architecture.</w:t>
+        <w:t>While this study utilized national survey microdata, several limitations must be noted. First, remote sensing vegetation indices (e.g., Sentinel-2 NDVI) and high-resolution gridded soil grids were not directly linked at the GPS plot level due to survey privacy masking (Benami et al., 2021; Lobell et al., 2020). Second, pest and disease outbreaks (such as Fall Armyworm) were captured via categorical farmer recall rather than systematic field scouting. Future research will integrate high-resolution earth observation data into this spatial machine learning architecture.</w:t>
       </w:r>
     </w:p>
     <w:p>
@@ -14614,7 +14670,7 @@
         <w:rPr>
           <w:rFonts w:ascii="Times New Roman" w:hAnsi="Times New Roman"/>
         </w:rPr>
-        <w:t>This study developed and validated a leakage-free spatial machine learning pipeline to predict smallholder crop yield volatility across 27 administrative regions of Tanzania. Utilizing national agricultural survey microdata from 10,750 households, we engineered domain-specific agronomic features and established that an out-of-fold Weighted Ensemble achieves superior generalization (</w:t>
+        <w:t>This study developed and validated a leakage-free spatial machine learning pipeline to predict smallholder crop yield volatility across 27 administrative regions of Tanzania. Utilizing national agricultural survey microdata from 10,750 households, we engineered domain-specific agronomic features and established that an out-of-fold Weighted Ensemble achieved superior generalization (</w:t>
       </w:r>
       <m:oMath>
         <m:sSup>
@@ -14634,7 +14690,7 @@
         <w:rPr>
           <w:rFonts w:ascii="Times New Roman" w:hAnsi="Times New Roman"/>
         </w:rPr>
-        <w:t xml:space="preserve"> = 0.584 ± 0.042, RMSE = 0.231) under strict spatial regional cross-validation. We quantified that naive non-spatial cross-validation introduces an optimistic bias of +0.157 in </w:t>
+        <w:t xml:space="preserve"> = 0.584 ± 0.042, RMSE = 0.231) under strict spatial regional cross-validation. We quantified that naive non-spatial cross-validation introduced an optimistic bias of +0.157 in </w:t>
       </w:r>
       <m:oMath>
         <m:sSup>
@@ -14665,7 +14721,7 @@
         <w:rPr>
           <w:rFonts w:ascii="Times New Roman" w:hAnsi="Times New Roman"/>
         </w:rPr>
-        <w:t>Explainable AI via SHAP revealed that planting window divergence, seasonal fertilizer differentials, and crop portfolio Shannon diversity are the primary drivers of yield stability. Counterfactual simulations proved that an integrated climate-smart agriculture package reduces hyper-volatile smallholder holdings by 63.3%. This framework provides a deployment-ready decision support tool for climate resilience, input subsidy targeting, and food security planning across Sub-Saharan Africa.</w:t>
+        <w:t>Explainable AI via SHAP revealed that planting window divergence, seasonal fertilizer differentials, and crop portfolio Shannon diversity were the primary drivers of yield stability. Counterfactual simulations proved that an integrated climate-smart agriculture package reduced hyper-volatile smallholder holdings by 63.3%. This framework provides a deployment-ready decision support tool for climate resilience, input subsidy targeting, and food security planning across Sub-Saharan Africa.</w:t>
       </w:r>
     </w:p>
     <w:p>

</xml_diff>

<commit_message>
refactor: improve variable descriptions and manuscript text across tables and documentation
</commit_message>
<xml_diff>
--- a/Paper/manuscript.docx
+++ b/Paper/manuscript.docx
@@ -451,97 +451,13 @@
         </w:rPr>
         <w:t>The microdata integration pipeline ingested and harmonized seven primary survey modules:</w:t>
         <w:br/>
-        <w:t>- Household demographics and asset rosters (</w:t>
-      </w:r>
-      <w:r>
-        <w:rPr>
-          <w:rFonts w:ascii="Courier New" w:hAnsi="Courier New"/>
-        </w:rPr>
-        <w:t>HOUSEHOLD</w:t>
-      </w:r>
-      <w:r>
-        <w:rPr>
-          <w:rFonts w:ascii="Times New Roman" w:hAnsi="Times New Roman"/>
-        </w:rPr>
-        <w:t>)</w:t>
+        <w:t>- Household demographic profiles and asset ownership rosters</w:t>
         <w:br/>
-        <w:t>- Agricultural plot registers and tenure characteristics (</w:t>
-      </w:r>
-      <w:r>
-        <w:rPr>
-          <w:rFonts w:ascii="Courier New" w:hAnsi="Courier New"/>
-        </w:rPr>
-        <w:t>MASIKAPLOT</w:t>
-      </w:r>
-      <w:r>
-        <w:rPr>
-          <w:rFonts w:ascii="Times New Roman" w:hAnsi="Times New Roman"/>
-        </w:rPr>
-        <w:t xml:space="preserve">, </w:t>
-      </w:r>
-      <w:r>
-        <w:rPr>
-          <w:rFonts w:ascii="Courier New" w:hAnsi="Courier New"/>
-        </w:rPr>
-        <w:t>VULIPLOT</w:t>
-      </w:r>
-      <w:r>
-        <w:rPr>
-          <w:rFonts w:ascii="Times New Roman" w:hAnsi="Times New Roman"/>
-        </w:rPr>
-        <w:t>)</w:t>
+        <w:t>- Agricultural parcel registers and land tenure characteristics across long- and short-rain seasons</w:t>
         <w:br/>
-        <w:t>- Crop production, area harvested, and harvest utilization (</w:t>
-      </w:r>
-      <w:r>
-        <w:rPr>
-          <w:rFonts w:ascii="Courier New" w:hAnsi="Courier New"/>
-        </w:rPr>
-        <w:t>MASIKACROP</w:t>
-      </w:r>
-      <w:r>
-        <w:rPr>
-          <w:rFonts w:ascii="Times New Roman" w:hAnsi="Times New Roman"/>
-        </w:rPr>
-        <w:t xml:space="preserve">, </w:t>
-      </w:r>
-      <w:r>
-        <w:rPr>
-          <w:rFonts w:ascii="Courier New" w:hAnsi="Courier New"/>
-        </w:rPr>
-        <w:t>VULICROP</w:t>
-      </w:r>
-      <w:r>
-        <w:rPr>
-          <w:rFonts w:ascii="Times New Roman" w:hAnsi="Times New Roman"/>
-        </w:rPr>
-        <w:t>)</w:t>
+        <w:t>- Seasonal crop production, cultivated and harvested areas, and harvest utilization records</w:t>
         <w:br/>
-        <w:t>- Input utilization rosters, including inorganic fertilizer, organic manure, pesticides, and improved seed varieties (</w:t>
-      </w:r>
-      <w:r>
-        <w:rPr>
-          <w:rFonts w:ascii="Courier New" w:hAnsi="Courier New"/>
-        </w:rPr>
-        <w:t>inputRoster_masika</w:t>
-      </w:r>
-      <w:r>
-        <w:rPr>
-          <w:rFonts w:ascii="Times New Roman" w:hAnsi="Times New Roman"/>
-        </w:rPr>
-        <w:t xml:space="preserve">, </w:t>
-      </w:r>
-      <w:r>
-        <w:rPr>
-          <w:rFonts w:ascii="Courier New" w:hAnsi="Courier New"/>
-        </w:rPr>
-        <w:t>inputRoster_vuli</w:t>
-      </w:r>
-      <w:r>
-        <w:rPr>
-          <w:rFonts w:ascii="Times New Roman" w:hAnsi="Times New Roman"/>
-        </w:rPr>
-        <w:t>)</w:t>
+        <w:t>- Agricultural input utilization rosters detailing chemical fertilizers, organic manure, agrochemicals, and improved seed varieties</w:t>
       </w:r>
     </w:p>
     <w:p>
@@ -4019,7 +3935,7 @@
                 <w:rFonts w:ascii="Times New Roman" w:hAnsi="Times New Roman"/>
                 <w:sz w:val="17"/>
               </w:rPr>
-              <w:t>Plot Fragmentation CV</w:t>
+              <w:t>Plot Fragmentation (Coefficient of Variation)</w:t>
             </w:r>
           </w:p>
         </w:tc>
@@ -4879,7 +4795,7 @@
                 <w:rFonts w:ascii="Times New Roman" w:hAnsi="Times New Roman"/>
                 <w:sz w:val="17"/>
               </w:rPr>
-              <w:t>Planting Month Delta (Months)</w:t>
+              <w:t>Planting Month Difference (Masika – Vuli, Months)</w:t>
             </w:r>
           </w:p>
         </w:tc>
@@ -5384,8 +5300,22 @@
                 <w:b/>
                 <w:sz w:val="18"/>
               </w:rPr>
-              <w:t>Spatial R2</w:t>
-            </w:r>
+              <w:t xml:space="preserve">Spatial </w:t>
+            </w:r>
+            <m:oMath>
+              <m:sSup>
+                <m:e>
+                  <m:r>
+                    <m:t>R</m:t>
+                  </m:r>
+                </m:e>
+                <m:sup>
+                  <m:r>
+                    <m:t>2</m:t>
+                  </m:r>
+                </m:sup>
+              </m:sSup>
+            </m:oMath>
           </w:p>
         </w:tc>
         <w:tc>
@@ -5507,7 +5437,7 @@
                 <w:rFonts w:ascii="Times New Roman" w:hAnsi="Times New Roman"/>
                 <w:sz w:val="17"/>
               </w:rPr>
-              <w:t>0.50 LGB + 0.40 XGB + 0.10 RF (Soft Voting)</w:t>
+              <w:t>0.50 LightGBM + 0.40 XGBoost + 0.10 Random Forest (Soft Voting)</w:t>
             </w:r>
           </w:p>
         </w:tc>
@@ -5869,43 +5799,7 @@
         <w:rPr>
           <w:rFonts w:ascii="Times New Roman" w:hAnsi="Times New Roman"/>
         </w:rPr>
-        <w:t>The top 25 features identified through Grandmaster feature selection are detailed in Table 3 and visualized in Figures 3 and 4. The dominant predictor of seasonal yield volatility was seasonal planting date divergence (</w:t>
-      </w:r>
-      <w:r>
-        <w:rPr>
-          <w:rFonts w:ascii="Courier New" w:hAnsi="Courier New"/>
-        </w:rPr>
-        <w:t>plant_month_delta</w:t>
-      </w:r>
-      <w:r>
-        <w:rPr>
-          <w:rFonts w:ascii="Times New Roman" w:hAnsi="Times New Roman"/>
-        </w:rPr>
-        <w:t>), which accounted for 34.2% of total feature gain in LightGBM. The second and third most influential features were harvest realization share (</w:t>
-      </w:r>
-      <w:r>
-        <w:rPr>
-          <w:rFonts w:ascii="Courier New" w:hAnsi="Courier New"/>
-        </w:rPr>
-        <w:t>m_harvest_pct_mean</w:t>
-      </w:r>
-      <w:r>
-        <w:rPr>
-          <w:rFonts w:ascii="Times New Roman" w:hAnsi="Times New Roman"/>
-        </w:rPr>
-        <w:t>) and crop diversity differential (</w:t>
-      </w:r>
-      <w:r>
-        <w:rPr>
-          <w:rFonts w:ascii="Courier New" w:hAnsi="Courier New"/>
-        </w:rPr>
-        <w:t>shannon_diff_from_region_mean</w:t>
-      </w:r>
-      <w:r>
-        <w:rPr>
-          <w:rFonts w:ascii="Times New Roman" w:hAnsi="Times New Roman"/>
-        </w:rPr>
-        <w:t xml:space="preserve">). SHAP summary attributions (Figure 4) demonstrated that households maintaining higher Shannon diversity than their regional peers exhibited negative SHAP values (driving </w:t>
+        <w:t xml:space="preserve">The top 25 features identified through Grandmaster feature selection are detailed in Table 3 and visualized in Figures 3 and 4. The dominant predictor of seasonal yield volatility was seasonal planting date divergence (the calendar month difference between Masika and Vuli sowing), which accounted for 34.2% of total feature gain in LightGBM. The second and third most influential features were Masika harvest realization rate (the mean proportion of cultivated area successfully harvested) and relative crop diversity differential (household Shannon diversity relative to the regional peer mean). SHAP summary attributions (Figure 4) demonstrated that households maintaining higher Shannon diversity than their regional peers exhibited negative SHAP values (driving </w:t>
       </w:r>
       <m:oMath>
         <m:sSub>
@@ -5925,31 +5819,7 @@
         <w:rPr>
           <w:rFonts w:ascii="Times New Roman" w:hAnsi="Times New Roman"/>
         </w:rPr>
-        <w:t xml:space="preserve"> lower), confirming that multi-crop portfolios act as a direct biophysical shock absorber (Renard &amp; Tilman, 2019). Household asset buffers—specifically Tropical Livestock Units (</w:t>
-      </w:r>
-      <w:r>
-        <w:rPr>
-          <w:rFonts w:ascii="Courier New" w:hAnsi="Courier New"/>
-        </w:rPr>
-        <w:t>total_livestock_tlu</w:t>
-      </w:r>
-      <w:r>
-        <w:rPr>
-          <w:rFonts w:ascii="Times New Roman" w:hAnsi="Times New Roman"/>
-        </w:rPr>
-        <w:t>) and plot fragmentation (</w:t>
-      </w:r>
-      <w:r>
-        <w:rPr>
-          <w:rFonts w:ascii="Courier New" w:hAnsi="Courier New"/>
-        </w:rPr>
-        <w:t>plot_area_cv</w:t>
-      </w:r>
-      <w:r>
-        <w:rPr>
-          <w:rFonts w:ascii="Times New Roman" w:hAnsi="Times New Roman"/>
-        </w:rPr>
-        <w:t>)—also displayed substantial stabilizing attributions. Households possessing &gt;3.0 TLU were insulated against acute yield volatility, as livestock sales provided liquid capital to purchase supplementary inputs during stressed seasons (Carter &amp; Barrett, 2006).</w:t>
+        <w:t xml:space="preserve"> lower), confirming that multi-crop portfolios act as a direct biophysical shock absorber (Renard &amp; Tilman, 2019). Household asset buffers—specifically Tropical Livestock Units (TLU, representing household livestock endowment) and operational plot area fragmentation (parcel size coefficient of variation)—also displayed substantial stabilizing attributions. Households possessing &gt;3.0 TLU were insulated against acute yield volatility, as livestock sales provided liquid capital to purchase supplementary inputs during stressed seasons (Carter &amp; Barrett, 2006).</w:t>
       </w:r>
     </w:p>
     <w:p>
@@ -6057,22 +5927,7 @@
           <w:i/>
           <w:sz w:val="19"/>
         </w:rPr>
-        <w:t>Figure 4: Global SHAP feature attributions and directional dependency plots. (A) SHAP beeswarm plot ranking top-15 features by mean absolute SHAP value, illustrating directional influence on volatility predictions. (B) Partial dependence curves for seasonal planting date shift (</w:t>
-      </w:r>
-      <w:r>
-        <w:rPr>
-          <w:rFonts w:ascii="Courier New" w:hAnsi="Courier New"/>
-          <w:sz w:val="17"/>
-        </w:rPr>
-        <w:t>plant_month_delta</w:t>
-      </w:r>
-      <w:r>
-        <w:rPr>
-          <w:rFonts w:ascii="Times New Roman" w:hAnsi="Times New Roman"/>
-          <w:i/>
-          <w:sz w:val="19"/>
-        </w:rPr>
-        <w:t>) and Shannon diversity differential.</w:t>
+        <w:t>Figure 4: Global SHAP feature attributions and directional dependency plots. (A) SHAP beeswarm plot ranking top-15 features by mean absolute SHAP value, illustrating directional influence on volatility predictions. (B) Partial dependence curves for seasonal planting date shift (difference between Masika and Vuli sowing months) and Shannon diversity differential.</w:t>
       </w:r>
     </w:p>
     <w:p>
@@ -6136,7 +5991,7 @@
                 <w:b/>
                 <w:sz w:val="18"/>
               </w:rPr>
-              <w:t>Feature Identifier</w:t>
+              <w:t>Agronomic Variable Name</w:t>
             </w:r>
           </w:p>
         </w:tc>
@@ -6208,7 +6063,7 @@
                 <w:b/>
                 <w:sz w:val="18"/>
               </w:rPr>
-              <w:t>Agronomic Rationale</w:t>
+              <w:t>Agronomic Description &amp; Rationale</w:t>
             </w:r>
           </w:p>
         </w:tc>
@@ -6244,7 +6099,7 @@
                 <w:rFonts w:ascii="Times New Roman" w:hAnsi="Times New Roman"/>
                 <w:sz w:val="17"/>
               </w:rPr>
-              <w:t>plant_month_delta</w:t>
+              <w:t>Planting Month Difference (Masika – Vuli)</w:t>
             </w:r>
           </w:p>
         </w:tc>
@@ -6312,7 +6167,7 @@
                 <w:rFonts w:ascii="Times New Roman" w:hAnsi="Times New Roman"/>
                 <w:sz w:val="17"/>
               </w:rPr>
-              <w:t>Misalignment in seasonal onset and crop establishment timing</w:t>
+              <w:t>Inter-seasonal gap in crop establishment timing between long and short rains</w:t>
             </w:r>
           </w:p>
         </w:tc>
@@ -6348,7 +6203,7 @@
                 <w:rFonts w:ascii="Times New Roman" w:hAnsi="Times New Roman"/>
                 <w:sz w:val="17"/>
               </w:rPr>
-              <w:t>m_harvest_pct_mean</w:t>
+              <w:t>Mean Harvested Area Proportion (Masika)</w:t>
             </w:r>
           </w:p>
         </w:tc>
@@ -6416,7 +6271,7 @@
                 <w:rFonts w:ascii="Times New Roman" w:hAnsi="Times New Roman"/>
                 <w:sz w:val="17"/>
               </w:rPr>
-              <w:t>Average proportion of cultivated area successfully harvested</w:t>
+              <w:t>Average proportion of cultivated holding area successfully harvested in Masika</w:t>
             </w:r>
           </w:p>
         </w:tc>
@@ -6452,7 +6307,7 @@
                 <w:rFonts w:ascii="Times New Roman" w:hAnsi="Times New Roman"/>
                 <w:sz w:val="17"/>
               </w:rPr>
-              <w:t>v_plant_month_mean</w:t>
+              <w:t>Mean Planting Month (Vuli)</w:t>
             </w:r>
           </w:p>
         </w:tc>
@@ -6520,7 +6375,7 @@
                 <w:rFonts w:ascii="Times New Roman" w:hAnsi="Times New Roman"/>
                 <w:sz w:val="17"/>
               </w:rPr>
-              <w:t>Timing of Vuli short-rain planting relative to dry-season onset</w:t>
+              <w:t>Calendar timing of Vuli short-rain crop sowing relative to rainy season onset</w:t>
             </w:r>
           </w:p>
         </w:tc>
@@ -6556,7 +6411,7 @@
                 <w:rFonts w:ascii="Times New Roman" w:hAnsi="Times New Roman"/>
                 <w:sz w:val="17"/>
               </w:rPr>
-              <w:t>shannon_diff_from_region_mean</w:t>
+              <w:t>Shannon Crop Diversity Relative to Regional Mean</w:t>
             </w:r>
           </w:p>
         </w:tc>
@@ -6624,7 +6479,7 @@
                 <w:rFonts w:ascii="Times New Roman" w:hAnsi="Times New Roman"/>
                 <w:sz w:val="17"/>
               </w:rPr>
-              <w:t>Portfolio diversification relative to local peer average</w:t>
+              <w:t>Holding-level portfolio diversification benchmarked against regional peer average</w:t>
             </w:r>
           </w:p>
         </w:tc>
@@ -6660,7 +6515,7 @@
                 <w:rFonts w:ascii="Times New Roman" w:hAnsi="Times New Roman"/>
                 <w:sz w:val="17"/>
               </w:rPr>
-              <w:t>delta_evenness</w:t>
+              <w:t>Seasonal Species Evenness Shift (Pielou Index)</w:t>
             </w:r>
           </w:p>
         </w:tc>
@@ -6728,7 +6583,7 @@
                 <w:rFonts w:ascii="Times New Roman" w:hAnsi="Times New Roman"/>
                 <w:sz w:val="17"/>
               </w:rPr>
-              <w:t>Seasonal shift in Pielou evenness across plot cultivars</w:t>
+              <w:t>Inter-seasonal change in cultivar species evenness and abundance parity</w:t>
             </w:r>
           </w:p>
         </w:tc>
@@ -6764,7 +6619,7 @@
                 <w:rFonts w:ascii="Times New Roman" w:hAnsi="Times New Roman"/>
                 <w:sz w:val="17"/>
               </w:rPr>
-              <w:t>total_livestock_tlu</w:t>
+              <w:t>Total Tropical Livestock Units (TLU)</w:t>
             </w:r>
           </w:p>
         </w:tc>
@@ -6832,7 +6687,7 @@
                 <w:rFonts w:ascii="Times New Roman" w:hAnsi="Times New Roman"/>
                 <w:sz w:val="17"/>
               </w:rPr>
-              <w:t>Tropical Livestock Units providing buffer capital against crop failure</w:t>
+              <w:t>Aggregated herd size providing liquid capital buffer against acute crop failure</w:t>
             </w:r>
           </w:p>
         </w:tc>
@@ -6868,7 +6723,7 @@
                 <w:rFonts w:ascii="Times New Roman" w:hAnsi="Times New Roman"/>
                 <w:sz w:val="17"/>
               </w:rPr>
-              <w:t>m_no_harvest_share</w:t>
+              <w:t>Crop Failure Plot Share (Masika)</w:t>
             </w:r>
           </w:p>
         </w:tc>
@@ -6936,7 +6791,7 @@
                 <w:rFonts w:ascii="Times New Roman" w:hAnsi="Times New Roman"/>
                 <w:sz w:val="17"/>
               </w:rPr>
-              <w:t>Share of plots suffering total crop abandonment in Masika</w:t>
+              <w:t>Proportion of cultivated parcels experiencing total crop loss or abandonment</w:t>
             </w:r>
           </w:p>
         </w:tc>
@@ -6972,7 +6827,7 @@
                 <w:rFonts w:ascii="Times New Roman" w:hAnsi="Times New Roman"/>
                 <w:sz w:val="17"/>
               </w:rPr>
-              <w:t>dist_agronomic_archetype_1</w:t>
+              <w:t>Distance to Commercial Mixed Cropping Archetype</w:t>
             </w:r>
           </w:p>
         </w:tc>
@@ -7040,7 +6895,7 @@
                 <w:rFonts w:ascii="Times New Roman" w:hAnsi="Times New Roman"/>
                 <w:sz w:val="17"/>
               </w:rPr>
-              <w:t>KMeans distance to Commercial Mixed Cropping cluster</w:t>
+              <w:t>Euclidean distance to regional Commercial Mixed Cropping farming cluster</w:t>
             </w:r>
           </w:p>
         </w:tc>
@@ -7076,7 +6931,7 @@
                 <w:rFonts w:ascii="Times New Roman" w:hAnsi="Times New Roman"/>
                 <w:sz w:val="17"/>
               </w:rPr>
-              <w:t>land_per_adult_labor</w:t>
+              <w:t>Cultivated Land per Adult Laborer (ha/adult)</w:t>
             </w:r>
           </w:p>
         </w:tc>
@@ -7144,7 +6999,7 @@
                 <w:rFonts w:ascii="Times New Roman" w:hAnsi="Times New Roman"/>
                 <w:sz w:val="17"/>
               </w:rPr>
-              <w:t>Farm capitalization ratio (cultivated hectares per adult laborer)</w:t>
+              <w:t>Household labor capitalization ratio (cultivated hectares per active adult)</w:t>
             </w:r>
           </w:p>
         </w:tc>
@@ -7180,7 +7035,7 @@
                 <w:rFonts w:ascii="Times New Roman" w:hAnsi="Times New Roman"/>
                 <w:sz w:val="17"/>
               </w:rPr>
-              <w:t>plot_area_mean</w:t>
+              <w:t>Mean Operational Plot Area (ha)</w:t>
             </w:r>
           </w:p>
         </w:tc>
@@ -7248,7 +7103,7 @@
                 <w:rFonts w:ascii="Times New Roman" w:hAnsi="Times New Roman"/>
                 <w:sz w:val="17"/>
               </w:rPr>
-              <w:t>Mean operational plot area across household holding</w:t>
+              <w:t>Average operational parcel size across the agricultural holding</w:t>
             </w:r>
           </w:p>
         </w:tc>
@@ -7284,7 +7139,7 @@
                 <w:rFonts w:ascii="Times New Roman" w:hAnsi="Times New Roman"/>
                 <w:sz w:val="17"/>
               </w:rPr>
-              <w:t>head_age</w:t>
+              <w:t>Age of Household Head (Years)</w:t>
             </w:r>
           </w:p>
         </w:tc>
@@ -7352,7 +7207,7 @@
                 <w:rFonts w:ascii="Times New Roman" w:hAnsi="Times New Roman"/>
                 <w:sz w:val="17"/>
               </w:rPr>
-              <w:t>Farming experience and human capital adaptive capacity</w:t>
+              <w:t>Farming experience and managerial human capital of the primary decision-maker</w:t>
             </w:r>
           </w:p>
         </w:tc>
@@ -7388,7 +7243,7 @@
                 <w:rFonts w:ascii="Times New Roman" w:hAnsi="Times New Roman"/>
                 <w:sz w:val="17"/>
               </w:rPr>
-              <w:t>area_diff_from_region_mean</w:t>
+              <w:t>Farm Size Difference from Regional Mean (ha)</w:t>
             </w:r>
           </w:p>
         </w:tc>
@@ -7456,7 +7311,7 @@
                 <w:rFonts w:ascii="Times New Roman" w:hAnsi="Times New Roman"/>
                 <w:sz w:val="17"/>
               </w:rPr>
-              <w:t>Deviation of farm size from regional agro-ecological mean</w:t>
+              <w:t>Deviation of total cultivated farm size from regional agro-ecological average</w:t>
             </w:r>
           </w:p>
         </w:tc>
@@ -7492,7 +7347,7 @@
                 <w:rFonts w:ascii="Times New Roman" w:hAnsi="Times New Roman"/>
                 <w:sz w:val="17"/>
               </w:rPr>
-              <w:t>total_livestock_head</w:t>
+              <w:t>Total Livestock Head Count</w:t>
             </w:r>
           </w:p>
         </w:tc>
@@ -7560,7 +7415,7 @@
                 <w:rFonts w:ascii="Times New Roman" w:hAnsi="Times New Roman"/>
                 <w:sz w:val="17"/>
               </w:rPr>
-              <w:t>Total count of livestock animals owned by holding</w:t>
+              <w:t>Total absolute number of domestic farm animals owned by the household</w:t>
             </w:r>
           </w:p>
         </w:tc>
@@ -7596,7 +7451,7 @@
                 <w:rFonts w:ascii="Times New Roman" w:hAnsi="Times New Roman"/>
                 <w:sz w:val="17"/>
               </w:rPr>
-              <w:t>dist_agronomic_archetype_0</w:t>
+              <w:t>Distance to Subsistence Cereals Archetype</w:t>
             </w:r>
           </w:p>
         </w:tc>
@@ -7664,7 +7519,7 @@
                 <w:rFonts w:ascii="Times New Roman" w:hAnsi="Times New Roman"/>
                 <w:sz w:val="17"/>
               </w:rPr>
-              <w:t>KMeans distance to Subsistence Cereals cluster</w:t>
+              <w:t>Euclidean distance to regional Subsistence Cereal Monoculture cluster</w:t>
             </w:r>
           </w:p>
         </w:tc>
@@ -7700,7 +7555,7 @@
                 <w:rFonts w:ascii="Times New Roman" w:hAnsi="Times New Roman"/>
                 <w:sz w:val="17"/>
               </w:rPr>
-              <w:t>v_drought_fail</w:t>
+              <w:t>Drought-Induced Harvest Failure Indicator (Vuli)</w:t>
             </w:r>
           </w:p>
         </w:tc>
@@ -7768,7 +7623,7 @@
                 <w:rFonts w:ascii="Times New Roman" w:hAnsi="Times New Roman"/>
                 <w:sz w:val="17"/>
               </w:rPr>
-              <w:t>Reported severe drought failure during Vuli season</w:t>
+              <w:t>Binary indicator of severe drought-induced crop failure during the short rains</w:t>
             </w:r>
           </w:p>
         </w:tc>
@@ -8171,8 +8026,22 @@
                 <w:b/>
                 <w:sz w:val="18"/>
               </w:rPr>
-              <w:t>Regional Model R2</w:t>
-            </w:r>
+              <w:t xml:space="preserve">Regional Model </w:t>
+            </w:r>
+            <m:oMath>
+              <m:sSup>
+                <m:e>
+                  <m:r>
+                    <m:t>R</m:t>
+                  </m:r>
+                </m:e>
+                <m:sup>
+                  <m:r>
+                    <m:t>2</m:t>
+                  </m:r>
+                </m:sup>
+              </m:sSup>
+            </m:oMath>
           </w:p>
         </w:tc>
         <w:tc>
@@ -8207,8 +8076,22 @@
                 <w:b/>
                 <w:sz w:val="18"/>
               </w:rPr>
-              <w:t>National Model R2</w:t>
-            </w:r>
+              <w:t xml:space="preserve">National Model </w:t>
+            </w:r>
+            <m:oMath>
+              <m:sSup>
+                <m:e>
+                  <m:r>
+                    <m:t>R</m:t>
+                  </m:r>
+                </m:e>
+                <m:sup>
+                  <m:r>
+                    <m:t>2</m:t>
+                  </m:r>
+                </m:sup>
+              </m:sSup>
+            </m:oMath>
           </w:p>
         </w:tc>
         <w:tc>
@@ -8225,7 +8108,32 @@
                 <w:b/>
                 <w:sz w:val="18"/>
               </w:rPr>
-              <w:t>National Advantage (Delta R2)</w:t>
+              <w:t>National Advantage (</w:t>
+            </w:r>
+            <m:oMath>
+              <m:r>
+                <m:t>Δ</m:t>
+              </m:r>
+              <m:sSup>
+                <m:e>
+                  <m:r>
+                    <m:t>R</m:t>
+                  </m:r>
+                </m:e>
+                <m:sup>
+                  <m:r>
+                    <m:t>2</m:t>
+                  </m:r>
+                </m:sup>
+              </m:sSup>
+            </m:oMath>
+            <w:r>
+              <w:rPr>
+                <w:rFonts w:ascii="Times New Roman" w:hAnsi="Times New Roman"/>
+                <w:b/>
+                <w:sz w:val="18"/>
+              </w:rPr>
+              <w:t>)</w:t>
             </w:r>
           </w:p>
         </w:tc>
@@ -12092,22 +12000,7 @@
           <w:i/>
           <w:sz w:val="19"/>
         </w:rPr>
-        <w:t>Figure 9: Agro-economic partial dependence surfaces and two-way interaction contours. (A) Marginal response of yield volatility to fertilizer application rate. (B) Labor allocation shift response. (C) Plot fragmentation (</w:t>
-      </w:r>
-      <w:r>
-        <w:rPr>
-          <w:rFonts w:ascii="Courier New" w:hAnsi="Courier New"/>
-          <w:sz w:val="17"/>
-        </w:rPr>
-        <w:t>plot_area_cv</w:t>
-      </w:r>
-      <w:r>
-        <w:rPr>
-          <w:rFonts w:ascii="Times New Roman" w:hAnsi="Times New Roman"/>
-          <w:i/>
-          <w:sz w:val="19"/>
-        </w:rPr>
-        <w:t>) interaction surface.</w:t>
+        <w:t>Figure 9: Agro-economic partial dependence surfaces and two-way interaction contours. (A) Marginal response of yield volatility to fertilizer application rate. (B) Labor allocation shift response. (C) Plot fragmentation (parcel size coefficient of variation) interaction surface.</w:t>
       </w:r>
     </w:p>
     <w:p>
@@ -12463,7 +12356,7 @@
                 <w:rFonts w:ascii="Times New Roman" w:hAnsi="Times New Roman"/>
                 <w:sz w:val="17"/>
               </w:rPr>
-              <w:t xml:space="preserve">Verifies target </w:t>
+              <w:t>Verifies target Yield Volatility Index (</w:t>
             </w:r>
             <m:oMath>
               <m:sSub>
@@ -12484,7 +12377,7 @@
                 <w:rFonts w:ascii="Times New Roman" w:hAnsi="Times New Roman"/>
                 <w:sz w:val="17"/>
               </w:rPr>
-              <w:t xml:space="preserve"> is strictly excluded from feature space and no trivial target proxies exist</w:t>
+              <w:t>) is strictly excluded from feature space and no trivial target proxies exist</w:t>
             </w:r>
           </w:p>
         </w:tc>
@@ -12974,7 +12867,7 @@
                 <w:b/>
                 <w:sz w:val="18"/>
               </w:rPr>
-              <w:t xml:space="preserve">Mean </w:t>
+              <w:t>Mean Yield Volatility (</w:t>
             </w:r>
             <m:oMath>
               <m:sSub>
@@ -12990,23 +12883,13 @@
                 </m:sub>
               </m:sSub>
             </m:oMath>
-          </w:p>
-        </w:tc>
-        <w:tc>
-          <w:tcPr>
-            <w:tcW w:type="dxa" w:w="936"/>
-          </w:tcPr>
-          <w:p>
-            <w:pPr>
-              <w:jc w:val="center"/>
-            </w:pPr>
             <w:r>
               <w:rPr>
                 <w:rFonts w:ascii="Times New Roman" w:hAnsi="Times New Roman"/>
                 <w:b/>
                 <w:sz w:val="18"/>
               </w:rPr>
-              <w:t>Mean Yield Gap (kg/ha)</w:t>
+              <w:t>)</w:t>
             </w:r>
           </w:p>
         </w:tc>
@@ -13024,7 +12907,7 @@
                 <w:b/>
                 <w:sz w:val="18"/>
               </w:rPr>
-              <w:t>Mean Crop Diversity (Shannon)</w:t>
+              <w:t>Mean Yield Gap (kg/ha)</w:t>
             </w:r>
           </w:p>
         </w:tc>
@@ -13042,7 +12925,7 @@
                 <w:b/>
                 <w:sz w:val="18"/>
               </w:rPr>
-              <w:t>Complete Harvest Failure Rate (%)</w:t>
+              <w:t>Mean Crop Diversity (Shannon)</w:t>
             </w:r>
           </w:p>
         </w:tc>
@@ -13060,7 +12943,7 @@
                 <w:b/>
                 <w:sz w:val="18"/>
               </w:rPr>
-              <w:t>Fertilizer Intensity (kg)</w:t>
+              <w:t>Complete Harvest Failure Rate (%)</w:t>
             </w:r>
           </w:p>
         </w:tc>
@@ -13078,7 +12961,7 @@
                 <w:b/>
                 <w:sz w:val="18"/>
               </w:rPr>
-              <w:t>Tropical Livestock Units (TLU)</w:t>
+              <w:t>Fertilizer Intensity (kg)</w:t>
             </w:r>
           </w:p>
         </w:tc>
@@ -13096,7 +12979,7 @@
                 <w:b/>
                 <w:sz w:val="18"/>
               </w:rPr>
-              <w:t>Planting Timing Delta (Months)</w:t>
+              <w:t>Tropical Livestock Units (TLU)</w:t>
             </w:r>
           </w:p>
         </w:tc>
@@ -13114,7 +12997,25 @@
                 <w:b/>
                 <w:sz w:val="18"/>
               </w:rPr>
-              <w:t>Plot Fragmentation CV</w:t>
+              <w:t>Planting Month Difference (Months)</w:t>
+            </w:r>
+          </w:p>
+        </w:tc>
+        <w:tc>
+          <w:tcPr>
+            <w:tcW w:type="dxa" w:w="936"/>
+          </w:tcPr>
+          <w:p>
+            <w:pPr>
+              <w:jc w:val="center"/>
+            </w:pPr>
+            <w:r>
+              <w:rPr>
+                <w:rFonts w:ascii="Times New Roman" w:hAnsi="Times New Roman"/>
+                <w:b/>
+                <w:sz w:val="18"/>
+              </w:rPr>
+              <w:t>Plot Fragmentation (CV)</w:t>
             </w:r>
           </w:p>
         </w:tc>

</xml_diff>

<commit_message>
docs: update manuscript sample size and survey methodology details across paper files
</commit_message>
<xml_diff>
--- a/Paper/manuscript.docx
+++ b/Paper/manuscript.docx
@@ -73,7 +73,7 @@
         <w:rPr>
           <w:rFonts w:ascii="Times New Roman" w:hAnsi="Times New Roman"/>
         </w:rPr>
-        <w:t>Smallholder farming households in Sub-Saharan Africa operate on the frontlines of climatic volatility, where bimodal precipitation regimes govern two distinct cropping seasons: Masika (long rains) and Vuli (short rains). When crop yields fluctuate unpredictably between these successive seasons, household food reserves are rapidly depleted, locking rural communities into persistent seasonal poverty traps. While machine learning offers transformative capabilities to anticipate agricultural shocks, standard algorithms frequently learn spurious spatial correlations, resulting in inflated accuracy metrics that degrade precipitously when models are deployed across unseen rural districts. In this study, we developed a strictly leakage-free spatial artificial intelligence framework evaluated across 27 administrative regions of Tanzania using national microdata from 10,750 smallholder households. We demonstrated that seasonal fertilizer application disparities, soil management constraints, and inadequate livestock safety buffers accounted for more than half of observed inter-seasonal yield swings. Furthermore, policy counterfactual simulations revealed that targeted fertilizer stabilization and crop portfolio diversification suppressed extreme seasonal yield crashes by more than 30%. These findings equip agricultural extension services and policymakers with an empirical, deployment-ready decision support tool to strengthen food security across Africa's smallholder landscapes.</w:t>
+        <w:t>Smallholder farming households in Sub-Saharan Africa operate on the frontlines of climatic volatility, where bimodal precipitation regimes govern two distinct cropping seasons: Masika (long rains) and Vuli (short rains). When crop yields fluctuate unpredictably between these successive seasons, household food reserves are rapidly depleted, locking rural communities into persistent seasonal poverty traps. While machine learning offers transformative capabilities to anticipate agricultural shocks, standard algorithms frequently learn spurious spatial correlations, resulting in inflated accuracy metrics that degrade precipitously when models are deployed across unseen rural districts. In this study, we developed a strictly leakage-free spatial artificial intelligence framework evaluated across 27 administrative regions of Tanzania using national survey microdata spanning 4,564 bi-modal smallholder holdings (derived from 18,904 surveyed holdings across Tanzania's multi-wave agricultural survey infrastructure). We demonstrated that seasonal fertilizer application disparities, soil management constraints, and inadequate livestock safety buffers accounted for more than half of observed inter-seasonal yield swings. Furthermore, policy counterfactual simulations revealed that targeted fertilizer stabilization and crop portfolio diversification suppressed extreme seasonal yield crashes by more than 30%. These findings equip agricultural extension services and policymakers with an empirical, deployment-ready decision support tool to strengthen food security across Africa's smallholder landscapes.</w:t>
       </w:r>
     </w:p>
     <w:p>
@@ -95,7 +95,7 @@
         <w:rPr>
           <w:rFonts w:ascii="Times New Roman" w:hAnsi="Times New Roman"/>
         </w:rPr>
-        <w:t>Intra-annual crop yield volatility between bimodal production seasons constitutes a profound vulnerability for smallholder farming systems in Sub-Saharan Africa. While machine learning offers transformative capabilities for agricultural risk forecasting, conventional cross-validation schemes suffer from spatial autocorrelation leakage, generating over-optimistic performance estimates that fail upon deployment to unmonitored agro-ecological zones. Here, we developed a leakage-free spatial machine learning pipeline utilizing the Tanzania National Bureau of Statistics (NBS) Annual Agricultural Sample Survey (AASS) microdata, encompassing 10,750 smallholder households across 27 administrative regions. We formulated a standardized inter-seasonal Yield Volatility Index (</w:t>
+        <w:t>Intra-annual crop yield volatility between bimodal production seasons constitutes a profound vulnerability for smallholder farming systems in Sub-Saharan Africa. While machine learning offers transformative capabilities for agricultural risk forecasting, conventional cross-validation schemes suffer from spatial autocorrelation leakage, generating over-optimistic performance estimates that fail upon deployment to unmonitored agro-ecological zones. Here, we developed a leakage-free spatial machine learning pipeline utilizing the Tanzania National Bureau of Statistics (NBS) Annual Agricultural Sample Survey (AASS) microdata. Contextualized within a three-wave national survey repository (2022/23, 2023/24, and 2024/25, encompassing 53,684 agricultural holdings), this study models the complete bi-modal analytical cohort of 4,564 smallholder holdings (screened from 18,904 surveyed holdings in the feature-complete 2024/25 round) across 27 administrative regions. We formulated a standardized inter-seasonal Yield Volatility Index (</w:t>
       </w:r>
       <m:oMath>
         <m:sSub>
@@ -308,7 +308,7 @@
         <w:rPr>
           <w:rFonts w:ascii="Times New Roman" w:hAnsi="Times New Roman"/>
         </w:rPr>
-        <w:t>To overcome these barriers, this study establishes a rigorous, leakage-free spatial machine learning framework for predicting smallholder crop yield volatility across Tanzania. Utilizing microdata from the National Bureau of Statistics (NBS) Annual Agricultural Sample Survey (AASS)—comprising 10,750 smallholder households across all 27 administrative regions—we engineer a suite of domain-specific agronomic features, enforce a 5-pillar spatial isolation protocol, evaluate diverse model architectures, explain feature mechanisms via Shapley Additive Explanations (SHAP; Lundberg &amp; Lee, 2017; Lundberg et al., 2020), and conduct counterfactual policy simulations.</w:t>
+        <w:t>To overcome these barriers, this study establishes a rigorous, leakage-free spatial machine learning framework for predicting smallholder crop yield volatility across Tanzania. Contextualized within the National Bureau of Statistics (NBS) multi-wave Annual Agricultural Sample Survey (AASS) infrastructure—which compiles three consecutive survey rounds (2022/23, 2023/24, and 2024/25) encompassing 53,684 holdings—we focus our predictive modeling on the eligible analytical cohort of 4,564 bi-modal smallholder holdings (derived from 18,904 surveyed holdings in the feature-complete 2024/25 wave) across all 27 administrative regions with bi-modal production regimes. We engineer a suite of domain-specific agronomic features, enforce a 5-pillar spatial isolation protocol, evaluate diverse model architectures, explain feature mechanisms via Shapley Additive Explanations (SHAP; Lundberg &amp; Lee, 2017; Lundberg et al., 2020), and conduct counterfactual policy simulations.</w:t>
       </w:r>
     </w:p>
     <w:p>
@@ -427,7 +427,7 @@
           <w:color w:val="2B5C8F"/>
           <w:sz w:val="26"/>
         </w:rPr>
-        <w:t>2.1 Microdata Acquisition and Harmonization</w:t>
+        <w:t>2.1 Multi-Wave Microdata Architecture &amp; Survey Scope</w:t>
       </w:r>
     </w:p>
     <w:p>
@@ -438,7 +438,52 @@
         <w:rPr>
           <w:rFonts w:ascii="Times New Roman" w:hAnsi="Times New Roman"/>
         </w:rPr>
-        <w:t>The empirical foundation of this study was the National Bureau of Statistics (NBS) Annual Agricultural Sample Survey (AASS) microdata covering mainland Tanzania and Zanzibar (NBS, 2021). The survey followed a multi-stage stratified cluster sampling design representative of smallholder agricultural households at both national and regional levels (URT, 2020).</w:t>
+        <w:t>The empirical foundation of this study originates from the National Bureau of Statistics (NBS) of Tanzania and the Office of the Chief Government Statistician (OCGS) Zanzibar Annual Agricultural Sample Survey (AASS) series (NBS, 2021, 2025). The research infrastructure consolidates microdata across three consecutive national survey rounds:</w:t>
+        <w:br/>
+        <w:t xml:space="preserve">1. </w:t>
+      </w:r>
+      <w:r>
+        <w:rPr>
+          <w:rFonts w:ascii="Times New Roman" w:hAnsi="Times New Roman"/>
+          <w:b/>
+        </w:rPr>
+        <w:t>AASS Wave 2022/2023</w:t>
+      </w:r>
+      <w:r>
+        <w:rPr>
+          <w:rFonts w:ascii="Times New Roman" w:hAnsi="Times New Roman"/>
+        </w:rPr>
+        <w:t xml:space="preserve"> (Catalog 52): 15,944 agricultural holdings and 76,863 household individuals.</w:t>
+        <w:br/>
+        <w:t xml:space="preserve">2. </w:t>
+      </w:r>
+      <w:r>
+        <w:rPr>
+          <w:rFonts w:ascii="Times New Roman" w:hAnsi="Times New Roman"/>
+          <w:b/>
+        </w:rPr>
+        <w:t>AASS Wave 2023/2024</w:t>
+      </w:r>
+      <w:r>
+        <w:rPr>
+          <w:rFonts w:ascii="Times New Roman" w:hAnsi="Times New Roman"/>
+        </w:rPr>
+        <w:t xml:space="preserve"> (Catalog 60): 18,836 agricultural holdings, 88,977 household individuals, and the Women's Empowerment in Nutrition and Agriculture module.</w:t>
+        <w:br/>
+        <w:t xml:space="preserve">3. </w:t>
+      </w:r>
+      <w:r>
+        <w:rPr>
+          <w:rFonts w:ascii="Times New Roman" w:hAnsi="Times New Roman"/>
+          <w:b/>
+        </w:rPr>
+        <w:t>AASS Wave 2024/2025</w:t>
+      </w:r>
+      <w:r>
+        <w:rPr>
+          <w:rFonts w:ascii="Times New Roman" w:hAnsi="Times New Roman"/>
+        </w:rPr>
+        <w:t xml:space="preserve"> (Catalog 69): 18,904 agricultural holdings and 92,945 household individuals across 921 Enumeration Areas in all 31 administrative regions.</w:t>
       </w:r>
     </w:p>
     <w:p>
@@ -449,15 +494,21 @@
         <w:rPr>
           <w:rFonts w:ascii="Times New Roman" w:hAnsi="Times New Roman"/>
         </w:rPr>
-        <w:t>The microdata integration pipeline ingested and harmonized seven primary survey modules:</w:t>
-        <w:br/>
-        <w:t>- Household demographic profiles and asset ownership rosters</w:t>
-        <w:br/>
-        <w:t>- Agricultural parcel registers and land tenure characteristics across long- and short-rain seasons</w:t>
-        <w:br/>
-        <w:t>- Seasonal crop production, cultivated and harvested areas, and harvest utilization records</w:t>
-        <w:br/>
-        <w:t>- Agricultural input utilization rosters detailing chemical fertilizers, organic manure, agrochemicals, and improved seed varieties</w:t>
+        <w:t>Across all three waves, the compiled repository encompasses over 53,680 agricultural holdings and 258,000 household members. However, because each annual AASS round is drawn as an independent, repeated cross-sectional stratified cluster sample from the National Master Sample rather than a balanced longitudinal panel, individual households cannot be tracked sequentially across successive agricultural years.</w:t>
+      </w:r>
+    </w:p>
+    <w:p>
+      <w:pPr>
+        <w:spacing w:before="200" w:after="60"/>
+      </w:pPr>
+      <w:r>
+        <w:rPr>
+          <w:rFonts w:ascii="Times New Roman" w:hAnsi="Times New Roman"/>
+          <w:b/>
+          <w:color w:val="2B5C8F"/>
+          <w:sz w:val="26"/>
+        </w:rPr>
+        <w:t>2.2 Empirical Modeling Wave Selection and Bi-Modal Cohort Funnel</w:t>
       </w:r>
     </w:p>
     <w:p>
@@ -468,33 +519,148 @@
         <w:rPr>
           <w:rFonts w:ascii="Times New Roman" w:hAnsi="Times New Roman"/>
         </w:rPr>
-        <w:t xml:space="preserve">To resolve measurement heterogeneity across rural districts, non-standard harvest volume units (e.g., </w:t>
+        <w:t>For empirical machine learning modeling of seasonal crop yield volatility, this study utilizes the 2024/2025 AASS wave. This wave uniquely provides four specialized, high-resolution modules unavailable in earlier survey rounds:</w:t>
+        <w:br/>
+        <w:t xml:space="preserve">- An itemized </w:t>
       </w:r>
       <w:r>
         <w:rPr>
           <w:rFonts w:ascii="Times New Roman" w:hAnsi="Times New Roman"/>
-          <w:i/>
-        </w:rPr>
-        <w:t>debe</w:t>
+          <w:b/>
+        </w:rPr>
+        <w:t>Food Shock Roster</w:t>
       </w:r>
       <w:r>
         <w:rPr>
           <w:rFonts w:ascii="Times New Roman" w:hAnsi="Times New Roman"/>
         </w:rPr>
+        <w:t xml:space="preserve"> (</w:t>
+      </w:r>
+      <w:r>
+        <w:rPr>
+          <w:rFonts w:ascii="Courier New" w:hAnsi="Courier New"/>
+        </w:rPr>
+        <w:t>shocks_roster.dta</w:t>
+      </w:r>
+      <w:r>
+        <w:rPr>
+          <w:rFonts w:ascii="Times New Roman" w:hAnsi="Times New Roman"/>
+        </w:rPr>
+        <w:t>), capturing 43,445 shock exposure records across 15 distinct covariate and idiosyncratic hazard categories (drought, pests, floods, input price spikes), damage severity classifications, and access to coping instruments;</w:t>
+        <w:br/>
+        <w:t xml:space="preserve">- A dedicated </w:t>
+      </w:r>
+      <w:r>
+        <w:rPr>
+          <w:rFonts w:ascii="Times New Roman" w:hAnsi="Times New Roman"/>
+          <w:b/>
+        </w:rPr>
+        <w:t>Climate Advisory &amp; Extension Roster</w:t>
+      </w:r>
+      <w:r>
+        <w:rPr>
+          <w:rFonts w:ascii="Times New Roman" w:hAnsi="Times New Roman"/>
+        </w:rPr>
+        <w:t xml:space="preserve"> (</w:t>
+      </w:r>
+      <w:r>
+        <w:rPr>
+          <w:rFonts w:ascii="Courier New" w:hAnsi="Courier New"/>
+        </w:rPr>
+        <w:t>pme_6_Roster.dta</w:t>
+      </w:r>
+      <w:r>
+        <w:rPr>
+          <w:rFonts w:ascii="Times New Roman" w:hAnsi="Times New Roman"/>
+        </w:rPr>
+        <w:t>), detailing 13,491 records on localized weather forecasts, rain onset advisories, and pest alerts;</w:t>
+        <w:br/>
+        <w:t xml:space="preserve">- Granular </w:t>
+      </w:r>
+      <w:r>
+        <w:rPr>
+          <w:rFonts w:ascii="Times New Roman" w:hAnsi="Times New Roman"/>
+          <w:b/>
+        </w:rPr>
+        <w:t>Livestock Herd Dynamics &amp; Stock Rosters</w:t>
+      </w:r>
+      <w:r>
+        <w:rPr>
+          <w:rFonts w:ascii="Times New Roman" w:hAnsi="Times New Roman"/>
+        </w:rPr>
+        <w:t xml:space="preserve"> (</w:t>
+      </w:r>
+      <w:r>
+        <w:rPr>
+          <w:rFonts w:ascii="Courier New" w:hAnsi="Courier New"/>
+        </w:rPr>
+        <w:t>stock_livestock.dta</w:t>
+      </w:r>
+      <w:r>
+        <w:rPr>
+          <w:rFonts w:ascii="Times New Roman" w:hAnsi="Times New Roman"/>
+        </w:rPr>
         <w:t xml:space="preserve">, </w:t>
       </w:r>
       <w:r>
         <w:rPr>
+          <w:rFonts w:ascii="Courier New" w:hAnsi="Courier New"/>
+        </w:rPr>
+        <w:t>livestock_type.dta</w:t>
+      </w:r>
+      <w:r>
+        <w:rPr>
           <w:rFonts w:ascii="Times New Roman" w:hAnsi="Times New Roman"/>
-          <w:i/>
-        </w:rPr>
-        <w:t>gunia</w:t>
+        </w:rPr>
+        <w:t>), recording species-level livestock counts required to compute household liquidity buffers (Tropical Livestock Units);</w:t>
+        <w:br/>
+        <w:t>- Synchronized seasonal input rosters (</w:t>
+      </w:r>
+      <w:r>
+        <w:rPr>
+          <w:rFonts w:ascii="Courier New" w:hAnsi="Courier New"/>
+        </w:rPr>
+        <w:t>inputRoster_masika.dta</w:t>
       </w:r>
       <w:r>
         <w:rPr>
           <w:rFonts w:ascii="Times New Roman" w:hAnsi="Times New Roman"/>
         </w:rPr>
-        <w:t>, ox-carts, pieces) were harmonized to standard kilograms (kg) using official agro-ecological conversion coefficients published by the Ministry of Agriculture and NBS (NBS, 2021). Crop areas were standardized to hectares (ha). Holdings cultivating during both Masika and Vuli seasons were identified, yielding an eligible analytical cohort of 4,564 bi-modal smallholder households across 27 administrative regions.</w:t>
+        <w:t xml:space="preserve"> and </w:t>
+      </w:r>
+      <w:r>
+        <w:rPr>
+          <w:rFonts w:ascii="Courier New" w:hAnsi="Courier New"/>
+        </w:rPr>
+        <w:t>inputRoster_vuli.dta</w:t>
+      </w:r>
+      <w:r>
+        <w:rPr>
+          <w:rFonts w:ascii="Times New Roman" w:hAnsi="Times New Roman"/>
+        </w:rPr>
+        <w:t>) documenting chemical fertilizers, organic manure, agrochemicals, and improved seeds across both cultivation seasons.</w:t>
+      </w:r>
+    </w:p>
+    <w:p>
+      <w:pPr>
+        <w:spacing w:line="276" w:lineRule="auto" w:after="120"/>
+      </w:pPr>
+      <w:r>
+        <w:rPr>
+          <w:rFonts w:ascii="Times New Roman" w:hAnsi="Times New Roman"/>
+        </w:rPr>
+        <w:t>Because these shock, advisory, and herd inventory modules were not administered in the 2022/23 or 2023/24 surveys, pooling across waves would force the omission of the highest-leverage predictive features. Consequently, the 2024/2025 wave serves as the primary empirical modeling dataset, while earlier waves provide institutional and methodological baseline context.</w:t>
+      </w:r>
+    </w:p>
+    <w:p>
+      <w:pPr>
+        <w:spacing w:line="276" w:lineRule="auto" w:after="120"/>
+      </w:pPr>
+      <w:r>
+        <w:rPr>
+          <w:rFonts w:ascii="Times New Roman" w:hAnsi="Times New Roman"/>
+        </w:rPr>
+        <w:t>#</w:t>
       </w:r>
     </w:p>
     <w:p>
@@ -508,7 +674,349 @@
           <w:color w:val="2B5C8F"/>
           <w:sz w:val="26"/>
         </w:rPr>
-        <w:t>2.2 Yield Volatility Index Target Formulation</w:t>
+        <w:t>Derivation of the Bi-Modal Analytical Cohort (N = 4,564)</w:t>
+      </w:r>
+    </w:p>
+    <w:p>
+      <w:pPr>
+        <w:spacing w:line="276" w:lineRule="auto" w:after="120"/>
+      </w:pPr>
+      <w:r>
+        <w:rPr>
+          <w:rFonts w:ascii="Times New Roman" w:hAnsi="Times New Roman"/>
+        </w:rPr>
+        <w:t>A fundamental methodological requirement of this study is aligning the analytical sample with Tanzania's agro-climatic geography:</w:t>
+        <w:br/>
+        <w:t xml:space="preserve">- </w:t>
+      </w:r>
+      <w:r>
+        <w:rPr>
+          <w:rFonts w:ascii="Times New Roman" w:hAnsi="Times New Roman"/>
+          <w:b/>
+        </w:rPr>
+        <w:t>Bi-modal Production Zones</w:t>
+      </w:r>
+      <w:r>
+        <w:rPr>
+          <w:rFonts w:ascii="Times New Roman" w:hAnsi="Times New Roman"/>
+        </w:rPr>
+        <w:t>: Encompassing the Northern Highlands (Kilimanjaro, Arusha, Manyara), the Lake Victoria Basin (Kagera, Mwanza, Mara, Simiyu, Geita), the Northern Coast (Tanga, Morogoro, Pwani, Dar es Salaam), and parts of Zanzibar. These regions receive two distinct rainfall cycles per agricultural year: the long rains (</w:t>
+      </w:r>
+      <w:r>
+        <w:rPr>
+          <w:rFonts w:ascii="Times New Roman" w:hAnsi="Times New Roman"/>
+          <w:i/>
+        </w:rPr>
+        <w:t>Masika</w:t>
+      </w:r>
+      <w:r>
+        <w:rPr>
+          <w:rFonts w:ascii="Times New Roman" w:hAnsi="Times New Roman"/>
+        </w:rPr>
+        <w:t>, typically March–May) and the short rains (</w:t>
+      </w:r>
+      <w:r>
+        <w:rPr>
+          <w:rFonts w:ascii="Times New Roman" w:hAnsi="Times New Roman"/>
+          <w:i/>
+        </w:rPr>
+        <w:t>Vuli</w:t>
+      </w:r>
+      <w:r>
+        <w:rPr>
+          <w:rFonts w:ascii="Times New Roman" w:hAnsi="Times New Roman"/>
+        </w:rPr>
+        <w:t>, typically October–December).</w:t>
+        <w:br/>
+        <w:t xml:space="preserve">- </w:t>
+      </w:r>
+      <w:r>
+        <w:rPr>
+          <w:rFonts w:ascii="Times New Roman" w:hAnsi="Times New Roman"/>
+          <w:b/>
+        </w:rPr>
+        <w:t>Uni-modal Production Zones</w:t>
+      </w:r>
+      <w:r>
+        <w:rPr>
+          <w:rFonts w:ascii="Times New Roman" w:hAnsi="Times New Roman"/>
+        </w:rPr>
+        <w:t>: Encompassing the Southern Highlands (Mbeya, Iringa, Songwe, Ruvuma, Njombe), the Central Semi-Arid Plateau (Dodoma, Singida), and Western Tanzania (Tabora, Kigoma, Katavi, Rukwa). These zones receive unimodal precipitation spanning a single extended agricultural cycle (</w:t>
+      </w:r>
+      <w:r>
+        <w:rPr>
+          <w:rFonts w:ascii="Times New Roman" w:hAnsi="Times New Roman"/>
+          <w:i/>
+        </w:rPr>
+        <w:t>Msimu</w:t>
+      </w:r>
+      <w:r>
+        <w:rPr>
+          <w:rFonts w:ascii="Times New Roman" w:hAnsi="Times New Roman"/>
+        </w:rPr>
+        <w:t>, November–April/May) and do not support two separate annual rainfed production cycles.</w:t>
+      </w:r>
+    </w:p>
+    <w:p>
+      <w:pPr>
+        <w:spacing w:line="276" w:lineRule="auto" w:after="120"/>
+      </w:pPr>
+      <w:r>
+        <w:rPr>
+          <w:rFonts w:ascii="Times New Roman" w:hAnsi="Times New Roman"/>
+        </w:rPr>
+        <w:t>By mathematical definition, the intra-annual Yield Volatility Index (</w:t>
+      </w:r>
+      <m:oMath>
+        <m:sSub>
+          <m:e>
+            <m:r>
+              <m:t>Y</m:t>
+            </m:r>
+          </m:e>
+          <m:sub>
+            <m:r>
+              <m:t>vol,i</m:t>
+            </m:r>
+          </m:sub>
+        </m:sSub>
+      </m:oMath>
+      <w:r>
+        <w:rPr>
+          <w:rFonts w:ascii="Times New Roman" w:hAnsi="Times New Roman"/>
+        </w:rPr>
+        <w:t xml:space="preserve">) measures the relative harvest fluctuation </w:t>
+      </w:r>
+      <w:r>
+        <w:rPr>
+          <w:rFonts w:ascii="Times New Roman" w:hAnsi="Times New Roman"/>
+          <w:i/>
+        </w:rPr>
+        <w:t>between successive production seasons within the same agricultural holding</w:t>
+      </w:r>
+      <w:r>
+        <w:rPr>
+          <w:rFonts w:ascii="Times New Roman" w:hAnsi="Times New Roman"/>
+        </w:rPr>
+        <w:t xml:space="preserve">. Consequently, calculating </w:t>
+      </w:r>
+      <m:oMath>
+        <m:sSub>
+          <m:e>
+            <m:r>
+              <m:t>Y</m:t>
+            </m:r>
+          </m:e>
+          <m:sub>
+            <m:r>
+              <m:t>vol,i</m:t>
+            </m:r>
+          </m:sub>
+        </m:sSub>
+      </m:oMath>
+      <w:r>
+        <w:rPr>
+          <w:rFonts w:ascii="Times New Roman" w:hAnsi="Times New Roman"/>
+        </w:rPr>
+        <w:t xml:space="preserve"> requires that a holding actively cultivated and recorded harvest outputs during both </w:t>
+      </w:r>
+      <w:r>
+        <w:rPr>
+          <w:rFonts w:ascii="Times New Roman" w:hAnsi="Times New Roman"/>
+          <w:i/>
+        </w:rPr>
+        <w:t>Masika</w:t>
+      </w:r>
+      <w:r>
+        <w:rPr>
+          <w:rFonts w:ascii="Times New Roman" w:hAnsi="Times New Roman"/>
+        </w:rPr>
+        <w:t xml:space="preserve"> and </w:t>
+      </w:r>
+      <w:r>
+        <w:rPr>
+          <w:rFonts w:ascii="Times New Roman" w:hAnsi="Times New Roman"/>
+          <w:i/>
+        </w:rPr>
+        <w:t>Vuli</w:t>
+      </w:r>
+      <w:r>
+        <w:rPr>
+          <w:rFonts w:ascii="Times New Roman" w:hAnsi="Times New Roman"/>
+        </w:rPr>
+        <w:t>.</w:t>
+      </w:r>
+    </w:p>
+    <w:p>
+      <w:pPr>
+        <w:spacing w:line="276" w:lineRule="auto" w:after="120"/>
+      </w:pPr>
+      <w:r>
+        <w:rPr>
+          <w:rFonts w:ascii="Times New Roman" w:hAnsi="Times New Roman"/>
+        </w:rPr>
+        <w:t>The sampling funnel is structured as follows:</w:t>
+        <w:br/>
+        <w:t xml:space="preserve">- </w:t>
+      </w:r>
+      <w:r>
+        <w:rPr>
+          <w:rFonts w:ascii="Times New Roman" w:hAnsi="Times New Roman"/>
+          <w:b/>
+        </w:rPr>
+        <w:t>Total Holdings Surveyed in AASS 2024/25</w:t>
+      </w:r>
+      <w:r>
+        <w:rPr>
+          <w:rFonts w:ascii="Times New Roman" w:hAnsi="Times New Roman"/>
+        </w:rPr>
+        <w:t>: 18,904 holdings across 921 Enumeration Areas;</w:t>
+        <w:br/>
+        <w:t xml:space="preserve">- </w:t>
+      </w:r>
+      <w:r>
+        <w:rPr>
+          <w:rFonts w:ascii="Times New Roman" w:hAnsi="Times New Roman"/>
+          <w:b/>
+        </w:rPr>
+        <w:t>Holdings Cultivating in Masika (Long Rains)</w:t>
+      </w:r>
+      <w:r>
+        <w:rPr>
+          <w:rFonts w:ascii="Times New Roman" w:hAnsi="Times New Roman"/>
+        </w:rPr>
+        <w:t>: 15,107 holdings;</w:t>
+        <w:br/>
+        <w:t xml:space="preserve">- </w:t>
+      </w:r>
+      <w:r>
+        <w:rPr>
+          <w:rFonts w:ascii="Times New Roman" w:hAnsi="Times New Roman"/>
+          <w:b/>
+        </w:rPr>
+        <w:t>Holdings Cultivating in Vuli (Short Rains)</w:t>
+      </w:r>
+      <w:r>
+        <w:rPr>
+          <w:rFonts w:ascii="Times New Roman" w:hAnsi="Times New Roman"/>
+        </w:rPr>
+        <w:t>: 9,552 holdings;</w:t>
+        <w:br/>
+        <w:t xml:space="preserve">- </w:t>
+      </w:r>
+      <w:r>
+        <w:rPr>
+          <w:rFonts w:ascii="Times New Roman" w:hAnsi="Times New Roman"/>
+          <w:b/>
+        </w:rPr>
+        <w:t>Eligible Bi-Modal Analytical Cohort ($N = 4,564$)</w:t>
+      </w:r>
+      <w:r>
+        <w:rPr>
+          <w:rFonts w:ascii="Times New Roman" w:hAnsi="Times New Roman"/>
+        </w:rPr>
+        <w:t xml:space="preserve">: Smallholder holdings that cultivated in both </w:t>
+      </w:r>
+      <w:r>
+        <w:rPr>
+          <w:rFonts w:ascii="Times New Roman" w:hAnsi="Times New Roman"/>
+          <w:i/>
+        </w:rPr>
+        <w:t>Masika</w:t>
+      </w:r>
+      <w:r>
+        <w:rPr>
+          <w:rFonts w:ascii="Times New Roman" w:hAnsi="Times New Roman"/>
+        </w:rPr>
+        <w:t xml:space="preserve"> and </w:t>
+      </w:r>
+      <w:r>
+        <w:rPr>
+          <w:rFonts w:ascii="Times New Roman" w:hAnsi="Times New Roman"/>
+          <w:i/>
+        </w:rPr>
+        <w:t>Vuli</w:t>
+      </w:r>
+      <w:r>
+        <w:rPr>
+          <w:rFonts w:ascii="Times New Roman" w:hAnsi="Times New Roman"/>
+        </w:rPr>
+        <w:t>, had standardized parcel area measurements, and recorded positive aggregate seasonal yields.</w:t>
+      </w:r>
+    </w:p>
+    <w:p>
+      <w:pPr>
+        <w:spacing w:line="276" w:lineRule="auto" w:after="120"/>
+      </w:pPr>
+      <w:r>
+        <w:rPr>
+          <w:rFonts w:ascii="Times New Roman" w:hAnsi="Times New Roman"/>
+        </w:rPr>
+        <w:t xml:space="preserve">Holdings located in uni-modal </w:t>
+      </w:r>
+      <w:r>
+        <w:rPr>
+          <w:rFonts w:ascii="Times New Roman" w:hAnsi="Times New Roman"/>
+          <w:i/>
+        </w:rPr>
+        <w:t>Msimu</w:t>
+      </w:r>
+      <w:r>
+        <w:rPr>
+          <w:rFonts w:ascii="Times New Roman" w:hAnsi="Times New Roman"/>
+        </w:rPr>
+        <w:t xml:space="preserve"> zones, pastoralists without seasonal crop plots, and single-season producers cannot logically possess an inter-seasonal Masika–Vuli volatility index and were naturally excluded from the volatility cohort.</w:t>
+      </w:r>
+    </w:p>
+    <w:p>
+      <w:pPr>
+        <w:spacing w:line="276" w:lineRule="auto" w:after="120"/>
+      </w:pPr>
+      <w:r>
+        <w:rPr>
+          <w:rFonts w:ascii="Times New Roman" w:hAnsi="Times New Roman"/>
+        </w:rPr>
+        <w:t xml:space="preserve">To resolve measurement heterogeneity across rural districts, non-standard harvest volume units (e.g., </w:t>
+      </w:r>
+      <w:r>
+        <w:rPr>
+          <w:rFonts w:ascii="Times New Roman" w:hAnsi="Times New Roman"/>
+          <w:i/>
+        </w:rPr>
+        <w:t>debe</w:t>
+      </w:r>
+      <w:r>
+        <w:rPr>
+          <w:rFonts w:ascii="Times New Roman" w:hAnsi="Times New Roman"/>
+        </w:rPr>
+        <w:t xml:space="preserve">, </w:t>
+      </w:r>
+      <w:r>
+        <w:rPr>
+          <w:rFonts w:ascii="Times New Roman" w:hAnsi="Times New Roman"/>
+          <w:i/>
+        </w:rPr>
+        <w:t>gunia</w:t>
+      </w:r>
+      <w:r>
+        <w:rPr>
+          <w:rFonts w:ascii="Times New Roman" w:hAnsi="Times New Roman"/>
+        </w:rPr>
+        <w:t>, ox-carts, pieces) were harmonized to standard kilograms (kg) using official agro-ecological conversion coefficients published by the Ministry of Agriculture and NBS (NBS, 2021). Crop areas were standardized to hectares (ha). This yielded the finalized, clean analytical cohort of 4,564 bi-modal smallholder households across 27 administrative regions.</w:t>
+      </w:r>
+    </w:p>
+    <w:p>
+      <w:pPr>
+        <w:spacing w:before="200" w:after="60"/>
+      </w:pPr>
+      <w:r>
+        <w:rPr>
+          <w:rFonts w:ascii="Times New Roman" w:hAnsi="Times New Roman"/>
+          <w:b/>
+          <w:color w:val="2B5C8F"/>
+          <w:sz w:val="26"/>
+        </w:rPr>
+        <w:t>2.3 Yield Volatility Index Target Formulation</w:t>
       </w:r>
     </w:p>
     <w:p>
@@ -871,7 +1379,7 @@
           <w:color w:val="2B5C8F"/>
           <w:sz w:val="26"/>
         </w:rPr>
-        <w:t>2.3 Domain-Engineered Agronomic Features</w:t>
+        <w:t>2.4 Domain-Engineered Agronomic Features</w:t>
       </w:r>
     </w:p>
     <w:p>
@@ -1155,7 +1663,7 @@
           <w:color w:val="2B5C8F"/>
           <w:sz w:val="26"/>
         </w:rPr>
-        <w:t>2.4 The 5-Pillar Spatial Leakage Audit Protocol</w:t>
+        <w:t>2.5 The 5-Pillar Spatial Leakage Audit Protocol</w:t>
       </w:r>
     </w:p>
     <w:p>
@@ -1266,7 +1774,7 @@
           <w:color w:val="2B5C8F"/>
           <w:sz w:val="26"/>
         </w:rPr>
-        <w:t>2.5 Machine Learning Architectures &amp; Ensembling</w:t>
+        <w:t>2.6 Machine Learning Architectures &amp; Ensembling</w:t>
       </w:r>
     </w:p>
     <w:p>
@@ -14571,7 +15079,7 @@
         <w:rPr>
           <w:rFonts w:ascii="Times New Roman" w:hAnsi="Times New Roman"/>
         </w:rPr>
-        <w:t>This study developed and validated a leakage-free spatial machine learning pipeline to predict smallholder crop yield volatility across 27 administrative regions of Tanzania. Utilizing national agricultural survey microdata from 10,750 households, we engineered domain-specific agronomic features and established that an out-of-fold Weighted Ensemble achieved superior generalization (</w:t>
+        <w:t>This study developed and validated a leakage-free spatial machine learning pipeline to predict smallholder crop yield volatility across 27 administrative regions of Tanzania. Contextualized within a multi-wave national agricultural survey infrastructure (2022–2025, encompassing 53,684 holdings) and modeling the complete bi-modal analytical cohort of 4,564 smallholder holdings (derived from 18,904 surveyed holdings in the 2024/25 survey), we engineered domain-specific agronomic features and established that an out-of-fold Weighted Ensemble achieved superior generalization (</w:t>
       </w:r>
       <m:oMath>
         <m:sSup>

</xml_diff>